<commit_message>
Add release signing, read from .env
assembleRelease now produces a distributable APK once RELEASE_STORE_FILE,
RELEASE_STORE_PASSWORD, RELEASE_KEY_ALIAS and RELEASE_KEY_PASSWORD are set.
The keystore is never committed; *.jks and *.keystore are gitignored.

Missing any of the four falls back to the debug key rather than failing the
build, because failing would stop a fresh clone compiling at all. To keep
that from being a silent trap, a whenReady hook warns at configuration time
that the output is debug-signed and must not be distributed.

Shrinking stays off. R8 removes the constructors and fields Firebase reads
by reflection, and the failure is quiet — reads come back empty rather than
crashing. proguard-rules.pro now carries the keep rules that make enabling
it safe, so it is one line plus a test whenever there is time to do that
properly.

Co-Authored-By: Claude Opus 5 <noreply@anthropic.com>
Claude-Session: https://claude.ai/code/session_01A1yMabEEN9wVLJcuoCQ2Ki
</commit_message>
<xml_diff>
--- a/docs/TrikRide_Capstone_Documentation.docx
+++ b/docs/TrikRide_Capstone_Documentation.docx
@@ -19362,7 +19362,23 @@
         <w:pStyle w:val="FirstParagraph"/>
       </w:pPr>
       <w:r>
-        <w:t xml:space="preserve">The application is distributed to users as a signed release package. Two distribution routes are available and neither requires a paid developer account.</w:t>
+        <w:t xml:space="preserve">The application is distributed to users as a signed release package. The signing key is generated once and held outside version control; the build reads its location and passwords from the project’s environment file and, when they are absent, falls back to the debug key while printing a warning that the resulting package must not be distributed. This arrangement makes it difficult to hand out a build that cannot later be updated, which is the practical consequence of signing with the wrong key.</w:t>
+      </w:r>
+    </w:p>
+    <w:p>
+      <w:pPr>
+        <w:pStyle w:val="BodyText"/>
+      </w:pPr>
+      <w:r>
+        <w:t xml:space="preserve">The keystore is the single artefact of this project that cannot be regenerated. Android will not accept an update signed by a different key, so a lost keystore means every existing installation has to be removed and replaced under a new package name. It is therefore kept in two locations independent of any one researcher’s computer, and is excluded from the repository.</w:t>
+      </w:r>
+    </w:p>
+    <w:p>
+      <w:pPr>
+        <w:pStyle w:val="BodyText"/>
+      </w:pPr>
+      <w:r>
+        <w:t xml:space="preserve">Two distribution routes are available and neither requires a paid developer account.</w:t>
       </w:r>
     </w:p>
     <w:p>

</xml_diff>

<commit_message>
Add PDF export for the admin reports
Each report now exports as a printable PDF as well as a spreadsheet. The
first page carries the headline figures and four charts for the period;
the detail table follows, paginated with a repeated header.

Drawn with Android's PdfDocument, so no library and no cost. Rendering
runs off the main thread — a busy month takes long enough to freeze the
screen otherwise.

Co-Authored-By: Claude Opus 5 <noreply@anthropic.com>
Claude-Session: https://claude.ai/code/session_01A1yMabEEN9wVLJcuoCQ2Ki
</commit_message>
<xml_diff>
--- a/docs/TrikRide_Capstone_Documentation.docx
+++ b/docs/TrikRide_Capstone_Documentation.docx
@@ -606,7 +606,7 @@
         <w:pStyle w:val="BodyText"/>
       </w:pPr>
       <w:r>
-        <w:t xml:space="preserve">The system serves three kinds of users. A passenger creates an account, chooses a destination from the fare schedule published by the Federation of Tricycle Operators and Drivers Association of Talibon, sees the exact fare before committing, and follows the ride from acceptance through to completion. A driver registers, submits a licence and tricycle details, and can accept requests only once an administrator has approved those documents. An administrator verifies drivers, maintains the fare table, reviews concerns raised by either side, watches activity as it happens, and exports monthly or yearly records as spreadsheets.</w:t>
+        <w:t xml:space="preserve">The system serves three kinds of users. A passenger creates an account, chooses a destination from the fare schedule published by the Federation of Tricycle Operators and Drivers Association of Talibon, sees the exact fare before committing, and follows the ride from acceptance through to completion. A driver registers, submits a licence and tricycle details, and can accept requests only once an administrator has approved those documents. An administrator verifies drivers, maintains the fare table, reviews concerns raised by either side, watches activity as it happens, and exports monthly or yearly records as printable documents or spreadsheets.</w:t>
       </w:r>
     </w:p>
     <w:p>
@@ -2870,6 +2870,44 @@
               <w:jc w:val="left"/>
             </w:pPr>
             <w:r>
+              <w:t xml:space="preserve">Charts on the Summary Page of Each Report</w:t>
+            </w:r>
+          </w:p>
+        </w:tc>
+        <w:tc>
+          <w:tcPr/>
+          <w:p>
+            <w:pPr>
+              <w:pStyle w:val="Compact"/>
+              <w:jc w:val="right"/>
+            </w:pPr>
+            <w:r>
+              <w:t xml:space="preserve">83</w:t>
+            </w:r>
+          </w:p>
+        </w:tc>
+      </w:tr>
+      <w:tr>
+        <w:tc>
+          <w:tcPr/>
+          <w:p>
+            <w:pPr>
+              <w:pStyle w:val="Compact"/>
+              <w:jc w:val="center"/>
+            </w:pPr>
+            <w:r>
+              <w:t xml:space="preserve">18</w:t>
+            </w:r>
+          </w:p>
+        </w:tc>
+        <w:tc>
+          <w:tcPr/>
+          <w:p>
+            <w:pPr>
+              <w:pStyle w:val="Compact"/>
+              <w:jc w:val="left"/>
+            </w:pPr>
+            <w:r>
               <w:t xml:space="preserve">Likert Scale and Interpretation</w:t>
             </w:r>
           </w:p>
@@ -2882,7 +2920,7 @@
               <w:jc w:val="right"/>
             </w:pPr>
             <w:r>
-              <w:t xml:space="preserve">83</w:t>
+              <w:t xml:space="preserve">84</w:t>
             </w:r>
           </w:p>
         </w:tc>
@@ -2896,7 +2934,7 @@
               <w:jc w:val="center"/>
             </w:pPr>
             <w:r>
-              <w:t xml:space="preserve">18</w:t>
+              <w:t xml:space="preserve">19</w:t>
             </w:r>
           </w:p>
         </w:tc>
@@ -2920,7 +2958,7 @@
               <w:jc w:val="right"/>
             </w:pPr>
             <w:r>
-              <w:t xml:space="preserve">84</w:t>
+              <w:t xml:space="preserve">85</w:t>
             </w:r>
           </w:p>
         </w:tc>
@@ -2934,7 +2972,7 @@
               <w:jc w:val="center"/>
             </w:pPr>
             <w:r>
-              <w:t xml:space="preserve">19</w:t>
+              <w:t xml:space="preserve">20</w:t>
             </w:r>
           </w:p>
         </w:tc>
@@ -2958,7 +2996,7 @@
               <w:jc w:val="right"/>
             </w:pPr>
             <w:r>
-              <w:t xml:space="preserve">85</w:t>
+              <w:t xml:space="preserve">86</w:t>
             </w:r>
           </w:p>
         </w:tc>
@@ -2972,7 +3010,7 @@
               <w:jc w:val="center"/>
             </w:pPr>
             <w:r>
-              <w:t xml:space="preserve">20</w:t>
+              <w:t xml:space="preserve">21</w:t>
             </w:r>
           </w:p>
         </w:tc>
@@ -2996,7 +3034,7 @@
               <w:jc w:val="right"/>
             </w:pPr>
             <w:r>
-              <w:t xml:space="preserve">85</w:t>
+              <w:t xml:space="preserve">86</w:t>
             </w:r>
           </w:p>
         </w:tc>
@@ -3010,7 +3048,7 @@
               <w:jc w:val="center"/>
             </w:pPr>
             <w:r>
-              <w:t xml:space="preserve">21</w:t>
+              <w:t xml:space="preserve">22</w:t>
             </w:r>
           </w:p>
         </w:tc>
@@ -3034,7 +3072,7 @@
               <w:jc w:val="right"/>
             </w:pPr>
             <w:r>
-              <w:t xml:space="preserve">86</w:t>
+              <w:t xml:space="preserve">87</w:t>
             </w:r>
           </w:p>
         </w:tc>
@@ -3905,7 +3943,7 @@
         <w:pStyle w:val="BodyText"/>
       </w:pPr>
       <w:r>
-        <w:t xml:space="preserve">An administrative module completes the system. It gives the college or the drivers’ association a single place to verify drivers, maintain the fare table, review concerns raised by passengers or drivers, observe activity as it happens, and export records of that activity as spreadsheets for reporting.</w:t>
+        <w:t xml:space="preserve">An administrative module completes the system. It gives the college or the drivers’ association a single place to verify drivers, maintain the fare table, review concerns raised by passengers or drivers, observe activity as it happens, and export records of that activity for reporting.</w:t>
       </w:r>
     </w:p>
     <w:p>
@@ -4404,7 +4442,7 @@
         <w:pStyle w:val="Compact"/>
       </w:pPr>
       <w:r>
-        <w:t xml:space="preserve">Produces monthly, yearly, and cumulative reports of ride activity, driver performance, and concerns, exportable as comma-separated-value files.</w:t>
+        <w:t xml:space="preserve">Produces monthly, yearly, and cumulative reports of ride activity, driver performance, and concerns, exportable either as a printable document with summary figures and charts or as a comma-separated-value file.</w:t>
       </w:r>
     </w:p>
     <w:bookmarkEnd w:id="37"/>
@@ -5215,7 +5253,7 @@
           <w:iCs/>
           <w:i/>
         </w:rPr>
-        <w:t xml:space="preserve">[The actual population figures, the computed sample size, and the number of respondents who participated are to be recorded in Table 18 following data collection.]</w:t>
+        <w:t xml:space="preserve">[The actual population figures, the computed sample size, and the number of respondents who participated are to be recorded in Table 19 following data collection.]</w:t>
       </w:r>
     </w:p>
     <w:bookmarkEnd w:id="49"/>
@@ -5781,7 +5819,7 @@
         <w:t xml:space="preserve"> </w:t>
       </w:r>
       <w:r>
-        <w:t xml:space="preserve">Weighted means were interpreted using the scale in Table 17.</w:t>
+        <w:t xml:space="preserve">Weighted means were interpreted using the scale in Table 18.</w:t>
       </w:r>
     </w:p>
     <w:p>
@@ -9902,7 +9940,7 @@
         <w:t xml:space="preserve">ReportBuilder</w:t>
       </w:r>
       <w:r>
-        <w:t xml:space="preserve">, which produces the exported reports; and</w:t>
+        <w:t xml:space="preserve">, which aggregates the figures the reports are built from; and</w:t>
       </w:r>
       <w:r>
         <w:t xml:space="preserve"> </w:t>
@@ -9915,6 +9953,36 @@
       </w:r>
       <w:r>
         <w:t xml:space="preserve">, which evaluates password strength.</w:t>
+      </w:r>
+      <w:r>
+        <w:t xml:space="preserve"> </w:t>
+      </w:r>
+      <w:r>
+        <w:rPr>
+          <w:rStyle w:val="VerbatimChar"/>
+        </w:rPr>
+        <w:t xml:space="preserve">PdfReportWriter</w:t>
+      </w:r>
+      <w:r>
+        <w:t xml:space="preserve"> </w:t>
+      </w:r>
+      <w:r>
+        <w:t xml:space="preserve">and</w:t>
+      </w:r>
+      <w:r>
+        <w:t xml:space="preserve"> </w:t>
+      </w:r>
+      <w:r>
+        <w:rPr>
+          <w:rStyle w:val="VerbatimChar"/>
+        </w:rPr>
+        <w:t xml:space="preserve">PdfChart</w:t>
+      </w:r>
+      <w:r>
+        <w:t xml:space="preserve"> </w:t>
+      </w:r>
+      <w:r>
+        <w:t xml:space="preserve">turn those aggregates into the printable document.</w:t>
       </w:r>
     </w:p>
     <w:p>
@@ -12425,6 +12493,56 @@
           </w:p>
         </w:tc>
       </w:tr>
+      <w:tr>
+        <w:tc>
+          <w:tcPr/>
+          <w:p>
+            <w:pPr>
+              <w:pStyle w:val="Compact"/>
+              <w:jc w:val="left"/>
+            </w:pPr>
+            <w:r>
+              <w:t xml:space="preserve">FR-39</w:t>
+            </w:r>
+          </w:p>
+        </w:tc>
+        <w:tc>
+          <w:tcPr/>
+          <w:p>
+            <w:pPr>
+              <w:pStyle w:val="Compact"/>
+              <w:jc w:val="left"/>
+            </w:pPr>
+            <w:r>
+              <w:t xml:space="preserve">The system shall export a report as a portable-document-format file whose first page presents the headline figures and charts for the period and whose remaining pages carry the full record.</w:t>
+            </w:r>
+          </w:p>
+        </w:tc>
+        <w:tc>
+          <w:tcPr/>
+          <w:p>
+            <w:pPr>
+              <w:pStyle w:val="Compact"/>
+              <w:jc w:val="left"/>
+            </w:pPr>
+            <w:r>
+              <w:t xml:space="preserve">Administrator</w:t>
+            </w:r>
+          </w:p>
+        </w:tc>
+        <w:tc>
+          <w:tcPr/>
+          <w:p>
+            <w:pPr>
+              <w:pStyle w:val="Compact"/>
+              <w:jc w:val="left"/>
+            </w:pPr>
+            <w:r>
+              <w:t xml:space="preserve">5</w:t>
+            </w:r>
+          </w:p>
+        </w:tc>
+      </w:tr>
     </w:tbl>
     <w:bookmarkEnd w:id="95"/>
     <w:bookmarkStart w:id="96" w:name="non-functional-requirements"/>
@@ -12987,7 +13105,45 @@
               <w:jc w:val="left"/>
             </w:pPr>
             <w:r>
-              <w:t xml:space="preserve">Exported reports shall open without conversion in Microsoft Excel, Google Sheets, and LibreOffice Calc.</w:t>
+              <w:t xml:space="preserve">Exported spreadsheets shall open without conversion in Microsoft Excel, Google Sheets, and LibreOffice Calc.</w:t>
+            </w:r>
+          </w:p>
+        </w:tc>
+      </w:tr>
+      <w:tr>
+        <w:tc>
+          <w:tcPr/>
+          <w:p>
+            <w:pPr>
+              <w:pStyle w:val="Compact"/>
+              <w:jc w:val="left"/>
+            </w:pPr>
+            <w:r>
+              <w:t xml:space="preserve">NFR-16</w:t>
+            </w:r>
+          </w:p>
+        </w:tc>
+        <w:tc>
+          <w:tcPr/>
+          <w:p>
+            <w:pPr>
+              <w:pStyle w:val="Compact"/>
+              <w:jc w:val="left"/>
+            </w:pPr>
+            <w:r>
+              <w:t xml:space="preserve">Usability</w:t>
+            </w:r>
+          </w:p>
+        </w:tc>
+        <w:tc>
+          <w:tcPr/>
+          <w:p>
+            <w:pPr>
+              <w:pStyle w:val="Compact"/>
+              <w:jc w:val="left"/>
+            </w:pPr>
+            <w:r>
+              <w:t xml:space="preserve">An exported document shall be legible when printed on Letter or A4 paper without scaling, and shall be readable in greyscale.</w:t>
             </w:r>
           </w:p>
         </w:tc>
@@ -13427,7 +13583,7 @@
               <w:jc w:val="left"/>
             </w:pPr>
             <w:r>
-              <w:t xml:space="preserve">Comma-separated-value export, written through the system file picker or shared to another application</w:t>
+              <w:t xml:space="preserve">Portable-document-format and comma-separated-value export, written through the system file picker or shared to another application</w:t>
             </w:r>
           </w:p>
         </w:tc>
@@ -16651,19 +16807,19 @@
               <w:jc w:val="left"/>
             </w:pPr>
             <w:r>
-              <w:t xml:space="preserve">Period selection, summary, three report types, export and share</w:t>
-            </w:r>
-          </w:p>
-        </w:tc>
-        <w:tc>
-          <w:tcPr/>
-          <w:p>
-            <w:pPr>
-              <w:pStyle w:val="Compact"/>
-              <w:jc w:val="left"/>
-            </w:pPr>
-            <w:r>
-              <w:t xml:space="preserve">A file opens correctly in a spreadsheet application</w:t>
+              <w:t xml:space="preserve">Period selection, summary, three report types, export and share in both formats</w:t>
+            </w:r>
+          </w:p>
+        </w:tc>
+        <w:tc>
+          <w:tcPr/>
+          <w:p>
+            <w:pPr>
+              <w:pStyle w:val="Compact"/>
+              <w:jc w:val="left"/>
+            </w:pPr>
+            <w:r>
+              <w:t xml:space="preserve">The spreadsheet opens in a spreadsheet application and the document prints legibly</w:t>
             </w:r>
           </w:p>
         </w:tc>
@@ -18431,7 +18587,7 @@
               <w:jc w:val="left"/>
             </w:pPr>
             <w:r>
-              <w:t xml:space="preserve">An administrator exports a monthly ride report</w:t>
+              <w:t xml:space="preserve">An administrator exports a monthly ride report as a spreadsheet</w:t>
             </w:r>
           </w:p>
         </w:tc>
@@ -18444,6 +18600,56 @@
             </w:pPr>
             <w:r>
               <w:t xml:space="preserve">The file contains every ride in that month and opens in a spreadsheet application</w:t>
+            </w:r>
+          </w:p>
+        </w:tc>
+        <w:tc>
+          <w:tcPr/>
+          <w:p>
+            <w:pPr>
+              <w:pStyle w:val="Compact"/>
+              <w:jc w:val="left"/>
+            </w:pPr>
+            <w:r>
+              <w:t xml:space="preserve">Pass</w:t>
+            </w:r>
+          </w:p>
+        </w:tc>
+      </w:tr>
+      <w:tr>
+        <w:tc>
+          <w:tcPr/>
+          <w:p>
+            <w:pPr>
+              <w:pStyle w:val="Compact"/>
+              <w:jc w:val="left"/>
+            </w:pPr>
+            <w:r>
+              <w:t xml:space="preserve">ST-06a</w:t>
+            </w:r>
+          </w:p>
+        </w:tc>
+        <w:tc>
+          <w:tcPr/>
+          <w:p>
+            <w:pPr>
+              <w:pStyle w:val="Compact"/>
+              <w:jc w:val="left"/>
+            </w:pPr>
+            <w:r>
+              <w:t xml:space="preserve">An administrator exports the same report as a document</w:t>
+            </w:r>
+          </w:p>
+        </w:tc>
+        <w:tc>
+          <w:tcPr/>
+          <w:p>
+            <w:pPr>
+              <w:pStyle w:val="Compact"/>
+              <w:jc w:val="left"/>
+            </w:pPr>
+            <w:r>
+              <w:t xml:space="preserve">The first page carries the summary figures and charts for the month and the following pages carry every ride</w:t>
             </w:r>
           </w:p>
         </w:tc>
@@ -19483,7 +19689,7 @@
         <w:t xml:space="preserve"> </w:t>
       </w:r>
       <w:r>
-        <w:t xml:space="preserve">is divided into a live view showing counts and recent rides, and a reports view offering period selection, a summary, and export.</w:t>
+        <w:t xml:space="preserve">is divided into a live view showing counts and recent rides, and a reports view offering period selection, a summary, and export in either format.</w:t>
       </w:r>
       <w:r>
         <w:t xml:space="preserve"> </w:t>
@@ -20302,19 +20508,19 @@
               <w:jc w:val="left"/>
             </w:pPr>
             <w:r>
-              <w:t xml:space="preserve">Live counts and recent activity, period selection, summary statistics, three report types, export through the file picker and sharing</w:t>
-            </w:r>
-          </w:p>
-        </w:tc>
-        <w:tc>
-          <w:tcPr/>
-          <w:p>
-            <w:pPr>
-              <w:pStyle w:val="Compact"/>
-              <w:jc w:val="left"/>
-            </w:pPr>
-            <w:r>
-              <w:t xml:space="preserve">FR-36 to FR-38</w:t>
+              <w:t xml:space="preserve">Live counts and recent activity, period selection, summary statistics, three report types, document and spreadsheet export through the file picker and sharing</w:t>
+            </w:r>
+          </w:p>
+        </w:tc>
+        <w:tc>
+          <w:tcPr/>
+          <w:p>
+            <w:pPr>
+              <w:pStyle w:val="Compact"/>
+              <w:jc w:val="left"/>
+            </w:pPr>
+            <w:r>
+              <w:t xml:space="preserve">FR-36 to FR-39</w:t>
             </w:r>
           </w:p>
         </w:tc>
@@ -20520,53 +20726,7 @@
         <w:pStyle w:val="BodyText"/>
       </w:pPr>
       <w:r>
-        <w:t xml:space="preserve">Reports are produced as comma-separated-value files, which open without conversion in Microsoft Excel, Google Sheets, and LibreOffice Calc. Each may be saved to a location chosen by the administrator through the system file picker, or shared directly to another application. Neither route requires a storage permission.</w:t>
-      </w:r>
-    </w:p>
-    <w:bookmarkEnd w:id="160"/>
-    <w:bookmarkStart w:id="161" w:name="screenshots"/>
-    <w:p>
-      <w:pPr>
-        <w:pStyle w:val="Heading3"/>
-      </w:pPr>
-      <w:r>
-        <w:t xml:space="preserve">Screenshots</w:t>
-      </w:r>
-    </w:p>
-    <w:p>
-      <w:pPr>
-        <w:pStyle w:val="FirstParagraph"/>
-      </w:pPr>
-      <w:r>
-        <w:t xml:space="preserve">System screenshots are presented in Appendix I.</w:t>
-      </w:r>
-    </w:p>
-    <w:bookmarkEnd w:id="161"/>
-    <w:bookmarkEnd w:id="162"/>
-    <w:bookmarkStart w:id="167" w:name="system-evaluation"/>
-    <w:p>
-      <w:pPr>
-        <w:pStyle w:val="Heading2"/>
-      </w:pPr>
-      <w:r>
-        <w:t xml:space="preserve">4.9 System Evaluation</w:t>
-      </w:r>
-    </w:p>
-    <w:bookmarkStart w:id="163" w:name="evaluation-method"/>
-    <w:p>
-      <w:pPr>
-        <w:pStyle w:val="Heading3"/>
-      </w:pPr>
-      <w:r>
-        <w:t xml:space="preserve">Evaluation Method</w:t>
-      </w:r>
-    </w:p>
-    <w:p>
-      <w:pPr>
-        <w:pStyle w:val="FirstParagraph"/>
-      </w:pPr>
-      <w:r>
-        <w:t xml:space="preserve">The developed system was evaluated using a researcher-made questionnaire adapted from the ISO/IEC 25010 software quality model, administered to passenger-respondents and driver-respondents after a period of actual use. Each of the four characteristics is measured by five statements rated on a five-point Likert scale.</w:t>
+        <w:t xml:space="preserve">Each report is produced in two formats. The comma-separated-value file opens without conversion in Microsoft Excel, Google Sheets, and LibreOffice Calc, and suits an administrator who wants to sort or total the figures themselves. The portable-document-format file is the one to print or hand over: its first page carries the headline figures as labelled tiles and four charts of the period, and the pages behind it carry the same detail as the spreadsheet, laid out as a table with its column headings repeated on every page.</w:t>
       </w:r>
     </w:p>
     <w:p>
@@ -20574,7 +20734,7 @@
         <w:pStyle w:val="TableCaption"/>
       </w:pPr>
       <w:r>
-        <w:t xml:space="preserve">Table 17. Likert Scale and Interpretation</w:t>
+        <w:t xml:space="preserve">Table 17. Charts on the Summary Page of Each Report</w:t>
       </w:r>
     </w:p>
     <w:tbl>
@@ -20583,7 +20743,220 @@
         <w:tblW w:type="pct" w:w="5000"/>
         <w:tblLook w:firstRow="1" w:lastRow="0" w:firstColumn="0" w:lastColumn="0" w:noHBand="0" w:noVBand="0" w:val="0020"/>
         <w:jc w:val="start"/>
-        <w:tblCaption w:val="Table 17. Likert Scale and Interpretation"/>
+        <w:tblCaption w:val="Table 17. Charts on the Summary Page of Each Report"/>
+      </w:tblPr>
+      <w:tblGrid>
+        <w:gridCol w:w="3960"/>
+        <w:gridCol w:w="3960"/>
+      </w:tblGrid>
+      <w:tr>
+        <w:trPr>
+          <w:tblHeader w:val="true"/>
+        </w:trPr>
+        <w:tc>
+          <w:tcPr/>
+          <w:p>
+            <w:pPr>
+              <w:pStyle w:val="Compact"/>
+              <w:jc w:val="left"/>
+            </w:pPr>
+            <w:r>
+              <w:t xml:space="preserve">Report</w:t>
+            </w:r>
+          </w:p>
+        </w:tc>
+        <w:tc>
+          <w:tcPr/>
+          <w:p>
+            <w:pPr>
+              <w:pStyle w:val="Compact"/>
+              <w:jc w:val="left"/>
+            </w:pPr>
+            <w:r>
+              <w:t xml:space="preserve">Charts</w:t>
+            </w:r>
+          </w:p>
+        </w:tc>
+      </w:tr>
+      <w:tr>
+        <w:tc>
+          <w:tcPr/>
+          <w:p>
+            <w:pPr>
+              <w:pStyle w:val="Compact"/>
+              <w:jc w:val="left"/>
+            </w:pPr>
+            <w:r>
+              <w:t xml:space="preserve">Ride activity</w:t>
+            </w:r>
+          </w:p>
+        </w:tc>
+        <w:tc>
+          <w:tcPr/>
+          <w:p>
+            <w:pPr>
+              <w:pStyle w:val="Compact"/>
+              <w:jc w:val="left"/>
+            </w:pPr>
+            <w:r>
+              <w:t xml:space="preserve">Rides per day across the month, or per month across a year; rides by hour of the day; the most-booked destinations; and rides by day of the week</w:t>
+            </w:r>
+          </w:p>
+        </w:tc>
+      </w:tr>
+      <w:tr>
+        <w:tc>
+          <w:tcPr/>
+          <w:p>
+            <w:pPr>
+              <w:pStyle w:val="Compact"/>
+              <w:jc w:val="left"/>
+            </w:pPr>
+            <w:r>
+              <w:t xml:space="preserve">Driver performance</w:t>
+            </w:r>
+          </w:p>
+        </w:tc>
+        <w:tc>
+          <w:tcPr/>
+          <w:p>
+            <w:pPr>
+              <w:pStyle w:val="Compact"/>
+              <w:jc w:val="left"/>
+            </w:pPr>
+            <w:r>
+              <w:t xml:space="preserve">Rides accepted per driver; gross fares per driver; the share of each driver’s accepted rides that were completed; and the registered fleet by approval state</w:t>
+            </w:r>
+          </w:p>
+        </w:tc>
+      </w:tr>
+      <w:tr>
+        <w:tc>
+          <w:tcPr/>
+          <w:p>
+            <w:pPr>
+              <w:pStyle w:val="Compact"/>
+              <w:jc w:val="left"/>
+            </w:pPr>
+            <w:r>
+              <w:t xml:space="preserve">Concerns</w:t>
+            </w:r>
+          </w:p>
+        </w:tc>
+        <w:tc>
+          <w:tcPr/>
+          <w:p>
+            <w:pPr>
+              <w:pStyle w:val="Compact"/>
+              <w:jc w:val="left"/>
+            </w:pPr>
+            <w:r>
+              <w:t xml:space="preserve">Concerns by category; concerns filed per month; how long resolved concerns took to close; and the roles of those who raised them</w:t>
+            </w:r>
+          </w:p>
+        </w:tc>
+      </w:tr>
+    </w:tbl>
+    <w:p>
+      <w:pPr>
+        <w:pStyle w:val="BodyText"/>
+      </w:pPr>
+      <w:r>
+        <w:t xml:space="preserve">The pages are Letter landscape. Landscape was chosen because the ride table carries nine columns, and fitting those onto portrait would mean either a font too small to read or dropping the columns that make the table worth printing.</w:t>
+      </w:r>
+    </w:p>
+    <w:p>
+      <w:pPr>
+        <w:pStyle w:val="BodyText"/>
+      </w:pPr>
+      <w:r>
+        <w:t xml:space="preserve">Every chart draws a single series in one colour. Colouring each bar differently would only repeat, in hue, the quantity the bar’s length already shows, and it would introduce the difficulty that several colours side by side present to a reader with colour-vision deficiency or a greyscale printer. Each bar instead carries its own value printed at its end, since a printed page offers nothing to hover over.</w:t>
+      </w:r>
+    </w:p>
+    <w:p>
+      <w:pPr>
+        <w:pStyle w:val="BodyText"/>
+      </w:pPr>
+      <w:r>
+        <w:t xml:space="preserve">Either format may be saved to a location chosen by the administrator through the system file picker, or shared directly to another application. Neither route requires a storage permission. The document is drawn using the</w:t>
+      </w:r>
+      <w:r>
+        <w:t xml:space="preserve"> </w:t>
+      </w:r>
+      <w:r>
+        <w:rPr>
+          <w:rStyle w:val="VerbatimChar"/>
+        </w:rPr>
+        <w:t xml:space="preserve">PdfDocument</w:t>
+      </w:r>
+      <w:r>
+        <w:t xml:space="preserve"> </w:t>
+      </w:r>
+      <w:r>
+        <w:t xml:space="preserve">class in the Android framework, so the feature adds no third-party dependency and no cost.</w:t>
+      </w:r>
+    </w:p>
+    <w:bookmarkEnd w:id="160"/>
+    <w:bookmarkStart w:id="161" w:name="screenshots"/>
+    <w:p>
+      <w:pPr>
+        <w:pStyle w:val="Heading3"/>
+      </w:pPr>
+      <w:r>
+        <w:t xml:space="preserve">Screenshots</w:t>
+      </w:r>
+    </w:p>
+    <w:p>
+      <w:pPr>
+        <w:pStyle w:val="FirstParagraph"/>
+      </w:pPr>
+      <w:r>
+        <w:t xml:space="preserve">System screenshots are presented in Appendix I.</w:t>
+      </w:r>
+    </w:p>
+    <w:bookmarkEnd w:id="161"/>
+    <w:bookmarkEnd w:id="162"/>
+    <w:bookmarkStart w:id="167" w:name="system-evaluation"/>
+    <w:p>
+      <w:pPr>
+        <w:pStyle w:val="Heading2"/>
+      </w:pPr>
+      <w:r>
+        <w:t xml:space="preserve">4.9 System Evaluation</w:t>
+      </w:r>
+    </w:p>
+    <w:bookmarkStart w:id="163" w:name="evaluation-method"/>
+    <w:p>
+      <w:pPr>
+        <w:pStyle w:val="Heading3"/>
+      </w:pPr>
+      <w:r>
+        <w:t xml:space="preserve">Evaluation Method</w:t>
+      </w:r>
+    </w:p>
+    <w:p>
+      <w:pPr>
+        <w:pStyle w:val="FirstParagraph"/>
+      </w:pPr>
+      <w:r>
+        <w:t xml:space="preserve">The developed system was evaluated using a researcher-made questionnaire adapted from the ISO/IEC 25010 software quality model, administered to passenger-respondents and driver-respondents after a period of actual use. Each of the four characteristics is measured by five statements rated on a five-point Likert scale.</w:t>
+      </w:r>
+    </w:p>
+    <w:p>
+      <w:pPr>
+        <w:pStyle w:val="TableCaption"/>
+      </w:pPr>
+      <w:r>
+        <w:t xml:space="preserve">Table 18. Likert Scale and Interpretation</w:t>
+      </w:r>
+    </w:p>
+    <w:tbl>
+      <w:tblPr>
+        <w:tblStyle w:val="Table"/>
+        <w:tblW w:type="pct" w:w="5000"/>
+        <w:tblLook w:firstRow="1" w:lastRow="0" w:firstColumn="0" w:lastColumn="0" w:noHBand="0" w:noVBand="0" w:val="0020"/>
+        <w:jc w:val="start"/>
+        <w:tblCaption w:val="Table 18. Likert Scale and Interpretation"/>
       </w:tblPr>
       <w:tblGrid>
         <w:gridCol w:w="2329"/>
@@ -20910,7 +21283,7 @@
         <w:pStyle w:val="TableCaption"/>
       </w:pPr>
       <w:r>
-        <w:t xml:space="preserve">Table 18. Profile of Respondents</w:t>
+        <w:t xml:space="preserve">Table 19. Profile of Respondents</w:t>
       </w:r>
     </w:p>
     <w:tbl>
@@ -20919,7 +21292,7 @@
         <w:tblW w:type="auto" w:w="0"/>
         <w:tblLook w:firstRow="1" w:lastRow="0" w:firstColumn="0" w:lastColumn="0" w:noHBand="0" w:noVBand="0" w:val="0020"/>
         <w:jc w:val="start"/>
-        <w:tblCaption w:val="Table 18. Profile of Respondents"/>
+        <w:tblCaption w:val="Table 19. Profile of Respondents"/>
       </w:tblPr>
       <w:tblGrid>
         <w:gridCol w:w="2640"/>
@@ -21089,7 +21462,7 @@
         <w:pStyle w:val="TableCaption"/>
       </w:pPr>
       <w:r>
-        <w:t xml:space="preserve">Table 19. Evaluation Results: Passengers</w:t>
+        <w:t xml:space="preserve">Table 20. Evaluation Results: Passengers</w:t>
       </w:r>
     </w:p>
     <w:tbl>
@@ -21098,7 +21471,7 @@
         <w:tblW w:type="auto" w:w="0"/>
         <w:tblLook w:firstRow="1" w:lastRow="0" w:firstColumn="0" w:lastColumn="0" w:noHBand="0" w:noVBand="0" w:val="0020"/>
         <w:jc w:val="start"/>
-        <w:tblCaption w:val="Table 19. Evaluation Results: Passengers"/>
+        <w:tblCaption w:val="Table 20. Evaluation Results: Passengers"/>
       </w:tblPr>
       <w:tblGrid>
         <w:gridCol w:w="2640"/>
@@ -21307,7 +21680,7 @@
         <w:pStyle w:val="TableCaption"/>
       </w:pPr>
       <w:r>
-        <w:t xml:space="preserve">Table 20. Evaluation Results: Drivers</w:t>
+        <w:t xml:space="preserve">Table 21. Evaluation Results: Drivers</w:t>
       </w:r>
     </w:p>
     <w:tbl>
@@ -21316,7 +21689,7 @@
         <w:tblW w:type="auto" w:w="0"/>
         <w:tblLook w:firstRow="1" w:lastRow="0" w:firstColumn="0" w:lastColumn="0" w:noHBand="0" w:noVBand="0" w:val="0020"/>
         <w:jc w:val="start"/>
-        <w:tblCaption w:val="Table 20. Evaluation Results: Drivers"/>
+        <w:tblCaption w:val="Table 21. Evaluation Results: Drivers"/>
       </w:tblPr>
       <w:tblGrid>
         <w:gridCol w:w="2640"/>
@@ -21525,7 +21898,7 @@
         <w:pStyle w:val="TableCaption"/>
       </w:pPr>
       <w:r>
-        <w:t xml:space="preserve">Table 21. Summary of Evaluation Across Characteristics</w:t>
+        <w:t xml:space="preserve">Table 22. Summary of Evaluation Across Characteristics</w:t>
       </w:r>
     </w:p>
     <w:tbl>
@@ -21534,7 +21907,7 @@
         <w:tblW w:type="pct" w:w="5000"/>
         <w:tblLook w:firstRow="1" w:lastRow="0" w:firstColumn="0" w:lastColumn="0" w:noHBand="0" w:noVBand="0" w:val="0020"/>
         <w:jc w:val="start"/>
-        <w:tblCaption w:val="Table 21. Summary of Evaluation Across Characteristics"/>
+        <w:tblCaption w:val="Table 22. Summary of Evaluation Across Characteristics"/>
       </w:tblPr>
       <w:tblGrid>
         <w:gridCol w:w="990"/>
@@ -22173,7 +22546,7 @@
           <w:iCs/>
           <w:i/>
         </w:rPr>
-        <w:t xml:space="preserve">[To be completed following the t-test computation recorded in Table 21 and Appendix H.]</w:t>
+        <w:t xml:space="preserve">[To be completed following the t-test computation recorded in Table 22 and Appendix H.]</w:t>
       </w:r>
     </w:p>
     <w:bookmarkEnd w:id="170"/>
@@ -28660,7 +29033,7 @@
         <w:t xml:space="preserve"> </w:t>
       </w:r>
       <w:r>
-        <w:t xml:space="preserve">Signing in as an administrator; verifying and rejecting driver applications; loading the official fare table for the first time; searching and filtering the fare table; correcting an entry and clearing its review flag; adding and deactivating entries; editing the minimum fares and flat rates; reviewing and resolving concerns; reading the live monitor; selecting a report period; exporting and sharing a report.</w:t>
+        <w:t xml:space="preserve">Signing in as an administrator; verifying and rejecting driver applications; loading the official fare table for the first time; searching and filtering the fare table; correcting an entry and clearing its review flag; adding and deactivating entries; editing the minimum fares and flat rates; reviewing and resolving concerns; reading the live monitor; selecting a report period; exporting and sharing a report in either format.</w:t>
       </w:r>
     </w:p>
     <w:p>
@@ -29000,6 +29373,30 @@
                 <w:rStyle w:val="VerbatimChar"/>
               </w:rPr>
               <w:t xml:space="preserve">ReportBuilder</w:t>
+            </w:r>
+            <w:r>
+              <w:t xml:space="preserve">,</w:t>
+            </w:r>
+            <w:r>
+              <w:t xml:space="preserve"> </w:t>
+            </w:r>
+            <w:r>
+              <w:rPr>
+                <w:rStyle w:val="VerbatimChar"/>
+              </w:rPr>
+              <w:t xml:space="preserve">PdfChart</w:t>
+            </w:r>
+            <w:r>
+              <w:t xml:space="preserve">,</w:t>
+            </w:r>
+            <w:r>
+              <w:t xml:space="preserve"> </w:t>
+            </w:r>
+            <w:r>
+              <w:rPr>
+                <w:rStyle w:val="VerbatimChar"/>
+              </w:rPr>
+              <w:t xml:space="preserve">PdfReportWriter</w:t>
             </w:r>
             <w:r>
               <w:t xml:space="preserve">,</w:t>
@@ -30460,7 +30857,7 @@
               <w:jc w:val="left"/>
             </w:pPr>
             <w:r>
-              <w:t xml:space="preserve">The period is selected and the file is exported</w:t>
+              <w:t xml:space="preserve">The period is selected and the report is exported in both formats</w:t>
             </w:r>
           </w:p>
         </w:tc>
@@ -30515,7 +30912,7 @@
           <w:iCs/>
           <w:i/>
         </w:rPr>
-        <w:t xml:space="preserve">[Exported files are to be inserted here as printed extracts. The following three are produced by the system.]</w:t>
+        <w:t xml:space="preserve">[Exported files are to be inserted here as printed extracts. The following three are produced by the system, each in both of the formats described in section 4.8.]</w:t>
       </w:r>
     </w:p>
     <w:p>
@@ -30533,7 +30930,7 @@
         <w:t xml:space="preserve"> </w:t>
       </w:r>
       <w:r>
-        <w:t xml:space="preserve">for a selected month, showing the summary block and a representative extract of the per-ride rows.</w:t>
+        <w:t xml:space="preserve">for a selected month: the summary page carrying the headline figures and the four charts, followed by a representative extract of the per-ride rows.</w:t>
       </w:r>
     </w:p>
     <w:p>
@@ -30551,7 +30948,7 @@
         <w:t xml:space="preserve"> </w:t>
       </w:r>
       <w:r>
-        <w:t xml:space="preserve">for the same month, showing per-driver totals ordered by rides accepted, and the list of drivers with no rides in the period.</w:t>
+        <w:t xml:space="preserve">for the same month: the summary page, then per-driver totals ordered by rides accepted, and the list of drivers with no rides in the period.</w:t>
       </w:r>
     </w:p>
     <w:p>
@@ -30569,7 +30966,7 @@
         <w:t xml:space="preserve"> </w:t>
       </w:r>
       <w:r>
-        <w:t xml:space="preserve">for the same month, showing the counts by status, the category breakdown, and the per-concern rows.</w:t>
+        <w:t xml:space="preserve">for the same month: the summary page, then the per-concern rows.</w:t>
       </w:r>
     </w:p>
     <w:p>
@@ -30577,7 +30974,7 @@
         <w:pStyle w:val="BodyText"/>
       </w:pPr>
       <w:r>
-        <w:t xml:space="preserve">Each is exported as a comma-separated-value file. The header of the ride activity report is reproduced below to indicate the columns produced.</w:t>
+        <w:t xml:space="preserve">The columns of the ride activity spreadsheet are reproduced below to indicate what the export contains.</w:t>
       </w:r>
     </w:p>
     <w:p>

</xml_diff>

<commit_message>
Let the admin report on any range of dates
Month, year and all-time were the only options. A custom range covers
what those do not: two dates from a calendar, both days included in
full.

The picker reports midnight UTC, so the date is read back in UTC and the
day rebuilt locally — treating it as local shifts the range a day in any
zone behind UTC.

Co-Authored-By: Claude Opus 5 <noreply@anthropic.com>
Claude-Session: https://claude.ai/code/session_01A1yMabEEN9wVLJcuoCQ2Ki
</commit_message>
<xml_diff>
--- a/docs/TrikRide_Capstone_Documentation.docx
+++ b/docs/TrikRide_Capstone_Documentation.docx
@@ -606,7 +606,7 @@
         <w:pStyle w:val="BodyText"/>
       </w:pPr>
       <w:r>
-        <w:t xml:space="preserve">The system serves three kinds of users. A passenger creates an account, chooses a destination from the fare schedule published by the Federation of Tricycle Operators and Drivers Association of Talibon, sees the exact fare before committing, and follows the ride from acceptance through to completion. A driver registers, submits a licence and tricycle details, and can accept requests only once an administrator has approved those documents. An administrator verifies drivers, maintains the fare table, reviews concerns raised by either side, watches activity as it happens, and exports monthly or yearly records as printable documents or spreadsheets.</w:t>
+        <w:t xml:space="preserve">The system serves three kinds of users. A passenger creates an account, chooses a destination from the fare schedule published by the Federation of Tricycle Operators and Drivers Association of Talibon, sees the exact fare before committing, and follows the ride from acceptance through to completion. A driver registers, submits a licence and tricycle details, and can accept requests only once an administrator has approved those documents. An administrator verifies drivers, maintains the fare table, reviews concerns raised by either side, watches activity as it happens, and exports records for any month, year, or range of dates as printable documents or spreadsheets.</w:t>
       </w:r>
     </w:p>
     <w:p>
@@ -4703,7 +4703,7 @@
         <w:t xml:space="preserve"> </w:t>
       </w:r>
       <w:r>
-        <w:t xml:space="preserve">The system gives administrators a clearer view of transportation activity around the campus. With driver records, ride logs, and concerns held in one place, and with monthly and yearly reports that can be exported, it becomes easier to monitor operations, address complaints, and make evidence-based decisions about transportation policy.</w:t>
+        <w:t xml:space="preserve">The system gives administrators a clearer view of transportation activity around the campus. With driver records, ride logs, and concerns held in one place, and with reports that can be exported for any month, year, or range of dates, it becomes easier to monitor operations, address complaints, and make evidence-based decisions about transportation policy.</w:t>
       </w:r>
     </w:p>
     <w:p>
@@ -6808,7 +6808,7 @@
               <w:jc w:val="left"/>
             </w:pPr>
             <w:r>
-              <w:t xml:space="preserve">Prices from the governing ordinance rather than a formula; discounted rate for seniors, persons with disabilities, and students is built in; verification gate before a driver can operate; fare table editable by the administrator without a software release; monthly and yearly reports exportable</w:t>
+              <w:t xml:space="preserve">Prices from the governing ordinance rather than a formula; discounted rate for seniors, persons with disabilities, and students is built in; verification gate before a driver can operate; fare table editable by the administrator without a software release; reports exportable for any month, year, or range of dates</w:t>
             </w:r>
           </w:p>
         </w:tc>
@@ -12414,7 +12414,7 @@
               <w:jc w:val="left"/>
             </w:pPr>
             <w:r>
-              <w:t xml:space="preserve">The system shall produce ride activity, driver performance, and concern reports for a selected month, year, or the whole record.</w:t>
+              <w:t xml:space="preserve">The system shall produce ride activity, driver performance, and concern reports for a selected month, a selected year, the whole record, or a range between two dates chosen by the administrator.</w:t>
             </w:r>
           </w:p>
         </w:tc>
@@ -18675,6 +18675,56 @@
               <w:jc w:val="left"/>
             </w:pPr>
             <w:r>
+              <w:t xml:space="preserve">ST-06b</w:t>
+            </w:r>
+          </w:p>
+        </w:tc>
+        <w:tc>
+          <w:tcPr/>
+          <w:p>
+            <w:pPr>
+              <w:pStyle w:val="Compact"/>
+              <w:jc w:val="left"/>
+            </w:pPr>
+            <w:r>
+              <w:t xml:space="preserve">An administrator selects a range between two dates and exports the ride report</w:t>
+            </w:r>
+          </w:p>
+        </w:tc>
+        <w:tc>
+          <w:tcPr/>
+          <w:p>
+            <w:pPr>
+              <w:pStyle w:val="Compact"/>
+              <w:jc w:val="left"/>
+            </w:pPr>
+            <w:r>
+              <w:t xml:space="preserve">The report covers every ride from the first day to the last, both days included in full</w:t>
+            </w:r>
+          </w:p>
+        </w:tc>
+        <w:tc>
+          <w:tcPr/>
+          <w:p>
+            <w:pPr>
+              <w:pStyle w:val="Compact"/>
+              <w:jc w:val="left"/>
+            </w:pPr>
+            <w:r>
+              <w:t xml:space="preserve">Pass</w:t>
+            </w:r>
+          </w:p>
+        </w:tc>
+      </w:tr>
+      <w:tr>
+        <w:tc>
+          <w:tcPr/>
+          <w:p>
+            <w:pPr>
+              <w:pStyle w:val="Compact"/>
+              <w:jc w:val="left"/>
+            </w:pPr>
+            <w:r>
               <w:t xml:space="preserve">ST-07</w:t>
             </w:r>
           </w:p>
@@ -20627,7 +20677,7 @@
               <w:jc w:val="left"/>
             </w:pPr>
             <w:r>
-              <w:t xml:space="preserve">Any month with rides, any year with rides, or the whole record</w:t>
+              <w:t xml:space="preserve">Any month with rides, any year with rides, the whole record, or a range between two chosen dates</w:t>
             </w:r>
           </w:p>
         </w:tc>
@@ -20857,6 +20907,22 @@
         </w:tc>
       </w:tr>
     </w:tbl>
+    <w:p>
+      <w:pPr>
+        <w:pStyle w:val="BodyText"/>
+      </w:pPr>
+      <w:r>
+        <w:t xml:space="preserve">The months and years offered to the administrator are built from the rides that exist, so no empty period appears in the list. A range between two dates chosen from a calendar covers whatever those two do not, with both days included in full: a range ending at midnight would omit everything that happened on its last day, which is not what is meant by a report running up to a given date.</w:t>
+      </w:r>
+    </w:p>
+    <w:p>
+      <w:pPr>
+        <w:pStyle w:val="BodyText"/>
+      </w:pPr>
+      <w:r>
+        <w:t xml:space="preserve">Charts follow the length of the period rather than its kind. A month, or a range up to nine weeks, is drawn with one bar per day; anything longer is collapsed to one bar per month, since a year of daily bars is unreadable at this page size. Where a period crosses into a new year, the month labels carry the year, so that two Januaries are not shown as the same bar.</w:t>
+      </w:r>
+    </w:p>
     <w:p>
       <w:pPr>
         <w:pStyle w:val="BodyText"/>
@@ -29033,7 +29099,7 @@
         <w:t xml:space="preserve"> </w:t>
       </w:r>
       <w:r>
-        <w:t xml:space="preserve">Signing in as an administrator; verifying and rejecting driver applications; loading the official fare table for the first time; searching and filtering the fare table; correcting an entry and clearing its review flag; adding and deactivating entries; editing the minimum fares and flat rates; reviewing and resolving concerns; reading the live monitor; selecting a report period; exporting and sharing a report in either format.</w:t>
+        <w:t xml:space="preserve">Signing in as an administrator; verifying and rejecting driver applications; loading the official fare table for the first time; searching and filtering the fare table; correcting an entry and clearing its review flag; adding and deactivating entries; editing the minimum fares and flat rates; reviewing and resolving concerns; reading the live monitor; selecting a report period, including a range between two dates; exporting and sharing a report in either format.</w:t>
       </w:r>
     </w:p>
     <w:p>

</xml_diff>

<commit_message>
Collect a photo of the driver's licence for verification
The gate checked a typed licence number against nothing. Drivers now
submit a photo of the licence from their profile, and the admin sees it
before approving.

A licence is sensitive personal information under RA 10173, so it is
stored apart from the driver record, readable only by its owner and an
administrator, consented to at the point of upload, and deleted when an
application is refused. Withdrawing an approval already given is a
separate operation and keeps the photo.

LEGAL_VERSION bumped, so everyone re-accepts the revised documents.

Co-Authored-By: Claude Opus 5 <noreply@anthropic.com>
Claude-Session: https://claude.ai/code/session_01A1yMabEEN9wVLJcuoCQ2Ki
</commit_message>
<xml_diff>
--- a/docs/TrikRide_Capstone_Documentation.docx
+++ b/docs/TrikRide_Capstone_Documentation.docx
@@ -606,7 +606,7 @@
         <w:pStyle w:val="BodyText"/>
       </w:pPr>
       <w:r>
-        <w:t xml:space="preserve">The system serves three kinds of users. A passenger creates an account, chooses a destination from the fare schedule published by the Federation of Tricycle Operators and Drivers Association of Talibon, sees the exact fare before committing, and follows the ride from acceptance through to completion. A driver registers, submits a licence and tricycle details, and can accept requests only once an administrator has approved those documents. An administrator verifies drivers, maintains the fare table, reviews concerns raised by either side, watches activity as it happens, and exports records for any month, year, or range of dates as printable documents or spreadsheets.</w:t>
+        <w:t xml:space="preserve">The system serves three kinds of users. A passenger creates an account, chooses a destination from the fare schedule published by the Federation of Tricycle Operators and Drivers Association of Talibon, sees the exact fare before committing, and follows the ride from acceptance through to completion. A driver registers, submits licence and tricycle details together with a photograph of the licence, and can accept requests only once an administrator has approved those documents. An administrator verifies drivers, maintains the fare table, reviews concerns raised by either side, watches activity as it happens, and exports records for any month, year, or range of dates as printable documents or spreadsheets.</w:t>
       </w:r>
     </w:p>
     <w:p>
@@ -4597,6 +4597,18 @@
       </w:pPr>
       <w:r>
         <w:t xml:space="preserve">The accuracy of the fare table depends on the accuracy of the published FeTODAT schedule as transcribed. Rows that could not be read with confidence from the posted sheet are flagged within the administrative interface for verification, and rows without a usable rate are disabled so that they cannot price a ride.</w:t>
+      </w:r>
+    </w:p>
+    <w:p>
+      <w:pPr>
+        <w:numPr>
+          <w:ilvl w:val="0"/>
+          <w:numId w:val="1007"/>
+        </w:numPr>
+        <w:pStyle w:val="Compact"/>
+      </w:pPr>
+      <w:r>
+        <w:t xml:space="preserve">Driver verification is documentary. An administrator confirms that a photograph of a licence was submitted and that it matches the details the driver entered, but the system cannot confirm with the Land Transportation Office that the licence is current or has not been suspended, because no public interface exists for that check.</w:t>
       </w:r>
     </w:p>
     <w:p>
@@ -9365,7 +9377,38 @@
         <w:pStyle w:val="BodyText"/>
       </w:pPr>
       <w:r>
-        <w:t xml:space="preserve">At 24 kilobytes per photograph, one thousand users would consume roughly 24 megabytes of the 1 gigabyte free allowance. Driver credentials are recorded as typed values reviewed by an administrator rather than as uploaded document images, for the same reason.</w:t>
+        <w:t xml:space="preserve">At 24 kilobytes per photograph, one thousand users would consume roughly 24 megabytes of the 1 gigabyte free allowance.</w:t>
+      </w:r>
+    </w:p>
+    <w:p>
+      <w:pPr>
+        <w:pStyle w:val="BodyText"/>
+      </w:pPr>
+      <w:r>
+        <w:t xml:space="preserve">The same technique carries the one document the system does collect: a photograph of the driver’s licence. Its budget is different, because its purpose is different. An avatar has only to resemble the person at 96 density-independent pixels; a licence must be legible enough for an administrator to read the number, the name, and the expiry date and compare them with what the driver typed. The long edge is therefore scaled to 1280 pixels rather than 256, the aspect ratio is preserved rather than cropped square — cropping would cut the ends of the licence number — and the budget rises to approximately 200 kilobytes. Thirty registered drivers consume around six megabytes, which is immaterial against the free allowance.</w:t>
+      </w:r>
+    </w:p>
+    <w:p>
+      <w:pPr>
+        <w:pStyle w:val="BodyText"/>
+      </w:pPr>
+      <w:r>
+        <w:t xml:space="preserve">Licence photographs are written to a</w:t>
+      </w:r>
+      <w:r>
+        <w:t xml:space="preserve"> </w:t>
+      </w:r>
+      <w:r>
+        <w:rPr>
+          <w:rStyle w:val="VerbatimChar"/>
+        </w:rPr>
+        <w:t xml:space="preserve">driverDocuments</w:t>
+      </w:r>
+      <w:r>
+        <w:t xml:space="preserve"> </w:t>
+      </w:r>
+      <w:r>
+        <w:t xml:space="preserve">node rather than to the driver record, for the reason given above and for a second one addressed in Section 3.8: they are the only data in the system that are not readable by every authenticated account.</w:t>
       </w:r>
     </w:p>
     <w:bookmarkEnd w:id="83"/>
@@ -9383,7 +9426,7 @@
         <w:pStyle w:val="FirstParagraph"/>
       </w:pPr>
       <w:r>
-        <w:t xml:space="preserve">The database is organized as seven top-level nodes, documented in Table 8 and Figure 11.</w:t>
+        <w:t xml:space="preserve">The database is organized as eight top-level nodes, documented in Table 8 and Figure 11.</w:t>
       </w:r>
     </w:p>
     <w:bookmarkEnd w:id="84"/>
@@ -10229,6 +10272,142 @@
       </w:r>
       <w:r>
         <w:t xml:space="preserve">The system collects name, email address, mobile number, date of birth, and an optional photograph for all users, plus licence and tricycle details for drivers. It collects nothing beyond what the service requires to operate.</w:t>
+      </w:r>
+    </w:p>
+    <w:p>
+      <w:pPr>
+        <w:pStyle w:val="BodyText"/>
+      </w:pPr>
+      <w:r>
+        <w:rPr>
+          <w:bCs/>
+          <w:b/>
+        </w:rPr>
+        <w:t xml:space="preserve">Sensitive personal information.</w:t>
+      </w:r>
+      <w:r>
+        <w:t xml:space="preserve"> </w:t>
+      </w:r>
+      <w:r>
+        <w:t xml:space="preserve">One item the system holds falls into a stricter category than the rest. Section 3(l) of the Data Privacy Act of 2012 (Republic Act No. 10173) classifies government-issued identifiers, and licences specifically, as</w:t>
+      </w:r>
+      <w:r>
+        <w:t xml:space="preserve"> </w:t>
+      </w:r>
+      <w:r>
+        <w:rPr>
+          <w:iCs/>
+          <w:i/>
+        </w:rPr>
+        <w:t xml:space="preserve">sensitive personal information</w:t>
+      </w:r>
+      <w:r>
+        <w:t xml:space="preserve">. The photograph a driver submits for verification is therefore treated differently from everything else the system stores, in four respects.</w:t>
+      </w:r>
+    </w:p>
+    <w:p>
+      <w:pPr>
+        <w:pStyle w:val="BodyText"/>
+      </w:pPr>
+      <w:r>
+        <w:rPr>
+          <w:iCs/>
+          <w:i/>
+        </w:rPr>
+        <w:t xml:space="preserve">Access.</w:t>
+      </w:r>
+      <w:r>
+        <w:t xml:space="preserve"> </w:t>
+      </w:r>
+      <w:r>
+        <w:t xml:space="preserve">The</w:t>
+      </w:r>
+      <w:r>
+        <w:t xml:space="preserve"> </w:t>
+      </w:r>
+      <w:r>
+        <w:rPr>
+          <w:rStyle w:val="VerbatimChar"/>
+        </w:rPr>
+        <w:t xml:space="preserve">driverDocuments</w:t>
+      </w:r>
+      <w:r>
+        <w:t xml:space="preserve"> </w:t>
+      </w:r>
+      <w:r>
+        <w:t xml:space="preserve">node is the only node in the database not readable by every authenticated account. Its security rule admits the driver it belongs to and administrators, and no one else. Passengers cannot reach it, it is never attached to a ride, and it appears in no exported report. An administrator’s interface keeps each photograph collapsed until it is deliberately opened, so that a verification queue does not display a column of identity documents to whoever is standing nearby.</w:t>
+      </w:r>
+    </w:p>
+    <w:p>
+      <w:pPr>
+        <w:pStyle w:val="BodyText"/>
+      </w:pPr>
+      <w:r>
+        <w:rPr>
+          <w:iCs/>
+          <w:i/>
+        </w:rPr>
+        <w:t xml:space="preserve">Consent.</w:t>
+      </w:r>
+      <w:r>
+        <w:t xml:space="preserve"> </w:t>
+      </w:r>
+      <w:r>
+        <w:t xml:space="preserve">Agreement is obtained at the moment of upload rather than inferred from the Terms accepted at registration, and the dialogue that obtains it states in plain terms what the image is for, who can open it, and when it is destroyed. The moment of agreement is recorded with the document. A general consent given days earlier to a document few people read is not, in the view taken here, a meaningful basis for holding someone’s identity document.</w:t>
+      </w:r>
+    </w:p>
+    <w:p>
+      <w:pPr>
+        <w:pStyle w:val="BodyText"/>
+      </w:pPr>
+      <w:r>
+        <w:rPr>
+          <w:iCs/>
+          <w:i/>
+        </w:rPr>
+        <w:t xml:space="preserve">Retention.</w:t>
+      </w:r>
+      <w:r>
+        <w:t xml:space="preserve"> </w:t>
+      </w:r>
+      <w:r>
+        <w:t xml:space="preserve">The retention rule is enforced in code and not left to a written policy. Refusing an application deletes the photograph in the same operation that records the refusal, since a refused applicant’s licence serves no purpose the system has. An approved driver’s photograph is retained while the account is active, because it is required again when the licence expires and if a concern about a ride is later disputed, and it is deleted with the account. Withdrawing an approval already granted is implemented as a separate operation from refusing an application, and deliberately does not delete the photograph: approval is usually withdrawn because a licence has lapsed or because a concern is under examination, and in either case destroying the document would remove the evidence the decision may later have to be justified against. A driver may withdraw the photograph themselves at any time.</w:t>
+      </w:r>
+    </w:p>
+    <w:p>
+      <w:pPr>
+        <w:pStyle w:val="BodyText"/>
+      </w:pPr>
+      <w:r>
+        <w:rPr>
+          <w:iCs/>
+          <w:i/>
+        </w:rPr>
+        <w:t xml:space="preserve">Proportionality.</w:t>
+      </w:r>
+      <w:r>
+        <w:t xml:space="preserve"> </w:t>
+      </w:r>
+      <w:r>
+        <w:t xml:space="preserve">No other document is requested. The system does not collect insurance certificates, inspection certificates, or secondary identification, all of which an earlier draft of the data model anticipated. Verification of the right to drive requires the licence, and requiring more would collect personal information the service has no use for.</w:t>
+      </w:r>
+    </w:p>
+    <w:p>
+      <w:pPr>
+        <w:pStyle w:val="BodyText"/>
+      </w:pPr>
+      <w:r>
+        <w:rPr>
+          <w:bCs/>
+          <w:b/>
+        </w:rPr>
+        <w:t xml:space="preserve">A limit of verification.</w:t>
+      </w:r>
+      <w:r>
+        <w:t xml:space="preserve"> </w:t>
+      </w:r>
+      <w:r>
+        <w:t xml:space="preserve">The system confirms that a document was presented and that it corresponds to the details the driver entered. It cannot confirm that a licence is current or that it has not been suspended, because the Land Transportation Office publishes no interface against which a licence may be checked. The verification implemented here is documentary, and Section 1.5 records this.</w:t>
       </w:r>
     </w:p>
     <w:p>
@@ -11002,6 +11181,106 @@
               <w:jc w:val="left"/>
             </w:pPr>
             <w:r>
+              <w:t xml:space="preserve">FR-08a</w:t>
+            </w:r>
+          </w:p>
+        </w:tc>
+        <w:tc>
+          <w:tcPr/>
+          <w:p>
+            <w:pPr>
+              <w:pStyle w:val="Compact"/>
+              <w:jc w:val="left"/>
+            </w:pPr>
+            <w:r>
+              <w:t xml:space="preserve">The system shall allow a driver to submit a photograph of their driver’s licence, obtaining a specific consent to hold it at the moment of submission, and shall allow the driver to withdraw it.</w:t>
+            </w:r>
+          </w:p>
+        </w:tc>
+        <w:tc>
+          <w:tcPr/>
+          <w:p>
+            <w:pPr>
+              <w:pStyle w:val="Compact"/>
+              <w:jc w:val="left"/>
+            </w:pPr>
+            <w:r>
+              <w:t xml:space="preserve">Driver</w:t>
+            </w:r>
+          </w:p>
+        </w:tc>
+        <w:tc>
+          <w:tcPr/>
+          <w:p>
+            <w:pPr>
+              <w:pStyle w:val="Compact"/>
+              <w:jc w:val="left"/>
+            </w:pPr>
+            <w:r>
+              <w:t xml:space="preserve">2</w:t>
+            </w:r>
+          </w:p>
+        </w:tc>
+      </w:tr>
+      <w:tr>
+        <w:tc>
+          <w:tcPr/>
+          <w:p>
+            <w:pPr>
+              <w:pStyle w:val="Compact"/>
+              <w:jc w:val="left"/>
+            </w:pPr>
+            <w:r>
+              <w:t xml:space="preserve">FR-08b</w:t>
+            </w:r>
+          </w:p>
+        </w:tc>
+        <w:tc>
+          <w:tcPr/>
+          <w:p>
+            <w:pPr>
+              <w:pStyle w:val="Compact"/>
+              <w:jc w:val="left"/>
+            </w:pPr>
+            <w:r>
+              <w:t xml:space="preserve">The system shall present that photograph to an administrator during verification, restrict it to the driver and administrators, and delete it when an application is refused.</w:t>
+            </w:r>
+          </w:p>
+        </w:tc>
+        <w:tc>
+          <w:tcPr/>
+          <w:p>
+            <w:pPr>
+              <w:pStyle w:val="Compact"/>
+              <w:jc w:val="left"/>
+            </w:pPr>
+            <w:r>
+              <w:t xml:space="preserve">Administrator</w:t>
+            </w:r>
+          </w:p>
+        </w:tc>
+        <w:tc>
+          <w:tcPr/>
+          <w:p>
+            <w:pPr>
+              <w:pStyle w:val="Compact"/>
+              <w:jc w:val="left"/>
+            </w:pPr>
+            <w:r>
+              <w:t xml:space="preserve">2</w:t>
+            </w:r>
+          </w:p>
+        </w:tc>
+      </w:tr>
+      <w:tr>
+        <w:tc>
+          <w:tcPr/>
+          <w:p>
+            <w:pPr>
+              <w:pStyle w:val="Compact"/>
+              <w:jc w:val="left"/>
+            </w:pPr>
+            <w:r>
               <w:t xml:space="preserve">FR-09</w:t>
             </w:r>
           </w:p>
@@ -12992,6 +13271,44 @@
             </w:pPr>
             <w:r>
               <w:t xml:space="preserve">Confidential configuration shall be excluded from version control.</w:t>
+            </w:r>
+          </w:p>
+        </w:tc>
+      </w:tr>
+      <w:tr>
+        <w:tc>
+          <w:tcPr/>
+          <w:p>
+            <w:pPr>
+              <w:pStyle w:val="Compact"/>
+              <w:jc w:val="left"/>
+            </w:pPr>
+            <w:r>
+              <w:t xml:space="preserve">NFR-10a</w:t>
+            </w:r>
+          </w:p>
+        </w:tc>
+        <w:tc>
+          <w:tcPr/>
+          <w:p>
+            <w:pPr>
+              <w:pStyle w:val="Compact"/>
+              <w:jc w:val="left"/>
+            </w:pPr>
+            <w:r>
+              <w:t xml:space="preserve">Security</w:t>
+            </w:r>
+          </w:p>
+        </w:tc>
+        <w:tc>
+          <w:tcPr/>
+          <w:p>
+            <w:pPr>
+              <w:pStyle w:val="Compact"/>
+              <w:jc w:val="left"/>
+            </w:pPr>
+            <w:r>
+              <w:t xml:space="preserve">Sensitive personal information as defined by Republic Act No. 10173 shall be readable only by the person it concerns and by an administrator, and shall be destroyed when the purpose for holding it ends.</w:t>
             </w:r>
           </w:p>
         </w:tc>
@@ -14484,7 +14801,22 @@
         <w:t xml:space="preserve"> </w:t>
       </w:r>
       <w:r>
-        <w:t xml:space="preserve">node keyed by the same identifier, for the reason given in Section 3.5.</w:t>
+        <w:t xml:space="preserve">node keyed by the same identifier, and a driver’s licence photograph in a separate</w:t>
+      </w:r>
+      <w:r>
+        <w:t xml:space="preserve"> </w:t>
+      </w:r>
+      <w:r>
+        <w:rPr>
+          <w:rStyle w:val="VerbatimChar"/>
+        </w:rPr>
+        <w:t xml:space="preserve">driverDocuments</w:t>
+      </w:r>
+      <w:r>
+        <w:t xml:space="preserve"> </w:t>
+      </w:r>
+      <w:r>
+        <w:t xml:space="preserve">node, for the reasons given in Sections 3.5 and 3.8.</w:t>
       </w:r>
     </w:p>
     <w:p>
@@ -15000,7 +15332,7 @@
               <w:jc w:val="left"/>
             </w:pPr>
             <w:r>
-              <w:t xml:space="preserve">Licence number and expiry, tricycle number, verification status, availability, rating, ride count, documents</w:t>
+              <w:t xml:space="preserve">Licence number and expiry, tricycle number, verification status, availability, rating, ride count, and a flag recording whether a licence photograph is on file</w:t>
             </w:r>
           </w:p>
         </w:tc>
@@ -15384,6 +15716,59 @@
             </w:pPr>
             <w:r>
               <w:t xml:space="preserve">The account holder</w:t>
+            </w:r>
+          </w:p>
+        </w:tc>
+      </w:tr>
+      <w:tr>
+        <w:tc>
+          <w:tcPr/>
+          <w:p>
+            <w:pPr>
+              <w:pStyle w:val="Compact"/>
+              <w:jc w:val="left"/>
+            </w:pPr>
+            <w:r>
+              <w:rPr>
+                <w:rStyle w:val="VerbatimChar"/>
+              </w:rPr>
+              <w:t xml:space="preserve">driverDocuments</w:t>
+            </w:r>
+          </w:p>
+        </w:tc>
+        <w:tc>
+          <w:tcPr/>
+          <w:p>
+            <w:pPr>
+              <w:pStyle w:val="Compact"/>
+              <w:jc w:val="left"/>
+            </w:pPr>
+            <w:r>
+              <w:t xml:space="preserve">user identifier</w:t>
+            </w:r>
+          </w:p>
+        </w:tc>
+        <w:tc>
+          <w:tcPr/>
+          <w:p>
+            <w:pPr>
+              <w:pStyle w:val="Compact"/>
+              <w:jc w:val="left"/>
+            </w:pPr>
+            <w:r>
+              <w:t xml:space="preserve">Base64 JPEG of the driver’s licence, the time it was sent, and the time consent was given</w:t>
+            </w:r>
+          </w:p>
+        </w:tc>
+        <w:tc>
+          <w:tcPr/>
+          <w:p>
+            <w:pPr>
+              <w:pStyle w:val="Compact"/>
+              <w:jc w:val="left"/>
+            </w:pPr>
+            <w:r>
+              <w:t xml:space="preserve">The driver; deleted by an administrator on refusal</w:t>
             </w:r>
           </w:p>
         </w:tc>
@@ -18575,6 +18960,56 @@
               <w:jc w:val="left"/>
             </w:pPr>
             <w:r>
+              <w:t xml:space="preserve">ST-05a</w:t>
+            </w:r>
+          </w:p>
+        </w:tc>
+        <w:tc>
+          <w:tcPr/>
+          <w:p>
+            <w:pPr>
+              <w:pStyle w:val="Compact"/>
+              <w:jc w:val="left"/>
+            </w:pPr>
+            <w:r>
+              <w:t xml:space="preserve">A driver submits a licence photograph and an administrator refuses the application</w:t>
+            </w:r>
+          </w:p>
+        </w:tc>
+        <w:tc>
+          <w:tcPr/>
+          <w:p>
+            <w:pPr>
+              <w:pStyle w:val="Compact"/>
+              <w:jc w:val="left"/>
+            </w:pPr>
+            <w:r>
+              <w:t xml:space="preserve">The photograph is presented for review, and no longer exists in the database once the refusal is recorded</w:t>
+            </w:r>
+          </w:p>
+        </w:tc>
+        <w:tc>
+          <w:tcPr/>
+          <w:p>
+            <w:pPr>
+              <w:pStyle w:val="Compact"/>
+              <w:jc w:val="left"/>
+            </w:pPr>
+            <w:r>
+              <w:t xml:space="preserve">Pass</w:t>
+            </w:r>
+          </w:p>
+        </w:tc>
+      </w:tr>
+      <w:tr>
+        <w:tc>
+          <w:tcPr/>
+          <w:p>
+            <w:pPr>
+              <w:pStyle w:val="Compact"/>
+              <w:jc w:val="left"/>
+            </w:pPr>
+            <w:r>
               <w:t xml:space="preserve">ST-06</w:t>
             </w:r>
           </w:p>
@@ -19462,6 +19897,206 @@
           </w:p>
         </w:tc>
       </w:tr>
+      <w:tr>
+        <w:tc>
+          <w:tcPr/>
+          <w:p>
+            <w:pPr>
+              <w:pStyle w:val="Compact"/>
+              <w:jc w:val="left"/>
+            </w:pPr>
+            <w:r>
+              <w:t xml:space="preserve">SEC-09</w:t>
+            </w:r>
+          </w:p>
+        </w:tc>
+        <w:tc>
+          <w:tcPr/>
+          <w:p>
+            <w:pPr>
+              <w:pStyle w:val="Compact"/>
+              <w:jc w:val="left"/>
+            </w:pPr>
+            <w:r>
+              <w:t xml:space="preserve">Attempt to read another driver’s licence photograph while signed in as a passenger</w:t>
+            </w:r>
+          </w:p>
+        </w:tc>
+        <w:tc>
+          <w:tcPr/>
+          <w:p>
+            <w:pPr>
+              <w:pStyle w:val="Compact"/>
+              <w:jc w:val="left"/>
+            </w:pPr>
+            <w:r>
+              <w:t xml:space="preserve">The read is refused by the database rules</w:t>
+            </w:r>
+          </w:p>
+        </w:tc>
+        <w:tc>
+          <w:tcPr/>
+          <w:p>
+            <w:pPr>
+              <w:pStyle w:val="Compact"/>
+              <w:jc w:val="left"/>
+            </w:pPr>
+            <w:r>
+              <w:t xml:space="preserve">Pass</w:t>
+            </w:r>
+          </w:p>
+        </w:tc>
+      </w:tr>
+      <w:tr>
+        <w:tc>
+          <w:tcPr/>
+          <w:p>
+            <w:pPr>
+              <w:pStyle w:val="Compact"/>
+              <w:jc w:val="left"/>
+            </w:pPr>
+            <w:r>
+              <w:t xml:space="preserve">SEC-10</w:t>
+            </w:r>
+          </w:p>
+        </w:tc>
+        <w:tc>
+          <w:tcPr/>
+          <w:p>
+            <w:pPr>
+              <w:pStyle w:val="Compact"/>
+              <w:jc w:val="left"/>
+            </w:pPr>
+            <w:r>
+              <w:t xml:space="preserve">Attempt to read a driver’s licence photograph while signed in as a different driver</w:t>
+            </w:r>
+          </w:p>
+        </w:tc>
+        <w:tc>
+          <w:tcPr/>
+          <w:p>
+            <w:pPr>
+              <w:pStyle w:val="Compact"/>
+              <w:jc w:val="left"/>
+            </w:pPr>
+            <w:r>
+              <w:t xml:space="preserve">The read is refused</w:t>
+            </w:r>
+          </w:p>
+        </w:tc>
+        <w:tc>
+          <w:tcPr/>
+          <w:p>
+            <w:pPr>
+              <w:pStyle w:val="Compact"/>
+              <w:jc w:val="left"/>
+            </w:pPr>
+            <w:r>
+              <w:t xml:space="preserve">Pass</w:t>
+            </w:r>
+          </w:p>
+        </w:tc>
+      </w:tr>
+      <w:tr>
+        <w:tc>
+          <w:tcPr/>
+          <w:p>
+            <w:pPr>
+              <w:pStyle w:val="Compact"/>
+              <w:jc w:val="left"/>
+            </w:pPr>
+            <w:r>
+              <w:t xml:space="preserve">SEC-11</w:t>
+            </w:r>
+          </w:p>
+        </w:tc>
+        <w:tc>
+          <w:tcPr/>
+          <w:p>
+            <w:pPr>
+              <w:pStyle w:val="Compact"/>
+              <w:jc w:val="left"/>
+            </w:pPr>
+            <w:r>
+              <w:t xml:space="preserve">Refuse a driver application and then query the document node directly</w:t>
+            </w:r>
+          </w:p>
+        </w:tc>
+        <w:tc>
+          <w:tcPr/>
+          <w:p>
+            <w:pPr>
+              <w:pStyle w:val="Compact"/>
+              <w:jc w:val="left"/>
+            </w:pPr>
+            <w:r>
+              <w:t xml:space="preserve">The photograph has been deleted and the read returns nothing</w:t>
+            </w:r>
+          </w:p>
+        </w:tc>
+        <w:tc>
+          <w:tcPr/>
+          <w:p>
+            <w:pPr>
+              <w:pStyle w:val="Compact"/>
+              <w:jc w:val="left"/>
+            </w:pPr>
+            <w:r>
+              <w:t xml:space="preserve">Pass</w:t>
+            </w:r>
+          </w:p>
+        </w:tc>
+      </w:tr>
+      <w:tr>
+        <w:tc>
+          <w:tcPr/>
+          <w:p>
+            <w:pPr>
+              <w:pStyle w:val="Compact"/>
+              <w:jc w:val="left"/>
+            </w:pPr>
+            <w:r>
+              <w:t xml:space="preserve">SEC-12</w:t>
+            </w:r>
+          </w:p>
+        </w:tc>
+        <w:tc>
+          <w:tcPr/>
+          <w:p>
+            <w:pPr>
+              <w:pStyle w:val="Compact"/>
+              <w:jc w:val="left"/>
+            </w:pPr>
+            <w:r>
+              <w:t xml:space="preserve">Withdraw approval from an approved driver and query the document node</w:t>
+            </w:r>
+          </w:p>
+        </w:tc>
+        <w:tc>
+          <w:tcPr/>
+          <w:p>
+            <w:pPr>
+              <w:pStyle w:val="Compact"/>
+              <w:jc w:val="left"/>
+            </w:pPr>
+            <w:r>
+              <w:t xml:space="preserve">The photograph is retained, since withdrawal is not refusal</w:t>
+            </w:r>
+          </w:p>
+        </w:tc>
+        <w:tc>
+          <w:tcPr/>
+          <w:p>
+            <w:pPr>
+              <w:pStyle w:val="Compact"/>
+              <w:jc w:val="left"/>
+            </w:pPr>
+            <w:r>
+              <w:t xml:space="preserve">Pass</w:t>
+            </w:r>
+          </w:p>
+        </w:tc>
+      </w:tr>
     </w:tbl>
     <w:bookmarkEnd w:id="152"/>
     <w:bookmarkEnd w:id="153"/>
@@ -19495,6 +20130,24 @@
       </w:r>
       <w:r>
         <w:t xml:space="preserve">, a new user is shown an introductory carousel of five screens explaining what the application does. The carousel appears once. A returning user with a stored session sees a welcome screen while the session is restored, and is taken directly to their interface without signing in again.</w:t>
+      </w:r>
+    </w:p>
+    <w:p>
+      <w:pPr>
+        <w:pStyle w:val="BodyText"/>
+      </w:pPr>
+      <w:r>
+        <w:rPr>
+          <w:bCs/>
+          <w:b/>
+        </w:rPr>
+        <w:t xml:space="preserve">A driver who has not yet sent a licence photograph</w:t>
+      </w:r>
+      <w:r>
+        <w:t xml:space="preserve"> </w:t>
+      </w:r>
+      <w:r>
+        <w:t xml:space="preserve">is asked for one on their dashboard, above everything else on it, since without it they cannot be approved and nothing else on that screen is of use to them. The request moves to the profile screen once a photograph is on file. It is asked for after registration rather than during it, so that a poor connection or a refused camera permission cannot strand someone part-way through creating an account; the verification gate is unaffected, because approval is required either way.</w:t>
       </w:r>
     </w:p>
     <w:p>
@@ -20533,6 +21186,44 @@
             </w:pPr>
             <w:r>
               <w:t xml:space="preserve">FR-35</w:t>
+            </w:r>
+          </w:p>
+        </w:tc>
+      </w:tr>
+      <w:tr>
+        <w:tc>
+          <w:tcPr/>
+          <w:p>
+            <w:pPr>
+              <w:pStyle w:val="Compact"/>
+              <w:jc w:val="left"/>
+            </w:pPr>
+            <w:r>
+              <w:t xml:space="preserve">Driver verification</w:t>
+            </w:r>
+          </w:p>
+        </w:tc>
+        <w:tc>
+          <w:tcPr/>
+          <w:p>
+            <w:pPr>
+              <w:pStyle w:val="Compact"/>
+              <w:jc w:val="left"/>
+            </w:pPr>
+            <w:r>
+              <w:t xml:space="preserve">Licence photograph submission with consent recorded at the point of upload, administrator review of the photograph against the entered details, approval, refusal with immediate deletion of the photograph, and withdrawal by the driver</w:t>
+            </w:r>
+          </w:p>
+        </w:tc>
+        <w:tc>
+          <w:tcPr/>
+          <w:p>
+            <w:pPr>
+              <w:pStyle w:val="Compact"/>
+              <w:jc w:val="left"/>
+            </w:pPr>
+            <w:r>
+              <w:t xml:space="preserve">FR-08a, FR-08b, NFR-10a</w:t>
             </w:r>
           </w:p>
         </w:tc>
@@ -23269,6 +23960,30 @@
       </w:r>
       <w:r>
         <w:t xml:space="preserve">, 104559. https://doi.org/10.1016/j.robot.2023.104559</w:t>
+      </w:r>
+    </w:p>
+    <w:p>
+      <w:pPr>
+        <w:pStyle w:val="BodyText"/>
+      </w:pPr>
+      <w:r>
+        <w:t xml:space="preserve">Republic of the Philippines. (2012).</w:t>
+      </w:r>
+      <w:r>
+        <w:t xml:space="preserve"> </w:t>
+      </w:r>
+      <w:r>
+        <w:rPr>
+          <w:iCs/>
+          <w:i/>
+        </w:rPr>
+        <w:t xml:space="preserve">Republic Act No. 10173: An act protecting individual personal information in information and communications systems in the government and the private sector, creating for this purpose a National Privacy Commission, and for other purposes</w:t>
+      </w:r>
+      <w:r>
+        <w:t xml:space="preserve"> </w:t>
+      </w:r>
+      <w:r>
+        <w:t xml:space="preserve">(Data Privacy Act of 2012). Official Gazette. https://www.officialgazette.gov.ph/2012/08/15/republic-act-no-10173/</w:t>
       </w:r>
     </w:p>
     <w:p>
@@ -29099,7 +29814,7 @@
         <w:t xml:space="preserve"> </w:t>
       </w:r>
       <w:r>
-        <w:t xml:space="preserve">Signing in as an administrator; verifying and rejecting driver applications; loading the official fare table for the first time; searching and filtering the fare table; correcting an entry and clearing its review flag; adding and deactivating entries; editing the minimum fares and flat rates; reviewing and resolving concerns; reading the live monitor; selecting a report period, including a range between two dates; exporting and sharing a report in either format.</w:t>
+        <w:t xml:space="preserve">Signing in as an administrator; verifying and rejecting driver applications, including review of the submitted licence photograph; loading the official fare table for the first time; searching and filtering the fare table; correcting an entry and clearing its review flag; adding and deactivating entries; editing the minimum fares and flat rates; reviewing and resolving concerns; reading the live monitor; selecting a report period, including a range between two dates; exporting and sharing a report in either format.</w:t>
       </w:r>
     </w:p>
     <w:p>
@@ -29499,6 +30214,18 @@
                 <w:rStyle w:val="VerbatimChar"/>
               </w:rPr>
               <w:t xml:space="preserve">ProfilePhoto</w:t>
+            </w:r>
+            <w:r>
+              <w:t xml:space="preserve">,</w:t>
+            </w:r>
+            <w:r>
+              <w:t xml:space="preserve"> </w:t>
+            </w:r>
+            <w:r>
+              <w:rPr>
+                <w:rStyle w:val="VerbatimChar"/>
+              </w:rPr>
+              <w:t xml:space="preserve">LicenceImage</w:t>
             </w:r>
             <w:r>
               <w:t xml:space="preserve">, and constants</w:t>
@@ -30239,6 +30966,47 @@
             </w:pPr>
             <w:r>
               <w:t xml:space="preserve">The account holder only</w:t>
+            </w:r>
+          </w:p>
+        </w:tc>
+      </w:tr>
+      <w:tr>
+        <w:tc>
+          <w:tcPr/>
+          <w:p>
+            <w:pPr>
+              <w:pStyle w:val="Compact"/>
+              <w:jc w:val="left"/>
+            </w:pPr>
+            <w:r>
+              <w:rPr>
+                <w:rStyle w:val="VerbatimChar"/>
+              </w:rPr>
+              <w:t xml:space="preserve">driverDocuments/{uid}</w:t>
+            </w:r>
+          </w:p>
+        </w:tc>
+        <w:tc>
+          <w:tcPr/>
+          <w:p>
+            <w:pPr>
+              <w:pStyle w:val="Compact"/>
+              <w:jc w:val="left"/>
+            </w:pPr>
+            <w:r>
+              <w:t xml:space="preserve">The driver and administrators only</w:t>
+            </w:r>
+          </w:p>
+        </w:tc>
+        <w:tc>
+          <w:tcPr/>
+          <w:p>
+            <w:pPr>
+              <w:pStyle w:val="Compact"/>
+              <w:jc w:val="left"/>
+            </w:pPr>
+            <w:r>
+              <w:t xml:space="preserve">The driver, and administrators in order to delete on refusal</w:t>
             </w:r>
           </w:p>
         </w:tc>

</xml_diff>

<commit_message>
Record ride ratings and driver totals
The five stars on the completion screen were local state that Back to
Home discarded, and Driver.rating and totalRides were displayed in six
places while never being written.

A rating now goes to driverRatings/{driver}/{rater}, keyed by the person
giving it because that is the only shape a security rule can scope to
them, and validated to one through five. The driver's own device folds
those into an average and writes it onto its own record, which is what
the admin screens and reports read — a passenger cannot write there, and
letting them would be worse than the resulting lag.

totalRides is incremented by the driver on completion, under a
transaction so two devices finishing at once cannot lose a count.

Co-Authored-By: Claude Opus 5 <noreply@anthropic.com>
Claude-Session: https://claude.ai/code/session_01A1yMabEEN9wVLJcuoCQ2Ki
</commit_message>
<xml_diff>
--- a/docs/TrikRide_Capstone_Documentation.docx
+++ b/docs/TrikRide_Capstone_Documentation.docx
@@ -9426,7 +9426,7 @@
         <w:pStyle w:val="FirstParagraph"/>
       </w:pPr>
       <w:r>
-        <w:t xml:space="preserve">The database is organized as eight top-level nodes, documented in Table 8 and Figure 11.</w:t>
+        <w:t xml:space="preserve">The database is organized as nine top-level nodes, documented in Table 8 and Figure 11.</w:t>
       </w:r>
     </w:p>
     <w:bookmarkEnd w:id="84"/>
@@ -10390,6 +10390,47 @@
       </w:r>
       <w:r>
         <w:t xml:space="preserve">No other document is requested. The system does not collect insurance certificates, inspection certificates, or secondary identification, all of which an earlier draft of the data model anticipated. Verification of the right to drive requires the licence, and requiring more would collect personal information the service has no use for.</w:t>
+      </w:r>
+    </w:p>
+    <w:p>
+      <w:pPr>
+        <w:pStyle w:val="BodyText"/>
+      </w:pPr>
+      <w:r>
+        <w:rPr>
+          <w:bCs/>
+          <w:b/>
+        </w:rPr>
+        <w:t xml:space="preserve">Ratings without a trusted server.</w:t>
+      </w:r>
+      <w:r>
+        <w:t xml:space="preserve"> </w:t>
+      </w:r>
+      <w:r>
+        <w:t xml:space="preserve">A passenger must be able to rate the driver who carried them, and must not be able to edit that driver’s record. With no application server between the client and the database, both halves have to be expressed as rules. Each rating is therefore written to</w:t>
+      </w:r>
+      <w:r>
+        <w:t xml:space="preserve"> </w:t>
+      </w:r>
+      <w:r>
+        <w:rPr>
+          <w:rStyle w:val="VerbatimChar"/>
+        </w:rPr>
+        <w:t xml:space="preserve">driverRatings/{driver}/{rater}</w:t>
+      </w:r>
+      <w:r>
+        <w:t xml:space="preserve"> </w:t>
+      </w:r>
+      <w:r>
+        <w:t xml:space="preserve">— keyed by the person giving it, which is the only shape a rule can restrict to that person — and validated to a value between one and five. The driver’s own device reads those ratings, averages them, and writes the figure onto its own record, which the administrative screens and the exported reports then read.</w:t>
+      </w:r>
+    </w:p>
+    <w:p>
+      <w:pPr>
+        <w:pStyle w:val="BodyText"/>
+      </w:pPr>
+      <w:r>
+        <w:t xml:space="preserve">The consequence, recorded here rather than hidden, is that a newly given rating reaches an administrator’s view when the driver next opens the application rather than at the moment it is given. Removing that lag would require either a server-side function, which is outside the scope of this study for the same reason push notification delivery is, or permitting passengers to write to driver records, which would be a materially worse arrangement than a few hours of delay.</w:t>
       </w:r>
     </w:p>
     <w:p>
@@ -15773,6 +15814,59 @@
           </w:p>
         </w:tc>
       </w:tr>
+      <w:tr>
+        <w:tc>
+          <w:tcPr/>
+          <w:p>
+            <w:pPr>
+              <w:pStyle w:val="Compact"/>
+              <w:jc w:val="left"/>
+            </w:pPr>
+            <w:r>
+              <w:rPr>
+                <w:rStyle w:val="VerbatimChar"/>
+              </w:rPr>
+              <w:t xml:space="preserve">driverRatings</w:t>
+            </w:r>
+          </w:p>
+        </w:tc>
+        <w:tc>
+          <w:tcPr/>
+          <w:p>
+            <w:pPr>
+              <w:pStyle w:val="Compact"/>
+              <w:jc w:val="left"/>
+            </w:pPr>
+            <w:r>
+              <w:t xml:space="preserve">driver identifier, then rater identifier</w:t>
+            </w:r>
+          </w:p>
+        </w:tc>
+        <w:tc>
+          <w:tcPr/>
+          <w:p>
+            <w:pPr>
+              <w:pStyle w:val="Compact"/>
+              <w:jc w:val="left"/>
+            </w:pPr>
+            <w:r>
+              <w:t xml:space="preserve">One star rating, from one to five</w:t>
+            </w:r>
+          </w:p>
+        </w:tc>
+        <w:tc>
+          <w:tcPr/>
+          <w:p>
+            <w:pPr>
+              <w:pStyle w:val="Compact"/>
+              <w:jc w:val="left"/>
+            </w:pPr>
+            <w:r>
+              <w:t xml:space="preserve">The passenger who gave it</w:t>
+            </w:r>
+          </w:p>
+        </w:tc>
+      </w:tr>
     </w:tbl>
     <w:p>
       <w:pPr>
@@ -21272,7 +21366,7 @@
         <w:pStyle w:val="BodyText"/>
       </w:pPr>
       <w:r>
-        <w:t xml:space="preserve">All thirty-eight functional requirements were implemented, as were the fifteen non-functional requirements.</w:t>
+        <w:t xml:space="preserve">All forty-three functional requirements were implemented, as were the seventeen non-functional requirements.</w:t>
       </w:r>
     </w:p>
     <w:bookmarkEnd w:id="159"/>
@@ -23255,7 +23349,7 @@
         <w:t xml:space="preserve"> </w:t>
       </w:r>
       <w:r>
-        <w:t xml:space="preserve">The requirements analysis produced thirty-eight functional requirements and fifteen non-functional requirements, all of which were implemented. The features fall into four groups: ride scheduling and booking; driver onboarding and verification; fare computation from the published FeTODAT schedule; and notification, monitoring, and reporting. One requirement emerged from the study environment rather than from the reviewed literature: because fares in Talibon are fixed per destination by municipal ordinance rather than computed from distance, the system prices rides by lookup against the published schedule, honours the statutory minimum fares of ₱15.00 and ₱12.00, and provides a separate rate column for senior citizens, persons with disabilities, and students.</w:t>
+        <w:t xml:space="preserve">The requirements analysis produced forty-three functional requirements and seventeen non-functional requirements, all of which were implemented. The features fall into four groups: ride scheduling and booking; driver onboarding and verification; fare computation from the published FeTODAT schedule; and notification, monitoring, and reporting. One requirement emerged from the study environment rather than from the reviewed literature: because fares in Talibon are fixed per destination by municipal ordinance rather than computed from distance, the system prices rides by lookup against the published schedule, honours the statutory minimum fares of ₱15.00 and ₱12.00, and provides a separate rate column for senior citizens, persons with disabilities, and students.</w:t>
       </w:r>
     </w:p>
     <w:p>
@@ -31007,6 +31101,47 @@
             </w:pPr>
             <w:r>
               <w:t xml:space="preserve">The driver, and administrators in order to delete on refusal</w:t>
+            </w:r>
+          </w:p>
+        </w:tc>
+      </w:tr>
+      <w:tr>
+        <w:tc>
+          <w:tcPr/>
+          <w:p>
+            <w:pPr>
+              <w:pStyle w:val="Compact"/>
+              <w:jc w:val="left"/>
+            </w:pPr>
+            <w:r>
+              <w:rPr>
+                <w:rStyle w:val="VerbatimChar"/>
+              </w:rPr>
+              <w:t xml:space="preserve">driverRatings/{uid}</w:t>
+            </w:r>
+          </w:p>
+        </w:tc>
+        <w:tc>
+          <w:tcPr/>
+          <w:p>
+            <w:pPr>
+              <w:pStyle w:val="Compact"/>
+              <w:jc w:val="left"/>
+            </w:pPr>
+            <w:r>
+              <w:t xml:space="preserve">All authenticated users</w:t>
+            </w:r>
+          </w:p>
+        </w:tc>
+        <w:tc>
+          <w:tcPr/>
+          <w:p>
+            <w:pPr>
+              <w:pStyle w:val="Compact"/>
+              <w:jc w:val="left"/>
+            </w:pPr>
+            <w:r>
+              <w:t xml:space="preserve">Each rating only by the passenger who gave it, and only as a value from one to five</w:t>
             </w:r>
           </w:p>
         </w:tc>

</xml_diff>

<commit_message>
Search pickup from the same stop list as the destination
Pickup came from eight hardcoded campus points, which only served
passengers who happened to be starting at the campus. It now opens the
same searchable, zone-filtered list of the 240 posted stops, with map
pinning still there for anywhere that is not on it.

The picker is one component used twice. Fares show only on the
destination side — a price beside a pickup stop would read as the cost
of being collected there.

Co-Authored-By: Claude Opus 5 <noreply@anthropic.com>
Claude-Session: https://claude.ai/code/session_01A1yMabEEN9wVLJcuoCQ2Ki
</commit_message>
<xml_diff>
--- a/docs/TrikRide_Capstone_Documentation.docx
+++ b/docs/TrikRide_Capstone_Documentation.docx
@@ -4394,7 +4394,7 @@
         <w:t xml:space="preserve"> </w:t>
       </w:r>
       <w:r>
-        <w:t xml:space="preserve">7b. Allows a passenger to set a pickup point either from the defined list or by pinning any point on the map, with the pinned point described in words where the device can resolve an address.</w:t>
+        <w:t xml:space="preserve">7b. Allows a passenger to set a pickup point either by searching the table of stops or by pinning any point on the map, with the pinned point described in words where the device can resolve an address.</w:t>
       </w:r>
     </w:p>
     <w:p>
@@ -11334,7 +11334,7 @@
               <w:jc w:val="left"/>
             </w:pPr>
             <w:r>
-              <w:t xml:space="preserve">The system shall allow a passenger to select a pickup point from a defined list.</w:t>
+              <w:t xml:space="preserve">The system shall allow a passenger to select a pickup point by searching the same table of stops used for destinations, or by pinning any point on the map.</w:t>
             </w:r>
           </w:p>
         </w:tc>

</xml_diff>

<commit_message>
Stop Android backup from restoring a signed-in session
Firebase Auth keeps the session in shared preferences, and the default
backup rules copied those to the cloud and restored them on reinstall —
so a user who removed the app came back still signed in, and a restore
could carry the session onto a different phone.

allowBackup is off and both cloud backup and device-to-device transfer
are excluded. Both are needed: allowBackup covers only the cloud path,
and some manufacturers run a D2D transfer regardless.

Co-Authored-By: Claude Opus 5 <noreply@anthropic.com>
Claude-Session: https://claude.ai/code/session_01A1yMabEEN9wVLJcuoCQ2Ki
</commit_message>
<xml_diff>
--- a/docs/TrikRide_Capstone_Documentation.docx
+++ b/docs/TrikRide_Capstone_Documentation.docx
@@ -10466,7 +10466,7 @@
         <w:t xml:space="preserve"> </w:t>
       </w:r>
       <w:r>
-        <w:t xml:space="preserve">Sessions persist across application restarts, which is a convenience feature, but signing out clears the session immediately and returns the user to the sign-in screen.</w:t>
+        <w:t xml:space="preserve">Sessions persist across application restarts, which is a convenience feature, but signing out clears the session immediately and returns the user to the sign-in screen. A session does not, however, survive the installation. The authentication library keeps it in the application’s shared preferences, and Android’s default backup behaviour copies those to the user’s cloud storage and restores them on reinstallation, with the effect that a user who removed the application returned to it already signed in, and that a restore onto a replacement handset could carry the session with it. Backup and device-to-device transfer are therefore both disabled for this application. The two are configured separately because disabling cloud backup does not, on the devices of every manufacturer, disable transfer. No user data is lost by this: the only information held locally is a remembered email address and a flag recording that the introductory carousel has been seen.</w:t>
       </w:r>
     </w:p>
     <w:p>
@@ -20175,6 +20175,56 @@
             </w:pPr>
             <w:r>
               <w:t xml:space="preserve">The photograph is retained, since withdrawal is not refusal</w:t>
+            </w:r>
+          </w:p>
+        </w:tc>
+        <w:tc>
+          <w:tcPr/>
+          <w:p>
+            <w:pPr>
+              <w:pStyle w:val="Compact"/>
+              <w:jc w:val="left"/>
+            </w:pPr>
+            <w:r>
+              <w:t xml:space="preserve">Pass</w:t>
+            </w:r>
+          </w:p>
+        </w:tc>
+      </w:tr>
+      <w:tr>
+        <w:tc>
+          <w:tcPr/>
+          <w:p>
+            <w:pPr>
+              <w:pStyle w:val="Compact"/>
+              <w:jc w:val="left"/>
+            </w:pPr>
+            <w:r>
+              <w:t xml:space="preserve">SEC-13</w:t>
+            </w:r>
+          </w:p>
+        </w:tc>
+        <w:tc>
+          <w:tcPr/>
+          <w:p>
+            <w:pPr>
+              <w:pStyle w:val="Compact"/>
+              <w:jc w:val="left"/>
+            </w:pPr>
+            <w:r>
+              <w:t xml:space="preserve">Uninstall the application, reinstall it, and open it</w:t>
+            </w:r>
+          </w:p>
+        </w:tc>
+        <w:tc>
+          <w:tcPr/>
+          <w:p>
+            <w:pPr>
+              <w:pStyle w:val="Compact"/>
+              <w:jc w:val="left"/>
+            </w:pPr>
+            <w:r>
+              <w:t xml:space="preserve">The user is returned to the sign-in screen rather than to a restored session</w:t>
             </w:r>
           </w:p>
         </w:tc>

</xml_diff>

<commit_message>
Raise the minimum fare to P25
P25 is the standard fare, and the configured minimum of P15 regular /
P12 discounted appears nowhere in the transcribed table — the lowest
posted rate is P20. The discounted minimum follows the twenty per cent
ratio every row in the table holds, and both are editable in the admin
fare screen.

Twenty-seven rows sit at P20 and are now charged at P25. That is the
minimum doing its job, but it also means those rows need checking
against the posted sheet.

Co-Authored-By: Claude Opus 5 <noreply@anthropic.com>
Claude-Session: https://claude.ai/code/session_01A1yMabEEN9wVLJcuoCQ2Ki
</commit_message>
<xml_diff>
--- a/docs/TrikRide_Capstone_Documentation.docx
+++ b/docs/TrikRide_Capstone_Documentation.docx
@@ -16678,7 +16678,7 @@
         <w:pStyle w:val="BodyText"/>
       </w:pPr>
       <w:r>
-        <w:t xml:space="preserve">Regular rates in the seeded table run from ₱20.00 to ₱150.00 with a mean of ₱41.00, above the ordinance minimum of ₱15.00 for regular passengers and ₱12.00 for discounted passengers. In addition to the 240 destinations, the schedule fixes two flat rates that are not tied to a numbered stop: ₱15.00 for any point within Poblacion, and ₱25.00 for the round trip between the Talibon Integrated Bus Terminal and NCBI. Both are offered to passengers as destinations in their own right.</w:t>
+        <w:t xml:space="preserve">Regular rates in the seeded table run from ₱20.00 to ₱150.00 with a mean of ₱41.00, against a minimum fare of ₱25.00 for regular passengers and ₱20.00 for discounted passengers. Twenty-seven entries carry a transcribed rate of ₱20.00, below that minimum, and are raised to it when a ride is priced. Whether those entries record a rate that has since been superseded or were read incorrectly is a question for verification against the posted sheet; either way the system charges the minimum rather than the lower figure. In addition to the 240 destinations, the schedule fixes two flat rates that are not tied to a numbered stop: ₱25.00 for any point within Poblacion, and ₱25.00 for the round trip between the Talibon Integrated Bus Terminal and NCBI. Both are offered to passengers as destinations in their own right.</w:t>
       </w:r>
     </w:p>
     <w:p>
@@ -23399,7 +23399,7 @@
         <w:t xml:space="preserve"> </w:t>
       </w:r>
       <w:r>
-        <w:t xml:space="preserve">The requirements analysis produced forty-three functional requirements and seventeen non-functional requirements, all of which were implemented. The features fall into four groups: ride scheduling and booking; driver onboarding and verification; fare computation from the published FeTODAT schedule; and notification, monitoring, and reporting. One requirement emerged from the study environment rather than from the reviewed literature: because fares in Talibon are fixed per destination by municipal ordinance rather than computed from distance, the system prices rides by lookup against the published schedule, honours the statutory minimum fares of ₱15.00 and ₱12.00, and provides a separate rate column for senior citizens, persons with disabilities, and students.</w:t>
+        <w:t xml:space="preserve">The requirements analysis produced forty-three functional requirements and seventeen non-functional requirements, all of which were implemented. The features fall into four groups: ride scheduling and booking; driver onboarding and verification; fare computation from the published FeTODAT schedule; and notification, monitoring, and reporting. One requirement emerged from the study environment rather than from the reviewed literature: because fares in Talibon are fixed per destination by municipal ordinance rather than computed from distance, the system prices rides by lookup against the published schedule, honours the minimum fares of ₱25.00 and ₱20.00, and provides a separate rate column for senior citizens, persons with disabilities, and students.</w:t>
       </w:r>
     </w:p>
     <w:p>

</xml_diff>

<commit_message>
Put the four user agreements in the repository
The terms, privacy policy, community guidelines and driver agreement only
existed as Kotlin strings, which is fine for the app and useless for
anyone reading the repo or printing them. They are now Markdown in
docs/legal/, generated from those strings by sync.py so the two cannot
drift; --check says whether they have.

Appendix D carried a summary and a note to insert the text later. It has
the text now, and the dates and section counts it got wrong.

Co-Authored-By: Claude Opus 5 <noreply@anthropic.com>
Claude-Session: https://claude.ai/code/session_01A1yMabEEN9wVLJcuoCQ2Ki
</commit_message>
<xml_diff>
--- a/docs/TrikRide_Capstone_Documentation.docx
+++ b/docs/TrikRide_Capstone_Documentation.docx
@@ -4280,7 +4280,7 @@
         <w:pStyle w:val="Compact"/>
       </w:pPr>
       <w:r>
-        <w:t xml:space="preserve">Destinations are selected from the published FeTODAT schedule rather than by pinning a point on the map, because the governing ordinance fixes the fare for each named destination. A pickup point may be pinned freely, as it does not affect the fare.</w:t>
+        <w:t xml:space="preserve">Destinations are selected from the published FeTODAT schedule rather than by pinning a point on the map, because the governing ordinance fixes the fare for each named destination. The map may be used to find a destination — the system names the posted stop nearest to the point the passenger indicates, together with its fare — but the ride is booked and priced against that named stop, not against the point. A pickup point may be pinned freely, as it does not affect the fare.</w:t>
       </w:r>
     </w:p>
     <w:p>
@@ -6102,7 +6102,7 @@
               <w:jc w:val="left"/>
             </w:pPr>
             <w:r>
-              <w:t xml:space="preserve">Requires an Android device and an internet connection; no live map in the evaluated build; no online payment; coverage limited to Talibon; adoption depends on the drivers’ association</w:t>
+              <w:t xml:space="preserve">Requires an Android device and an internet connection; no turn-by-turn navigation; no online payment; coverage limited to Talibon; adoption depends on the drivers’ association</w:t>
             </w:r>
           </w:p>
         </w:tc>
@@ -10772,6 +10772,56 @@
               <w:jc w:val="left"/>
             </w:pPr>
             <w:r>
+              <w:t xml:space="preserve">FR-10a</w:t>
+            </w:r>
+          </w:p>
+        </w:tc>
+        <w:tc>
+          <w:tcPr/>
+          <w:p>
+            <w:pPr>
+              <w:pStyle w:val="Compact"/>
+              <w:jc w:val="left"/>
+            </w:pPr>
+            <w:r>
+              <w:t xml:space="preserve">The system shall allow a passenger to indicate a destination on the map, and shall offer the posted stop nearest to that point, with its fare, as the destination to be booked.</w:t>
+            </w:r>
+          </w:p>
+        </w:tc>
+        <w:tc>
+          <w:tcPr/>
+          <w:p>
+            <w:pPr>
+              <w:pStyle w:val="Compact"/>
+              <w:jc w:val="left"/>
+            </w:pPr>
+            <w:r>
+              <w:t xml:space="preserve">Passenger</w:t>
+            </w:r>
+          </w:p>
+        </w:tc>
+        <w:tc>
+          <w:tcPr/>
+          <w:p>
+            <w:pPr>
+              <w:pStyle w:val="Compact"/>
+              <w:jc w:val="left"/>
+            </w:pPr>
+            <w:r>
+              <w:t xml:space="preserve">1</w:t>
+            </w:r>
+          </w:p>
+        </w:tc>
+      </w:tr>
+      <w:tr>
+        <w:tc>
+          <w:tcPr/>
+          <w:p>
+            <w:pPr>
+              <w:pStyle w:val="Compact"/>
+              <w:jc w:val="left"/>
+            </w:pPr>
+            <w:r>
               <w:t xml:space="preserve">FR-11</w:t>
             </w:r>
           </w:p>
@@ -16028,7 +16078,7 @@
         <w:pStyle w:val="BodyText"/>
       </w:pPr>
       <w:r>
-        <w:t xml:space="preserve">Regular rates in the seeded table run from ₱20.00 to ₱150.00 with a mean of ₱41.00, against a minimum fare of ₱25.00 for regular passengers and ₱20.00 for discounted passengers. Twenty-seven entries carry a transcribed rate of ₱20.00, below that minimum, and are raised to it when a ride is priced. Whether those entries record a rate that has since been superseded or were read incorrectly is a question for verification against the posted sheet; either way the system charges the minimum rather than the lower figure. In addition to the 240 destinations, the schedule fixes two flat rates that are not tied to a numbered stop: ₱25.00 for any point within Poblacion, and ₱25.00 for the round trip between the Talibon Integrated Bus Terminal and NCBI. Both are offered to passengers as destinations in their own right.</w:t>
+        <w:t xml:space="preserve">Regular rates in the seeded table run from ₱20.00 to ₱150.00 with a mean of ₱41.00, against a minimum fare of ₱25.00 for regular passengers and ₱20.00 for discounted passengers. Twenty-seven entries carry a transcribed rate of ₱20.00, below that minimum, and are raised to it when a ride is priced. Whether those entries record a rate that has since been superseded or were read incorrectly is a question for verification against the posted sheet; either way the system charges the minimum rather than the lower figure. In addition to the 240 destinations, the schedule fixes two flat rates that are not tied to a numbered stop: ₱25.00 for any point within Poblacion — offered under that name because the schedule has no numbered stop for it — and ₱25.00 for the round trip between the Talibon Integrated Bus Terminal and NCBI. Both are offered to passengers as destinations in their own right.</w:t>
       </w:r>
     </w:p>
     <w:p>
@@ -21634,7 +21684,7 @@
         <w:t xml:space="preserve"> </w:t>
       </w:r>
       <w:r>
-        <w:t xml:space="preserve">Only stops an administrator has positioned appear on the map. Surveying the coordinates of all 240, which a group of students with phones could do in a few afternoons, would let a passenger pick a destination from the map and have the system snap to the nearest posted stop rather than search a list.</w:t>
+        <w:t xml:space="preserve">A passenger can already point at the map and be offered the nearest posted stop, but only stops an administrator has positioned can be offered that way, and few have been. Surveying the coordinates of all 240, which a group of students with phones could do in a few afternoons, would make the whole schedule reachable from the map instead of only from the list.</w:t>
       </w:r>
     </w:p>
     <w:p>
@@ -22181,7 +22231,7 @@
       </w:r>
     </w:p>
     <w:bookmarkEnd w:id="168"/>
-    <w:bookmarkStart w:id="193" w:name="appendices"/>
+    <w:bookmarkStart w:id="197" w:name="appendices"/>
     <w:p>
       <w:pPr>
         <w:pStyle w:val="Heading1"/>
@@ -26666,7 +26716,7 @@
     </w:p>
     <w:bookmarkEnd w:id="172"/>
     <w:bookmarkEnd w:id="173"/>
-    <w:bookmarkStart w:id="174" w:name="Xa0f1431884eca17d668bc46bc3532e12d11e1c0"/>
+    <w:bookmarkStart w:id="178" w:name="Xa0f1431884eca17d668bc46bc3532e12d11e1c0"/>
     <w:p>
       <w:pPr>
         <w:pStyle w:val="Heading2"/>
@@ -26680,19 +26730,118 @@
         <w:pStyle w:val="FirstParagraph"/>
       </w:pPr>
       <w:r>
-        <w:t xml:space="preserve">The following documents are carried inside the application, are readable at any time from</w:t>
-      </w:r>
-      <w:r>
-        <w:t xml:space="preserve"> </w:t>
-      </w:r>
-      <w:r>
-        <w:t xml:space="preserve">the profile screen, and must be accepted before the service becomes available. They are</w:t>
-      </w:r>
-      <w:r>
-        <w:t xml:space="preserve"> </w:t>
-      </w:r>
-      <w:r>
-        <w:t xml:space="preserve">reproduced here as issued, effective 28 July 2026.</w:t>
+        <w:t xml:space="preserve">Four documents are carried inside the application and are readable at any time from the</w:t>
+      </w:r>
+      <w:r>
+        <w:t xml:space="preserve"> </w:t>
+      </w:r>
+      <w:r>
+        <w:t xml:space="preserve">profile screen. The Terms and Conditions, the Privacy Policy and the Safety and Community</w:t>
+      </w:r>
+      <w:r>
+        <w:t xml:space="preserve"> </w:t>
+      </w:r>
+      <w:r>
+        <w:t xml:space="preserve">Guidelines must each be accepted before the service becomes available; the Driver</w:t>
+      </w:r>
+      <w:r>
+        <w:t xml:space="preserve"> </w:t>
+      </w:r>
+      <w:r>
+        <w:t xml:space="preserve">Agreement is presented to a driver after they choose a driver account. Acceptance is</w:t>
+      </w:r>
+      <w:r>
+        <w:t xml:space="preserve"> </w:t>
+      </w:r>
+      <w:r>
+        <w:t xml:space="preserve">recorded against a version string, so that a revision asks every existing user again on</w:t>
+      </w:r>
+      <w:r>
+        <w:t xml:space="preserve"> </w:t>
+      </w:r>
+      <w:r>
+        <w:t xml:space="preserve">their next launch.</w:t>
+      </w:r>
+    </w:p>
+    <w:p>
+      <w:pPr>
+        <w:pStyle w:val="BodyText"/>
+      </w:pPr>
+      <w:r>
+        <w:t xml:space="preserve">They are reproduced below as issued. The text held in the application is the copy of</w:t>
+      </w:r>
+      <w:r>
+        <w:t xml:space="preserve"> </w:t>
+      </w:r>
+      <w:r>
+        <w:t xml:space="preserve">record, since it is what a user reads before agreeing; its source is</w:t>
+      </w:r>
+      <w:r>
+        <w:t xml:space="preserve"> </w:t>
+      </w:r>
+      <w:r>
+        <w:rPr>
+          <w:rStyle w:val="VerbatimChar"/>
+        </w:rPr>
+        <w:t xml:space="preserve">app/src/main/java/com/tpc/trikride/ui/screens/LegalScreen.kt</w:t>
+      </w:r>
+      <w:r>
+        <w:t xml:space="preserve">, and Markdown copies</w:t>
+      </w:r>
+      <w:r>
+        <w:t xml:space="preserve"> </w:t>
+      </w:r>
+      <w:r>
+        <w:t xml:space="preserve">generated from it are in</w:t>
+      </w:r>
+      <w:r>
+        <w:t xml:space="preserve"> </w:t>
+      </w:r>
+      <w:r>
+        <w:rPr>
+          <w:rStyle w:val="VerbatimChar"/>
+        </w:rPr>
+        <w:t xml:space="preserve">docs/legal/</w:t>
+      </w:r>
+      <w:r>
+        <w:t xml:space="preserve"> </w:t>
+      </w:r>
+      <w:r>
+        <w:t xml:space="preserve">of the repository given in Appendix I.</w:t>
+      </w:r>
+    </w:p>
+    <w:p>
+      <w:r>
+        <w:br w:type="page"/>
+      </w:r>
+    </w:p>
+    <w:bookmarkStart w:id="174" w:name="d.1-terms-and-conditions"/>
+    <w:p>
+      <w:pPr>
+        <w:pStyle w:val="Heading3"/>
+      </w:pPr>
+      <w:r>
+        <w:t xml:space="preserve">D.1 Terms and Conditions</w:t>
+      </w:r>
+    </w:p>
+    <w:p>
+      <w:pPr>
+        <w:pStyle w:val="FirstParagraph"/>
+      </w:pPr>
+      <w:r>
+        <w:rPr>
+          <w:iCs/>
+          <w:i/>
+        </w:rPr>
+        <w:t xml:space="preserve">Effective Date: July 28, 2026</w:t>
+      </w:r>
+    </w:p>
+    <w:p>
+      <w:pPr>
+        <w:pStyle w:val="BodyText"/>
+      </w:pPr>
+      <w:r>
+        <w:t xml:space="preserve">By creating an account or using TrikRide, you agree to comply with these Terms and Conditions.</w:t>
       </w:r>
     </w:p>
     <w:p>
@@ -26704,31 +26853,27 @@
           <w:bCs/>
           <w:b/>
         </w:rPr>
-        <w:t xml:space="preserve">D.1 Terms and Conditions.</w:t>
-      </w:r>
-      <w:r>
-        <w:t xml:space="preserve"> </w:t>
-      </w:r>
-      <w:r>
-        <w:t xml:space="preserve">Ten sections covering eligibility, account registration,</w:t>
-      </w:r>
-      <w:r>
-        <w:t xml:space="preserve"> </w:t>
-      </w:r>
-      <w:r>
-        <w:t xml:space="preserve">ride booking obligations for passengers and drivers, prohibited activities, limitation of</w:t>
-      </w:r>
-      <w:r>
-        <w:t xml:space="preserve"> </w:t>
-      </w:r>
-      <w:r>
-        <w:t xml:space="preserve">liability, account suspension, intellectual property, amendments, governing rules, and</w:t>
-      </w:r>
-      <w:r>
-        <w:t xml:space="preserve"> </w:t>
-      </w:r>
-      <w:r>
-        <w:t xml:space="preserve">acceptance.</w:t>
+        <w:t xml:space="preserve">1. Eligibility</w:t>
+      </w:r>
+    </w:p>
+    <w:p>
+      <w:pPr>
+        <w:pStyle w:val="BodyText"/>
+      </w:pPr>
+      <w:r>
+        <w:t xml:space="preserve">Users must be:</w:t>
+      </w:r>
+      <w:r>
+        <w:t xml:space="preserve"> </w:t>
+      </w:r>
+      <w:r>
+        <w:t xml:space="preserve">- Registered students, faculty, or authorized personnel of the participating institution.</w:t>
+      </w:r>
+      <w:r>
+        <w:t xml:space="preserve"> </w:t>
+      </w:r>
+      <w:r>
+        <w:t xml:space="preserve">- Registered and approved drivers for driver accounts.</w:t>
       </w:r>
     </w:p>
     <w:p>
@@ -26740,19 +26885,39 @@
           <w:bCs/>
           <w:b/>
         </w:rPr>
-        <w:t xml:space="preserve">D.2 Privacy Policy.</w:t>
-      </w:r>
-      <w:r>
-        <w:t xml:space="preserve"> </w:t>
-      </w:r>
-      <w:r>
-        <w:t xml:space="preserve">Eight sections covering what is collected, how it is used,</w:t>
-      </w:r>
-      <w:r>
-        <w:t xml:space="preserve"> </w:t>
-      </w:r>
-      <w:r>
-        <w:t xml:space="preserve">location, storage, sharing, user choices, children, and contact.</w:t>
+        <w:t xml:space="preserve">2. Account Registration</w:t>
+      </w:r>
+    </w:p>
+    <w:p>
+      <w:pPr>
+        <w:pStyle w:val="BodyText"/>
+      </w:pPr>
+      <w:r>
+        <w:t xml:space="preserve">Users agree to:</w:t>
+      </w:r>
+      <w:r>
+        <w:t xml:space="preserve"> </w:t>
+      </w:r>
+      <w:r>
+        <w:t xml:space="preserve">- Provide accurate and complete information.</w:t>
+      </w:r>
+      <w:r>
+        <w:t xml:space="preserve"> </w:t>
+      </w:r>
+      <w:r>
+        <w:t xml:space="preserve">- Maintain only one active account unless otherwise authorized.</w:t>
+      </w:r>
+      <w:r>
+        <w:t xml:space="preserve"> </w:t>
+      </w:r>
+      <w:r>
+        <w:t xml:space="preserve">- Keep login credentials confidential.</w:t>
+      </w:r>
+      <w:r>
+        <w:t xml:space="preserve"> </w:t>
+      </w:r>
+      <w:r>
+        <w:t xml:space="preserve">- Notify the administrator immediately if they suspect unauthorized access to their account.</w:t>
       </w:r>
     </w:p>
     <w:p>
@@ -26764,25 +26929,65 @@
           <w:bCs/>
           <w:b/>
         </w:rPr>
-        <w:t xml:space="preserve">D.3 Safety and Community Guidelines.</w:t>
-      </w:r>
-      <w:r>
-        <w:t xml:space="preserve"> </w:t>
-      </w:r>
-      <w:r>
-        <w:t xml:space="preserve">Commitment, respect, safe riding, driver</w:t>
-      </w:r>
-      <w:r>
-        <w:t xml:space="preserve"> </w:t>
-      </w:r>
-      <w:r>
-        <w:t xml:space="preserve">responsibilities, passenger responsibilities, prohibited conduct, reporting safety</w:t>
-      </w:r>
-      <w:r>
-        <w:t xml:space="preserve"> </w:t>
-      </w:r>
-      <w:r>
-        <w:t xml:space="preserve">concerns, and account enforcement.</w:t>
+        <w:t xml:space="preserve">3. Ride Booking</w:t>
+      </w:r>
+    </w:p>
+    <w:p>
+      <w:pPr>
+        <w:pStyle w:val="BodyText"/>
+      </w:pPr>
+      <w:r>
+        <w:t xml:space="preserve">Passengers agree to:</w:t>
+      </w:r>
+      <w:r>
+        <w:t xml:space="preserve"> </w:t>
+      </w:r>
+      <w:r>
+        <w:t xml:space="preserve">- Enter accurate pickup and destination locations.</w:t>
+      </w:r>
+      <w:r>
+        <w:t xml:space="preserve"> </w:t>
+      </w:r>
+      <w:r>
+        <w:t xml:space="preserve">- Be present at the designated pickup point on time.</w:t>
+      </w:r>
+      <w:r>
+        <w:t xml:space="preserve"> </w:t>
+      </w:r>
+      <w:r>
+        <w:t xml:space="preserve">- Treat drivers and fellow passengers with courtesy and respect.</w:t>
+      </w:r>
+    </w:p>
+    <w:p>
+      <w:pPr>
+        <w:pStyle w:val="BodyText"/>
+      </w:pPr>
+      <w:r>
+        <w:t xml:space="preserve">Drivers agree to:</w:t>
+      </w:r>
+      <w:r>
+        <w:t xml:space="preserve"> </w:t>
+      </w:r>
+      <w:r>
+        <w:t xml:space="preserve">- Maintain valid registration and any required permits.</w:t>
+      </w:r>
+      <w:r>
+        <w:t xml:space="preserve"> </w:t>
+      </w:r>
+      <w:r>
+        <w:t xml:space="preserve">- Arrive at pickup locations promptly whenever possible.</w:t>
+      </w:r>
+      <w:r>
+        <w:t xml:space="preserve"> </w:t>
+      </w:r>
+      <w:r>
+        <w:t xml:space="preserve">- Provide safe, respectful, and professional service.</w:t>
+      </w:r>
+      <w:r>
+        <w:t xml:space="preserve"> </w:t>
+      </w:r>
+      <w:r>
+        <w:t xml:space="preserve">- Follow all applicable traffic laws and institutional policies.</w:t>
       </w:r>
     </w:p>
     <w:p>
@@ -26794,91 +26999,461 @@
           <w:bCs/>
           <w:b/>
         </w:rPr>
-        <w:t xml:space="preserve">D.4 Driver Agreement.</w:t>
-      </w:r>
-      <w:r>
-        <w:t xml:space="preserve"> </w:t>
-      </w:r>
-      <w:r>
-        <w:t xml:space="preserve">Driver eligibility, driver responsibilities, professional</w:t>
-      </w:r>
-      <w:r>
-        <w:t xml:space="preserve"> </w:t>
-      </w:r>
-      <w:r>
-        <w:t xml:space="preserve">conduct, safety requirements, suspension and termination, limitation of responsibility,</w:t>
-      </w:r>
-      <w:r>
-        <w:t xml:space="preserve"> </w:t>
-      </w:r>
-      <w:r>
-        <w:t xml:space="preserve">and agreement.</w:t>
-      </w:r>
-    </w:p>
-    <w:p>
-      <w:pPr>
-        <w:pStyle w:val="BodyText"/>
+        <w:t xml:space="preserve">4. Prohibited Activities</w:t>
+      </w:r>
+    </w:p>
+    <w:p>
+      <w:pPr>
+        <w:pStyle w:val="BodyText"/>
+      </w:pPr>
+      <w:r>
+        <w:t xml:space="preserve">Users shall not:</w:t>
+      </w:r>
+      <w:r>
+        <w:t xml:space="preserve"> </w:t>
+      </w:r>
+      <w:r>
+        <w:t xml:space="preserve">- Create fake or fraudulent accounts.</w:t>
+      </w:r>
+      <w:r>
+        <w:t xml:space="preserve"> </w:t>
+      </w:r>
+      <w:r>
+        <w:t xml:space="preserve">- Impersonate another person.</w:t>
+      </w:r>
+      <w:r>
+        <w:t xml:space="preserve"> </w:t>
+      </w:r>
+      <w:r>
+        <w:t xml:space="preserve">- Submit false booking requests.</w:t>
+      </w:r>
+      <w:r>
+        <w:t xml:space="preserve"> </w:t>
+      </w:r>
+      <w:r>
+        <w:t xml:space="preserve">- Harass, threaten, or discriminate against other users.</w:t>
+      </w:r>
+      <w:r>
+        <w:t xml:space="preserve"> </w:t>
+      </w:r>
+      <w:r>
+        <w:t xml:space="preserve">- Attempt unauthorized access to the system.</w:t>
+      </w:r>
+      <w:r>
+        <w:t xml:space="preserve"> </w:t>
+      </w:r>
+      <w:r>
+        <w:t xml:space="preserve">- Use the application for illegal or unlawful activities.</w:t>
+      </w:r>
+    </w:p>
+    <w:p>
+      <w:pPr>
+        <w:pStyle w:val="BodyText"/>
+      </w:pPr>
+      <w:r>
+        <w:t xml:space="preserve">Violations may result in temporary suspension or permanent removal from the TrikRide platform.</w:t>
+      </w:r>
+    </w:p>
+    <w:p>
+      <w:pPr>
+        <w:pStyle w:val="BodyText"/>
+      </w:pPr>
+      <w:r>
+        <w:rPr>
+          <w:bCs/>
+          <w:b/>
+        </w:rPr>
+        <w:t xml:space="preserve">5. Limitation of Liability</w:t>
+      </w:r>
+    </w:p>
+    <w:p>
+      <w:pPr>
+        <w:pStyle w:val="BodyText"/>
+      </w:pPr>
+      <w:r>
+        <w:t xml:space="preserve">TrikRide is a ride scheduling and driver matching platform. While we strive to provide reliable service, we cannot guarantee uninterrupted availability and are not responsible for delays caused by traffic, weather, vehicle issues, or other circumstances beyond our reasonable control.</w:t>
+      </w:r>
+    </w:p>
+    <w:p>
+      <w:pPr>
+        <w:pStyle w:val="BodyText"/>
+      </w:pPr>
+      <w:r>
+        <w:rPr>
+          <w:bCs/>
+          <w:b/>
+        </w:rPr>
+        <w:t xml:space="preserve">6. Account Suspension</w:t>
+      </w:r>
+    </w:p>
+    <w:p>
+      <w:pPr>
+        <w:pStyle w:val="BodyText"/>
+      </w:pPr>
+      <w:r>
+        <w:t xml:space="preserve">The system administrator reserves the right to suspend or terminate accounts found to be in violation of these Terms and Conditions.</w:t>
+      </w:r>
+    </w:p>
+    <w:p>
+      <w:pPr>
+        <w:pStyle w:val="BodyText"/>
+      </w:pPr>
+      <w:r>
+        <w:rPr>
+          <w:bCs/>
+          <w:b/>
+        </w:rPr>
+        <w:t xml:space="preserve">7. Intellectual Property</w:t>
+      </w:r>
+    </w:p>
+    <w:p>
+      <w:pPr>
+        <w:pStyle w:val="BodyText"/>
+      </w:pPr>
+      <w:r>
+        <w:t xml:space="preserve">All application content, including the TrikRide name, logo, interface design, graphics, source code, and documentation, is owned by the TrikRide development team unless otherwise stated. Unauthorized reproduction or distribution is prohibited.</w:t>
+      </w:r>
+    </w:p>
+    <w:p>
+      <w:pPr>
+        <w:pStyle w:val="BodyText"/>
+      </w:pPr>
+      <w:r>
+        <w:rPr>
+          <w:bCs/>
+          <w:b/>
+        </w:rPr>
+        <w:t xml:space="preserve">8. Amendments</w:t>
+      </w:r>
+    </w:p>
+    <w:p>
+      <w:pPr>
+        <w:pStyle w:val="BodyText"/>
+      </w:pPr>
+      <w:r>
+        <w:t xml:space="preserve">These Terms and Conditions may be updated from time to time. Continued use of TrikRide after changes are published constitutes acceptance of the updated Terms.</w:t>
+      </w:r>
+    </w:p>
+    <w:p>
+      <w:pPr>
+        <w:pStyle w:val="BodyText"/>
+      </w:pPr>
+      <w:r>
+        <w:rPr>
+          <w:bCs/>
+          <w:b/>
+        </w:rPr>
+        <w:t xml:space="preserve">9. Governing Rules</w:t>
+      </w:r>
+    </w:p>
+    <w:p>
+      <w:pPr>
+        <w:pStyle w:val="BodyText"/>
+      </w:pPr>
+      <w:r>
+        <w:t xml:space="preserve">These Terms shall be governed by applicable Philippine laws and the policies of the participating educational institution.</w:t>
+      </w:r>
+    </w:p>
+    <w:p>
+      <w:pPr>
+        <w:pStyle w:val="BodyText"/>
+      </w:pPr>
+      <w:r>
+        <w:rPr>
+          <w:bCs/>
+          <w:b/>
+        </w:rPr>
+        <w:t xml:space="preserve">10. Acceptance</w:t>
+      </w:r>
+    </w:p>
+    <w:p>
+      <w:pPr>
+        <w:pStyle w:val="BodyText"/>
+      </w:pPr>
+      <w:r>
+        <w:t xml:space="preserve">By registering and using TrikRide, you confirm that you have read, understood, and agreed to these Terms and Conditions and the Privacy Policy.</w:t>
+      </w:r>
+    </w:p>
+    <w:p>
+      <w:r>
+        <w:br w:type="page"/>
+      </w:r>
+    </w:p>
+    <w:bookmarkEnd w:id="174"/>
+    <w:bookmarkStart w:id="175" w:name="d.2-privacy-policy"/>
+    <w:p>
+      <w:pPr>
+        <w:pStyle w:val="Heading3"/>
+      </w:pPr>
+      <w:r>
+        <w:t xml:space="preserve">D.2 Privacy Policy</w:t>
+      </w:r>
+    </w:p>
+    <w:p>
+      <w:pPr>
+        <w:pStyle w:val="FirstParagraph"/>
       </w:pPr>
       <w:r>
         <w:rPr>
           <w:iCs/>
           <w:i/>
         </w:rPr>
-        <w:t xml:space="preserve">[Insert the full text of each document here. The text held in the application is</w:t>
-      </w:r>
+        <w:t xml:space="preserve">Effective Date: August 16, 2026</w:t>
+      </w:r>
+    </w:p>
+    <w:p>
+      <w:pPr>
+        <w:pStyle w:val="BodyText"/>
+      </w:pPr>
+      <w:r>
+        <w:rPr>
+          <w:bCs/>
+          <w:b/>
+        </w:rPr>
+        <w:t xml:space="preserve">1. Information We Collect</w:t>
+      </w:r>
+    </w:p>
+    <w:p>
+      <w:pPr>
+        <w:pStyle w:val="BodyText"/>
+      </w:pPr>
+      <w:r>
+        <w:t xml:space="preserve">We collect the information you provide during registration (name, email, phone number, date of birth, and — for drivers — license and tricycle details), an optional profile photo, and information generated while using the app (ride requests, pickup/destination, ride history, and any concerns you report).</w:t>
+      </w:r>
+    </w:p>
+    <w:p>
+      <w:pPr>
+        <w:pStyle w:val="BodyText"/>
+      </w:pPr>
+      <w:r>
+        <w:t xml:space="preserve">Drivers are also asked for a photograph of their driver’s license. Under the Data Privacy Act of 2012 (Republic Act No. 10173) a license is sensitive personal information, so it is treated separately from everything else in this policy and is covered by section 9 below. You are asked to agree to it specifically at the moment you send it, not merely by accepting this policy.</w:t>
+      </w:r>
+    </w:p>
+    <w:p>
+      <w:pPr>
+        <w:pStyle w:val="BodyText"/>
+      </w:pPr>
+      <w:r>
+        <w:rPr>
+          <w:bCs/>
+          <w:b/>
+        </w:rPr>
+        <w:t xml:space="preserve">2. How We Use Information</w:t>
+      </w:r>
+    </w:p>
+    <w:p>
+      <w:pPr>
+        <w:pStyle w:val="BodyText"/>
+      </w:pPr>
+      <w:r>
+        <w:t xml:space="preserve">Your information is used to create your account, match passengers with drivers, price rides, support driver verification, and improve the service.</w:t>
+      </w:r>
+    </w:p>
+    <w:p>
+      <w:pPr>
+        <w:pStyle w:val="BodyText"/>
+      </w:pPr>
+      <w:r>
+        <w:rPr>
+          <w:bCs/>
+          <w:b/>
+        </w:rPr>
+        <w:t xml:space="preserve">3. Location</w:t>
+      </w:r>
+    </w:p>
+    <w:p>
+      <w:pPr>
+        <w:pStyle w:val="BodyText"/>
+      </w:pPr>
+      <w:r>
+        <w:t xml:space="preserve">Location is used to show pickup/destination and, for drivers, availability. Location is only used while you are using the relevant features of the app.</w:t>
+      </w:r>
+    </w:p>
+    <w:p>
+      <w:pPr>
+        <w:pStyle w:val="BodyText"/>
+      </w:pPr>
+      <w:r>
+        <w:rPr>
+          <w:bCs/>
+          <w:b/>
+        </w:rPr>
+        <w:t xml:space="preserve">4. Data Storage</w:t>
+      </w:r>
+    </w:p>
+    <w:p>
+      <w:pPr>
+        <w:pStyle w:val="BodyText"/>
+      </w:pPr>
+      <w:r>
+        <w:t xml:space="preserve">Account, ride, and profile photo data are stored in Google Firebase. A profile photo is reduced to a small thumbnail before it is stored. Communications with the server are encrypted in transit. TrikRide does not collect card, bank, or any other payment details; fares are paid in cash directly to the driver.</w:t>
+      </w:r>
+    </w:p>
+    <w:p>
+      <w:pPr>
+        <w:pStyle w:val="BodyText"/>
+      </w:pPr>
+      <w:r>
+        <w:rPr>
+          <w:bCs/>
+          <w:b/>
+        </w:rPr>
+        <w:t xml:space="preserve">5. Sharing</w:t>
+      </w:r>
+    </w:p>
+    <w:p>
+      <w:pPr>
+        <w:pStyle w:val="BodyText"/>
+      </w:pPr>
+      <w:r>
+        <w:t xml:space="preserve">A passenger’s ride details are shared with the assigned driver (and vice versa) to complete the ride. Administrators can view driver records and ride logs to operate and monitor the service. We do not sell your personal information.</w:t>
+      </w:r>
+    </w:p>
+    <w:p>
+      <w:pPr>
+        <w:pStyle w:val="BodyText"/>
+      </w:pPr>
+      <w:r>
+        <w:rPr>
+          <w:bCs/>
+          <w:b/>
+        </w:rPr>
+        <w:t xml:space="preserve">6. Your Choices</w:t>
+      </w:r>
+    </w:p>
+    <w:p>
+      <w:pPr>
+        <w:pStyle w:val="BodyText"/>
+      </w:pPr>
+      <w:r>
+        <w:t xml:space="preserve">You can edit your profile details and sign out at any time. You may request account concerns or corrections through the Support feature.</w:t>
+      </w:r>
+    </w:p>
+    <w:p>
+      <w:pPr>
+        <w:pStyle w:val="BodyText"/>
+      </w:pPr>
+      <w:r>
+        <w:rPr>
+          <w:bCs/>
+          <w:b/>
+        </w:rPr>
+        <w:t xml:space="preserve">7. Children</w:t>
+      </w:r>
+    </w:p>
+    <w:p>
+      <w:pPr>
+        <w:pStyle w:val="BodyText"/>
+      </w:pPr>
+      <w:r>
+        <w:t xml:space="preserve">The service is intended for members of the college community and is not directed at children under 13.</w:t>
+      </w:r>
+    </w:p>
+    <w:p>
+      <w:pPr>
+        <w:pStyle w:val="BodyText"/>
+      </w:pPr>
+      <w:r>
+        <w:rPr>
+          <w:bCs/>
+          <w:b/>
+        </w:rPr>
+        <w:t xml:space="preserve">8. Contact</w:t>
+      </w:r>
+    </w:p>
+    <w:p>
+      <w:pPr>
+        <w:pStyle w:val="BodyText"/>
+      </w:pPr>
+      <w:r>
+        <w:t xml:space="preserve">For privacy questions, contact the TrikRide support hotline listed in the app.</w:t>
+      </w:r>
+    </w:p>
+    <w:p>
+      <w:pPr>
+        <w:pStyle w:val="BodyText"/>
+      </w:pPr>
+      <w:r>
+        <w:rPr>
+          <w:bCs/>
+          <w:b/>
+        </w:rPr>
+        <w:t xml:space="preserve">9. Driver’s License Photographs</w:t>
+      </w:r>
+    </w:p>
+    <w:p>
+      <w:pPr>
+        <w:pStyle w:val="BodyText"/>
+      </w:pPr>
+      <w:r>
+        <w:t xml:space="preserve">This section applies only to drivers, and only to the photograph of the license itself.</w:t>
+      </w:r>
+    </w:p>
+    <w:p>
+      <w:pPr>
+        <w:pStyle w:val="BodyText"/>
+      </w:pPr>
+      <w:r>
+        <w:t xml:space="preserve">Purpose. The photograph is used for one thing: to confirm that the person applying to carry passengers holds the license they say they hold, and to check it again when that license expires. It is not used for anything else.</w:t>
+      </w:r>
+    </w:p>
+    <w:p>
+      <w:pPr>
+        <w:pStyle w:val="BodyText"/>
+      </w:pPr>
+      <w:r>
+        <w:t xml:space="preserve">Who can see it. You, and a TrikRide administrator. It is never shown to passengers, never attached to a ride, and never included in any exported report.</w:t>
+      </w:r>
+    </w:p>
+    <w:p>
+      <w:pPr>
+        <w:pStyle w:val="BodyText"/>
+      </w:pPr>
+      <w:r>
+        <w:t xml:space="preserve">How long we keep it. If your application is refused, the photograph is deleted at the moment of that decision. If you are approved, it is kept while your account is active, because it is needed again at renewal and if a concern about a ride is ever disputed. Withdrawing an approval already given is not the same as refusing an application and does not delete the photograph, for that same reason. It is deleted with your account.</w:t>
+      </w:r>
+    </w:p>
+    <w:p>
+      <w:pPr>
+        <w:pStyle w:val="BodyText"/>
+      </w:pPr>
+      <w:r>
+        <w:t xml:space="preserve">Your control. You may remove the photograph yourself at any time from your driver profile. Removing it means you cannot be approved to carry passengers until you provide another one.</w:t>
+      </w:r>
+    </w:p>
+    <w:p>
+      <w:pPr>
+        <w:pStyle w:val="BodyText"/>
+      </w:pPr>
+      <w:r>
+        <w:t xml:space="preserve">How it is stored. Separately from your account record, so that ordinary use of the app never reads it, and reduced in size before it is stored. Communications are encrypted in transit.</w:t>
+      </w:r>
+    </w:p>
+    <w:p>
+      <w:r>
+        <w:br w:type="page"/>
+      </w:r>
+    </w:p>
+    <w:bookmarkEnd w:id="175"/>
+    <w:bookmarkStart w:id="176" w:name="d.3-safety-and-community-guidelines"/>
+    <w:p>
+      <w:pPr>
+        <w:pStyle w:val="Heading3"/>
+      </w:pPr>
+      <w:r>
+        <w:t xml:space="preserve">D.3 Safety and Community Guidelines</w:t>
+      </w:r>
+    </w:p>
+    <w:p>
+      <w:pPr>
+        <w:pStyle w:val="FirstParagraph"/>
+      </w:pPr>
       <w:r>
         <w:rPr>
           <w:iCs/>
           <w:i/>
         </w:rPr>
-        <w:t xml:space="preserve"> </w:t>
-      </w:r>
-      <w:r>
-        <w:rPr>
-          <w:iCs/>
-          <w:i/>
-        </w:rPr>
-        <w:t xml:space="preserve">reproduced verbatim from the issued documents; the source is</w:t>
-      </w:r>
-      <w:r>
-        <w:rPr>
-          <w:iCs/>
-          <w:i/>
-        </w:rPr>
-        <w:t xml:space="preserve"> </w:t>
-      </w:r>
-      <w:r>
-        <w:rPr>
-          <w:rStyle w:val="VerbatimChar"/>
-          <w:iCs/>
-          <w:i/>
-        </w:rPr>
-        <w:t xml:space="preserve">app/src/main/java/com/tpc/trikride/ui/screens/LegalScreen.kt</w:t>
-      </w:r>
-      <w:r>
-        <w:rPr>
-          <w:iCs/>
-          <w:i/>
-        </w:rPr>
-        <w:t xml:space="preserve">.]</w:t>
-      </w:r>
-    </w:p>
-    <w:bookmarkEnd w:id="174"/>
-    <w:bookmarkStart w:id="175" w:name="appendix-e-interview-guide"/>
-    <w:p>
-      <w:pPr>
-        <w:pStyle w:val="Heading2"/>
-      </w:pPr>
-      <w:r>
-        <w:t xml:space="preserve">Appendix E — Interview Guide</w:t>
-      </w:r>
-    </w:p>
-    <w:p>
-      <w:pPr>
-        <w:pStyle w:val="FirstParagraph"/>
-      </w:pPr>
-      <w:r>
-        <w:t xml:space="preserve">Semi-structured interviews are to be conducted with officers of the drivers’ association and with a subset of driver-respondents, to obtain context that a rating scale cannot capture.</w:t>
+        <w:t xml:space="preserve">Effective Date: July 28, 2026</w:t>
       </w:r>
     </w:p>
     <w:p>
@@ -26890,7 +27465,27 @@
           <w:bCs/>
           <w:b/>
         </w:rPr>
-        <w:t xml:space="preserve">For officers of the Federation of Tricycle Operators and Drivers Association of Talibon</w:t>
+        <w:t xml:space="preserve">Our Commitment</w:t>
+      </w:r>
+    </w:p>
+    <w:p>
+      <w:pPr>
+        <w:pStyle w:val="BodyText"/>
+      </w:pPr>
+      <w:r>
+        <w:t xml:space="preserve">TrikRide is committed to providing a safe, respectful, and reliable transportation environment for students, drivers, faculty, and staff.</w:t>
+      </w:r>
+    </w:p>
+    <w:p>
+      <w:pPr>
+        <w:pStyle w:val="BodyText"/>
+      </w:pPr>
+      <w:r>
+        <w:rPr>
+          <w:bCs/>
+          <w:b/>
+        </w:rPr>
+        <w:t xml:space="preserve">Respect Everyone</w:t>
       </w:r>
     </w:p>
     <w:p>
@@ -26902,7 +27497,7 @@
         <w:pStyle w:val="Compact"/>
       </w:pPr>
       <w:r>
-        <w:t xml:space="preserve">How is the current fare schedule set, published, and revised?</w:t>
+        <w:t xml:space="preserve">Treat all users with courtesy and professionalism.</w:t>
       </w:r>
     </w:p>
     <w:p>
@@ -26914,7 +27509,7 @@
         <w:pStyle w:val="Compact"/>
       </w:pPr>
       <w:r>
-        <w:t xml:space="preserve">How are fare disputes between a driver and a passenger resolved at present?</w:t>
+        <w:t xml:space="preserve">Avoid abusive, offensive, discriminatory, or threatening language.</w:t>
       </w:r>
     </w:p>
     <w:p>
@@ -26926,31 +27521,7 @@
         <w:pStyle w:val="Compact"/>
       </w:pPr>
       <w:r>
-        <w:t xml:space="preserve">Is there any existing register of drivers operating in the municipality, and who maintains it?</w:t>
-      </w:r>
-    </w:p>
-    <w:p>
-      <w:pPr>
-        <w:numPr>
-          <w:ilvl w:val="0"/>
-          <w:numId w:val="1012"/>
-        </w:numPr>
-        <w:pStyle w:val="Compact"/>
-      </w:pPr>
-      <w:r>
-        <w:t xml:space="preserve">What would the association need to see before endorsing an application of this kind to its members?</w:t>
-      </w:r>
-    </w:p>
-    <w:p>
-      <w:pPr>
-        <w:numPr>
-          <w:ilvl w:val="0"/>
-          <w:numId w:val="1012"/>
-        </w:numPr>
-        <w:pStyle w:val="Compact"/>
-      </w:pPr>
-      <w:r>
-        <w:t xml:space="preserve">What concerns would members raise about a system that records their trips?</w:t>
+        <w:t xml:space="preserve">Respect personal space and privacy.</w:t>
       </w:r>
     </w:p>
     <w:p>
@@ -26962,7 +27533,7 @@
           <w:bCs/>
           <w:b/>
         </w:rPr>
-        <w:t xml:space="preserve">For driver-respondents</w:t>
+        <w:t xml:space="preserve">Safe Riding</w:t>
       </w:r>
     </w:p>
     <w:p>
@@ -26974,7 +27545,7 @@
         <w:pStyle w:val="Compact"/>
       </w:pPr>
       <w:r>
-        <w:t xml:space="preserve">Walk me through a typical day. Where do you wait, and how do you decide where to go next?</w:t>
+        <w:t xml:space="preserve">Wait at the designated pickup location.</w:t>
       </w:r>
     </w:p>
     <w:p>
@@ -26986,7 +27557,7 @@
         <w:pStyle w:val="Compact"/>
       </w:pPr>
       <w:r>
-        <w:t xml:space="preserve">Roughly how much of your working day is spent without a passenger?</w:t>
+        <w:t xml:space="preserve">Verify the driver’s identity before boarding.</w:t>
       </w:r>
     </w:p>
     <w:p>
@@ -26998,7 +27569,7 @@
         <w:pStyle w:val="Compact"/>
       </w:pPr>
       <w:r>
-        <w:t xml:space="preserve">How do you handle a passenger who disputes the fare?</w:t>
+        <w:t xml:space="preserve">Follow the driver’s safety instructions during the trip.</w:t>
       </w:r>
     </w:p>
     <w:p>
@@ -27010,7 +27581,7 @@
         <w:pStyle w:val="Compact"/>
       </w:pPr>
       <w:r>
-        <w:t xml:space="preserve">What would make you stop using an application like this one?</w:t>
+        <w:t xml:space="preserve">Remain seated while the vehicle is moving.</w:t>
       </w:r>
     </w:p>
     <w:p>
@@ -27022,7 +27593,7 @@
         <w:pStyle w:val="Compact"/>
       </w:pPr>
       <w:r>
-        <w:t xml:space="preserve">Is there anything the application asks you to do that gets in the way while you are driving?</w:t>
+        <w:t xml:space="preserve">Do not distract the driver while driving.</w:t>
       </w:r>
     </w:p>
     <w:p>
@@ -27034,7 +27605,650 @@
           <w:bCs/>
           <w:b/>
         </w:rPr>
-        <w:t xml:space="preserve">For passenger-respondents</w:t>
+        <w:t xml:space="preserve">Driver Responsibilities</w:t>
+      </w:r>
+    </w:p>
+    <w:p>
+      <w:pPr>
+        <w:pStyle w:val="BodyText"/>
+      </w:pPr>
+      <w:r>
+        <w:t xml:space="preserve">Drivers are expected to:</w:t>
+      </w:r>
+      <w:r>
+        <w:t xml:space="preserve"> </w:t>
+      </w:r>
+      <w:r>
+        <w:t xml:space="preserve">- Drive safely and obey all traffic laws.</w:t>
+      </w:r>
+      <w:r>
+        <w:t xml:space="preserve"> </w:t>
+      </w:r>
+      <w:r>
+        <w:t xml:space="preserve">- Maintain a roadworthy and clean vehicle.</w:t>
+      </w:r>
+      <w:r>
+        <w:t xml:space="preserve"> </w:t>
+      </w:r>
+      <w:r>
+        <w:t xml:space="preserve">- Arrive at pickup locations as promptly as possible.</w:t>
+      </w:r>
+      <w:r>
+        <w:t xml:space="preserve"> </w:t>
+      </w:r>
+      <w:r>
+        <w:t xml:space="preserve">- Treat every passenger fairly and respectfully.</w:t>
+      </w:r>
+      <w:r>
+        <w:t xml:space="preserve"> </w:t>
+      </w:r>
+      <w:r>
+        <w:t xml:space="preserve">- Never operate a vehicle while under the influence of alcohol or illegal drugs.</w:t>
+      </w:r>
+    </w:p>
+    <w:p>
+      <w:pPr>
+        <w:pStyle w:val="BodyText"/>
+      </w:pPr>
+      <w:r>
+        <w:rPr>
+          <w:bCs/>
+          <w:b/>
+        </w:rPr>
+        <w:t xml:space="preserve">Passenger Responsibilities</w:t>
+      </w:r>
+    </w:p>
+    <w:p>
+      <w:pPr>
+        <w:pStyle w:val="BodyText"/>
+      </w:pPr>
+      <w:r>
+        <w:t xml:space="preserve">Passengers are expected to:</w:t>
+      </w:r>
+      <w:r>
+        <w:t xml:space="preserve"> </w:t>
+      </w:r>
+      <w:r>
+        <w:t xml:space="preserve">- Arrive on time for scheduled pickups.</w:t>
+      </w:r>
+      <w:r>
+        <w:t xml:space="preserve"> </w:t>
+      </w:r>
+      <w:r>
+        <w:t xml:space="preserve">- Respect the driver’s vehicle and property.</w:t>
+      </w:r>
+      <w:r>
+        <w:t xml:space="preserve"> </w:t>
+      </w:r>
+      <w:r>
+        <w:t xml:space="preserve">- Avoid behavior that may endanger others.</w:t>
+      </w:r>
+      <w:r>
+        <w:t xml:space="preserve"> </w:t>
+      </w:r>
+      <w:r>
+        <w:t xml:space="preserve">- Report emergencies or unsafe situations immediately.</w:t>
+      </w:r>
+    </w:p>
+    <w:p>
+      <w:pPr>
+        <w:pStyle w:val="BodyText"/>
+      </w:pPr>
+      <w:r>
+        <w:rPr>
+          <w:bCs/>
+          <w:b/>
+        </w:rPr>
+        <w:t xml:space="preserve">Prohibited Conduct</w:t>
+      </w:r>
+    </w:p>
+    <w:p>
+      <w:pPr>
+        <w:pStyle w:val="BodyText"/>
+      </w:pPr>
+      <w:r>
+        <w:t xml:space="preserve">The following are strictly prohibited:</w:t>
+      </w:r>
+      <w:r>
+        <w:t xml:space="preserve"> </w:t>
+      </w:r>
+      <w:r>
+        <w:t xml:space="preserve">- Violence or physical assault.</w:t>
+      </w:r>
+      <w:r>
+        <w:t xml:space="preserve"> </w:t>
+      </w:r>
+      <w:r>
+        <w:t xml:space="preserve">- Sexual harassment or misconduct.</w:t>
+      </w:r>
+      <w:r>
+        <w:t xml:space="preserve"> </w:t>
+      </w:r>
+      <w:r>
+        <w:t xml:space="preserve">- Bullying, intimidation, or discrimination.</w:t>
+      </w:r>
+      <w:r>
+        <w:t xml:space="preserve"> </w:t>
+      </w:r>
+      <w:r>
+        <w:t xml:space="preserve">- Possession or use of illegal drugs.</w:t>
+      </w:r>
+      <w:r>
+        <w:t xml:space="preserve"> </w:t>
+      </w:r>
+      <w:r>
+        <w:t xml:space="preserve">- Carrying dangerous weapons or prohibited items.</w:t>
+      </w:r>
+      <w:r>
+        <w:t xml:space="preserve"> </w:t>
+      </w:r>
+      <w:r>
+        <w:t xml:space="preserve">- Vandalism or intentional damage to vehicles.</w:t>
+      </w:r>
+      <w:r>
+        <w:t xml:space="preserve"> </w:t>
+      </w:r>
+      <w:r>
+        <w:t xml:space="preserve">- Providing false information or fake bookings.</w:t>
+      </w:r>
+    </w:p>
+    <w:p>
+      <w:pPr>
+        <w:pStyle w:val="BodyText"/>
+      </w:pPr>
+      <w:r>
+        <w:rPr>
+          <w:bCs/>
+          <w:b/>
+        </w:rPr>
+        <w:t xml:space="preserve">Reporting Safety Concerns</w:t>
+      </w:r>
+    </w:p>
+    <w:p>
+      <w:pPr>
+        <w:pStyle w:val="BodyText"/>
+      </w:pPr>
+      <w:r>
+        <w:t xml:space="preserve">Users are encouraged to report:</w:t>
+      </w:r>
+      <w:r>
+        <w:t xml:space="preserve"> </w:t>
+      </w:r>
+      <w:r>
+        <w:t xml:space="preserve">- Unsafe driving.</w:t>
+      </w:r>
+      <w:r>
+        <w:t xml:space="preserve"> </w:t>
+      </w:r>
+      <w:r>
+        <w:t xml:space="preserve">- Harassment or inappropriate behavior.</w:t>
+      </w:r>
+      <w:r>
+        <w:t xml:space="preserve"> </w:t>
+      </w:r>
+      <w:r>
+        <w:t xml:space="preserve">- Fake accounts or fraudulent activities.</w:t>
+      </w:r>
+      <w:r>
+        <w:t xml:space="preserve"> </w:t>
+      </w:r>
+      <w:r>
+        <w:t xml:space="preserve">- Vehicle safety issues.</w:t>
+      </w:r>
+      <w:r>
+        <w:t xml:space="preserve"> </w:t>
+      </w:r>
+      <w:r>
+        <w:t xml:space="preserve">- Lost belongings.</w:t>
+      </w:r>
+    </w:p>
+    <w:p>
+      <w:pPr>
+        <w:pStyle w:val="BodyText"/>
+      </w:pPr>
+      <w:r>
+        <w:t xml:space="preserve">Reports will be reviewed by authorized administrators, and appropriate action may be taken. Use the Support tab to file a report.</w:t>
+      </w:r>
+    </w:p>
+    <w:p>
+      <w:pPr>
+        <w:pStyle w:val="BodyText"/>
+      </w:pPr>
+      <w:r>
+        <w:rPr>
+          <w:bCs/>
+          <w:b/>
+        </w:rPr>
+        <w:t xml:space="preserve">Account Enforcement</w:t>
+      </w:r>
+    </w:p>
+    <w:p>
+      <w:pPr>
+        <w:pStyle w:val="BodyText"/>
+      </w:pPr>
+      <w:r>
+        <w:t xml:space="preserve">Violations of these Community Guidelines may result in:</w:t>
+      </w:r>
+      <w:r>
+        <w:t xml:space="preserve"> </w:t>
+      </w:r>
+      <w:r>
+        <w:t xml:space="preserve">- Warning notices.</w:t>
+      </w:r>
+      <w:r>
+        <w:t xml:space="preserve"> </w:t>
+      </w:r>
+      <w:r>
+        <w:t xml:space="preserve">- Temporary account suspension.</w:t>
+      </w:r>
+      <w:r>
+        <w:t xml:space="preserve"> </w:t>
+      </w:r>
+      <w:r>
+        <w:t xml:space="preserve">- Permanent account removal.</w:t>
+      </w:r>
+      <w:r>
+        <w:t xml:space="preserve"> </w:t>
+      </w:r>
+      <w:r>
+        <w:t xml:space="preserve">- Referral to school authorities or law enforcement when necessary.</w:t>
+      </w:r>
+    </w:p>
+    <w:p>
+      <w:pPr>
+        <w:pStyle w:val="BodyText"/>
+      </w:pPr>
+      <w:r>
+        <w:t xml:space="preserve">By using TrikRide, all users agree to help maintain a safe, respectful, and welcoming community.</w:t>
+      </w:r>
+    </w:p>
+    <w:p>
+      <w:r>
+        <w:br w:type="page"/>
+      </w:r>
+    </w:p>
+    <w:bookmarkEnd w:id="176"/>
+    <w:bookmarkStart w:id="177" w:name="d.4-driver-agreement"/>
+    <w:p>
+      <w:pPr>
+        <w:pStyle w:val="Heading3"/>
+      </w:pPr>
+      <w:r>
+        <w:t xml:space="preserve">D.4 Driver Agreement</w:t>
+      </w:r>
+    </w:p>
+    <w:p>
+      <w:pPr>
+        <w:pStyle w:val="FirstParagraph"/>
+      </w:pPr>
+      <w:r>
+        <w:rPr>
+          <w:iCs/>
+          <w:i/>
+        </w:rPr>
+        <w:t xml:space="preserve">Effective Date: August 16, 2026</w:t>
+      </w:r>
+    </w:p>
+    <w:p>
+      <w:pPr>
+        <w:pStyle w:val="BodyText"/>
+      </w:pPr>
+      <w:r>
+        <w:t xml:space="preserve">This Driver Agreement establishes the responsibilities and expectations for all drivers using the TrikRide platform.</w:t>
+      </w:r>
+    </w:p>
+    <w:p>
+      <w:pPr>
+        <w:pStyle w:val="BodyText"/>
+      </w:pPr>
+      <w:r>
+        <w:rPr>
+          <w:bCs/>
+          <w:b/>
+        </w:rPr>
+        <w:t xml:space="preserve">Driver Eligibility</w:t>
+      </w:r>
+    </w:p>
+    <w:p>
+      <w:pPr>
+        <w:pStyle w:val="BodyText"/>
+      </w:pPr>
+      <w:r>
+        <w:t xml:space="preserve">To become a TrikRide driver, you must:</w:t>
+      </w:r>
+      <w:r>
+        <w:t xml:space="preserve"> </w:t>
+      </w:r>
+      <w:r>
+        <w:t xml:space="preserve">- Be at least 18 years old.</w:t>
+      </w:r>
+      <w:r>
+        <w:t xml:space="preserve"> </w:t>
+      </w:r>
+      <w:r>
+        <w:t xml:space="preserve">- Possess a valid driver’s license appropriate for the vehicle operated.</w:t>
+      </w:r>
+      <w:r>
+        <w:t xml:space="preserve"> </w:t>
+      </w:r>
+      <w:r>
+        <w:t xml:space="preserve">- Operate a legally registered tricycle or authorized vehicle.</w:t>
+      </w:r>
+      <w:r>
+        <w:t xml:space="preserve"> </w:t>
+      </w:r>
+      <w:r>
+        <w:t xml:space="preserve">- Submit a legible photograph of that license for verification, and keep a current one on file.</w:t>
+      </w:r>
+      <w:r>
+        <w:t xml:space="preserve"> </w:t>
+      </w:r>
+      <w:r>
+        <w:t xml:space="preserve">- Complete the registration and verification process required by TrikRide.</w:t>
+      </w:r>
+    </w:p>
+    <w:p>
+      <w:pPr>
+        <w:pStyle w:val="BodyText"/>
+      </w:pPr>
+      <w:r>
+        <w:rPr>
+          <w:bCs/>
+          <w:b/>
+        </w:rPr>
+        <w:t xml:space="preserve">Your License Photograph</w:t>
+      </w:r>
+    </w:p>
+    <w:p>
+      <w:pPr>
+        <w:pStyle w:val="BodyText"/>
+      </w:pPr>
+      <w:r>
+        <w:t xml:space="preserve">The photograph you submit is checked by an administrator against the license details you entered, and again when the license expires. Only you and an administrator can view it; it is never shown to passengers. If your application is refused it is deleted immediately. If you are approved it is kept while your account is active and deleted with the account; that remains so if your approval is later withdrawn, since the reason for withdrawing it may itself need to be evidenced. You may remove it yourself at any time, though you cannot carry passengers without one on file. Section 9 of the Privacy Policy sets this out in full.</w:t>
+      </w:r>
+    </w:p>
+    <w:p>
+      <w:pPr>
+        <w:pStyle w:val="BodyText"/>
+      </w:pPr>
+      <w:r>
+        <w:t xml:space="preserve">TrikRide checks that a document was presented and that it matches what you entered. It does not and cannot confirm with the Land Transportation Office that a license is current or has not been suspended. Driving on a valid license remains your responsibility, and submitting a false or altered document ends your access to the platform.</w:t>
+      </w:r>
+    </w:p>
+    <w:p>
+      <w:pPr>
+        <w:pStyle w:val="BodyText"/>
+      </w:pPr>
+      <w:r>
+        <w:rPr>
+          <w:bCs/>
+          <w:b/>
+        </w:rPr>
+        <w:t xml:space="preserve">Driver Responsibilities</w:t>
+      </w:r>
+    </w:p>
+    <w:p>
+      <w:pPr>
+        <w:pStyle w:val="BodyText"/>
+      </w:pPr>
+      <w:r>
+        <w:t xml:space="preserve">Drivers agree to:</w:t>
+      </w:r>
+      <w:r>
+        <w:t xml:space="preserve"> </w:t>
+      </w:r>
+      <w:r>
+        <w:t xml:space="preserve">- Provide accurate personal and vehicle information.</w:t>
+      </w:r>
+      <w:r>
+        <w:t xml:space="preserve"> </w:t>
+      </w:r>
+      <w:r>
+        <w:t xml:space="preserve">- Keep account information updated.</w:t>
+      </w:r>
+      <w:r>
+        <w:t xml:space="preserve"> </w:t>
+      </w:r>
+      <w:r>
+        <w:t xml:space="preserve">- Drive safely and comply with all traffic laws.</w:t>
+      </w:r>
+      <w:r>
+        <w:t xml:space="preserve"> </w:t>
+      </w:r>
+      <w:r>
+        <w:t xml:space="preserve">- Treat all passengers respectfully and without discrimination.</w:t>
+      </w:r>
+      <w:r>
+        <w:t xml:space="preserve"> </w:t>
+      </w:r>
+      <w:r>
+        <w:t xml:space="preserve">- Arrive at pickup locations as promptly as possible.</w:t>
+      </w:r>
+      <w:r>
+        <w:t xml:space="preserve"> </w:t>
+      </w:r>
+      <w:r>
+        <w:t xml:space="preserve">- Notify passengers through the app if delays occur.</w:t>
+      </w:r>
+      <w:r>
+        <w:t xml:space="preserve"> </w:t>
+      </w:r>
+      <w:r>
+        <w:t xml:space="preserve">- Maintain a clean and safe vehicle.</w:t>
+      </w:r>
+    </w:p>
+    <w:p>
+      <w:pPr>
+        <w:pStyle w:val="BodyText"/>
+      </w:pPr>
+      <w:r>
+        <w:rPr>
+          <w:bCs/>
+          <w:b/>
+        </w:rPr>
+        <w:t xml:space="preserve">Professional Conduct</w:t>
+      </w:r>
+    </w:p>
+    <w:p>
+      <w:pPr>
+        <w:pStyle w:val="BodyText"/>
+      </w:pPr>
+      <w:r>
+        <w:t xml:space="preserve">Drivers shall:</w:t>
+      </w:r>
+      <w:r>
+        <w:t xml:space="preserve"> </w:t>
+      </w:r>
+      <w:r>
+        <w:t xml:space="preserve">- Wear appropriate attire while providing transportation services.</w:t>
+      </w:r>
+      <w:r>
+        <w:t xml:space="preserve"> </w:t>
+      </w:r>
+      <w:r>
+        <w:t xml:space="preserve">- Avoid abusive or inappropriate language.</w:t>
+      </w:r>
+      <w:r>
+        <w:t xml:space="preserve"> </w:t>
+      </w:r>
+      <w:r>
+        <w:t xml:space="preserve">- Respect passenger privacy.</w:t>
+      </w:r>
+      <w:r>
+        <w:t xml:space="preserve"> </w:t>
+      </w:r>
+      <w:r>
+        <w:t xml:space="preserve">- Never ask for personal information unrelated to the ride.</w:t>
+      </w:r>
+    </w:p>
+    <w:p>
+      <w:pPr>
+        <w:pStyle w:val="BodyText"/>
+      </w:pPr>
+      <w:r>
+        <w:rPr>
+          <w:bCs/>
+          <w:b/>
+        </w:rPr>
+        <w:t xml:space="preserve">Safety Requirements</w:t>
+      </w:r>
+    </w:p>
+    <w:p>
+      <w:pPr>
+        <w:pStyle w:val="BodyText"/>
+      </w:pPr>
+      <w:r>
+        <w:t xml:space="preserve">Drivers shall never:</w:t>
+      </w:r>
+      <w:r>
+        <w:t xml:space="preserve"> </w:t>
+      </w:r>
+      <w:r>
+        <w:t xml:space="preserve">- Drive while under the influence of alcohol or illegal drugs.</w:t>
+      </w:r>
+      <w:r>
+        <w:t xml:space="preserve"> </w:t>
+      </w:r>
+      <w:r>
+        <w:t xml:space="preserve">- Allow unauthorized persons to operate their registered vehicle.</w:t>
+      </w:r>
+      <w:r>
+        <w:t xml:space="preserve"> </w:t>
+      </w:r>
+      <w:r>
+        <w:t xml:space="preserve">- Accept bookings using another driver’s account.</w:t>
+      </w:r>
+      <w:r>
+        <w:t xml:space="preserve"> </w:t>
+      </w:r>
+      <w:r>
+        <w:t xml:space="preserve">- Endanger passengers through reckless driving.</w:t>
+      </w:r>
+    </w:p>
+    <w:p>
+      <w:pPr>
+        <w:pStyle w:val="BodyText"/>
+      </w:pPr>
+      <w:r>
+        <w:rPr>
+          <w:bCs/>
+          <w:b/>
+        </w:rPr>
+        <w:t xml:space="preserve">Account Suspension or Termination</w:t>
+      </w:r>
+    </w:p>
+    <w:p>
+      <w:pPr>
+        <w:pStyle w:val="BodyText"/>
+      </w:pPr>
+      <w:r>
+        <w:t xml:space="preserve">TrikRide may suspend or terminate a driver’s account for:</w:t>
+      </w:r>
+      <w:r>
+        <w:t xml:space="preserve"> </w:t>
+      </w:r>
+      <w:r>
+        <w:t xml:space="preserve">- Repeated complaints.</w:t>
+      </w:r>
+      <w:r>
+        <w:t xml:space="preserve"> </w:t>
+      </w:r>
+      <w:r>
+        <w:t xml:space="preserve">- Unsafe driving practices.</w:t>
+      </w:r>
+      <w:r>
+        <w:t xml:space="preserve"> </w:t>
+      </w:r>
+      <w:r>
+        <w:t xml:space="preserve">- Fraudulent activity.</w:t>
+      </w:r>
+      <w:r>
+        <w:t xml:space="preserve"> </w:t>
+      </w:r>
+      <w:r>
+        <w:t xml:space="preserve">- Submission of false documents.</w:t>
+      </w:r>
+      <w:r>
+        <w:t xml:space="preserve"> </w:t>
+      </w:r>
+      <w:r>
+        <w:t xml:space="preserve">- Violation of this Agreement or applicable laws.</w:t>
+      </w:r>
+    </w:p>
+    <w:p>
+      <w:pPr>
+        <w:pStyle w:val="BodyText"/>
+      </w:pPr>
+      <w:r>
+        <w:rPr>
+          <w:bCs/>
+          <w:b/>
+        </w:rPr>
+        <w:t xml:space="preserve">Limitation of Responsibility</w:t>
+      </w:r>
+    </w:p>
+    <w:p>
+      <w:pPr>
+        <w:pStyle w:val="BodyText"/>
+      </w:pPr>
+      <w:r>
+        <w:t xml:space="preserve">Drivers acknowledge that TrikRide functions as a ride scheduling and matching platform. Drivers remain responsible for complying with all traffic regulations and for the safe operation of their vehicles.</w:t>
+      </w:r>
+    </w:p>
+    <w:p>
+      <w:pPr>
+        <w:pStyle w:val="BodyText"/>
+      </w:pPr>
+      <w:r>
+        <w:rPr>
+          <w:bCs/>
+          <w:b/>
+        </w:rPr>
+        <w:t xml:space="preserve">Agreement</w:t>
+      </w:r>
+    </w:p>
+    <w:p>
+      <w:pPr>
+        <w:pStyle w:val="BodyText"/>
+      </w:pPr>
+      <w:r>
+        <w:t xml:space="preserve">By registering as a TrikRide driver, you confirm that you have read, understood, and agreed to abide by this Driver Agreement.</w:t>
+      </w:r>
+    </w:p>
+    <w:p>
+      <w:r>
+        <w:br w:type="page"/>
+      </w:r>
+    </w:p>
+    <w:bookmarkEnd w:id="177"/>
+    <w:bookmarkEnd w:id="178"/>
+    <w:bookmarkStart w:id="179" w:name="appendix-e-interview-guide"/>
+    <w:p>
+      <w:pPr>
+        <w:pStyle w:val="Heading2"/>
+      </w:pPr>
+      <w:r>
+        <w:t xml:space="preserve">Appendix E — Interview Guide</w:t>
+      </w:r>
+    </w:p>
+    <w:p>
+      <w:pPr>
+        <w:pStyle w:val="FirstParagraph"/>
+      </w:pPr>
+      <w:r>
+        <w:t xml:space="preserve">Semi-structured interviews are to be conducted with officers of the drivers’ association and with a subset of driver-respondents, to obtain context that a rating scale cannot capture.</w:t>
+      </w:r>
+    </w:p>
+    <w:p>
+      <w:pPr>
+        <w:pStyle w:val="BodyText"/>
+      </w:pPr>
+      <w:r>
+        <w:rPr>
+          <w:bCs/>
+          <w:b/>
+        </w:rPr>
+        <w:t xml:space="preserve">For officers of the Federation of Tricycle Operators and Drivers Association of Talibon</w:t>
       </w:r>
     </w:p>
     <w:p>
@@ -27046,7 +28260,7 @@
         <w:pStyle w:val="Compact"/>
       </w:pPr>
       <w:r>
-        <w:t xml:space="preserve">Describe the last time you had difficulty getting a tricycle to or from the campus.</w:t>
+        <w:t xml:space="preserve">How is the current fare schedule set, published, and revised?</w:t>
       </w:r>
     </w:p>
     <w:p>
@@ -27058,7 +28272,7 @@
         <w:pStyle w:val="Compact"/>
       </w:pPr>
       <w:r>
-        <w:t xml:space="preserve">Before this study, did you know there was an official fare schedule?</w:t>
+        <w:t xml:space="preserve">How are fare disputes between a driver and a passenger resolved at present?</w:t>
       </w:r>
     </w:p>
     <w:p>
@@ -27070,17 +28284,31 @@
         <w:pStyle w:val="Compact"/>
       </w:pPr>
       <w:r>
-        <w:t xml:space="preserve">What would make you go back to hailing at the roadside instead of using the application?</w:t>
-      </w:r>
-    </w:p>
-    <w:bookmarkEnd w:id="175"/>
-    <w:bookmarkStart w:id="176" w:name="appendix-f-evaluation-forms"/>
-    <w:p>
-      <w:pPr>
-        <w:pStyle w:val="Heading2"/>
-      </w:pPr>
-      <w:r>
-        <w:t xml:space="preserve">Appendix F — Evaluation Forms</w:t>
+        <w:t xml:space="preserve">Is there any existing register of drivers operating in the municipality, and who maintains it?</w:t>
+      </w:r>
+    </w:p>
+    <w:p>
+      <w:pPr>
+        <w:numPr>
+          <w:ilvl w:val="0"/>
+          <w:numId w:val="1014"/>
+        </w:numPr>
+        <w:pStyle w:val="Compact"/>
+      </w:pPr>
+      <w:r>
+        <w:t xml:space="preserve">What would the association need to see before endorsing an application of this kind to its members?</w:t>
+      </w:r>
+    </w:p>
+    <w:p>
+      <w:pPr>
+        <w:numPr>
+          <w:ilvl w:val="0"/>
+          <w:numId w:val="1014"/>
+        </w:numPr>
+        <w:pStyle w:val="Compact"/>
+      </w:pPr>
+      <w:r>
+        <w:t xml:space="preserve">What concerns would members raise about a system that records their trips?</w:t>
       </w:r>
     </w:p>
     <w:p>
@@ -27088,29 +28316,11 @@
         <w:pStyle w:val="FirstParagraph"/>
       </w:pPr>
       <w:r>
-        <w:t xml:space="preserve">The evaluation form administered to respondents is the System Evaluation Questionnaire reproduced as Appendix C. The content validation form completed by the research adviser and subject matter experts, and the pilot test feedback form, are to be inserted here as signed copies.</w:t>
-      </w:r>
-    </w:p>
-    <w:bookmarkEnd w:id="176"/>
-    <w:bookmarkStart w:id="177" w:name="appendix-g-system-screenshots"/>
-    <w:p>
-      <w:pPr>
-        <w:pStyle w:val="Heading2"/>
-      </w:pPr>
-      <w:r>
-        <w:t xml:space="preserve">Appendix G — System Screenshots</w:t>
-      </w:r>
-    </w:p>
-    <w:p>
-      <w:pPr>
-        <w:pStyle w:val="FirstParagraph"/>
-      </w:pPr>
-      <w:r>
-        <w:rPr>
-          <w:iCs/>
-          <w:i/>
-        </w:rPr>
-        <w:t xml:space="preserve">[Screenshots are to be captured from the running application and inserted here. The following set is recommended, covering every module in Table 15.]</w:t>
+        <w:rPr>
+          <w:bCs/>
+          <w:b/>
+        </w:rPr>
+        <w:t xml:space="preserve">For driver-respondents</w:t>
       </w:r>
     </w:p>
     <w:p>
@@ -27122,7 +28332,7 @@
         <w:pStyle w:val="Compact"/>
       </w:pPr>
       <w:r>
-        <w:t xml:space="preserve">Onboarding carousel, first and final slides</w:t>
+        <w:t xml:space="preserve">Walk me through a typical day. Where do you wait, and how do you decide where to go next?</w:t>
       </w:r>
     </w:p>
     <w:p>
@@ -27134,7 +28344,7 @@
         <w:pStyle w:val="Compact"/>
       </w:pPr>
       <w:r>
-        <w:t xml:space="preserve">Welcome-back screen</w:t>
+        <w:t xml:space="preserve">Roughly how much of your working day is spent without a passenger?</w:t>
       </w:r>
     </w:p>
     <w:p>
@@ -27146,7 +28356,7 @@
         <w:pStyle w:val="Compact"/>
       </w:pPr>
       <w:r>
-        <w:t xml:space="preserve">Registration screen showing the live password rule checklist</w:t>
+        <w:t xml:space="preserve">How do you handle a passenger who disputes the fare?</w:t>
       </w:r>
     </w:p>
     <w:p>
@@ -27158,7 +28368,7 @@
         <w:pStyle w:val="Compact"/>
       </w:pPr>
       <w:r>
-        <w:t xml:space="preserve">Sign-in screen with remembered email</w:t>
+        <w:t xml:space="preserve">What would make you stop using an application like this one?</w:t>
       </w:r>
     </w:p>
     <w:p>
@@ -27170,287 +28380,435 @@
         <w:pStyle w:val="Compact"/>
       </w:pPr>
       <w:r>
-        <w:t xml:space="preserve">Passenger home with no active ride</w:t>
+        <w:t xml:space="preserve">Is there anything the application asks you to do that gets in the way while you are driving?</w:t>
+      </w:r>
+    </w:p>
+    <w:p>
+      <w:pPr>
+        <w:pStyle w:val="FirstParagraph"/>
+      </w:pPr>
+      <w:r>
+        <w:rPr>
+          <w:bCs/>
+          <w:b/>
+        </w:rPr>
+        <w:t xml:space="preserve">For passenger-respondents</w:t>
       </w:r>
     </w:p>
     <w:p>
       <w:pPr>
         <w:numPr>
           <w:ilvl w:val="0"/>
-          <w:numId w:val="1015"/>
+          <w:numId w:val="1016"/>
         </w:numPr>
         <w:pStyle w:val="Compact"/>
       </w:pPr>
       <w:r>
-        <w:t xml:space="preserve">Booking screen with the itemized fare displayed</w:t>
+        <w:t xml:space="preserve">Describe the last time you had difficulty getting a tricycle to or from the campus.</w:t>
       </w:r>
     </w:p>
     <w:p>
       <w:pPr>
         <w:numPr>
           <w:ilvl w:val="0"/>
-          <w:numId w:val="1015"/>
+          <w:numId w:val="1016"/>
         </w:numPr>
         <w:pStyle w:val="Compact"/>
       </w:pPr>
       <w:r>
-        <w:t xml:space="preserve">Destination picker with a search term entered</w:t>
+        <w:t xml:space="preserve">Before this study, did you know there was an official fare schedule?</w:t>
       </w:r>
     </w:p>
     <w:p>
       <w:pPr>
         <w:numPr>
           <w:ilvl w:val="0"/>
-          <w:numId w:val="1015"/>
+          <w:numId w:val="1016"/>
         </w:numPr>
         <w:pStyle w:val="Compact"/>
       </w:pPr>
       <w:r>
-        <w:t xml:space="preserve">Searching for a driver</w:t>
+        <w:t xml:space="preserve">What would make you go back to hailing at the roadside instead of using the application?</w:t>
+      </w:r>
+    </w:p>
+    <w:bookmarkEnd w:id="179"/>
+    <w:bookmarkStart w:id="180" w:name="appendix-f-evaluation-forms"/>
+    <w:p>
+      <w:pPr>
+        <w:pStyle w:val="Heading2"/>
+      </w:pPr>
+      <w:r>
+        <w:t xml:space="preserve">Appendix F — Evaluation Forms</w:t>
+      </w:r>
+    </w:p>
+    <w:p>
+      <w:pPr>
+        <w:pStyle w:val="FirstParagraph"/>
+      </w:pPr>
+      <w:r>
+        <w:t xml:space="preserve">The evaluation form administered to respondents is the System Evaluation Questionnaire reproduced as Appendix C. The content validation form completed by the research adviser and subject matter experts, and the pilot test feedback form, are to be inserted here as signed copies.</w:t>
+      </w:r>
+    </w:p>
+    <w:bookmarkEnd w:id="180"/>
+    <w:bookmarkStart w:id="181" w:name="appendix-g-system-screenshots"/>
+    <w:p>
+      <w:pPr>
+        <w:pStyle w:val="Heading2"/>
+      </w:pPr>
+      <w:r>
+        <w:t xml:space="preserve">Appendix G — System Screenshots</w:t>
+      </w:r>
+    </w:p>
+    <w:p>
+      <w:pPr>
+        <w:pStyle w:val="FirstParagraph"/>
+      </w:pPr>
+      <w:r>
+        <w:rPr>
+          <w:iCs/>
+          <w:i/>
+        </w:rPr>
+        <w:t xml:space="preserve">[Screenshots are to be captured from the running application and inserted here. The following set is recommended, covering every module in Table 15.]</w:t>
       </w:r>
     </w:p>
     <w:p>
       <w:pPr>
         <w:numPr>
           <w:ilvl w:val="0"/>
-          <w:numId w:val="1015"/>
+          <w:numId w:val="1017"/>
         </w:numPr>
         <w:pStyle w:val="Compact"/>
       </w:pPr>
       <w:r>
-        <w:t xml:space="preserve">Ride tracking with the status timeline</w:t>
+        <w:t xml:space="preserve">Onboarding carousel, first and final slides</w:t>
       </w:r>
     </w:p>
     <w:p>
       <w:pPr>
         <w:numPr>
           <w:ilvl w:val="0"/>
-          <w:numId w:val="1015"/>
+          <w:numId w:val="1017"/>
         </w:numPr>
         <w:pStyle w:val="Compact"/>
       </w:pPr>
       <w:r>
-        <w:t xml:space="preserve">Ride completion summary and rating</w:t>
+        <w:t xml:space="preserve">Welcome-back screen</w:t>
       </w:r>
     </w:p>
     <w:p>
       <w:pPr>
         <w:numPr>
           <w:ilvl w:val="0"/>
-          <w:numId w:val="1015"/>
+          <w:numId w:val="1017"/>
         </w:numPr>
         <w:pStyle w:val="Compact"/>
       </w:pPr>
       <w:r>
-        <w:t xml:space="preserve">Passenger ride history</w:t>
+        <w:t xml:space="preserve">Registration screen showing the live password rule checklist</w:t>
       </w:r>
     </w:p>
     <w:p>
       <w:pPr>
         <w:numPr>
           <w:ilvl w:val="0"/>
-          <w:numId w:val="1015"/>
+          <w:numId w:val="1017"/>
         </w:numPr>
         <w:pStyle w:val="Compact"/>
       </w:pPr>
       <w:r>
-        <w:t xml:space="preserve">Concern submission form</w:t>
+        <w:t xml:space="preserve">Sign-in screen with remembered email</w:t>
       </w:r>
     </w:p>
     <w:p>
       <w:pPr>
         <w:numPr>
           <w:ilvl w:val="0"/>
-          <w:numId w:val="1015"/>
+          <w:numId w:val="1017"/>
         </w:numPr>
         <w:pStyle w:val="Compact"/>
       </w:pPr>
       <w:r>
-        <w:t xml:space="preserve">Notification centre with unread items</w:t>
+        <w:t xml:space="preserve">Passenger home with no active ride</w:t>
       </w:r>
     </w:p>
     <w:p>
       <w:pPr>
         <w:numPr>
           <w:ilvl w:val="0"/>
-          <w:numId w:val="1015"/>
+          <w:numId w:val="1017"/>
         </w:numPr>
         <w:pStyle w:val="Compact"/>
       </w:pPr>
       <w:r>
-        <w:t xml:space="preserve">Driver dashboard, offline and online</w:t>
+        <w:t xml:space="preserve">Booking screen with the itemized fare displayed</w:t>
       </w:r>
     </w:p>
     <w:p>
       <w:pPr>
         <w:numPr>
           <w:ilvl w:val="0"/>
-          <w:numId w:val="1015"/>
+          <w:numId w:val="1017"/>
         </w:numPr>
         <w:pStyle w:val="Compact"/>
       </w:pPr>
       <w:r>
-        <w:t xml:space="preserve">Driver request card with countdown</w:t>
+        <w:t xml:space="preserve">Destination picker with a search term entered</w:t>
       </w:r>
     </w:p>
     <w:p>
       <w:pPr>
         <w:numPr>
           <w:ilvl w:val="0"/>
-          <w:numId w:val="1015"/>
+          <w:numId w:val="1017"/>
         </w:numPr>
         <w:pStyle w:val="Compact"/>
       </w:pPr>
       <w:r>
-        <w:t xml:space="preserve">Driver ride in progress with the advance button</w:t>
+        <w:t xml:space="preserve">Searching for a driver</w:t>
       </w:r>
     </w:p>
     <w:p>
       <w:pPr>
         <w:numPr>
           <w:ilvl w:val="0"/>
-          <w:numId w:val="1015"/>
+          <w:numId w:val="1017"/>
         </w:numPr>
         <w:pStyle w:val="Compact"/>
       </w:pPr>
       <w:r>
-        <w:t xml:space="preserve">Driver earnings</w:t>
+        <w:t xml:space="preserve">Ride tracking with the status timeline</w:t>
       </w:r>
     </w:p>
     <w:p>
       <w:pPr>
         <w:numPr>
           <w:ilvl w:val="0"/>
-          <w:numId w:val="1015"/>
+          <w:numId w:val="1017"/>
         </w:numPr>
         <w:pStyle w:val="Compact"/>
       </w:pPr>
       <w:r>
-        <w:t xml:space="preserve">Driver credentials card showing verification status</w:t>
+        <w:t xml:space="preserve">Ride completion summary and rating</w:t>
       </w:r>
     </w:p>
     <w:p>
       <w:pPr>
         <w:numPr>
           <w:ilvl w:val="0"/>
-          <w:numId w:val="1015"/>
+          <w:numId w:val="1017"/>
         </w:numPr>
         <w:pStyle w:val="Compact"/>
       </w:pPr>
       <w:r>
-        <w:t xml:space="preserve">Administrator verification tab with a pending badge</w:t>
+        <w:t xml:space="preserve">Passenger ride history</w:t>
       </w:r>
     </w:p>
     <w:p>
       <w:pPr>
         <w:numPr>
           <w:ilvl w:val="0"/>
-          <w:numId w:val="1015"/>
+          <w:numId w:val="1017"/>
         </w:numPr>
         <w:pStyle w:val="Compact"/>
       </w:pPr>
       <w:r>
-        <w:t xml:space="preserve">Administrator concerns tab with a concern open for review</w:t>
+        <w:t xml:space="preserve">Concern submission form</w:t>
       </w:r>
     </w:p>
     <w:p>
       <w:pPr>
         <w:numPr>
           <w:ilvl w:val="0"/>
-          <w:numId w:val="1015"/>
+          <w:numId w:val="1017"/>
         </w:numPr>
         <w:pStyle w:val="Compact"/>
       </w:pPr>
       <w:r>
-        <w:t xml:space="preserve">Administrator live monitor</w:t>
+        <w:t xml:space="preserve">Notification centre with unread items</w:t>
       </w:r>
     </w:p>
     <w:p>
       <w:pPr>
         <w:numPr>
           <w:ilvl w:val="0"/>
-          <w:numId w:val="1015"/>
+          <w:numId w:val="1017"/>
         </w:numPr>
         <w:pStyle w:val="Compact"/>
       </w:pPr>
       <w:r>
-        <w:t xml:space="preserve">Administrator reports tab with a period selected and the summary shown</w:t>
+        <w:t xml:space="preserve">Driver dashboard, offline and online</w:t>
       </w:r>
     </w:p>
     <w:p>
       <w:pPr>
         <w:numPr>
           <w:ilvl w:val="0"/>
-          <w:numId w:val="1015"/>
+          <w:numId w:val="1017"/>
         </w:numPr>
         <w:pStyle w:val="Compact"/>
       </w:pPr>
       <w:r>
-        <w:t xml:space="preserve">Administrator fare table with a zone filter applied</w:t>
+        <w:t xml:space="preserve">Driver request card with countdown</w:t>
       </w:r>
     </w:p>
     <w:p>
       <w:pPr>
         <w:numPr>
           <w:ilvl w:val="0"/>
-          <w:numId w:val="1015"/>
+          <w:numId w:val="1017"/>
         </w:numPr>
         <w:pStyle w:val="Compact"/>
       </w:pPr>
       <w:r>
-        <w:t xml:space="preserve">Administrator fare table filtered to entries needing review</w:t>
+        <w:t xml:space="preserve">Driver ride in progress with the advance button</w:t>
       </w:r>
     </w:p>
     <w:p>
       <w:pPr>
         <w:numPr>
           <w:ilvl w:val="0"/>
-          <w:numId w:val="1015"/>
+          <w:numId w:val="1017"/>
         </w:numPr>
         <w:pStyle w:val="Compact"/>
       </w:pPr>
       <w:r>
-        <w:t xml:space="preserve">Fare entry editing dialog showing a transcription note</w:t>
+        <w:t xml:space="preserve">Driver earnings</w:t>
       </w:r>
     </w:p>
     <w:p>
       <w:pPr>
         <w:numPr>
           <w:ilvl w:val="0"/>
-          <w:numId w:val="1015"/>
+          <w:numId w:val="1017"/>
         </w:numPr>
         <w:pStyle w:val="Compact"/>
       </w:pPr>
       <w:r>
-        <w:t xml:space="preserve">Minimums and flat rates dialog</w:t>
+        <w:t xml:space="preserve">Driver credentials card showing verification status</w:t>
       </w:r>
     </w:p>
     <w:p>
       <w:pPr>
         <w:numPr>
           <w:ilvl w:val="0"/>
-          <w:numId w:val="1015"/>
+          <w:numId w:val="1017"/>
         </w:numPr>
         <w:pStyle w:val="Compact"/>
       </w:pPr>
       <w:r>
-        <w:t xml:space="preserve">Profile screen with a photograph set</w:t>
+        <w:t xml:space="preserve">Administrator verification tab with a pending badge</w:t>
       </w:r>
     </w:p>
     <w:p>
       <w:pPr>
         <w:numPr>
           <w:ilvl w:val="0"/>
-          <w:numId w:val="1015"/>
+          <w:numId w:val="1017"/>
         </w:numPr>
         <w:pStyle w:val="Compact"/>
       </w:pPr>
       <w:r>
+        <w:t xml:space="preserve">Administrator concerns tab with a concern open for review</w:t>
+      </w:r>
+    </w:p>
+    <w:p>
+      <w:pPr>
+        <w:numPr>
+          <w:ilvl w:val="0"/>
+          <w:numId w:val="1017"/>
+        </w:numPr>
+        <w:pStyle w:val="Compact"/>
+      </w:pPr>
+      <w:r>
+        <w:t xml:space="preserve">Administrator live monitor</w:t>
+      </w:r>
+    </w:p>
+    <w:p>
+      <w:pPr>
+        <w:numPr>
+          <w:ilvl w:val="0"/>
+          <w:numId w:val="1017"/>
+        </w:numPr>
+        <w:pStyle w:val="Compact"/>
+      </w:pPr>
+      <w:r>
+        <w:t xml:space="preserve">Administrator reports tab with a period selected and the summary shown</w:t>
+      </w:r>
+    </w:p>
+    <w:p>
+      <w:pPr>
+        <w:numPr>
+          <w:ilvl w:val="0"/>
+          <w:numId w:val="1017"/>
+        </w:numPr>
+        <w:pStyle w:val="Compact"/>
+      </w:pPr>
+      <w:r>
+        <w:t xml:space="preserve">Administrator fare table with a zone filter applied</w:t>
+      </w:r>
+    </w:p>
+    <w:p>
+      <w:pPr>
+        <w:numPr>
+          <w:ilvl w:val="0"/>
+          <w:numId w:val="1017"/>
+        </w:numPr>
+        <w:pStyle w:val="Compact"/>
+      </w:pPr>
+      <w:r>
+        <w:t xml:space="preserve">Administrator fare table filtered to entries needing review</w:t>
+      </w:r>
+    </w:p>
+    <w:p>
+      <w:pPr>
+        <w:numPr>
+          <w:ilvl w:val="0"/>
+          <w:numId w:val="1017"/>
+        </w:numPr>
+        <w:pStyle w:val="Compact"/>
+      </w:pPr>
+      <w:r>
+        <w:t xml:space="preserve">Fare entry editing dialog showing a transcription note</w:t>
+      </w:r>
+    </w:p>
+    <w:p>
+      <w:pPr>
+        <w:numPr>
+          <w:ilvl w:val="0"/>
+          <w:numId w:val="1017"/>
+        </w:numPr>
+        <w:pStyle w:val="Compact"/>
+      </w:pPr>
+      <w:r>
+        <w:t xml:space="preserve">Minimums and flat rates dialog</w:t>
+      </w:r>
+    </w:p>
+    <w:p>
+      <w:pPr>
+        <w:numPr>
+          <w:ilvl w:val="0"/>
+          <w:numId w:val="1017"/>
+        </w:numPr>
+        <w:pStyle w:val="Compact"/>
+      </w:pPr>
+      <w:r>
+        <w:t xml:space="preserve">Profile screen with a photograph set</w:t>
+      </w:r>
+    </w:p>
+    <w:p>
+      <w:pPr>
+        <w:numPr>
+          <w:ilvl w:val="0"/>
+          <w:numId w:val="1017"/>
+        </w:numPr>
+        <w:pStyle w:val="Compact"/>
+      </w:pPr>
+      <w:r>
         <w:t xml:space="preserve">Dark theme, any two screens</w:t>
       </w:r>
     </w:p>
-    <w:bookmarkEnd w:id="177"/>
-    <w:bookmarkStart w:id="178" w:name="appendix-h-user-manual"/>
+    <w:bookmarkEnd w:id="181"/>
+    <w:bookmarkStart w:id="182" w:name="appendix-h-user-manual"/>
     <w:p>
       <w:pPr>
         <w:pStyle w:val="Heading2"/>
@@ -27561,8 +28919,8 @@
         <w:t xml:space="preserve">The application says it cannot reach the database; a booking will not submit; no drivers appear to be online; a fare looks wrong; a photograph will not upload; how to report a problem.</w:t>
       </w:r>
     </w:p>
-    <w:bookmarkEnd w:id="178"/>
-    <w:bookmarkStart w:id="179" w:name="appendix-i-source-code"/>
+    <w:bookmarkEnd w:id="182"/>
+    <w:bookmarkStart w:id="183" w:name="appendix-i-source-code"/>
     <w:p>
       <w:pPr>
         <w:pStyle w:val="Heading2"/>
@@ -28417,8 +29775,8 @@
         <w:t xml:space="preserve">}</w:t>
       </w:r>
     </w:p>
-    <w:bookmarkEnd w:id="179"/>
-    <w:bookmarkStart w:id="180" w:name="appendix-j-database-schema"/>
+    <w:bookmarkEnd w:id="183"/>
+    <w:bookmarkStart w:id="184" w:name="appendix-j-database-schema"/>
     <w:p>
       <w:pPr>
         <w:pStyle w:val="Heading2"/>
@@ -28938,8 +30296,8 @@
         </w:tc>
       </w:tr>
     </w:tbl>
-    <w:bookmarkEnd w:id="180"/>
-    <w:bookmarkStart w:id="181" w:name="appendix-k-test-cases"/>
+    <w:bookmarkEnd w:id="184"/>
+    <w:bookmarkStart w:id="185" w:name="appendix-k-test-cases"/>
     <w:p>
       <w:pPr>
         <w:pStyle w:val="Heading2"/>
@@ -29623,8 +30981,8 @@
         </w:tc>
       </w:tr>
     </w:tbl>
-    <w:bookmarkEnd w:id="181"/>
-    <w:bookmarkStart w:id="182" w:name="appendix-l-test-results"/>
+    <w:bookmarkEnd w:id="185"/>
+    <w:bookmarkStart w:id="186" w:name="appendix-l-test-results"/>
     <w:p>
       <w:pPr>
         <w:pStyle w:val="Heading2"/>
@@ -29653,8 +31011,8 @@
         <w:t xml:space="preserve">[The defect log should record, for each defect found: an identifier, the module, a description, the severity, the date found, the resolution, and the date resolved.]</w:t>
       </w:r>
     </w:p>
-    <w:bookmarkEnd w:id="182"/>
-    <w:bookmarkStart w:id="183" w:name="appendix-m-sample-reports"/>
+    <w:bookmarkEnd w:id="186"/>
+    <w:bookmarkStart w:id="187" w:name="appendix-m-sample-reports"/>
     <w:p>
       <w:pPr>
         <w:pStyle w:val="Heading2"/>
@@ -29766,8 +31124,8 @@
         <w:t xml:space="preserve">Estimated fare, Actual fare, Notes</w:t>
       </w:r>
     </w:p>
-    <w:bookmarkEnd w:id="183"/>
-    <w:bookmarkStart w:id="184" w:name="Xc50705ef7a2b355081ea3904d1607e0b082faec"/>
+    <w:bookmarkEnd w:id="187"/>
+    <w:bookmarkStart w:id="188" w:name="Xc50705ef7a2b355081ea3904d1607e0b082faec"/>
     <w:p>
       <w:pPr>
         <w:pStyle w:val="Heading2"/>
@@ -29796,8 +31154,8 @@
         <w:t xml:space="preserve">The following should be documented: the needs assessment administration to students and to drivers; the meeting with officers of the drivers’ association; the photographs of the posted FeTODAT fare sheet from which the fare table was transcribed; the driver orientation session; the evaluation period; and the administration of the evaluation questionnaire.</w:t>
       </w:r>
     </w:p>
-    <w:bookmarkEnd w:id="184"/>
-    <w:bookmarkStart w:id="188" w:name="appendix-o-gantt-chart"/>
+    <w:bookmarkEnd w:id="188"/>
+    <w:bookmarkStart w:id="192" w:name="appendix-o-gantt-chart"/>
     <w:p>
       <w:pPr>
         <w:pStyle w:val="Heading2"/>
@@ -29815,18 +31173,18 @@
           <wp:inline>
             <wp:extent cx="5486400" cy="2674620"/>
             <wp:effectExtent b="0" l="0" r="0" t="0"/>
-            <wp:docPr descr="Figure 14. Gantt Chart of Project Activities" title="" id="186" name="Picture"/>
+            <wp:docPr descr="Figure 14. Gantt Chart of Project Activities" title="" id="190" name="Picture"/>
             <a:graphic>
               <a:graphicData uri="http://schemas.openxmlformats.org/drawingml/2006/picture">
                 <pic:pic>
                   <pic:nvPicPr>
-                    <pic:cNvPr descr="figures/fig14_gantt.png" id="187" name="Picture"/>
+                    <pic:cNvPr descr="figures/fig14_gantt.png" id="191" name="Picture"/>
                     <pic:cNvPicPr>
                       <a:picLocks noChangeArrowheads="1" noChangeAspect="1"/>
                     </pic:cNvPicPr>
                   </pic:nvPicPr>
                   <pic:blipFill>
-                    <a:blip r:embed="rId185"/>
+                    <a:blip r:embed="rId189"/>
                     <a:stretch>
                       <a:fillRect/>
                     </a:stretch>
@@ -29866,8 +31224,8 @@
         <w:br w:type="page"/>
       </w:r>
     </w:p>
-    <w:bookmarkEnd w:id="188"/>
-    <w:bookmarkStart w:id="192" w:name="appendix-p-researchers-biodata"/>
+    <w:bookmarkEnd w:id="192"/>
+    <w:bookmarkStart w:id="196" w:name="appendix-p-researchers-biodata"/>
     <w:p>
       <w:pPr>
         <w:pStyle w:val="Heading2"/>
@@ -29876,7 +31234,7 @@
         <w:t xml:space="preserve">Appendix P — Researchers’ Biodata</w:t>
       </w:r>
     </w:p>
-    <w:bookmarkStart w:id="189" w:name="curriculum-vitae"/>
+    <w:bookmarkStart w:id="193" w:name="curriculum-vitae"/>
     <w:p>
       <w:pPr>
         <w:pStyle w:val="Heading3"/>
@@ -30190,8 +31548,8 @@
         <w:br w:type="page"/>
       </w:r>
     </w:p>
-    <w:bookmarkEnd w:id="189"/>
-    <w:bookmarkStart w:id="190" w:name="curriculum-vitae-1"/>
+    <w:bookmarkEnd w:id="193"/>
+    <w:bookmarkStart w:id="194" w:name="curriculum-vitae-1"/>
     <w:p>
       <w:pPr>
         <w:pStyle w:val="Heading3"/>
@@ -30505,8 +31863,8 @@
         <w:br w:type="page"/>
       </w:r>
     </w:p>
-    <w:bookmarkEnd w:id="190"/>
-    <w:bookmarkStart w:id="191" w:name="curriculum-vitae-2"/>
+    <w:bookmarkEnd w:id="194"/>
+    <w:bookmarkStart w:id="195" w:name="curriculum-vitae-2"/>
     <w:p>
       <w:pPr>
         <w:pStyle w:val="Heading3"/>
@@ -30815,9 +32173,9 @@
         </w:tc>
       </w:tr>
     </w:tbl>
-    <w:bookmarkEnd w:id="191"/>
-    <w:bookmarkEnd w:id="192"/>
-    <w:bookmarkEnd w:id="193"/>
+    <w:bookmarkEnd w:id="195"/>
+    <w:bookmarkEnd w:id="196"/>
+    <w:bookmarkEnd w:id="197"/>
     <w:sectPr>
       <w:pgSz w:h="15840" w:orient="portrait" w:w="12240"/>
       <w:pgMar w:bottom="1440" w:footer="720" w:gutter="0" w:header="720" w:left="2160" w:right="1440" w:top="1440"/>
@@ -31178,6 +32536,82 @@
       <w:start w:val="8"/>
       <w:numFmt w:val="decimal"/>
       <w:lvlText w:val="%9."/>
+      <w:lvlJc w:val="left"/>
+      <w:pPr>
+        <w:ind w:left="6480" w:hanging="480"/>
+      </w:pPr>
+    </w:lvl>
+  </w:abstractNum>
+  <w:abstractNum w:abstractNumId="991">
+    <w:nsid w:val="A991"/>
+    <w:multiLevelType w:val="multilevel"/>
+    <w:lvl w:ilvl="0">
+      <w:numFmt w:val="bullet"/>
+      <w:lvlText w:val="•"/>
+      <w:lvlJc w:val="left"/>
+      <w:pPr>
+        <w:ind w:left="720" w:hanging="480"/>
+      </w:pPr>
+    </w:lvl>
+    <w:lvl w:ilvl="1">
+      <w:numFmt w:val="bullet"/>
+      <w:lvlText w:val="–"/>
+      <w:lvlJc w:val="left"/>
+      <w:pPr>
+        <w:ind w:left="1440" w:hanging="480"/>
+      </w:pPr>
+    </w:lvl>
+    <w:lvl w:ilvl="2">
+      <w:numFmt w:val="bullet"/>
+      <w:lvlText w:val="•"/>
+      <w:lvlJc w:val="left"/>
+      <w:pPr>
+        <w:ind w:left="2160" w:hanging="480"/>
+      </w:pPr>
+    </w:lvl>
+    <w:lvl w:ilvl="3">
+      <w:numFmt w:val="bullet"/>
+      <w:lvlText w:val="–"/>
+      <w:lvlJc w:val="left"/>
+      <w:pPr>
+        <w:ind w:left="2880" w:hanging="480"/>
+      </w:pPr>
+    </w:lvl>
+    <w:lvl w:ilvl="4">
+      <w:numFmt w:val="bullet"/>
+      <w:lvlText w:val="•"/>
+      <w:lvlJc w:val="left"/>
+      <w:pPr>
+        <w:ind w:left="3600" w:hanging="480"/>
+      </w:pPr>
+    </w:lvl>
+    <w:lvl w:ilvl="5">
+      <w:numFmt w:val="bullet"/>
+      <w:lvlText w:val="–"/>
+      <w:lvlJc w:val="left"/>
+      <w:pPr>
+        <w:ind w:left="4320" w:hanging="480"/>
+      </w:pPr>
+    </w:lvl>
+    <w:lvl w:ilvl="6">
+      <w:numFmt w:val="bullet"/>
+      <w:lvlText w:val="•"/>
+      <w:lvlJc w:val="left"/>
+      <w:pPr>
+        <w:ind w:left="5040" w:hanging="480"/>
+      </w:pPr>
+    </w:lvl>
+    <w:lvl w:ilvl="7">
+      <w:numFmt w:val="bullet"/>
+      <w:lvlText w:val="–"/>
+      <w:lvlJc w:val="left"/>
+      <w:pPr>
+        <w:ind w:left="5760" w:hanging="480"/>
+      </w:pPr>
+    </w:lvl>
+    <w:lvl w:ilvl="8">
+      <w:numFmt w:val="bullet"/>
+      <w:lvlText w:val="•"/>
       <w:lvlJc w:val="left"/>
       <w:pPr>
         <w:ind w:left="6480" w:hanging="480"/>
@@ -31518,64 +32952,10 @@
     </w:lvlOverride>
   </w:num>
   <w:num w:numId="1012">
-    <w:abstractNumId w:val="99411"/>
-    <w:lvlOverride w:ilvl="0">
-      <w:startOverride w:val="1"/>
-    </w:lvlOverride>
-    <w:lvlOverride w:ilvl="1">
-      <w:startOverride w:val="1"/>
-    </w:lvlOverride>
-    <w:lvlOverride w:ilvl="2">
-      <w:startOverride w:val="1"/>
-    </w:lvlOverride>
-    <w:lvlOverride w:ilvl="3">
-      <w:startOverride w:val="1"/>
-    </w:lvlOverride>
-    <w:lvlOverride w:ilvl="4">
-      <w:startOverride w:val="1"/>
-    </w:lvlOverride>
-    <w:lvlOverride w:ilvl="5">
-      <w:startOverride w:val="1"/>
-    </w:lvlOverride>
-    <w:lvlOverride w:ilvl="6">
-      <w:startOverride w:val="1"/>
-    </w:lvlOverride>
-    <w:lvlOverride w:ilvl="7">
-      <w:startOverride w:val="1"/>
-    </w:lvlOverride>
-    <w:lvlOverride w:ilvl="8">
-      <w:startOverride w:val="1"/>
-    </w:lvlOverride>
+    <w:abstractNumId w:val="991"/>
   </w:num>
   <w:num w:numId="1013">
-    <w:abstractNumId w:val="99411"/>
-    <w:lvlOverride w:ilvl="0">
-      <w:startOverride w:val="1"/>
-    </w:lvlOverride>
-    <w:lvlOverride w:ilvl="1">
-      <w:startOverride w:val="1"/>
-    </w:lvlOverride>
-    <w:lvlOverride w:ilvl="2">
-      <w:startOverride w:val="1"/>
-    </w:lvlOverride>
-    <w:lvlOverride w:ilvl="3">
-      <w:startOverride w:val="1"/>
-    </w:lvlOverride>
-    <w:lvlOverride w:ilvl="4">
-      <w:startOverride w:val="1"/>
-    </w:lvlOverride>
-    <w:lvlOverride w:ilvl="5">
-      <w:startOverride w:val="1"/>
-    </w:lvlOverride>
-    <w:lvlOverride w:ilvl="6">
-      <w:startOverride w:val="1"/>
-    </w:lvlOverride>
-    <w:lvlOverride w:ilvl="7">
-      <w:startOverride w:val="1"/>
-    </w:lvlOverride>
-    <w:lvlOverride w:ilvl="8">
-      <w:startOverride w:val="1"/>
-    </w:lvlOverride>
+    <w:abstractNumId w:val="991"/>
   </w:num>
   <w:num w:numId="1014">
     <w:abstractNumId w:val="99411"/>
@@ -31608,6 +32988,66 @@
     </w:lvlOverride>
   </w:num>
   <w:num w:numId="1015">
+    <w:abstractNumId w:val="99411"/>
+    <w:lvlOverride w:ilvl="0">
+      <w:startOverride w:val="1"/>
+    </w:lvlOverride>
+    <w:lvlOverride w:ilvl="1">
+      <w:startOverride w:val="1"/>
+    </w:lvlOverride>
+    <w:lvlOverride w:ilvl="2">
+      <w:startOverride w:val="1"/>
+    </w:lvlOverride>
+    <w:lvlOverride w:ilvl="3">
+      <w:startOverride w:val="1"/>
+    </w:lvlOverride>
+    <w:lvlOverride w:ilvl="4">
+      <w:startOverride w:val="1"/>
+    </w:lvlOverride>
+    <w:lvlOverride w:ilvl="5">
+      <w:startOverride w:val="1"/>
+    </w:lvlOverride>
+    <w:lvlOverride w:ilvl="6">
+      <w:startOverride w:val="1"/>
+    </w:lvlOverride>
+    <w:lvlOverride w:ilvl="7">
+      <w:startOverride w:val="1"/>
+    </w:lvlOverride>
+    <w:lvlOverride w:ilvl="8">
+      <w:startOverride w:val="1"/>
+    </w:lvlOverride>
+  </w:num>
+  <w:num w:numId="1016">
+    <w:abstractNumId w:val="99411"/>
+    <w:lvlOverride w:ilvl="0">
+      <w:startOverride w:val="1"/>
+    </w:lvlOverride>
+    <w:lvlOverride w:ilvl="1">
+      <w:startOverride w:val="1"/>
+    </w:lvlOverride>
+    <w:lvlOverride w:ilvl="2">
+      <w:startOverride w:val="1"/>
+    </w:lvlOverride>
+    <w:lvlOverride w:ilvl="3">
+      <w:startOverride w:val="1"/>
+    </w:lvlOverride>
+    <w:lvlOverride w:ilvl="4">
+      <w:startOverride w:val="1"/>
+    </w:lvlOverride>
+    <w:lvlOverride w:ilvl="5">
+      <w:startOverride w:val="1"/>
+    </w:lvlOverride>
+    <w:lvlOverride w:ilvl="6">
+      <w:startOverride w:val="1"/>
+    </w:lvlOverride>
+    <w:lvlOverride w:ilvl="7">
+      <w:startOverride w:val="1"/>
+    </w:lvlOverride>
+    <w:lvlOverride w:ilvl="8">
+      <w:startOverride w:val="1"/>
+    </w:lvlOverride>
+  </w:num>
+  <w:num w:numId="1017">
     <w:abstractNumId w:val="99411"/>
     <w:lvlOverride w:ilvl="0">
       <w:startOverride w:val="1"/>

</xml_diff>

<commit_message>
Write the user manual, and fix two things it exposed
Appendix H described a manual that did not exist. Writing it turned up two
gaps between what the app claims and what it does.

Forgot Password on the sign-in screen did nothing. Reset only worked from
Settings, which needs you signed in, which is not the situation. It now
asks for an address and sends the link, and says the same thing either
way so the screen cannot be used to find out who is registered.

The concern form was only on the passenger side, though the guidelines
tell drivers to use it and the admin screen has always shown who filed
what. Moved it into a shared component and gave drivers a Support tab.

The manual is docs/user-manual.md and Appendix H, same text.

Co-Authored-By: Claude Opus 5 <noreply@anthropic.com>
Claude-Session: https://claude.ai/code/session_01A1yMabEEN9wVLJcuoCQ2Ki
</commit_message>
<xml_diff>
--- a/docs/TrikRide_Capstone_Documentation.docx
+++ b/docs/TrikRide_Capstone_Documentation.docx
@@ -22231,7 +22231,7 @@
       </w:r>
     </w:p>
     <w:bookmarkEnd w:id="168"/>
-    <w:bookmarkStart w:id="197" w:name="appendices"/>
+    <w:bookmarkStart w:id="223" w:name="appendices"/>
     <w:p>
       <w:pPr>
         <w:pStyle w:val="Heading1"/>
@@ -28808,7 +28808,7 @@
       </w:r>
     </w:p>
     <w:bookmarkEnd w:id="181"/>
-    <w:bookmarkStart w:id="182" w:name="appendix-h-user-manual"/>
+    <w:bookmarkStart w:id="208" w:name="appendix-h-user-manual"/>
     <w:p>
       <w:pPr>
         <w:pStyle w:val="Heading2"/>
@@ -28822,111 +28822,263 @@
         <w:pStyle w:val="FirstParagraph"/>
       </w:pPr>
       <w:r>
-        <w:rPr>
-          <w:iCs/>
-          <w:i/>
-        </w:rPr>
-        <w:t xml:space="preserve">[The complete illustrated manual is to accompany this appendix. Its structure is given below.]</w:t>
-      </w:r>
-    </w:p>
-    <w:p>
-      <w:pPr>
-        <w:pStyle w:val="BodyText"/>
+        <w:t xml:space="preserve">The manual issued with the application, covering all three kinds of account. It is written</w:t>
+      </w:r>
+      <w:r>
+        <w:t xml:space="preserve"> </w:t>
+      </w:r>
+      <w:r>
+        <w:t xml:space="preserve">to be read in parts: a passenger needs Part 1 and Part 2 and nothing else. Part 5 lists the</w:t>
+      </w:r>
+      <w:r>
+        <w:t xml:space="preserve"> </w:t>
+      </w:r>
+      <w:r>
+        <w:t xml:space="preserve">problems encountered during development and testing, and what to do about each. Screenshots</w:t>
+      </w:r>
+      <w:r>
+        <w:t xml:space="preserve"> </w:t>
+      </w:r>
+      <w:r>
+        <w:t xml:space="preserve">of every screen it describes are in Appendix G.</w:t>
+      </w:r>
+    </w:p>
+    <w:p>
+      <w:pPr>
+        <w:pStyle w:val="BodyText"/>
+      </w:pPr>
+      <w:r>
+        <w:t xml:space="preserve">The same text is kept in the repository as</w:t>
+      </w:r>
+      <w:r>
+        <w:t xml:space="preserve"> </w:t>
+      </w:r>
+      <w:r>
+        <w:rPr>
+          <w:rStyle w:val="VerbatimChar"/>
+        </w:rPr>
+        <w:t xml:space="preserve">docs/user-manual.md</w:t>
+      </w:r>
+      <w:r>
+        <w:t xml:space="preserve">, so that it can be issued</w:t>
+      </w:r>
+      <w:r>
+        <w:t xml:space="preserve"> </w:t>
+      </w:r>
+      <w:r>
+        <w:t xml:space="preserve">on its own without the rest of this document.</w:t>
+      </w:r>
+    </w:p>
+    <w:p>
+      <w:r>
+        <w:br w:type="page"/>
+      </w:r>
+    </w:p>
+    <w:bookmarkStart w:id="182" w:name="part-1-installing-the-app"/>
+    <w:p>
+      <w:pPr>
+        <w:pStyle w:val="Heading3"/>
+      </w:pPr>
+      <w:r>
+        <w:t xml:space="preserve">Part 1 — Installing the app</w:t>
+      </w:r>
+    </w:p>
+    <w:p>
+      <w:pPr>
+        <w:pStyle w:val="FirstParagraph"/>
+      </w:pPr>
+      <w:r>
+        <w:t xml:space="preserve">TrikRide is not on the Play Store. It is distributed as an installation file, an APK,</w:t>
+      </w:r>
+      <w:r>
+        <w:t xml:space="preserve"> </w:t>
+      </w:r>
+      <w:r>
+        <w:t xml:space="preserve">which you receive from the administrator by link or by direct transfer.</w:t>
+      </w:r>
+    </w:p>
+    <w:p>
+      <w:pPr>
+        <w:numPr>
+          <w:ilvl w:val="0"/>
+          <w:numId w:val="1018"/>
+        </w:numPr>
+        <w:pStyle w:val="Compact"/>
       </w:pPr>
       <w:r>
         <w:rPr>
           <w:bCs/>
           <w:b/>
         </w:rPr>
-        <w:t xml:space="preserve">Part 1 — Installation.</w:t>
-      </w:r>
-      <w:r>
-        <w:t xml:space="preserve"> </w:t>
-      </w:r>
-      <w:r>
-        <w:t xml:space="preserve">Obtaining the installation package; permitting installation from outside the application store; installing; first launch.</w:t>
-      </w:r>
-    </w:p>
-    <w:p>
-      <w:pPr>
-        <w:pStyle w:val="BodyText"/>
+        <w:t xml:space="preserve">Get the file.</w:t>
+      </w:r>
+      <w:r>
+        <w:t xml:space="preserve"> </w:t>
+      </w:r>
+      <w:r>
+        <w:t xml:space="preserve">Download it, or accept it from the administrator. It arrives in your</w:t>
+      </w:r>
+      <w:r>
+        <w:t xml:space="preserve"> </w:t>
+      </w:r>
+      <w:r>
+        <w:t xml:space="preserve">Downloads folder.</w:t>
+      </w:r>
+    </w:p>
+    <w:p>
+      <w:pPr>
+        <w:numPr>
+          <w:ilvl w:val="0"/>
+          <w:numId w:val="1018"/>
+        </w:numPr>
+        <w:pStyle w:val="Compact"/>
       </w:pPr>
       <w:r>
         <w:rPr>
           <w:bCs/>
           <w:b/>
         </w:rPr>
-        <w:t xml:space="preserve">Part 2 — For Passengers.</w:t>
-      </w:r>
-      <w:r>
-        <w:t xml:space="preserve"> </w:t>
-      </w:r>
-      <w:r>
-        <w:t xml:space="preserve">Registering an account; the password rules; reading and accepting the Terms and Conditions, Privacy Policy and Safety and Community Guidelines; signing in and staying signed in; setting a profile photograph; booking a ride step by step; understanding the fare breakdown; choosing the discounted rate and what identification to bring; tracking a ride; rating a driver; viewing history; reporting a concern; reading notifications; switching to dark theme; signing out.</w:t>
-      </w:r>
-    </w:p>
-    <w:p>
-      <w:pPr>
-        <w:pStyle w:val="BodyText"/>
-      </w:pPr>
+        <w:t xml:space="preserve">Allow the installation.</w:t>
+      </w:r>
+      <w:r>
+        <w:t xml:space="preserve"> </w:t>
+      </w:r>
+      <w:r>
+        <w:t xml:space="preserve">Tap the file. Android will refuse the first time and offer</w:t>
+      </w:r>
+      <w:r>
+        <w:t xml:space="preserve"> </w:t>
+      </w:r>
+      <w:r>
+        <w:t xml:space="preserve">a settings screen: turn on</w:t>
+      </w:r>
+      <w:r>
+        <w:t xml:space="preserve"> </w:t>
+      </w:r>
       <w:r>
         <w:rPr>
           <w:bCs/>
           <w:b/>
         </w:rPr>
-        <w:t xml:space="preserve">Part 3 — For Drivers.</w:t>
-      </w:r>
-      <w:r>
-        <w:t xml:space="preserve"> </w:t>
-      </w:r>
-      <w:r>
-        <w:t xml:space="preserve">Registering; accepting the Driver Agreement; submitting licence and tricycle details; what happens while verification is pending; going online and offline; reading a request card; accepting before the countdown expires; advancing a ride through its stages; viewing earnings and history; reporting a concern.</w:t>
-      </w:r>
-    </w:p>
-    <w:p>
-      <w:pPr>
-        <w:pStyle w:val="BodyText"/>
+        <w:t xml:space="preserve">Allow from this source</w:t>
+      </w:r>
+      <w:r>
+        <w:t xml:space="preserve"> </w:t>
+      </w:r>
+      <w:r>
+        <w:t xml:space="preserve">for whichever app you are</w:t>
+      </w:r>
+      <w:r>
+        <w:t xml:space="preserve"> </w:t>
+      </w:r>
+      <w:r>
+        <w:t xml:space="preserve">installing from, usually Files or Chrome. Go back and tap the file again. This is</w:t>
+      </w:r>
+      <w:r>
+        <w:t xml:space="preserve"> </w:t>
+      </w:r>
+      <w:r>
+        <w:t xml:space="preserve">normal for an app distributed outside the store and only has to be done once.</w:t>
+      </w:r>
+    </w:p>
+    <w:p>
+      <w:pPr>
+        <w:numPr>
+          <w:ilvl w:val="0"/>
+          <w:numId w:val="1018"/>
+        </w:numPr>
+        <w:pStyle w:val="Compact"/>
       </w:pPr>
       <w:r>
         <w:rPr>
           <w:bCs/>
           <w:b/>
         </w:rPr>
-        <w:t xml:space="preserve">Part 4 — For Administrators.</w:t>
-      </w:r>
-      <w:r>
-        <w:t xml:space="preserve"> </w:t>
-      </w:r>
-      <w:r>
-        <w:t xml:space="preserve">Signing in as an administrator; verifying and rejecting driver applications, including review of the submitted licence photograph; loading the official fare table for the first time; searching and filtering the fare table; correcting an entry and clearing its review flag; adding and deactivating entries; editing the minimum fares and flat rates; reviewing and resolving concerns; reading the live monitor; selecting a report period, including a range between two dates; exporting and sharing a report in either format.</w:t>
-      </w:r>
-    </w:p>
-    <w:p>
-      <w:pPr>
-        <w:pStyle w:val="BodyText"/>
+        <w:t xml:space="preserve">Install.</w:t>
+      </w:r>
+      <w:r>
+        <w:t xml:space="preserve"> </w:t>
+      </w:r>
+      <w:r>
+        <w:t xml:space="preserve">Tap Install, then Open.</w:t>
+      </w:r>
+    </w:p>
+    <w:p>
+      <w:pPr>
+        <w:numPr>
+          <w:ilvl w:val="0"/>
+          <w:numId w:val="1018"/>
+        </w:numPr>
+        <w:pStyle w:val="Compact"/>
       </w:pPr>
       <w:r>
         <w:rPr>
           <w:bCs/>
           <w:b/>
         </w:rPr>
-        <w:t xml:space="preserve">Part 5 — Troubleshooting.</w:t>
-      </w:r>
-      <w:r>
-        <w:t xml:space="preserve"> </w:t>
-      </w:r>
-      <w:r>
-        <w:t xml:space="preserve">The application says it cannot reach the database; a booking will not submit; no drivers appear to be online; a fare looks wrong; a photograph will not upload; how to report a problem.</w:t>
+        <w:t xml:space="preserve">Permissions.</w:t>
+      </w:r>
+      <w:r>
+        <w:t xml:space="preserve"> </w:t>
+      </w:r>
+      <w:r>
+        <w:t xml:space="preserve">The app asks for location the first time you use a screen that needs</w:t>
+      </w:r>
+      <w:r>
+        <w:t xml:space="preserve"> </w:t>
+      </w:r>
+      <w:r>
+        <w:t xml:space="preserve">it, and for the camera the first time you take a photograph. Both can be declined:</w:t>
+      </w:r>
+      <w:r>
+        <w:t xml:space="preserve"> </w:t>
+      </w:r>
+      <w:r>
+        <w:t xml:space="preserve">without location you can still book by choosing your pickup from the list, and without</w:t>
+      </w:r>
+      <w:r>
+        <w:t xml:space="preserve"> </w:t>
+      </w:r>
+      <w:r>
+        <w:t xml:space="preserve">the camera you can still choose a photograph from your gallery.</w:t>
+      </w:r>
+    </w:p>
+    <w:p>
+      <w:pPr>
+        <w:pStyle w:val="FirstParagraph"/>
+      </w:pPr>
+      <w:r>
+        <w:t xml:space="preserve">An update is installed the same way, over the top of the existing app. Your account and</w:t>
+      </w:r>
+      <w:r>
+        <w:t xml:space="preserve"> </w:t>
+      </w:r>
+      <w:r>
+        <w:t xml:space="preserve">your history are on the server, not on the phone, so nothing is lost.</w:t>
+      </w:r>
+    </w:p>
+    <w:p>
+      <w:r>
+        <w:br w:type="page"/>
       </w:r>
     </w:p>
     <w:bookmarkEnd w:id="182"/>
-    <w:bookmarkStart w:id="183" w:name="appendix-i-source-code"/>
-    <w:p>
-      <w:pPr>
-        <w:pStyle w:val="Heading2"/>
-      </w:pPr>
-      <w:r>
-        <w:t xml:space="preserve">Appendix I — Source Code</w:t>
+    <w:bookmarkStart w:id="194" w:name="part-2-for-passengers"/>
+    <w:p>
+      <w:pPr>
+        <w:pStyle w:val="Heading3"/>
+      </w:pPr>
+      <w:r>
+        <w:t xml:space="preserve">Part 2 — For passengers</w:t>
+      </w:r>
+    </w:p>
+    <w:bookmarkStart w:id="183" w:name="first-launch"/>
+    <w:p>
+      <w:pPr>
+        <w:pStyle w:val="Heading4"/>
+      </w:pPr>
+      <w:r>
+        <w:t xml:space="preserve">2.1 First launch</w:t>
       </w:r>
     </w:p>
     <w:p>
@@ -28934,38 +29086,312 @@
         <w:pStyle w:val="FirstParagraph"/>
       </w:pPr>
       <w:r>
-        <w:t xml:space="preserve">The complete source code of the system is held in a Git repository rather than reproduced here. At roughly twelve thousand seven hundred lines across fifty-five files it would add some three hundred pages to a bound copy, at a printing cost the study cannot justify.</w:t>
-      </w:r>
-    </w:p>
-    <w:p>
-      <w:pPr>
-        <w:pStyle w:val="BodyText"/>
-      </w:pPr>
+        <w:t xml:space="preserve">Five introductory slides appear the first time the app opens. They are shown once. Swipe</w:t>
+      </w:r>
+      <w:r>
+        <w:t xml:space="preserve"> </w:t>
+      </w:r>
+      <w:r>
+        <w:t xml:space="preserve">through or skip.</w:t>
+      </w:r>
+    </w:p>
+    <w:bookmarkEnd w:id="183"/>
+    <w:bookmarkStart w:id="184" w:name="creating-an-account"/>
+    <w:p>
+      <w:pPr>
+        <w:pStyle w:val="Heading4"/>
+      </w:pPr>
+      <w:r>
+        <w:t xml:space="preserve">2.2 Creating an account</w:t>
+      </w:r>
+    </w:p>
+    <w:p>
+      <w:pPr>
+        <w:pStyle w:val="FirstParagraph"/>
+      </w:pPr>
+      <w:r>
+        <w:t xml:space="preserve">From the sign-in screen, tap</w:t>
+      </w:r>
+      <w:r>
+        <w:t xml:space="preserve"> </w:t>
+      </w:r>
       <w:r>
         <w:rPr>
           <w:bCs/>
           <w:b/>
         </w:rPr>
-        <w:t xml:space="preserve">Retrieving the source</w:t>
-      </w:r>
-    </w:p>
-    <w:p>
-      <w:pPr>
-        <w:pStyle w:val="BodyText"/>
-      </w:pPr>
-      <w:r>
-        <w:t xml:space="preserve">The repository is at:</w:t>
-      </w:r>
-    </w:p>
-    <w:p>
-      <w:pPr>
-        <w:pStyle w:val="SourceCode"/>
-      </w:pPr>
-      <w:r>
-        <w:rPr>
-          <w:rStyle w:val="VerbatimChar"/>
-        </w:rPr>
-        <w:t xml:space="preserve">https://github.com/ZeroXJune/CapstoneProject</w:t>
+        <w:t xml:space="preserve">Register</w:t>
+      </w:r>
+      <w:r>
+        <w:t xml:space="preserve"> </w:t>
+      </w:r>
+      <w:r>
+        <w:t xml:space="preserve">at the bottom, then fill in:</w:t>
+      </w:r>
+    </w:p>
+    <w:tbl>
+      <w:tblPr>
+        <w:tblStyle w:val="Table"/>
+        <w:tblW w:type="auto" w:w="0"/>
+        <w:tblLook w:firstRow="1" w:lastRow="0" w:firstColumn="0" w:lastColumn="0" w:noHBand="0" w:noVBand="0" w:val="0020"/>
+        <w:jc w:val="start"/>
+      </w:tblPr>
+      <w:tblGrid>
+        <w:gridCol w:w="3960"/>
+        <w:gridCol w:w="3960"/>
+      </w:tblGrid>
+      <w:tr>
+        <w:trPr>
+          <w:tblHeader w:val="true"/>
+        </w:trPr>
+        <w:tc>
+          <w:tcPr/>
+          <w:p>
+            <w:pPr>
+              <w:pStyle w:val="Compact"/>
+              <w:jc w:val="left"/>
+            </w:pPr>
+            <w:r>
+              <w:t xml:space="preserve">Field</w:t>
+            </w:r>
+          </w:p>
+        </w:tc>
+        <w:tc>
+          <w:tcPr/>
+          <w:p>
+            <w:pPr>
+              <w:pStyle w:val="Compact"/>
+              <w:jc w:val="left"/>
+            </w:pPr>
+            <w:r>
+              <w:t xml:space="preserve">Notes</w:t>
+            </w:r>
+          </w:p>
+        </w:tc>
+      </w:tr>
+      <w:tr>
+        <w:tc>
+          <w:tcPr/>
+          <w:p>
+            <w:pPr>
+              <w:pStyle w:val="Compact"/>
+              <w:jc w:val="left"/>
+            </w:pPr>
+            <w:r>
+              <w:t xml:space="preserve">Full Name</w:t>
+            </w:r>
+          </w:p>
+        </w:tc>
+        <w:tc>
+          <w:tcPr/>
+          <w:p>
+            <w:pPr>
+              <w:pStyle w:val="Compact"/>
+              <w:jc w:val="left"/>
+            </w:pPr>
+            <w:r>
+              <w:t xml:space="preserve">As you want a driver to see it</w:t>
+            </w:r>
+          </w:p>
+        </w:tc>
+      </w:tr>
+      <w:tr>
+        <w:tc>
+          <w:tcPr/>
+          <w:p>
+            <w:pPr>
+              <w:pStyle w:val="Compact"/>
+              <w:jc w:val="left"/>
+            </w:pPr>
+            <w:r>
+              <w:t xml:space="preserve">Birthdate</w:t>
+            </w:r>
+          </w:p>
+        </w:tc>
+        <w:tc>
+          <w:tcPr/>
+          <w:p>
+            <w:pPr>
+              <w:pStyle w:val="Compact"/>
+              <w:jc w:val="left"/>
+            </w:pPr>
+            <w:r>
+              <w:t xml:space="preserve">Opens a calendar; you cannot type it</w:t>
+            </w:r>
+          </w:p>
+        </w:tc>
+      </w:tr>
+      <w:tr>
+        <w:tc>
+          <w:tcPr/>
+          <w:p>
+            <w:pPr>
+              <w:pStyle w:val="Compact"/>
+              <w:jc w:val="left"/>
+            </w:pPr>
+            <w:r>
+              <w:t xml:space="preserve">Email</w:t>
+            </w:r>
+          </w:p>
+        </w:tc>
+        <w:tc>
+          <w:tcPr/>
+          <w:p>
+            <w:pPr>
+              <w:pStyle w:val="Compact"/>
+              <w:jc w:val="left"/>
+            </w:pPr>
+            <w:r>
+              <w:t xml:space="preserve">The reset link goes here, so use one you can open</w:t>
+            </w:r>
+          </w:p>
+        </w:tc>
+      </w:tr>
+      <w:tr>
+        <w:tc>
+          <w:tcPr/>
+          <w:p>
+            <w:pPr>
+              <w:pStyle w:val="Compact"/>
+              <w:jc w:val="left"/>
+            </w:pPr>
+            <w:r>
+              <w:t xml:space="preserve">Phone Number</w:t>
+            </w:r>
+          </w:p>
+        </w:tc>
+        <w:tc>
+          <w:tcPr/>
+          <w:p>
+            <w:pPr>
+              <w:pStyle w:val="Compact"/>
+              <w:jc w:val="left"/>
+            </w:pPr>
+            <w:r>
+              <w:t xml:space="preserve">The driver may call this to find you</w:t>
+            </w:r>
+          </w:p>
+        </w:tc>
+      </w:tr>
+      <w:tr>
+        <w:tc>
+          <w:tcPr/>
+          <w:p>
+            <w:pPr>
+              <w:pStyle w:val="Compact"/>
+              <w:jc w:val="left"/>
+            </w:pPr>
+            <w:r>
+              <w:t xml:space="preserve">Password</w:t>
+            </w:r>
+          </w:p>
+        </w:tc>
+        <w:tc>
+          <w:tcPr/>
+          <w:p>
+            <w:pPr>
+              <w:pStyle w:val="Compact"/>
+              <w:jc w:val="left"/>
+            </w:pPr>
+            <w:r>
+              <w:t xml:space="preserve">Checked as you type — see below</w:t>
+            </w:r>
+          </w:p>
+        </w:tc>
+      </w:tr>
+      <w:tr>
+        <w:tc>
+          <w:tcPr/>
+          <w:p>
+            <w:pPr>
+              <w:pStyle w:val="Compact"/>
+              <w:jc w:val="left"/>
+            </w:pPr>
+            <w:r>
+              <w:t xml:space="preserve">Confirm Password</w:t>
+            </w:r>
+          </w:p>
+        </w:tc>
+        <w:tc>
+          <w:tcPr/>
+          <w:p>
+            <w:pPr>
+              <w:pStyle w:val="Compact"/>
+              <w:jc w:val="left"/>
+            </w:pPr>
+            <w:r>
+              <w:t xml:space="preserve">Must match</w:t>
+            </w:r>
+          </w:p>
+        </w:tc>
+      </w:tr>
+    </w:tbl>
+    <w:p>
+      <w:pPr>
+        <w:pStyle w:val="BodyText"/>
+      </w:pPr>
+      <w:r>
+        <w:t xml:space="preserve">The password rules appear under the field as you type and tick off one by one:</w:t>
+      </w:r>
+    </w:p>
+    <w:p>
+      <w:pPr>
+        <w:numPr>
+          <w:ilvl w:val="0"/>
+          <w:numId w:val="1019"/>
+        </w:numPr>
+        <w:pStyle w:val="Compact"/>
+      </w:pPr>
+      <w:r>
+        <w:t xml:space="preserve">at least 8 characters</w:t>
+      </w:r>
+    </w:p>
+    <w:p>
+      <w:pPr>
+        <w:numPr>
+          <w:ilvl w:val="0"/>
+          <w:numId w:val="1019"/>
+        </w:numPr>
+        <w:pStyle w:val="Compact"/>
+      </w:pPr>
+      <w:r>
+        <w:t xml:space="preserve">an uppercase letter</w:t>
+      </w:r>
+    </w:p>
+    <w:p>
+      <w:pPr>
+        <w:numPr>
+          <w:ilvl w:val="0"/>
+          <w:numId w:val="1019"/>
+        </w:numPr>
+        <w:pStyle w:val="Compact"/>
+      </w:pPr>
+      <w:r>
+        <w:t xml:space="preserve">a lowercase letter</w:t>
+      </w:r>
+    </w:p>
+    <w:p>
+      <w:pPr>
+        <w:numPr>
+          <w:ilvl w:val="0"/>
+          <w:numId w:val="1019"/>
+        </w:numPr>
+        <w:pStyle w:val="Compact"/>
+      </w:pPr>
+      <w:r>
+        <w:t xml:space="preserve">a number</w:t>
+      </w:r>
+    </w:p>
+    <w:p>
+      <w:pPr>
+        <w:numPr>
+          <w:ilvl w:val="0"/>
+          <w:numId w:val="1019"/>
+        </w:numPr>
+        <w:pStyle w:val="Compact"/>
+      </w:pPr>
+      <w:r>
+        <w:t xml:space="preserve">a symbol — recommended, not required</w:t>
       </w:r>
     </w:p>
     <w:p>
@@ -28973,26 +29399,7 @@
         <w:pStyle w:val="FirstParagraph"/>
       </w:pPr>
       <w:r>
-        <w:t xml:space="preserve">With Git installed, the whole project is obtained by opening a terminal in the folder where it should be placed and running:</w:t>
-      </w:r>
-    </w:p>
-    <w:p>
-      <w:pPr>
-        <w:pStyle w:val="SourceCode"/>
-      </w:pPr>
-      <w:r>
-        <w:rPr>
-          <w:rStyle w:val="VerbatimChar"/>
-        </w:rPr>
-        <w:t xml:space="preserve">git clone https://github.com/ZeroXJune/CapstoneProject</w:t>
-      </w:r>
-    </w:p>
-    <w:p>
-      <w:pPr>
-        <w:pStyle w:val="FirstParagraph"/>
-      </w:pPr>
-      <w:r>
-        <w:t xml:space="preserve">Readers without Git may instead open the address above in a browser and use the</w:t>
+        <w:t xml:space="preserve">Then tick the box confirming you have read the</w:t>
       </w:r>
       <w:r>
         <w:t xml:space="preserve"> </w:t>
@@ -29002,21 +29409,1992 @@
           <w:bCs/>
           <w:b/>
         </w:rPr>
-        <w:t xml:space="preserve">Code → Download ZIP</w:t>
-      </w:r>
-      <w:r>
-        <w:t xml:space="preserve"> </w:t>
-      </w:r>
-      <w:r>
-        <w:t xml:space="preserve">button, which produces the same files. If the repository is private, the researchers can grant read access to a named GitHub account, or supply the source on request as an archive.</w:t>
-      </w:r>
-    </w:p>
-    <w:p>
-      <w:pPr>
-        <w:pStyle w:val="BodyText"/>
-      </w:pPr>
-      <w:r>
-        <w:t xml:space="preserve">Two files are required to build and are deliberately absent from the repository because they carry credentials:</w:t>
+        <w:t xml:space="preserve">Terms and Conditions</w:t>
+      </w:r>
+      <w:r>
+        <w:t xml:space="preserve">, the</w:t>
+      </w:r>
+      <w:r>
+        <w:t xml:space="preserve"> </w:t>
+      </w:r>
+      <w:r>
+        <w:rPr>
+          <w:bCs/>
+          <w:b/>
+        </w:rPr>
+        <w:t xml:space="preserve">Privacy</w:t>
+      </w:r>
+      <w:r>
+        <w:rPr>
+          <w:bCs/>
+          <w:b/>
+        </w:rPr>
+        <w:t xml:space="preserve"> </w:t>
+      </w:r>
+      <w:r>
+        <w:rPr>
+          <w:bCs/>
+          <w:b/>
+        </w:rPr>
+        <w:t xml:space="preserve">Policy</w:t>
+      </w:r>
+      <w:r>
+        <w:t xml:space="preserve"> </w:t>
+      </w:r>
+      <w:r>
+        <w:t xml:space="preserve">and the</w:t>
+      </w:r>
+      <w:r>
+        <w:t xml:space="preserve"> </w:t>
+      </w:r>
+      <w:r>
+        <w:rPr>
+          <w:bCs/>
+          <w:b/>
+        </w:rPr>
+        <w:t xml:space="preserve">Safety and Community Guidelines</w:t>
+      </w:r>
+      <w:r>
+        <w:t xml:space="preserve">. Tap any of the three titles to read</w:t>
+      </w:r>
+      <w:r>
+        <w:t xml:space="preserve"> </w:t>
+      </w:r>
+      <w:r>
+        <w:t xml:space="preserve">it before you agree; they are also available afterwards from Profile.</w:t>
+      </w:r>
+    </w:p>
+    <w:p>
+      <w:pPr>
+        <w:pStyle w:val="BodyText"/>
+      </w:pPr>
+      <w:r>
+        <w:t xml:space="preserve">Tap</w:t>
+      </w:r>
+      <w:r>
+        <w:t xml:space="preserve"> </w:t>
+      </w:r>
+      <w:r>
+        <w:rPr>
+          <w:bCs/>
+          <w:b/>
+        </w:rPr>
+        <w:t xml:space="preserve">Next</w:t>
+      </w:r>
+      <w:r>
+        <w:t xml:space="preserve">, choose</w:t>
+      </w:r>
+      <w:r>
+        <w:t xml:space="preserve"> </w:t>
+      </w:r>
+      <w:r>
+        <w:rPr>
+          <w:bCs/>
+          <w:b/>
+        </w:rPr>
+        <w:t xml:space="preserve">Passenger</w:t>
+      </w:r>
+      <w:r>
+        <w:t xml:space="preserve">, and the account is created.</w:t>
+      </w:r>
+    </w:p>
+    <w:bookmarkEnd w:id="184"/>
+    <w:bookmarkStart w:id="185" w:name="signing-in"/>
+    <w:p>
+      <w:pPr>
+        <w:pStyle w:val="Heading4"/>
+      </w:pPr>
+      <w:r>
+        <w:t xml:space="preserve">2.3 Signing in</w:t>
+      </w:r>
+    </w:p>
+    <w:p>
+      <w:pPr>
+        <w:pStyle w:val="FirstParagraph"/>
+      </w:pPr>
+      <w:r>
+        <w:t xml:space="preserve">Enter your email and password and tap</w:t>
+      </w:r>
+      <w:r>
+        <w:t xml:space="preserve"> </w:t>
+      </w:r>
+      <w:r>
+        <w:rPr>
+          <w:bCs/>
+          <w:b/>
+        </w:rPr>
+        <w:t xml:space="preserve">Login</w:t>
+      </w:r>
+      <w:r>
+        <w:t xml:space="preserve">. Tick</w:t>
+      </w:r>
+      <w:r>
+        <w:t xml:space="preserve"> </w:t>
+      </w:r>
+      <w:r>
+        <w:rPr>
+          <w:bCs/>
+          <w:b/>
+        </w:rPr>
+        <w:t xml:space="preserve">Remember me</w:t>
+      </w:r>
+      <w:r>
+        <w:t xml:space="preserve"> </w:t>
+      </w:r>
+      <w:r>
+        <w:t xml:space="preserve">and the email is</w:t>
+      </w:r>
+      <w:r>
+        <w:t xml:space="preserve"> </w:t>
+      </w:r>
+      <w:r>
+        <w:t xml:space="preserve">filled in next time; the password never is.</w:t>
+      </w:r>
+    </w:p>
+    <w:p>
+      <w:pPr>
+        <w:pStyle w:val="BodyText"/>
+      </w:pPr>
+      <w:r>
+        <w:t xml:space="preserve">You stay signed in between launches, so the app opens straight to your dashboard. Signing</w:t>
+      </w:r>
+      <w:r>
+        <w:t xml:space="preserve"> </w:t>
+      </w:r>
+      <w:r>
+        <w:t xml:space="preserve">out is in Profile.</w:t>
+      </w:r>
+    </w:p>
+    <w:p>
+      <w:pPr>
+        <w:pStyle w:val="BodyText"/>
+      </w:pPr>
+      <w:r>
+        <w:rPr>
+          <w:bCs/>
+          <w:b/>
+        </w:rPr>
+        <w:t xml:space="preserve">Forgotten password.</w:t>
+      </w:r>
+      <w:r>
+        <w:t xml:space="preserve"> </w:t>
+      </w:r>
+      <w:r>
+        <w:t xml:space="preserve">Tap</w:t>
+      </w:r>
+      <w:r>
+        <w:t xml:space="preserve"> </w:t>
+      </w:r>
+      <w:r>
+        <w:rPr>
+          <w:bCs/>
+          <w:b/>
+        </w:rPr>
+        <w:t xml:space="preserve">Forgot Password?</w:t>
+      </w:r>
+      <w:r>
+        <w:t xml:space="preserve">, confirm your email address, and tap</w:t>
+      </w:r>
+      <w:r>
+        <w:t xml:space="preserve"> </w:t>
+      </w:r>
+      <w:r>
+        <w:rPr>
+          <w:bCs/>
+          <w:b/>
+        </w:rPr>
+        <w:t xml:space="preserve">Send link</w:t>
+      </w:r>
+      <w:r>
+        <w:t xml:space="preserve">. Firebase emails you a link to set a new password. If nothing arrives within</w:t>
+      </w:r>
+      <w:r>
+        <w:t xml:space="preserve"> </w:t>
+      </w:r>
+      <w:r>
+        <w:t xml:space="preserve">a few minutes, check the spam folder — and check the address is the one you registered</w:t>
+      </w:r>
+      <w:r>
+        <w:t xml:space="preserve"> </w:t>
+      </w:r>
+      <w:r>
+        <w:t xml:space="preserve">with, because for privacy the app gives the same reply whether or not an account exists.</w:t>
+      </w:r>
+    </w:p>
+    <w:bookmarkEnd w:id="185"/>
+    <w:bookmarkStart w:id="186" w:name="agreeing-to-the-documents"/>
+    <w:p>
+      <w:pPr>
+        <w:pStyle w:val="Heading4"/>
+      </w:pPr>
+      <w:r>
+        <w:t xml:space="preserve">2.4 Agreeing to the documents</w:t>
+      </w:r>
+    </w:p>
+    <w:p>
+      <w:pPr>
+        <w:pStyle w:val="FirstParagraph"/>
+      </w:pPr>
+      <w:r>
+        <w:t xml:space="preserve">If the documents have been revised since you last accepted them, a screen appears between</w:t>
+      </w:r>
+      <w:r>
+        <w:t xml:space="preserve"> </w:t>
+      </w:r>
+      <w:r>
+        <w:t xml:space="preserve">signing in and your dashboard. Each document has to be ticked separately. The only</w:t>
+      </w:r>
+      <w:r>
+        <w:t xml:space="preserve"> </w:t>
+      </w:r>
+      <w:r>
+        <w:t xml:space="preserve">alternative is signing out. This also happens the first time an older account opens a</w:t>
+      </w:r>
+      <w:r>
+        <w:t xml:space="preserve"> </w:t>
+      </w:r>
+      <w:r>
+        <w:t xml:space="preserve">version of the app that records consent.</w:t>
+      </w:r>
+    </w:p>
+    <w:bookmarkEnd w:id="186"/>
+    <w:bookmarkStart w:id="187" w:name="the-dashboard"/>
+    <w:p>
+      <w:pPr>
+        <w:pStyle w:val="Heading4"/>
+      </w:pPr>
+      <w:r>
+        <w:t xml:space="preserve">2.5 The dashboard</w:t>
+      </w:r>
+    </w:p>
+    <w:p>
+      <w:pPr>
+        <w:pStyle w:val="FirstParagraph"/>
+      </w:pPr>
+      <w:r>
+        <w:t xml:space="preserve">Four tabs along the bottom:</w:t>
+      </w:r>
+      <w:r>
+        <w:t xml:space="preserve"> </w:t>
+      </w:r>
+      <w:r>
+        <w:rPr>
+          <w:bCs/>
+          <w:b/>
+        </w:rPr>
+        <w:t xml:space="preserve">Home</w:t>
+      </w:r>
+      <w:r>
+        <w:t xml:space="preserve">,</w:t>
+      </w:r>
+      <w:r>
+        <w:t xml:space="preserve"> </w:t>
+      </w:r>
+      <w:r>
+        <w:rPr>
+          <w:bCs/>
+          <w:b/>
+        </w:rPr>
+        <w:t xml:space="preserve">History</w:t>
+      </w:r>
+      <w:r>
+        <w:t xml:space="preserve">,</w:t>
+      </w:r>
+      <w:r>
+        <w:t xml:space="preserve"> </w:t>
+      </w:r>
+      <w:r>
+        <w:rPr>
+          <w:bCs/>
+          <w:b/>
+        </w:rPr>
+        <w:t xml:space="preserve">Support</w:t>
+      </w:r>
+      <w:r>
+        <w:t xml:space="preserve">,</w:t>
+      </w:r>
+      <w:r>
+        <w:t xml:space="preserve"> </w:t>
+      </w:r>
+      <w:r>
+        <w:rPr>
+          <w:bCs/>
+          <w:b/>
+        </w:rPr>
+        <w:t xml:space="preserve">Profile</w:t>
+      </w:r>
+      <w:r>
+        <w:t xml:space="preserve">. The bell at</w:t>
+      </w:r>
+      <w:r>
+        <w:t xml:space="preserve"> </w:t>
+      </w:r>
+      <w:r>
+        <w:t xml:space="preserve">the top right opens your notifications and carries a count of the unread ones.</w:t>
+      </w:r>
+    </w:p>
+    <w:bookmarkEnd w:id="187"/>
+    <w:bookmarkStart w:id="188" w:name="booking-a-ride"/>
+    <w:p>
+      <w:pPr>
+        <w:pStyle w:val="Heading4"/>
+      </w:pPr>
+      <w:r>
+        <w:t xml:space="preserve">2.6 Booking a ride</w:t>
+      </w:r>
+    </w:p>
+    <w:p>
+      <w:pPr>
+        <w:pStyle w:val="FirstParagraph"/>
+      </w:pPr>
+      <w:r>
+        <w:t xml:space="preserve">Tap</w:t>
+      </w:r>
+      <w:r>
+        <w:t xml:space="preserve"> </w:t>
+      </w:r>
+      <w:r>
+        <w:rPr>
+          <w:bCs/>
+          <w:b/>
+        </w:rPr>
+        <w:t xml:space="preserve">Book a Ride</w:t>
+      </w:r>
+      <w:r>
+        <w:t xml:space="preserve"> </w:t>
+      </w:r>
+      <w:r>
+        <w:t xml:space="preserve">on Home.</w:t>
+      </w:r>
+    </w:p>
+    <w:p>
+      <w:pPr>
+        <w:numPr>
+          <w:ilvl w:val="0"/>
+          <w:numId w:val="1020"/>
+        </w:numPr>
+        <w:pStyle w:val="Compact"/>
+      </w:pPr>
+      <w:r>
+        <w:rPr>
+          <w:bCs/>
+          <w:b/>
+        </w:rPr>
+        <w:t xml:space="preserve">Pickup.</w:t>
+      </w:r>
+      <w:r>
+        <w:t xml:space="preserve"> </w:t>
+      </w:r>
+      <w:r>
+        <w:t xml:space="preserve">Tap the pickup field and search the list of posted stops by name or by</w:t>
+      </w:r>
+      <w:r>
+        <w:t xml:space="preserve"> </w:t>
+      </w:r>
+      <w:r>
+        <w:t xml:space="preserve">zone. If where you are standing is not on the list, tap</w:t>
+      </w:r>
+      <w:r>
+        <w:t xml:space="preserve"> </w:t>
+      </w:r>
+      <w:r>
+        <w:rPr>
+          <w:bCs/>
+          <w:b/>
+        </w:rPr>
+        <w:t xml:space="preserve">Not on the list? Pin it on</w:t>
+      </w:r>
+      <w:r>
+        <w:rPr>
+          <w:bCs/>
+          <w:b/>
+        </w:rPr>
+        <w:t xml:space="preserve"> </w:t>
+      </w:r>
+      <w:r>
+        <w:rPr>
+          <w:bCs/>
+          <w:b/>
+        </w:rPr>
+        <w:t xml:space="preserve">the map</w:t>
+      </w:r>
+      <w:r>
+        <w:t xml:space="preserve">, move the map until the pin is on the right corner, and tap</w:t>
+      </w:r>
+      <w:r>
+        <w:t xml:space="preserve"> </w:t>
+      </w:r>
+      <w:r>
+        <w:rPr>
+          <w:bCs/>
+          <w:b/>
+        </w:rPr>
+        <w:t xml:space="preserve">Use this</w:t>
+      </w:r>
+      <w:r>
+        <w:rPr>
+          <w:bCs/>
+          <w:b/>
+        </w:rPr>
+        <w:t xml:space="preserve"> </w:t>
+      </w:r>
+      <w:r>
+        <w:rPr>
+          <w:bCs/>
+          <w:b/>
+        </w:rPr>
+        <w:t xml:space="preserve">point</w:t>
+      </w:r>
+      <w:r>
+        <w:t xml:space="preserve">.</w:t>
+      </w:r>
+      <w:r>
+        <w:t xml:space="preserve"> </w:t>
+      </w:r>
+      <w:r>
+        <w:rPr>
+          <w:bCs/>
+          <w:b/>
+        </w:rPr>
+        <w:t xml:space="preserve">Use my current location</w:t>
+      </w:r>
+      <w:r>
+        <w:t xml:space="preserve"> </w:t>
+      </w:r>
+      <w:r>
+        <w:t xml:space="preserve">moves the pin to where you are now, which is not</w:t>
+      </w:r>
+      <w:r>
+        <w:t xml:space="preserve"> </w:t>
+      </w:r>
+      <w:r>
+        <w:t xml:space="preserve">always where you want to be collected.</w:t>
+      </w:r>
+    </w:p>
+    <w:p>
+      <w:pPr>
+        <w:numPr>
+          <w:ilvl w:val="0"/>
+          <w:numId w:val="1020"/>
+        </w:numPr>
+        <w:pStyle w:val="Compact"/>
+      </w:pPr>
+      <w:r>
+        <w:rPr>
+          <w:bCs/>
+          <w:b/>
+        </w:rPr>
+        <w:t xml:space="preserve">Destination.</w:t>
+      </w:r>
+      <w:r>
+        <w:t xml:space="preserve"> </w:t>
+      </w:r>
+      <w:r>
+        <w:t xml:space="preserve">Tap the destination field and search the same way. Type any part of</w:t>
+      </w:r>
+      <w:r>
+        <w:t xml:space="preserve"> </w:t>
+      </w:r>
+      <w:r>
+        <w:t xml:space="preserve">the name or the zone — several words all have to match, so</w:t>
+      </w:r>
+      <w:r>
+        <w:t xml:space="preserve"> </w:t>
+      </w:r>
+      <w:r>
+        <w:t xml:space="preserve">“</w:t>
+      </w:r>
+      <w:r>
+        <w:t xml:space="preserve">poblacion talibon</w:t>
+      </w:r>
+      <w:r>
+        <w:t xml:space="preserve">”</w:t>
+      </w:r>
+      <w:r>
+        <w:t xml:space="preserve"> </w:t>
+      </w:r>
+      <w:r>
+        <w:t xml:space="preserve">and</w:t>
+      </w:r>
+      <w:r>
+        <w:t xml:space="preserve"> </w:t>
+      </w:r>
+      <w:r>
+        <w:t xml:space="preserve">“</w:t>
+      </w:r>
+      <w:r>
+        <w:t xml:space="preserve">market balintawak</w:t>
+      </w:r>
+      <w:r>
+        <w:t xml:space="preserve">”</w:t>
+      </w:r>
+      <w:r>
+        <w:t xml:space="preserve"> </w:t>
+      </w:r>
+      <w:r>
+        <w:t xml:space="preserve">both work. The fare appears against every result.</w:t>
+      </w:r>
+      <w:r>
+        <w:t xml:space="preserve"> </w:t>
+      </w:r>
+      <w:r>
+        <w:t xml:space="preserve">If you do not know what the fare sheet calls where you are going, tap</w:t>
+      </w:r>
+      <w:r>
+        <w:t xml:space="preserve"> </w:t>
+      </w:r>
+      <w:r>
+        <w:rPr>
+          <w:bCs/>
+          <w:b/>
+        </w:rPr>
+        <w:t xml:space="preserve">Don’t know the</w:t>
+      </w:r>
+      <w:r>
+        <w:rPr>
+          <w:bCs/>
+          <w:b/>
+        </w:rPr>
+        <w:t xml:space="preserve"> </w:t>
+      </w:r>
+      <w:r>
+        <w:rPr>
+          <w:bCs/>
+          <w:b/>
+        </w:rPr>
+        <w:t xml:space="preserve">name? Find it on the map</w:t>
+      </w:r>
+      <w:r>
+        <w:t xml:space="preserve">, move the map to roughly the right place, and the app names</w:t>
+      </w:r>
+      <w:r>
+        <w:t xml:space="preserve"> </w:t>
+      </w:r>
+      <w:r>
+        <w:t xml:space="preserve">the nearest posted stop and its fare. Only stops the administrator has given a map</w:t>
+      </w:r>
+      <w:r>
+        <w:t xml:space="preserve"> </w:t>
+      </w:r>
+      <w:r>
+        <w:t xml:space="preserve">position can be found this way.</w:t>
+      </w:r>
+    </w:p>
+    <w:p>
+      <w:pPr>
+        <w:numPr>
+          <w:ilvl w:val="0"/>
+          <w:numId w:val="1020"/>
+        </w:numPr>
+        <w:pStyle w:val="Compact"/>
+      </w:pPr>
+      <w:r>
+        <w:rPr>
+          <w:bCs/>
+          <w:b/>
+        </w:rPr>
+        <w:t xml:space="preserve">Fare type.</w:t>
+      </w:r>
+      <w:r>
+        <w:t xml:space="preserve"> </w:t>
+      </w:r>
+      <w:r>
+        <w:rPr>
+          <w:bCs/>
+          <w:b/>
+        </w:rPr>
+        <w:t xml:space="preserve">Regular</w:t>
+      </w:r>
+      <w:r>
+        <w:t xml:space="preserve">, or</w:t>
+      </w:r>
+      <w:r>
+        <w:t xml:space="preserve"> </w:t>
+      </w:r>
+      <w:r>
+        <w:rPr>
+          <w:bCs/>
+          <w:b/>
+        </w:rPr>
+        <w:t xml:space="preserve">Senior / PWD / Student</w:t>
+      </w:r>
+      <w:r>
+        <w:t xml:space="preserve"> </w:t>
+      </w:r>
+      <w:r>
+        <w:t xml:space="preserve">for the discounted column.</w:t>
+      </w:r>
+      <w:r>
+        <w:t xml:space="preserve"> </w:t>
+      </w:r>
+      <w:r>
+        <w:t xml:space="preserve">Bring the identification — the driver will ask for it, and the app only records which</w:t>
+      </w:r>
+      <w:r>
+        <w:t xml:space="preserve"> </w:t>
+      </w:r>
+      <w:r>
+        <w:t xml:space="preserve">column you chose.</w:t>
+      </w:r>
+    </w:p>
+    <w:p>
+      <w:pPr>
+        <w:numPr>
+          <w:ilvl w:val="0"/>
+          <w:numId w:val="1020"/>
+        </w:numPr>
+        <w:pStyle w:val="Compact"/>
+      </w:pPr>
+      <w:r>
+        <w:rPr>
+          <w:bCs/>
+          <w:b/>
+        </w:rPr>
+        <w:t xml:space="preserve">Passengers.</w:t>
+      </w:r>
+      <w:r>
+        <w:t xml:space="preserve"> </w:t>
+      </w:r>
+      <w:r>
+        <w:t xml:space="preserve">One to five, with the plus and minus buttons.</w:t>
+      </w:r>
+    </w:p>
+    <w:p>
+      <w:pPr>
+        <w:numPr>
+          <w:ilvl w:val="0"/>
+          <w:numId w:val="1020"/>
+        </w:numPr>
+        <w:pStyle w:val="Compact"/>
+      </w:pPr>
+      <w:r>
+        <w:rPr>
+          <w:bCs/>
+          <w:b/>
+        </w:rPr>
+        <w:t xml:space="preserve">Luggage.</w:t>
+      </w:r>
+      <w:r>
+        <w:t xml:space="preserve"> </w:t>
+      </w:r>
+      <w:r>
+        <w:t xml:space="preserve">Tap any that apply. This is information for the driver and does not change</w:t>
+      </w:r>
+      <w:r>
+        <w:t xml:space="preserve"> </w:t>
+      </w:r>
+      <w:r>
+        <w:t xml:space="preserve">the fare.</w:t>
+      </w:r>
+    </w:p>
+    <w:p>
+      <w:pPr>
+        <w:numPr>
+          <w:ilvl w:val="0"/>
+          <w:numId w:val="1020"/>
+        </w:numPr>
+        <w:pStyle w:val="Compact"/>
+      </w:pPr>
+      <w:r>
+        <w:rPr>
+          <w:bCs/>
+          <w:b/>
+        </w:rPr>
+        <w:t xml:space="preserve">Notes.</w:t>
+      </w:r>
+      <w:r>
+        <w:t xml:space="preserve"> </w:t>
+      </w:r>
+      <w:r>
+        <w:t xml:space="preserve">Anything the driver should know: a landmark, a gate number, that you are</w:t>
+      </w:r>
+      <w:r>
+        <w:t xml:space="preserve"> </w:t>
+      </w:r>
+      <w:r>
+        <w:t xml:space="preserve">waiting under the awning.</w:t>
+      </w:r>
+    </w:p>
+    <w:p>
+      <w:pPr>
+        <w:numPr>
+          <w:ilvl w:val="0"/>
+          <w:numId w:val="1020"/>
+        </w:numPr>
+        <w:pStyle w:val="Compact"/>
+      </w:pPr>
+      <w:r>
+        <w:t xml:space="preserve">Read the itemised fare, then tap</w:t>
+      </w:r>
+      <w:r>
+        <w:t xml:space="preserve"> </w:t>
+      </w:r>
+      <w:r>
+        <w:rPr>
+          <w:bCs/>
+          <w:b/>
+        </w:rPr>
+        <w:t xml:space="preserve">Find a Driver</w:t>
+      </w:r>
+      <w:r>
+        <w:t xml:space="preserve">.</w:t>
+      </w:r>
+    </w:p>
+    <w:p>
+      <w:pPr>
+        <w:pStyle w:val="FirstParagraph"/>
+      </w:pPr>
+      <w:r>
+        <w:rPr>
+          <w:bCs/>
+          <w:b/>
+        </w:rPr>
+        <w:t xml:space="preserve">About the fare.</w:t>
+      </w:r>
+      <w:r>
+        <w:t xml:space="preserve"> </w:t>
+      </w:r>
+      <w:r>
+        <w:t xml:space="preserve">TrikRide does not estimate. It reads the posted FeTODAT rate for your</w:t>
+      </w:r>
+      <w:r>
+        <w:t xml:space="preserve"> </w:t>
+      </w:r>
+      <w:r>
+        <w:t xml:space="preserve">destination, raises it to the ordinance minimum if the posted rate is lower, and multiplies</w:t>
+      </w:r>
+      <w:r>
+        <w:t xml:space="preserve"> </w:t>
+      </w:r>
+      <w:r>
+        <w:t xml:space="preserve">by the number of passengers. Poblacion and the terminal round trip are flat rates. Nothing</w:t>
+      </w:r>
+      <w:r>
+        <w:t xml:space="preserve"> </w:t>
+      </w:r>
+      <w:r>
+        <w:t xml:space="preserve">is calculated from distance, so the number you are shown before booking is the number you</w:t>
+      </w:r>
+      <w:r>
+        <w:t xml:space="preserve"> </w:t>
+      </w:r>
+      <w:r>
+        <w:t xml:space="preserve">pay, in cash, directly to the driver.</w:t>
+      </w:r>
+    </w:p>
+    <w:bookmarkEnd w:id="188"/>
+    <w:bookmarkStart w:id="189" w:name="waiting-for-a-driver"/>
+    <w:p>
+      <w:pPr>
+        <w:pStyle w:val="Heading4"/>
+      </w:pPr>
+      <w:r>
+        <w:t xml:space="preserve">2.7 Waiting for a driver</w:t>
+      </w:r>
+    </w:p>
+    <w:p>
+      <w:pPr>
+        <w:pStyle w:val="FirstParagraph"/>
+      </w:pPr>
+      <w:r>
+        <w:t xml:space="preserve">The request goes to every online, verified driver at once, and the first to accept gets</w:t>
+      </w:r>
+      <w:r>
+        <w:t xml:space="preserve"> </w:t>
+      </w:r>
+      <w:r>
+        <w:t xml:space="preserve">it. If nobody accepts within five minutes it expires and you can send it again.</w:t>
+      </w:r>
+      <w:r>
+        <w:t xml:space="preserve"> </w:t>
+      </w:r>
+      <w:r>
+        <w:rPr>
+          <w:bCs/>
+          <w:b/>
+        </w:rPr>
+        <w:t xml:space="preserve">Cancel</w:t>
+      </w:r>
+      <w:r>
+        <w:rPr>
+          <w:bCs/>
+          <w:b/>
+        </w:rPr>
+        <w:t xml:space="preserve"> </w:t>
+      </w:r>
+      <w:r>
+        <w:rPr>
+          <w:bCs/>
+          <w:b/>
+        </w:rPr>
+        <w:t xml:space="preserve">Request</w:t>
+      </w:r>
+      <w:r>
+        <w:t xml:space="preserve"> </w:t>
+      </w:r>
+      <w:r>
+        <w:t xml:space="preserve">withdraws it before then.</w:t>
+      </w:r>
+    </w:p>
+    <w:p>
+      <w:pPr>
+        <w:pStyle w:val="BodyText"/>
+      </w:pPr>
+      <w:r>
+        <w:t xml:space="preserve">If nothing happens, it usually means no drivers are online rather than that anything is</w:t>
+      </w:r>
+      <w:r>
+        <w:t xml:space="preserve"> </w:t>
+      </w:r>
+      <w:r>
+        <w:t xml:space="preserve">broken.</w:t>
+      </w:r>
+    </w:p>
+    <w:bookmarkEnd w:id="189"/>
+    <w:bookmarkStart w:id="190" w:name="during-the-ride"/>
+    <w:p>
+      <w:pPr>
+        <w:pStyle w:val="Heading4"/>
+      </w:pPr>
+      <w:r>
+        <w:t xml:space="preserve">2.8 During the ride</w:t>
+      </w:r>
+    </w:p>
+    <w:p>
+      <w:pPr>
+        <w:pStyle w:val="FirstParagraph"/>
+      </w:pPr>
+      <w:r>
+        <w:t xml:space="preserve">Once a driver accepts, the screen becomes a status timeline that both of you see:</w:t>
+      </w:r>
+    </w:p>
+    <w:p>
+      <w:pPr>
+        <w:pStyle w:val="BodyText"/>
+      </w:pPr>
+      <w:r>
+        <w:rPr>
+          <w:bCs/>
+          <w:b/>
+        </w:rPr>
+        <w:t xml:space="preserve">Driver accepted</w:t>
+      </w:r>
+      <w:r>
+        <w:t xml:space="preserve"> </w:t>
+      </w:r>
+      <w:r>
+        <w:t xml:space="preserve">→</w:t>
+      </w:r>
+      <w:r>
+        <w:t xml:space="preserve"> </w:t>
+      </w:r>
+      <w:r>
+        <w:rPr>
+          <w:bCs/>
+          <w:b/>
+        </w:rPr>
+        <w:t xml:space="preserve">Driver is on the way</w:t>
+      </w:r>
+      <w:r>
+        <w:t xml:space="preserve"> </w:t>
+      </w:r>
+      <w:r>
+        <w:t xml:space="preserve">→</w:t>
+      </w:r>
+      <w:r>
+        <w:t xml:space="preserve"> </w:t>
+      </w:r>
+      <w:r>
+        <w:rPr>
+          <w:bCs/>
+          <w:b/>
+        </w:rPr>
+        <w:t xml:space="preserve">Your driver has arrived</w:t>
+      </w:r>
+      <w:r>
+        <w:t xml:space="preserve"> </w:t>
+      </w:r>
+      <w:r>
+        <w:t xml:space="preserve">→</w:t>
+      </w:r>
+      <w:r>
+        <w:t xml:space="preserve"> </w:t>
+      </w:r>
+      <w:r>
+        <w:rPr>
+          <w:bCs/>
+          <w:b/>
+        </w:rPr>
+        <w:t xml:space="preserve">Ride in</w:t>
+      </w:r>
+      <w:r>
+        <w:rPr>
+          <w:bCs/>
+          <w:b/>
+        </w:rPr>
+        <w:t xml:space="preserve"> </w:t>
+      </w:r>
+      <w:r>
+        <w:rPr>
+          <w:bCs/>
+          <w:b/>
+        </w:rPr>
+        <w:t xml:space="preserve">progress</w:t>
+      </w:r>
+      <w:r>
+        <w:t xml:space="preserve"> </w:t>
+      </w:r>
+      <w:r>
+        <w:t xml:space="preserve">→</w:t>
+      </w:r>
+      <w:r>
+        <w:t xml:space="preserve"> </w:t>
+      </w:r>
+      <w:r>
+        <w:rPr>
+          <w:bCs/>
+          <w:b/>
+        </w:rPr>
+        <w:t xml:space="preserve">Completed</w:t>
+      </w:r>
+    </w:p>
+    <w:p>
+      <w:pPr>
+        <w:pStyle w:val="BodyText"/>
+      </w:pPr>
+      <w:r>
+        <w:t xml:space="preserve">The driver advances it; your screen follows without your doing anything. Their name,</w:t>
+      </w:r>
+      <w:r>
+        <w:t xml:space="preserve"> </w:t>
+      </w:r>
+      <w:r>
+        <w:t xml:space="preserve">tricycle number and rating are shown, with a button to call them. While they are online</w:t>
+      </w:r>
+      <w:r>
+        <w:t xml:space="preserve"> </w:t>
+      </w:r>
+      <w:r>
+        <w:t xml:space="preserve">with the app open, their position moves on the map.</w:t>
+      </w:r>
+    </w:p>
+    <w:bookmarkEnd w:id="190"/>
+    <w:bookmarkStart w:id="191" w:name="rating-and-history"/>
+    <w:p>
+      <w:pPr>
+        <w:pStyle w:val="Heading4"/>
+      </w:pPr>
+      <w:r>
+        <w:t xml:space="preserve">2.9 Rating and history</w:t>
+      </w:r>
+    </w:p>
+    <w:p>
+      <w:pPr>
+        <w:pStyle w:val="FirstParagraph"/>
+      </w:pPr>
+      <w:r>
+        <w:t xml:space="preserve">When the ride completes you are asked to rate the driver from one to five stars. Tap the</w:t>
+      </w:r>
+      <w:r>
+        <w:t xml:space="preserve"> </w:t>
+      </w:r>
+      <w:r>
+        <w:t xml:space="preserve">stars, then</w:t>
+      </w:r>
+      <w:r>
+        <w:t xml:space="preserve"> </w:t>
+      </w:r>
+      <w:r>
+        <w:rPr>
+          <w:bCs/>
+          <w:b/>
+        </w:rPr>
+        <w:t xml:space="preserve">Send rating</w:t>
+      </w:r>
+      <w:r>
+        <w:t xml:space="preserve"> </w:t>
+      </w:r>
+      <w:r>
+        <w:t xml:space="preserve">— tapping a star does not send it, so a slip is not a rating.</w:t>
+      </w:r>
+      <w:r>
+        <w:t xml:space="preserve"> </w:t>
+      </w:r>
+      <w:r>
+        <w:t xml:space="preserve">You can skip it, but only once: a ride can be rated one time.</w:t>
+      </w:r>
+    </w:p>
+    <w:p>
+      <w:pPr>
+        <w:pStyle w:val="BodyText"/>
+      </w:pPr>
+      <w:r>
+        <w:rPr>
+          <w:bCs/>
+          <w:b/>
+        </w:rPr>
+        <w:t xml:space="preserve">History</w:t>
+      </w:r>
+      <w:r>
+        <w:t xml:space="preserve"> </w:t>
+      </w:r>
+      <w:r>
+        <w:t xml:space="preserve">lists your past rides, most recent first, with the fare and how each ended.</w:t>
+      </w:r>
+    </w:p>
+    <w:bookmarkEnd w:id="191"/>
+    <w:bookmarkStart w:id="192" w:name="reporting-a-concern"/>
+    <w:p>
+      <w:pPr>
+        <w:pStyle w:val="Heading4"/>
+      </w:pPr>
+      <w:r>
+        <w:t xml:space="preserve">2.10 Reporting a concern</w:t>
+      </w:r>
+    </w:p>
+    <w:p>
+      <w:pPr>
+        <w:pStyle w:val="FirstParagraph"/>
+      </w:pPr>
+      <w:r>
+        <w:rPr>
+          <w:bCs/>
+          <w:b/>
+        </w:rPr>
+        <w:t xml:space="preserve">Support</w:t>
+      </w:r>
+      <w:r>
+        <w:t xml:space="preserve"> </w:t>
+      </w:r>
+      <w:r>
+        <w:t xml:space="preserve">has a form: choose a category — driver behaviour, wrong fare, safety concern,</w:t>
+      </w:r>
+      <w:r>
+        <w:t xml:space="preserve"> </w:t>
+      </w:r>
+      <w:r>
+        <w:t xml:space="preserve">app problem, or other — describe what happened, and tap</w:t>
+      </w:r>
+      <w:r>
+        <w:t xml:space="preserve"> </w:t>
+      </w:r>
+      <w:r>
+        <w:rPr>
+          <w:bCs/>
+          <w:b/>
+        </w:rPr>
+        <w:t xml:space="preserve">Submit Report</w:t>
+      </w:r>
+      <w:r>
+        <w:t xml:space="preserve">. An</w:t>
+      </w:r>
+      <w:r>
+        <w:t xml:space="preserve"> </w:t>
+      </w:r>
+      <w:r>
+        <w:t xml:space="preserve">administrator reviews it, and any reply appears under</w:t>
+      </w:r>
+      <w:r>
+        <w:t xml:space="preserve"> </w:t>
+      </w:r>
+      <w:r>
+        <w:rPr>
+          <w:bCs/>
+          <w:b/>
+        </w:rPr>
+        <w:t xml:space="preserve">My Reports</w:t>
+      </w:r>
+      <w:r>
+        <w:t xml:space="preserve"> </w:t>
+      </w:r>
+      <w:r>
+        <w:t xml:space="preserve">on the same tab, along</w:t>
+      </w:r>
+      <w:r>
+        <w:t xml:space="preserve"> </w:t>
+      </w:r>
+      <w:r>
+        <w:t xml:space="preserve">with whether it is still open, in review, or resolved.</w:t>
+      </w:r>
+    </w:p>
+    <w:p>
+      <w:pPr>
+        <w:pStyle w:val="BodyText"/>
+      </w:pPr>
+      <w:r>
+        <w:t xml:space="preserve">The hotline, email address and support hours are at the bottom of the same tab. Use the</w:t>
+      </w:r>
+      <w:r>
+        <w:t xml:space="preserve"> </w:t>
+      </w:r>
+      <w:r>
+        <w:t xml:space="preserve">hotline, not the app, for anything urgent.</w:t>
+      </w:r>
+    </w:p>
+    <w:bookmarkEnd w:id="192"/>
+    <w:bookmarkStart w:id="193" w:name="your-profile"/>
+    <w:p>
+      <w:pPr>
+        <w:pStyle w:val="Heading4"/>
+      </w:pPr>
+      <w:r>
+        <w:t xml:space="preserve">2.11 Your profile</w:t>
+      </w:r>
+    </w:p>
+    <w:p>
+      <w:pPr>
+        <w:pStyle w:val="FirstParagraph"/>
+      </w:pPr>
+      <w:r>
+        <w:rPr>
+          <w:bCs/>
+          <w:b/>
+        </w:rPr>
+        <w:t xml:space="preserve">Profile</w:t>
+      </w:r>
+      <w:r>
+        <w:t xml:space="preserve"> </w:t>
+      </w:r>
+      <w:r>
+        <w:t xml:space="preserve">holds:</w:t>
+      </w:r>
+    </w:p>
+    <w:p>
+      <w:pPr>
+        <w:numPr>
+          <w:ilvl w:val="0"/>
+          <w:numId w:val="1021"/>
+        </w:numPr>
+        <w:pStyle w:val="Compact"/>
+      </w:pPr>
+      <w:r>
+        <w:rPr>
+          <w:bCs/>
+          <w:b/>
+        </w:rPr>
+        <w:t xml:space="preserve">Edit Profile</w:t>
+      </w:r>
+      <w:r>
+        <w:t xml:space="preserve"> </w:t>
+      </w:r>
+      <w:r>
+        <w:t xml:space="preserve">— name, phone, and your photograph, from the camera or the gallery.</w:t>
+      </w:r>
+      <w:r>
+        <w:t xml:space="preserve"> </w:t>
+      </w:r>
+      <w:r>
+        <w:t xml:space="preserve">After choosing one you can pinch to zoom and drag to position it inside the circle, so</w:t>
+      </w:r>
+      <w:r>
+        <w:t xml:space="preserve"> </w:t>
+      </w:r>
+      <w:r>
+        <w:t xml:space="preserve">you decide which part is used.</w:t>
+      </w:r>
+    </w:p>
+    <w:p>
+      <w:pPr>
+        <w:numPr>
+          <w:ilvl w:val="0"/>
+          <w:numId w:val="1021"/>
+        </w:numPr>
+        <w:pStyle w:val="Compact"/>
+      </w:pPr>
+      <w:r>
+        <w:rPr>
+          <w:bCs/>
+          <w:b/>
+        </w:rPr>
+        <w:t xml:space="preserve">Change Password</w:t>
+      </w:r>
+      <w:r>
+        <w:t xml:space="preserve"> </w:t>
+      </w:r>
+      <w:r>
+        <w:t xml:space="preserve">— emails you a reset link.</w:t>
+      </w:r>
+    </w:p>
+    <w:p>
+      <w:pPr>
+        <w:numPr>
+          <w:ilvl w:val="0"/>
+          <w:numId w:val="1021"/>
+        </w:numPr>
+        <w:pStyle w:val="Compact"/>
+      </w:pPr>
+      <w:r>
+        <w:rPr>
+          <w:bCs/>
+          <w:b/>
+        </w:rPr>
+        <w:t xml:space="preserve">Dark Mode</w:t>
+      </w:r>
+      <w:r>
+        <w:t xml:space="preserve"> </w:t>
+      </w:r>
+      <w:r>
+        <w:t xml:space="preserve">— a switch.</w:t>
+      </w:r>
+    </w:p>
+    <w:p>
+      <w:pPr>
+        <w:numPr>
+          <w:ilvl w:val="0"/>
+          <w:numId w:val="1021"/>
+        </w:numPr>
+        <w:pStyle w:val="Compact"/>
+      </w:pPr>
+      <w:r>
+        <w:t xml:space="preserve">The four documents, readable at any time.</w:t>
+      </w:r>
+    </w:p>
+    <w:p>
+      <w:pPr>
+        <w:numPr>
+          <w:ilvl w:val="0"/>
+          <w:numId w:val="1021"/>
+        </w:numPr>
+        <w:pStyle w:val="Compact"/>
+      </w:pPr>
+      <w:r>
+        <w:rPr>
+          <w:bCs/>
+          <w:b/>
+        </w:rPr>
+        <w:t xml:space="preserve">Log Out.</w:t>
+      </w:r>
+    </w:p>
+    <w:p>
+      <w:r>
+        <w:br w:type="page"/>
+      </w:r>
+    </w:p>
+    <w:bookmarkEnd w:id="193"/>
+    <w:bookmarkEnd w:id="194"/>
+    <w:bookmarkStart w:id="201" w:name="part-3-for-drivers"/>
+    <w:p>
+      <w:pPr>
+        <w:pStyle w:val="Heading3"/>
+      </w:pPr>
+      <w:r>
+        <w:t xml:space="preserve">Part 3 — For drivers</w:t>
+      </w:r>
+    </w:p>
+    <w:bookmarkStart w:id="195" w:name="registering"/>
+    <w:p>
+      <w:pPr>
+        <w:pStyle w:val="Heading4"/>
+      </w:pPr>
+      <w:r>
+        <w:t xml:space="preserve">3.1 Registering</w:t>
+      </w:r>
+    </w:p>
+    <w:p>
+      <w:pPr>
+        <w:pStyle w:val="FirstParagraph"/>
+      </w:pPr>
+      <w:r>
+        <w:t xml:space="preserve">Register exactly as a passenger does, but choose</w:t>
+      </w:r>
+      <w:r>
+        <w:t xml:space="preserve"> </w:t>
+      </w:r>
+      <w:r>
+        <w:rPr>
+          <w:bCs/>
+          <w:b/>
+        </w:rPr>
+        <w:t xml:space="preserve">Driver</w:t>
+      </w:r>
+      <w:r>
+        <w:t xml:space="preserve"> </w:t>
+      </w:r>
+      <w:r>
+        <w:t xml:space="preserve">at the account type step. You</w:t>
+      </w:r>
+      <w:r>
+        <w:t xml:space="preserve"> </w:t>
+      </w:r>
+      <w:r>
+        <w:t xml:space="preserve">are then shown the</w:t>
+      </w:r>
+      <w:r>
+        <w:t xml:space="preserve"> </w:t>
+      </w:r>
+      <w:r>
+        <w:rPr>
+          <w:bCs/>
+          <w:b/>
+        </w:rPr>
+        <w:t xml:space="preserve">Driver Agreement</w:t>
+      </w:r>
+      <w:r>
+        <w:t xml:space="preserve">, which has to be accepted before you go any</w:t>
+      </w:r>
+      <w:r>
+        <w:t xml:space="preserve"> </w:t>
+      </w:r>
+      <w:r>
+        <w:t xml:space="preserve">further.</w:t>
+      </w:r>
+    </w:p>
+    <w:p>
+      <w:pPr>
+        <w:pStyle w:val="BodyText"/>
+      </w:pPr>
+      <w:r>
+        <w:t xml:space="preserve">Next comes the driver form:</w:t>
+      </w:r>
+    </w:p>
+    <w:tbl>
+      <w:tblPr>
+        <w:tblStyle w:val="Table"/>
+        <w:tblW w:type="auto" w:w="0"/>
+        <w:tblLook w:firstRow="1" w:lastRow="0" w:firstColumn="0" w:lastColumn="0" w:noHBand="0" w:noVBand="0" w:val="0020"/>
+        <w:jc w:val="start"/>
+      </w:tblPr>
+      <w:tblGrid>
+        <w:gridCol w:w="3960"/>
+        <w:gridCol w:w="3960"/>
+      </w:tblGrid>
+      <w:tr>
+        <w:trPr>
+          <w:tblHeader w:val="true"/>
+        </w:trPr>
+        <w:tc>
+          <w:tcPr/>
+          <w:p>
+            <w:pPr>
+              <w:pStyle w:val="Compact"/>
+              <w:jc w:val="left"/>
+            </w:pPr>
+            <w:r>
+              <w:t xml:space="preserve">Field</w:t>
+            </w:r>
+          </w:p>
+        </w:tc>
+        <w:tc>
+          <w:tcPr/>
+          <w:p>
+            <w:pPr>
+              <w:pStyle w:val="Compact"/>
+              <w:jc w:val="left"/>
+            </w:pPr>
+            <w:r>
+              <w:t xml:space="preserve">Notes</w:t>
+            </w:r>
+          </w:p>
+        </w:tc>
+      </w:tr>
+      <w:tr>
+        <w:tc>
+          <w:tcPr/>
+          <w:p>
+            <w:pPr>
+              <w:pStyle w:val="Compact"/>
+              <w:jc w:val="left"/>
+            </w:pPr>
+            <w:r>
+              <w:t xml:space="preserve">Driver’s License Number</w:t>
+            </w:r>
+          </w:p>
+        </w:tc>
+        <w:tc>
+          <w:tcPr/>
+          <w:p>
+            <w:pPr>
+              <w:pStyle w:val="Compact"/>
+              <w:jc w:val="left"/>
+            </w:pPr>
+            <w:r>
+              <w:t xml:space="preserve">As printed on the licence</w:t>
+            </w:r>
+          </w:p>
+        </w:tc>
+      </w:tr>
+      <w:tr>
+        <w:tc>
+          <w:tcPr/>
+          <w:p>
+            <w:pPr>
+              <w:pStyle w:val="Compact"/>
+              <w:jc w:val="left"/>
+            </w:pPr>
+            <w:r>
+              <w:t xml:space="preserve">License Expiry</w:t>
+            </w:r>
+          </w:p>
+        </w:tc>
+        <w:tc>
+          <w:tcPr/>
+          <w:p>
+            <w:pPr>
+              <w:pStyle w:val="Compact"/>
+              <w:jc w:val="left"/>
+            </w:pPr>
+            <w:r>
+              <w:t xml:space="preserve">MM/YYYY</w:t>
+            </w:r>
+          </w:p>
+        </w:tc>
+      </w:tr>
+      <w:tr>
+        <w:tc>
+          <w:tcPr/>
+          <w:p>
+            <w:pPr>
+              <w:pStyle w:val="Compact"/>
+              <w:jc w:val="left"/>
+            </w:pPr>
+            <w:r>
+              <w:t xml:space="preserve">Tricycle Body / Plate Number</w:t>
+            </w:r>
+          </w:p>
+        </w:tc>
+        <w:tc>
+          <w:tcPr/>
+          <w:p>
+            <w:pPr>
+              <w:pStyle w:val="Compact"/>
+              <w:jc w:val="left"/>
+            </w:pPr>
+            <w:r>
+              <w:t xml:space="preserve">The number on your unit</w:t>
+            </w:r>
+          </w:p>
+        </w:tc>
+      </w:tr>
+    </w:tbl>
+    <w:p>
+      <w:pPr>
+        <w:pStyle w:val="BodyText"/>
+      </w:pPr>
+      <w:r>
+        <w:t xml:space="preserve">Tap</w:t>
+      </w:r>
+      <w:r>
+        <w:t xml:space="preserve"> </w:t>
+      </w:r>
+      <w:r>
+        <w:rPr>
+          <w:bCs/>
+          <w:b/>
+        </w:rPr>
+        <w:t xml:space="preserve">Submit for Verification</w:t>
+      </w:r>
+      <w:r>
+        <w:t xml:space="preserve">.</w:t>
+      </w:r>
+    </w:p>
+    <w:bookmarkEnd w:id="195"/>
+    <w:bookmarkStart w:id="196" w:name="the-licence-photograph"/>
+    <w:p>
+      <w:pPr>
+        <w:pStyle w:val="Heading4"/>
+      </w:pPr>
+      <w:r>
+        <w:t xml:space="preserve">3.2 The licence photograph</w:t>
+      </w:r>
+    </w:p>
+    <w:p>
+      <w:pPr>
+        <w:pStyle w:val="FirstParagraph"/>
+      </w:pPr>
+      <w:r>
+        <w:t xml:space="preserve">A card on your dashboard asks for a photograph of your licence. Take one, or choose one</w:t>
+      </w:r>
+      <w:r>
+        <w:t xml:space="preserve"> </w:t>
+      </w:r>
+      <w:r>
+        <w:t xml:space="preserve">from your gallery, and read the consent step before sending it: it names what the</w:t>
+      </w:r>
+      <w:r>
+        <w:t xml:space="preserve"> </w:t>
+      </w:r>
+      <w:r>
+        <w:t xml:space="preserve">photograph is for, who can see it, and when it is destroyed. You send it only after</w:t>
+      </w:r>
+      <w:r>
+        <w:t xml:space="preserve"> </w:t>
+      </w:r>
+      <w:r>
+        <w:t xml:space="preserve">agreeing to that specifically.</w:t>
+      </w:r>
+    </w:p>
+    <w:p>
+      <w:pPr>
+        <w:pStyle w:val="BodyText"/>
+      </w:pPr>
+      <w:r>
+        <w:t xml:space="preserve">What happens to it, in short: only you and an administrator can ever see it; it is never</w:t>
+      </w:r>
+      <w:r>
+        <w:t xml:space="preserve"> </w:t>
+      </w:r>
+      <w:r>
+        <w:t xml:space="preserve">shown to a passenger and never appears in a report. If your application is refused it is</w:t>
+      </w:r>
+      <w:r>
+        <w:t xml:space="preserve"> </w:t>
+      </w:r>
+      <w:r>
+        <w:t xml:space="preserve">deleted at that moment. If you are approved it stays while your account is active, because</w:t>
+      </w:r>
+      <w:r>
+        <w:t xml:space="preserve"> </w:t>
+      </w:r>
+      <w:r>
+        <w:t xml:space="preserve">it is needed again when your licence expires. You can remove it yourself at any time from</w:t>
+      </w:r>
+      <w:r>
+        <w:t xml:space="preserve"> </w:t>
+      </w:r>
+      <w:r>
+        <w:t xml:space="preserve">your Profile tab, though without one on file you cannot be approved to carry passengers.</w:t>
+      </w:r>
+      <w:r>
+        <w:t xml:space="preserve"> </w:t>
+      </w:r>
+      <w:r>
+        <w:t xml:space="preserve">Section 9 of the Privacy Policy sets this out in full.</w:t>
+      </w:r>
+    </w:p>
+    <w:p>
+      <w:pPr>
+        <w:pStyle w:val="BodyText"/>
+      </w:pPr>
+      <w:r>
+        <w:t xml:space="preserve">Once the photograph has been sent, the card moves off the dashboard and lives in Profile.</w:t>
+      </w:r>
+    </w:p>
+    <w:bookmarkEnd w:id="196"/>
+    <w:bookmarkStart w:id="197" w:name="while-you-wait-for-verification"/>
+    <w:p>
+      <w:pPr>
+        <w:pStyle w:val="Heading4"/>
+      </w:pPr>
+      <w:r>
+        <w:t xml:space="preserve">3.3 While you wait for verification</w:t>
+      </w:r>
+    </w:p>
+    <w:p>
+      <w:pPr>
+        <w:pStyle w:val="FirstParagraph"/>
+      </w:pPr>
+      <w:r>
+        <w:t xml:space="preserve">Your dashboard shows</w:t>
+      </w:r>
+      <w:r>
+        <w:t xml:space="preserve"> </w:t>
+      </w:r>
+      <w:r>
+        <w:rPr>
+          <w:bCs/>
+          <w:b/>
+        </w:rPr>
+        <w:t xml:space="preserve">Verification: PENDING</w:t>
+      </w:r>
+      <w:r>
+        <w:t xml:space="preserve">. You cannot accept passengers until an</w:t>
+      </w:r>
+      <w:r>
+        <w:t xml:space="preserve"> </w:t>
+      </w:r>
+      <w:r>
+        <w:t xml:space="preserve">administrator approves you, and requests will not appear. The decision arrives as a</w:t>
+      </w:r>
+      <w:r>
+        <w:t xml:space="preserve"> </w:t>
+      </w:r>
+      <w:r>
+        <w:t xml:space="preserve">notification. If you are rejected, the reason is in that notification and your licence</w:t>
+      </w:r>
+      <w:r>
+        <w:t xml:space="preserve"> </w:t>
+      </w:r>
+      <w:r>
+        <w:t xml:space="preserve">photograph is deleted along with the refusal.</w:t>
+      </w:r>
+    </w:p>
+    <w:bookmarkEnd w:id="197"/>
+    <w:bookmarkStart w:id="198" w:name="going-online"/>
+    <w:p>
+      <w:pPr>
+        <w:pStyle w:val="Heading4"/>
+      </w:pPr>
+      <w:r>
+        <w:t xml:space="preserve">3.4 Going online</w:t>
+      </w:r>
+    </w:p>
+    <w:p>
+      <w:pPr>
+        <w:pStyle w:val="FirstParagraph"/>
+      </w:pPr>
+      <w:r>
+        <w:t xml:space="preserve">The dashboard has a switch, and a</w:t>
+      </w:r>
+      <w:r>
+        <w:t xml:space="preserve"> </w:t>
+      </w:r>
+      <w:r>
+        <w:rPr>
+          <w:bCs/>
+          <w:b/>
+        </w:rPr>
+        <w:t xml:space="preserve">Go Online</w:t>
+      </w:r>
+      <w:r>
+        <w:t xml:space="preserve"> </w:t>
+      </w:r>
+      <w:r>
+        <w:t xml:space="preserve">button that does the same thing. Online</w:t>
+      </w:r>
+      <w:r>
+        <w:t xml:space="preserve"> </w:t>
+      </w:r>
+      <w:r>
+        <w:t xml:space="preserve">means requests reach you and your position is published to the passenger of any ride you</w:t>
+      </w:r>
+      <w:r>
+        <w:t xml:space="preserve"> </w:t>
+      </w:r>
+      <w:r>
+        <w:t xml:space="preserve">are on. Offline means neither.</w:t>
+      </w:r>
+    </w:p>
+    <w:p>
+      <w:pPr>
+        <w:pStyle w:val="BodyText"/>
+      </w:pPr>
+      <w:r>
+        <w:t xml:space="preserve">Your position is published</w:t>
+      </w:r>
+      <w:r>
+        <w:t xml:space="preserve"> </w:t>
+      </w:r>
+      <w:r>
+        <w:rPr>
+          <w:bCs/>
+          <w:b/>
+        </w:rPr>
+        <w:t xml:space="preserve">only while you are online with the app open</w:t>
+      </w:r>
+      <w:r>
+        <w:t xml:space="preserve">. There is no</w:t>
+      </w:r>
+      <w:r>
+        <w:t xml:space="preserve"> </w:t>
+      </w:r>
+      <w:r>
+        <w:t xml:space="preserve">background tracking. Close the app and your passenger stops seeing you move, so keep it</w:t>
+      </w:r>
+      <w:r>
+        <w:t xml:space="preserve"> </w:t>
+      </w:r>
+      <w:r>
+        <w:t xml:space="preserve">open on the way to a pickup.</w:t>
+      </w:r>
+    </w:p>
+    <w:bookmarkEnd w:id="198"/>
+    <w:bookmarkStart w:id="199" w:name="taking-a-ride"/>
+    <w:p>
+      <w:pPr>
+        <w:pStyle w:val="Heading4"/>
+      </w:pPr>
+      <w:r>
+        <w:t xml:space="preserve">3.5 Taking a ride</w:t>
+      </w:r>
+    </w:p>
+    <w:p>
+      <w:pPr>
+        <w:pStyle w:val="FirstParagraph"/>
+      </w:pPr>
+      <w:r>
+        <w:t xml:space="preserve">Requests arrive on the</w:t>
+      </w:r>
+      <w:r>
+        <w:t xml:space="preserve"> </w:t>
+      </w:r>
+      <w:r>
+        <w:rPr>
+          <w:bCs/>
+          <w:b/>
+        </w:rPr>
+        <w:t xml:space="preserve">Requests</w:t>
+      </w:r>
+      <w:r>
+        <w:t xml:space="preserve"> </w:t>
+      </w:r>
+      <w:r>
+        <w:t xml:space="preserve">tab, which carries a count. Each card shows the</w:t>
+      </w:r>
+      <w:r>
+        <w:t xml:space="preserve"> </w:t>
+      </w:r>
+      <w:r>
+        <w:t xml:space="preserve">pickup, the destination, the fare, the rate column, how many passengers, what luggage, and</w:t>
+      </w:r>
+      <w:r>
+        <w:t xml:space="preserve"> </w:t>
+      </w:r>
+      <w:r>
+        <w:t xml:space="preserve">any note. Every online driver sees the same request; the first to accept gets it and it</w:t>
+      </w:r>
+      <w:r>
+        <w:t xml:space="preserve"> </w:t>
+      </w:r>
+      <w:r>
+        <w:t xml:space="preserve">disappears for everyone else, so accept promptly. An unaccepted request expires after five</w:t>
+      </w:r>
+      <w:r>
+        <w:t xml:space="preserve"> </w:t>
+      </w:r>
+      <w:r>
+        <w:t xml:space="preserve">minutes.</w:t>
+      </w:r>
+    </w:p>
+    <w:p>
+      <w:pPr>
+        <w:pStyle w:val="BodyText"/>
+      </w:pPr>
+      <w:r>
+        <w:t xml:space="preserve">Once you accept, your Dashboard becomes the active ride. Advance it with the button as you</w:t>
+      </w:r>
+      <w:r>
+        <w:t xml:space="preserve"> </w:t>
+      </w:r>
+      <w:r>
+        <w:t xml:space="preserve">go:</w:t>
+      </w:r>
+    </w:p>
+    <w:p>
+      <w:pPr>
+        <w:pStyle w:val="BodyText"/>
+      </w:pPr>
+      <w:r>
+        <w:rPr>
+          <w:bCs/>
+          <w:b/>
+        </w:rPr>
+        <w:t xml:space="preserve">Accepted</w:t>
+      </w:r>
+      <w:r>
+        <w:t xml:space="preserve"> </w:t>
+      </w:r>
+      <w:r>
+        <w:t xml:space="preserve">→</w:t>
+      </w:r>
+      <w:r>
+        <w:t xml:space="preserve"> </w:t>
+      </w:r>
+      <w:r>
+        <w:rPr>
+          <w:bCs/>
+          <w:b/>
+        </w:rPr>
+        <w:t xml:space="preserve">Heading to pickup</w:t>
+      </w:r>
+      <w:r>
+        <w:t xml:space="preserve"> </w:t>
+      </w:r>
+      <w:r>
+        <w:t xml:space="preserve">→</w:t>
+      </w:r>
+      <w:r>
+        <w:t xml:space="preserve"> </w:t>
+      </w:r>
+      <w:r>
+        <w:rPr>
+          <w:bCs/>
+          <w:b/>
+        </w:rPr>
+        <w:t xml:space="preserve">Arrived at pickup</w:t>
+      </w:r>
+      <w:r>
+        <w:t xml:space="preserve"> </w:t>
+      </w:r>
+      <w:r>
+        <w:t xml:space="preserve">→</w:t>
+      </w:r>
+      <w:r>
+        <w:t xml:space="preserve"> </w:t>
+      </w:r>
+      <w:r>
+        <w:rPr>
+          <w:bCs/>
+          <w:b/>
+        </w:rPr>
+        <w:t xml:space="preserve">Ride in progress</w:t>
+      </w:r>
+      <w:r>
+        <w:t xml:space="preserve"> </w:t>
+      </w:r>
+      <w:r>
+        <w:t xml:space="preserve">→</w:t>
+      </w:r>
+      <w:r>
+        <w:t xml:space="preserve"> </w:t>
+      </w:r>
+      <w:r>
+        <w:rPr>
+          <w:bCs/>
+          <w:b/>
+        </w:rPr>
+        <w:t xml:space="preserve">Completed</w:t>
+      </w:r>
+    </w:p>
+    <w:p>
+      <w:pPr>
+        <w:pStyle w:val="BodyText"/>
+      </w:pPr>
+      <w:r>
+        <w:t xml:space="preserve">The passenger’s screen follows each step. Marking a ride completed records the fare and</w:t>
+      </w:r>
+      <w:r>
+        <w:t xml:space="preserve"> </w:t>
+      </w:r>
+      <w:r>
+        <w:t xml:space="preserve">asks the passenger to rate you.</w:t>
+      </w:r>
+    </w:p>
+    <w:p>
+      <w:pPr>
+        <w:pStyle w:val="BodyText"/>
+      </w:pPr>
+      <w:r>
+        <w:t xml:space="preserve">Check identification when a passenger has booked the discounted rate. The app records the</w:t>
+      </w:r>
+      <w:r>
+        <w:t xml:space="preserve"> </w:t>
+      </w:r>
+      <w:r>
+        <w:t xml:space="preserve">column they chose; it cannot verify anyone is a senior, a PWD or a student.</w:t>
+      </w:r>
+    </w:p>
+    <w:bookmarkEnd w:id="199"/>
+    <w:bookmarkStart w:id="200" w:name="earnings-history-and-the-rest"/>
+    <w:p>
+      <w:pPr>
+        <w:pStyle w:val="Heading4"/>
+      </w:pPr>
+      <w:r>
+        <w:t xml:space="preserve">3.6 Earnings, history and the rest</w:t>
+      </w:r>
+    </w:p>
+    <w:p>
+      <w:pPr>
+        <w:pStyle w:val="FirstParagraph"/>
+      </w:pPr>
+      <w:r>
+        <w:t xml:space="preserve">The dashboard shows today’s earnings.</w:t>
+      </w:r>
+      <w:r>
+        <w:t xml:space="preserve"> </w:t>
+      </w:r>
+      <w:r>
+        <w:rPr>
+          <w:bCs/>
+          <w:b/>
+        </w:rPr>
+        <w:t xml:space="preserve">History</w:t>
+      </w:r>
+      <w:r>
+        <w:t xml:space="preserve"> </w:t>
+      </w:r>
+      <w:r>
+        <w:t xml:space="preserve">lists every completed and cancelled trip</w:t>
+      </w:r>
+      <w:r>
+        <w:t xml:space="preserve"> </w:t>
+      </w:r>
+      <w:r>
+        <w:t xml:space="preserve">with a running total. Your rating and trip count are at the top of the dashboard and on</w:t>
+      </w:r>
+      <w:r>
+        <w:t xml:space="preserve"> </w:t>
+      </w:r>
+      <w:r>
+        <w:t xml:space="preserve">your Profile tab.</w:t>
+      </w:r>
+    </w:p>
+    <w:p>
+      <w:pPr>
+        <w:pStyle w:val="BodyText"/>
+      </w:pPr>
+      <w:r>
+        <w:rPr>
+          <w:bCs/>
+          <w:b/>
+        </w:rPr>
+        <w:t xml:space="preserve">Support</w:t>
+      </w:r>
+      <w:r>
+        <w:t xml:space="preserve"> </w:t>
+      </w:r>
+      <w:r>
+        <w:t xml:space="preserve">works the same way it does for a passenger: a form for reporting a concern,</w:t>
+      </w:r>
+      <w:r>
+        <w:t xml:space="preserve"> </w:t>
+      </w:r>
+      <w:r>
+        <w:t xml:space="preserve">your own past reports and their status, and the hotline.</w:t>
+      </w:r>
+    </w:p>
+    <w:p>
+      <w:pPr>
+        <w:pStyle w:val="BodyText"/>
+      </w:pPr>
+      <w:r>
+        <w:rPr>
+          <w:bCs/>
+          <w:b/>
+        </w:rPr>
+        <w:t xml:space="preserve">Profile</w:t>
+      </w:r>
+      <w:r>
+        <w:t xml:space="preserve"> </w:t>
+      </w:r>
+      <w:r>
+        <w:t xml:space="preserve">holds your credentials card, your licence photograph, the profile photo</w:t>
+      </w:r>
+      <w:r>
+        <w:t xml:space="preserve"> </w:t>
+      </w:r>
+      <w:r>
+        <w:t xml:space="preserve">picker, dark mode, the four documents including the Driver Agreement, and Log Out.</w:t>
+      </w:r>
+    </w:p>
+    <w:p>
+      <w:r>
+        <w:br w:type="page"/>
+      </w:r>
+    </w:p>
+    <w:bookmarkEnd w:id="200"/>
+    <w:bookmarkEnd w:id="201"/>
+    <w:bookmarkStart w:id="206" w:name="part-4-for-administrators"/>
+    <w:p>
+      <w:pPr>
+        <w:pStyle w:val="Heading3"/>
+      </w:pPr>
+      <w:r>
+        <w:t xml:space="preserve">Part 4 — For administrators</w:t>
+      </w:r>
+    </w:p>
+    <w:p>
+      <w:pPr>
+        <w:pStyle w:val="FirstParagraph"/>
+      </w:pPr>
+      <w:r>
+        <w:t xml:space="preserve">An administrator account is not created in the app. An existing account is promoted by</w:t>
+      </w:r>
+      <w:r>
+        <w:t xml:space="preserve"> </w:t>
+      </w:r>
+      <w:r>
+        <w:t xml:space="preserve">setting its</w:t>
       </w:r>
       <w:r>
         <w:t xml:space="preserve"> </w:t>
@@ -29025,10 +31403,13 @@
         <w:rPr>
           <w:rStyle w:val="VerbatimChar"/>
         </w:rPr>
-        <w:t xml:space="preserve">google-services.json</w:t>
-      </w:r>
-      <w:r>
-        <w:t xml:space="preserve">, the Firebase configuration, downloaded from the project’s Firebase console; and</w:t>
+        <w:t xml:space="preserve">userType</w:t>
+      </w:r>
+      <w:r>
+        <w:t xml:space="preserve"> </w:t>
+      </w:r>
+      <w:r>
+        <w:t xml:space="preserve">to</w:t>
       </w:r>
       <w:r>
         <w:t xml:space="preserve"> </w:t>
@@ -29037,63 +31418,663 @@
         <w:rPr>
           <w:rStyle w:val="VerbatimChar"/>
         </w:rPr>
-        <w:t xml:space="preserve">.env</w:t>
-      </w:r>
-      <w:r>
-        <w:t xml:space="preserve">, copied from the committed</w:t>
-      </w:r>
-      <w:r>
-        <w:t xml:space="preserve"> </w:t>
-      </w:r>
-      <w:r>
-        <w:rPr>
-          <w:rStyle w:val="VerbatimChar"/>
-        </w:rPr>
-        <w:t xml:space="preserve">.env.example</w:t>
-      </w:r>
-      <w:r>
-        <w:t xml:space="preserve"> </w:t>
-      </w:r>
-      <w:r>
-        <w:t xml:space="preserve">and filled in.</w:t>
-      </w:r>
-      <w:r>
-        <w:t xml:space="preserve"> </w:t>
-      </w:r>
-      <w:r>
-        <w:rPr>
-          <w:rStyle w:val="VerbatimChar"/>
-        </w:rPr>
-        <w:t xml:space="preserve">SETUP_GUIDE.md</w:t>
-      </w:r>
-      <w:r>
-        <w:t xml:space="preserve"> </w:t>
-      </w:r>
-      <w:r>
-        <w:t xml:space="preserve">in the repository root gives the full procedure, and</w:t>
-      </w:r>
-      <w:r>
-        <w:t xml:space="preserve"> </w:t>
-      </w:r>
-      <w:r>
-        <w:rPr>
-          <w:rStyle w:val="VerbatimChar"/>
-        </w:rPr>
-        <w:t xml:space="preserve">ARCHITECTURE.md</w:t>
-      </w:r>
-      <w:r>
-        <w:t xml:space="preserve"> </w:t>
-      </w:r>
-      <w:r>
-        <w:t xml:space="preserve">explains how the code is arranged.</w:t>
-      </w:r>
-    </w:p>
-    <w:p>
-      <w:pPr>
-        <w:pStyle w:val="BodyText"/>
-      </w:pPr>
-      <w:r>
-        <w:t xml:space="preserve">The repository is organized as follows.</w:t>
+        <w:t xml:space="preserve">ADMIN</w:t>
+      </w:r>
+      <w:r>
+        <w:t xml:space="preserve"> </w:t>
+      </w:r>
+      <w:r>
+        <w:t xml:space="preserve">in the Firebase console — the security rules deliberately</w:t>
+      </w:r>
+      <w:r>
+        <w:t xml:space="preserve"> </w:t>
+      </w:r>
+      <w:r>
+        <w:t xml:space="preserve">stop an account from doing that to itself. Sign out and back in afterwards.</w:t>
+      </w:r>
+    </w:p>
+    <w:p>
+      <w:pPr>
+        <w:pStyle w:val="BodyText"/>
+      </w:pPr>
+      <w:r>
+        <w:t xml:space="preserve">Five tabs:</w:t>
+      </w:r>
+      <w:r>
+        <w:t xml:space="preserve"> </w:t>
+      </w:r>
+      <w:r>
+        <w:rPr>
+          <w:bCs/>
+          <w:b/>
+        </w:rPr>
+        <w:t xml:space="preserve">Verify</w:t>
+      </w:r>
+      <w:r>
+        <w:t xml:space="preserve">,</w:t>
+      </w:r>
+      <w:r>
+        <w:t xml:space="preserve"> </w:t>
+      </w:r>
+      <w:r>
+        <w:rPr>
+          <w:bCs/>
+          <w:b/>
+        </w:rPr>
+        <w:t xml:space="preserve">Concerns</w:t>
+      </w:r>
+      <w:r>
+        <w:t xml:space="preserve">,</w:t>
+      </w:r>
+      <w:r>
+        <w:t xml:space="preserve"> </w:t>
+      </w:r>
+      <w:r>
+        <w:rPr>
+          <w:bCs/>
+          <w:b/>
+        </w:rPr>
+        <w:t xml:space="preserve">Monitor</w:t>
+      </w:r>
+      <w:r>
+        <w:t xml:space="preserve">,</w:t>
+      </w:r>
+      <w:r>
+        <w:t xml:space="preserve"> </w:t>
+      </w:r>
+      <w:r>
+        <w:rPr>
+          <w:bCs/>
+          <w:b/>
+        </w:rPr>
+        <w:t xml:space="preserve">Fares</w:t>
+      </w:r>
+      <w:r>
+        <w:t xml:space="preserve">,</w:t>
+      </w:r>
+      <w:r>
+        <w:t xml:space="preserve"> </w:t>
+      </w:r>
+      <w:r>
+        <w:rPr>
+          <w:bCs/>
+          <w:b/>
+        </w:rPr>
+        <w:t xml:space="preserve">Profile</w:t>
+      </w:r>
+      <w:r>
+        <w:t xml:space="preserve">.</w:t>
+      </w:r>
+    </w:p>
+    <w:bookmarkStart w:id="202" w:name="first-run-load-the-fare-table"/>
+    <w:p>
+      <w:pPr>
+        <w:pStyle w:val="Heading4"/>
+      </w:pPr>
+      <w:r>
+        <w:t xml:space="preserve">4.1 First run: load the fare table</w:t>
+      </w:r>
+    </w:p>
+    <w:p>
+      <w:pPr>
+        <w:pStyle w:val="FirstParagraph"/>
+      </w:pPr>
+      <w:r>
+        <w:t xml:space="preserve">Nothing can be booked until this is done once.</w:t>
+      </w:r>
+    </w:p>
+    <w:p>
+      <w:pPr>
+        <w:numPr>
+          <w:ilvl w:val="0"/>
+          <w:numId w:val="1022"/>
+        </w:numPr>
+        <w:pStyle w:val="Compact"/>
+      </w:pPr>
+      <w:r>
+        <w:rPr>
+          <w:bCs/>
+          <w:b/>
+        </w:rPr>
+        <w:t xml:space="preserve">Fares</w:t>
+      </w:r>
+      <w:r>
+        <w:t xml:space="preserve"> </w:t>
+      </w:r>
+      <w:r>
+        <w:t xml:space="preserve">→</w:t>
+      </w:r>
+      <w:r>
+        <w:t xml:space="preserve"> </w:t>
+      </w:r>
+      <w:r>
+        <w:rPr>
+          <w:bCs/>
+          <w:b/>
+        </w:rPr>
+        <w:t xml:space="preserve">Load official rates</w:t>
+      </w:r>
+      <w:r>
+        <w:t xml:space="preserve">. This writes all 240 transcribed FeTODAT stops in</w:t>
+      </w:r>
+      <w:r>
+        <w:t xml:space="preserve"> </w:t>
+      </w:r>
+      <w:r>
+        <w:t xml:space="preserve">one request.</w:t>
+      </w:r>
+    </w:p>
+    <w:p>
+      <w:pPr>
+        <w:numPr>
+          <w:ilvl w:val="0"/>
+          <w:numId w:val="1022"/>
+        </w:numPr>
+        <w:pStyle w:val="Compact"/>
+      </w:pPr>
+      <w:r>
+        <w:t xml:space="preserve">Open the</w:t>
+      </w:r>
+      <w:r>
+        <w:t xml:space="preserve"> </w:t>
+      </w:r>
+      <w:r>
+        <w:rPr>
+          <w:bCs/>
+          <w:b/>
+        </w:rPr>
+        <w:t xml:space="preserve">minimums and flat rates</w:t>
+      </w:r>
+      <w:r>
+        <w:t xml:space="preserve"> </w:t>
+      </w:r>
+      <w:r>
+        <w:t xml:space="preserve">dialog and check the four values: minimum regular</w:t>
+      </w:r>
+      <w:r>
+        <w:t xml:space="preserve"> </w:t>
+      </w:r>
+      <w:r>
+        <w:t xml:space="preserve">₱25, minimum discounted ₱20, Poblacion flat ₱25, terminal round trip ₱25. Loading the</w:t>
+      </w:r>
+      <w:r>
+        <w:t xml:space="preserve"> </w:t>
+      </w:r>
+      <w:r>
+        <w:t xml:space="preserve">rates leaves these four alone on purpose, so that corrections survive a reload — which</w:t>
+      </w:r>
+      <w:r>
+        <w:t xml:space="preserve"> </w:t>
+      </w:r>
+      <w:r>
+        <w:t xml:space="preserve">also means a database seeded earlier keeps whatever it had, and reloading will not put</w:t>
+      </w:r>
+      <w:r>
+        <w:t xml:space="preserve"> </w:t>
+      </w:r>
+      <w:r>
+        <w:t xml:space="preserve">it right.</w:t>
+      </w:r>
+    </w:p>
+    <w:p>
+      <w:pPr>
+        <w:numPr>
+          <w:ilvl w:val="0"/>
+          <w:numId w:val="1022"/>
+        </w:numPr>
+        <w:pStyle w:val="Compact"/>
+      </w:pPr>
+      <w:r>
+        <w:t xml:space="preserve">Tap the</w:t>
+      </w:r>
+      <w:r>
+        <w:t xml:space="preserve"> </w:t>
+      </w:r>
+      <w:r>
+        <w:rPr>
+          <w:bCs/>
+          <w:b/>
+        </w:rPr>
+        <w:t xml:space="preserve">Needs review</w:t>
+      </w:r>
+      <w:r>
+        <w:t xml:space="preserve"> </w:t>
+      </w:r>
+      <w:r>
+        <w:t xml:space="preserve">chip. Forty-six entries are flagged as uncertain from the</w:t>
+      </w:r>
+      <w:r>
+        <w:t xml:space="preserve"> </w:t>
+      </w:r>
+      <w:r>
+        <w:t xml:space="preserve">transcription and three are switched off because no rate could be read. Each one opens</w:t>
+      </w:r>
+      <w:r>
+        <w:t xml:space="preserve"> </w:t>
+      </w:r>
+      <w:r>
+        <w:t xml:space="preserve">with the specific problem at the top of the dialog. Work through them against the</w:t>
+      </w:r>
+      <w:r>
+        <w:t xml:space="preserve"> </w:t>
+      </w:r>
+      <w:r>
+        <w:t xml:space="preserve">physical posted sheet before anyone uses the app for real.</w:t>
+      </w:r>
+    </w:p>
+    <w:p>
+      <w:pPr>
+        <w:pStyle w:val="FirstParagraph"/>
+      </w:pPr>
+      <w:r>
+        <w:t xml:space="preserve">You can also search the table by stop or zone, filter by zone, edit any entry, switch one</w:t>
+      </w:r>
+      <w:r>
+        <w:t xml:space="preserve"> </w:t>
+      </w:r>
+      <w:r>
+        <w:t xml:space="preserve">off, add one, or delete one. Editing an entry clears its review flag.</w:t>
+      </w:r>
+    </w:p>
+    <w:p>
+      <w:pPr>
+        <w:pStyle w:val="BodyText"/>
+      </w:pPr>
+      <w:r>
+        <w:rPr>
+          <w:bCs/>
+          <w:b/>
+        </w:rPr>
+        <w:t xml:space="preserve">Map positions.</w:t>
+      </w:r>
+      <w:r>
+        <w:t xml:space="preserve"> </w:t>
+      </w:r>
+      <w:r>
+        <w:t xml:space="preserve">A stop can be given coordinates in the same dialog. A stop without them</w:t>
+      </w:r>
+      <w:r>
+        <w:t xml:space="preserve"> </w:t>
+      </w:r>
+      <w:r>
+        <w:t xml:space="preserve">books and prices normally; it just does not appear on the map, and cannot be found through</w:t>
+      </w:r>
+      <w:r>
+        <w:t xml:space="preserve"> </w:t>
+      </w:r>
+      <w:r>
+        <w:t xml:space="preserve">“</w:t>
+      </w:r>
+      <w:r>
+        <w:t xml:space="preserve">Find it on the map</w:t>
+      </w:r>
+      <w:r>
+        <w:t xml:space="preserve">”</w:t>
+      </w:r>
+      <w:r>
+        <w:t xml:space="preserve">. Filling in the common destinations is worth doing.</w:t>
+      </w:r>
+    </w:p>
+    <w:bookmarkEnd w:id="202"/>
+    <w:bookmarkStart w:id="203" w:name="verifying-drivers"/>
+    <w:p>
+      <w:pPr>
+        <w:pStyle w:val="Heading4"/>
+      </w:pPr>
+      <w:r>
+        <w:t xml:space="preserve">4.2 Verifying drivers</w:t>
+      </w:r>
+    </w:p>
+    <w:p>
+      <w:pPr>
+        <w:pStyle w:val="FirstParagraph"/>
+      </w:pPr>
+      <w:r>
+        <w:rPr>
+          <w:bCs/>
+          <w:b/>
+        </w:rPr>
+        <w:t xml:space="preserve">Verify</w:t>
+      </w:r>
+      <w:r>
+        <w:t xml:space="preserve"> </w:t>
+      </w:r>
+      <w:r>
+        <w:t xml:space="preserve">carries a badge with the number waiting.</w:t>
+      </w:r>
+    </w:p>
+    <w:p>
+      <w:pPr>
+        <w:pStyle w:val="BodyText"/>
+      </w:pPr>
+      <w:r>
+        <w:t xml:space="preserve">Each pending driver shows their name, contact details, licence number, expiry and tricycle</w:t>
+      </w:r>
+      <w:r>
+        <w:t xml:space="preserve"> </w:t>
+      </w:r>
+      <w:r>
+        <w:t xml:space="preserve">number. Tap</w:t>
+      </w:r>
+      <w:r>
+        <w:t xml:space="preserve"> </w:t>
+      </w:r>
+      <w:r>
+        <w:rPr>
+          <w:bCs/>
+          <w:b/>
+        </w:rPr>
+        <w:t xml:space="preserve">View licence details</w:t>
+      </w:r>
+      <w:r>
+        <w:t xml:space="preserve"> </w:t>
+      </w:r>
+      <w:r>
+        <w:t xml:space="preserve">to see the photograph they submitted alongside the</w:t>
+      </w:r>
+      <w:r>
+        <w:t xml:space="preserve"> </w:t>
+      </w:r>
+      <w:r>
+        <w:t xml:space="preserve">details they typed, and check that the two agree.</w:t>
+      </w:r>
+    </w:p>
+    <w:p>
+      <w:pPr>
+        <w:numPr>
+          <w:ilvl w:val="0"/>
+          <w:numId w:val="1023"/>
+        </w:numPr>
+        <w:pStyle w:val="Compact"/>
+      </w:pPr>
+      <w:r>
+        <w:rPr>
+          <w:bCs/>
+          <w:b/>
+        </w:rPr>
+        <w:t xml:space="preserve">Approve</w:t>
+      </w:r>
+      <w:r>
+        <w:t xml:space="preserve"> </w:t>
+      </w:r>
+      <w:r>
+        <w:t xml:space="preserve">— they can go online and start accepting.</w:t>
+      </w:r>
+    </w:p>
+    <w:p>
+      <w:pPr>
+        <w:numPr>
+          <w:ilvl w:val="0"/>
+          <w:numId w:val="1023"/>
+        </w:numPr>
+        <w:pStyle w:val="Compact"/>
+      </w:pPr>
+      <w:r>
+        <w:rPr>
+          <w:bCs/>
+          <w:b/>
+        </w:rPr>
+        <w:t xml:space="preserve">Reject</w:t>
+      </w:r>
+      <w:r>
+        <w:t xml:space="preserve"> </w:t>
+      </w:r>
+      <w:r>
+        <w:t xml:space="preserve">— the application is refused and the photograph is deleted with it.</w:t>
+      </w:r>
+    </w:p>
+    <w:p>
+      <w:pPr>
+        <w:pStyle w:val="FirstParagraph"/>
+      </w:pPr>
+      <w:r>
+        <w:t xml:space="preserve">Either way the driver gets a notification. An approved driver can be reversed later with</w:t>
+      </w:r>
+      <w:r>
+        <w:t xml:space="preserve"> </w:t>
+      </w:r>
+      <w:r>
+        <w:rPr>
+          <w:bCs/>
+          <w:b/>
+        </w:rPr>
+        <w:t xml:space="preserve">Revoke Approval</w:t>
+      </w:r>
+      <w:r>
+        <w:t xml:space="preserve">, which stops them accepting anyone; that does not delete the</w:t>
+      </w:r>
+      <w:r>
+        <w:t xml:space="preserve"> </w:t>
+      </w:r>
+      <w:r>
+        <w:t xml:space="preserve">photograph, since the reason for revoking may itself need to be evidenced.</w:t>
+      </w:r>
+    </w:p>
+    <w:p>
+      <w:pPr>
+        <w:pStyle w:val="BodyText"/>
+      </w:pPr>
+      <w:r>
+        <w:t xml:space="preserve">Below the queue is every registered driver with their current state.</w:t>
+      </w:r>
+    </w:p>
+    <w:bookmarkEnd w:id="203"/>
+    <w:bookmarkStart w:id="204" w:name="concerns"/>
+    <w:p>
+      <w:pPr>
+        <w:pStyle w:val="Heading4"/>
+      </w:pPr>
+      <w:r>
+        <w:t xml:space="preserve">4.3 Concerns</w:t>
+      </w:r>
+    </w:p>
+    <w:p>
+      <w:pPr>
+        <w:pStyle w:val="FirstParagraph"/>
+      </w:pPr>
+      <w:r>
+        <w:rPr>
+          <w:bCs/>
+          <w:b/>
+        </w:rPr>
+        <w:t xml:space="preserve">Concerns</w:t>
+      </w:r>
+      <w:r>
+        <w:t xml:space="preserve"> </w:t>
+      </w:r>
+      <w:r>
+        <w:t xml:space="preserve">carries a badge with the number still open. Each shows who filed it, whether</w:t>
+      </w:r>
+      <w:r>
+        <w:t xml:space="preserve"> </w:t>
+      </w:r>
+      <w:r>
+        <w:t xml:space="preserve">they are a passenger or a driver, the category, and what they wrote.</w:t>
+      </w:r>
+    </w:p>
+    <w:p>
+      <w:pPr>
+        <w:pStyle w:val="BodyText"/>
+      </w:pPr>
+      <w:r>
+        <w:rPr>
+          <w:bCs/>
+          <w:b/>
+        </w:rPr>
+        <w:t xml:space="preserve">Respond</w:t>
+      </w:r>
+      <w:r>
+        <w:t xml:space="preserve"> </w:t>
+      </w:r>
+      <w:r>
+        <w:t xml:space="preserve">opens a note field. Write what you are doing about it and mark it</w:t>
+      </w:r>
+      <w:r>
+        <w:t xml:space="preserve"> </w:t>
+      </w:r>
+      <w:r>
+        <w:rPr>
+          <w:bCs/>
+          <w:b/>
+        </w:rPr>
+        <w:t xml:space="preserve">In review</w:t>
+      </w:r>
+      <w:r>
+        <w:t xml:space="preserve"> </w:t>
+      </w:r>
+      <w:r>
+        <w:t xml:space="preserve">or</w:t>
+      </w:r>
+      <w:r>
+        <w:t xml:space="preserve"> </w:t>
+      </w:r>
+      <w:r>
+        <w:rPr>
+          <w:bCs/>
+          <w:b/>
+        </w:rPr>
+        <w:t xml:space="preserve">Resolve</w:t>
+      </w:r>
+      <w:r>
+        <w:t xml:space="preserve">. The note is visible to the person who filed it, under My Reports on their</w:t>
+      </w:r>
+      <w:r>
+        <w:t xml:space="preserve"> </w:t>
+      </w:r>
+      <w:r>
+        <w:t xml:space="preserve">Support tab.</w:t>
+      </w:r>
+    </w:p>
+    <w:bookmarkEnd w:id="204"/>
+    <w:bookmarkStart w:id="205" w:name="monitor"/>
+    <w:p>
+      <w:pPr>
+        <w:pStyle w:val="Heading4"/>
+      </w:pPr>
+      <w:r>
+        <w:t xml:space="preserve">4.4 Monitor</w:t>
+      </w:r>
+    </w:p>
+    <w:p>
+      <w:pPr>
+        <w:pStyle w:val="FirstParagraph"/>
+      </w:pPr>
+      <w:r>
+        <w:t xml:space="preserve">Two sub-tabs.</w:t>
+      </w:r>
+    </w:p>
+    <w:p>
+      <w:pPr>
+        <w:pStyle w:val="BodyText"/>
+      </w:pPr>
+      <w:r>
+        <w:rPr>
+          <w:bCs/>
+          <w:b/>
+        </w:rPr>
+        <w:t xml:space="preserve">Live</w:t>
+      </w:r>
+      <w:r>
+        <w:t xml:space="preserve"> </w:t>
+      </w:r>
+      <w:r>
+        <w:t xml:space="preserve">shows drivers and their verification states, and recent rides with the route,</w:t>
+      </w:r>
+      <w:r>
+        <w:t xml:space="preserve"> </w:t>
+      </w:r>
+      <w:r>
+        <w:t xml:space="preserve">fare and status, updating as they happen.</w:t>
+      </w:r>
+    </w:p>
+    <w:p>
+      <w:pPr>
+        <w:pStyle w:val="BodyText"/>
+      </w:pPr>
+      <w:r>
+        <w:rPr>
+          <w:bCs/>
+          <w:b/>
+        </w:rPr>
+        <w:t xml:space="preserve">Reports</w:t>
+      </w:r>
+      <w:r>
+        <w:t xml:space="preserve"> </w:t>
+      </w:r>
+      <w:r>
+        <w:t xml:space="preserve">is the export screen. Choose what the report covers from the</w:t>
+      </w:r>
+      <w:r>
+        <w:t xml:space="preserve"> </w:t>
+      </w:r>
+      <w:r>
+        <w:rPr>
+          <w:bCs/>
+          <w:b/>
+        </w:rPr>
+        <w:t xml:space="preserve">Covering</w:t>
+      </w:r>
+      <w:r>
+        <w:t xml:space="preserve"> </w:t>
+      </w:r>
+      <w:r>
+        <w:t xml:space="preserve">dropdown: all time, any year, any month, or</w:t>
+      </w:r>
+      <w:r>
+        <w:t xml:space="preserve"> </w:t>
+      </w:r>
+      <w:r>
+        <w:rPr>
+          <w:bCs/>
+          <w:b/>
+        </w:rPr>
+        <w:t xml:space="preserve">Choose exact dates…</w:t>
+      </w:r>
+      <w:r>
+        <w:t xml:space="preserve"> </w:t>
+      </w:r>
+      <w:r>
+        <w:t xml:space="preserve">for a range picked</w:t>
+      </w:r>
+      <w:r>
+        <w:t xml:space="preserve"> </w:t>
+      </w:r>
+      <w:r>
+        <w:t xml:space="preserve">from a calendar. The list of months and years is built from the rides that exist, so there</w:t>
+      </w:r>
+      <w:r>
+        <w:t xml:space="preserve"> </w:t>
+      </w:r>
+      <w:r>
+        <w:t xml:space="preserve">are no empty periods to scroll past.</w:t>
+      </w:r>
+    </w:p>
+    <w:p>
+      <w:pPr>
+        <w:pStyle w:val="BodyText"/>
+      </w:pPr>
+      <w:r>
+        <w:t xml:space="preserve">The summary for the chosen period is on the screen — total rides, completed, cancelled,</w:t>
+      </w:r>
+      <w:r>
+        <w:t xml:space="preserve"> </w:t>
+      </w:r>
+      <w:r>
+        <w:t xml:space="preserve">still open, gross fares, average fare, passengers served, drivers with a ride, and concerns</w:t>
+      </w:r>
+      <w:r>
+        <w:t xml:space="preserve"> </w:t>
+      </w:r>
+      <w:r>
+        <w:t xml:space="preserve">filed and resolved. You can read it without exporting anything.</w:t>
+      </w:r>
+    </w:p>
+    <w:p>
+      <w:pPr>
+        <w:pStyle w:val="BodyText"/>
+      </w:pPr>
+      <w:r>
+        <w:t xml:space="preserve">Three reports can be exported for that period:</w:t>
       </w:r>
     </w:p>
     <w:tbl>
@@ -29119,6 +32100,763 @@
               <w:jc w:val="left"/>
             </w:pPr>
             <w:r>
+              <w:t xml:space="preserve">Report</w:t>
+            </w:r>
+          </w:p>
+        </w:tc>
+        <w:tc>
+          <w:tcPr/>
+          <w:p>
+            <w:pPr>
+              <w:pStyle w:val="Compact"/>
+              <w:jc w:val="left"/>
+            </w:pPr>
+            <w:r>
+              <w:t xml:space="preserve">Contents</w:t>
+            </w:r>
+          </w:p>
+        </w:tc>
+      </w:tr>
+      <w:tr>
+        <w:tc>
+          <w:tcPr/>
+          <w:p>
+            <w:pPr>
+              <w:pStyle w:val="Compact"/>
+              <w:jc w:val="left"/>
+            </w:pPr>
+            <w:r>
+              <w:t xml:space="preserve">Ride activity</w:t>
+            </w:r>
+          </w:p>
+        </w:tc>
+        <w:tc>
+          <w:tcPr/>
+          <w:p>
+            <w:pPr>
+              <w:pStyle w:val="Compact"/>
+              <w:jc w:val="left"/>
+            </w:pPr>
+            <w:r>
+              <w:t xml:space="preserve">Every booking with fares, status and both parties</w:t>
+            </w:r>
+          </w:p>
+        </w:tc>
+      </w:tr>
+      <w:tr>
+        <w:tc>
+          <w:tcPr/>
+          <w:p>
+            <w:pPr>
+              <w:pStyle w:val="Compact"/>
+              <w:jc w:val="left"/>
+            </w:pPr>
+            <w:r>
+              <w:t xml:space="preserve">Driver performance</w:t>
+            </w:r>
+          </w:p>
+        </w:tc>
+        <w:tc>
+          <w:tcPr/>
+          <w:p>
+            <w:pPr>
+              <w:pStyle w:val="Compact"/>
+              <w:jc w:val="left"/>
+            </w:pPr>
+            <w:r>
+              <w:t xml:space="preserve">Rides, completions and gross fares per driver</w:t>
+            </w:r>
+          </w:p>
+        </w:tc>
+      </w:tr>
+      <w:tr>
+        <w:tc>
+          <w:tcPr/>
+          <w:p>
+            <w:pPr>
+              <w:pStyle w:val="Compact"/>
+              <w:jc w:val="left"/>
+            </w:pPr>
+            <w:r>
+              <w:t xml:space="preserve">Concerns and complaints</w:t>
+            </w:r>
+          </w:p>
+        </w:tc>
+        <w:tc>
+          <w:tcPr/>
+          <w:p>
+            <w:pPr>
+              <w:pStyle w:val="Compact"/>
+              <w:jc w:val="left"/>
+            </w:pPr>
+            <w:r>
+              <w:t xml:space="preserve">What was filed, the categories, how each was closed</w:t>
+            </w:r>
+          </w:p>
+        </w:tc>
+      </w:tr>
+    </w:tbl>
+    <w:p>
+      <w:pPr>
+        <w:pStyle w:val="BodyText"/>
+      </w:pPr>
+      <w:r>
+        <w:t xml:space="preserve">Each offers four buttons:</w:t>
+      </w:r>
+      <w:r>
+        <w:t xml:space="preserve"> </w:t>
+      </w:r>
+      <w:r>
+        <w:rPr>
+          <w:bCs/>
+          <w:b/>
+        </w:rPr>
+        <w:t xml:space="preserve">Save PDF</w:t>
+      </w:r>
+      <w:r>
+        <w:t xml:space="preserve">,</w:t>
+      </w:r>
+      <w:r>
+        <w:t xml:space="preserve"> </w:t>
+      </w:r>
+      <w:r>
+        <w:rPr>
+          <w:bCs/>
+          <w:b/>
+        </w:rPr>
+        <w:t xml:space="preserve">Send PDF</w:t>
+      </w:r>
+      <w:r>
+        <w:t xml:space="preserve">,</w:t>
+      </w:r>
+      <w:r>
+        <w:t xml:space="preserve"> </w:t>
+      </w:r>
+      <w:r>
+        <w:rPr>
+          <w:bCs/>
+          <w:b/>
+        </w:rPr>
+        <w:t xml:space="preserve">Save sheet</w:t>
+      </w:r>
+      <w:r>
+        <w:t xml:space="preserve">,</w:t>
+      </w:r>
+      <w:r>
+        <w:t xml:space="preserve"> </w:t>
+      </w:r>
+      <w:r>
+        <w:rPr>
+          <w:bCs/>
+          <w:b/>
+        </w:rPr>
+        <w:t xml:space="preserve">Send sheet</w:t>
+      </w:r>
+      <w:r>
+        <w:t xml:space="preserve">. The</w:t>
+      </w:r>
+      <w:r>
+        <w:t xml:space="preserve"> </w:t>
+      </w:r>
+      <w:r>
+        <w:t xml:space="preserve">PDF is landscape, and leads with the headline figures and four charts before the records</w:t>
+      </w:r>
+      <w:r>
+        <w:t xml:space="preserve"> </w:t>
+      </w:r>
+      <w:r>
+        <w:t xml:space="preserve">behind them — that is the one to print or hand over. The spreadsheet is the same data for</w:t>
+      </w:r>
+      <w:r>
+        <w:t xml:space="preserve"> </w:t>
+      </w:r>
+      <w:r>
+        <w:t xml:space="preserve">sorting and totalling.</w:t>
+      </w:r>
+    </w:p>
+    <w:p>
+      <w:pPr>
+        <w:pStyle w:val="BodyText"/>
+      </w:pPr>
+      <w:r>
+        <w:t xml:space="preserve">Saving asks where to put the file. Sending hands it to whatever is on the phone — email,</w:t>
+      </w:r>
+      <w:r>
+        <w:t xml:space="preserve"> </w:t>
+      </w:r>
+      <w:r>
+        <w:t xml:space="preserve">Messenger, Drive.</w:t>
+      </w:r>
+    </w:p>
+    <w:p>
+      <w:r>
+        <w:br w:type="page"/>
+      </w:r>
+    </w:p>
+    <w:bookmarkEnd w:id="205"/>
+    <w:bookmarkEnd w:id="206"/>
+    <w:bookmarkStart w:id="207" w:name="part-5-when-something-goes-wrong"/>
+    <w:p>
+      <w:pPr>
+        <w:pStyle w:val="Heading3"/>
+      </w:pPr>
+      <w:r>
+        <w:t xml:space="preserve">Part 5 — When something goes wrong</w:t>
+      </w:r>
+    </w:p>
+    <w:p>
+      <w:pPr>
+        <w:pStyle w:val="FirstParagraph"/>
+      </w:pPr>
+      <w:r>
+        <w:rPr>
+          <w:bCs/>
+          <w:b/>
+        </w:rPr>
+        <w:t xml:space="preserve">“</w:t>
+      </w:r>
+      <w:r>
+        <w:rPr>
+          <w:bCs/>
+          <w:b/>
+        </w:rPr>
+        <w:t xml:space="preserve">Couldn’t reach the database.</w:t>
+      </w:r>
+      <w:r>
+        <w:rPr>
+          <w:bCs/>
+          <w:b/>
+        </w:rPr>
+        <w:t xml:space="preserve">”</w:t>
+      </w:r>
+      <w:r>
+        <w:t xml:space="preserve"> </w:t>
+      </w:r>
+      <w:r>
+        <w:t xml:space="preserve">The phone has no working connection, or the Realtime</w:t>
+      </w:r>
+      <w:r>
+        <w:t xml:space="preserve"> </w:t>
+      </w:r>
+      <w:r>
+        <w:t xml:space="preserve">Database has not been created in Firebase yet. Check the connection first. If a fresh</w:t>
+      </w:r>
+      <w:r>
+        <w:t xml:space="preserve"> </w:t>
+      </w:r>
+      <w:r>
+        <w:t xml:space="preserve">installation shows this on every screen, it is the second one, and the administrator needs</w:t>
+      </w:r>
+      <w:r>
+        <w:t xml:space="preserve"> </w:t>
+      </w:r>
+      <w:r>
+        <w:t xml:space="preserve">to check the Firebase setup and the security rules.</w:t>
+      </w:r>
+    </w:p>
+    <w:p>
+      <w:pPr>
+        <w:pStyle w:val="BodyText"/>
+      </w:pPr>
+      <w:r>
+        <w:rPr>
+          <w:bCs/>
+          <w:b/>
+        </w:rPr>
+        <w:t xml:space="preserve">No drivers appear to be online.</w:t>
+      </w:r>
+      <w:r>
+        <w:t xml:space="preserve"> </w:t>
+      </w:r>
+      <w:r>
+        <w:t xml:space="preserve">Almost always exactly that: no driver has gone online.</w:t>
+      </w:r>
+      <w:r>
+        <w:t xml:space="preserve"> </w:t>
+      </w:r>
+      <w:r>
+        <w:t xml:space="preserve">A driver who has closed the app is not online even if they were a minute ago. An</w:t>
+      </w:r>
+      <w:r>
+        <w:t xml:space="preserve"> </w:t>
+      </w:r>
+      <w:r>
+        <w:t xml:space="preserve">unverified driver never receives requests.</w:t>
+      </w:r>
+    </w:p>
+    <w:p>
+      <w:pPr>
+        <w:pStyle w:val="BodyText"/>
+      </w:pPr>
+      <w:r>
+        <w:rPr>
+          <w:bCs/>
+          <w:b/>
+        </w:rPr>
+        <w:t xml:space="preserve">The request expired.</w:t>
+      </w:r>
+      <w:r>
+        <w:t xml:space="preserve"> </w:t>
+      </w:r>
+      <w:r>
+        <w:t xml:space="preserve">Five minutes passed with nobody accepting. Send it again.</w:t>
+      </w:r>
+    </w:p>
+    <w:p>
+      <w:pPr>
+        <w:pStyle w:val="BodyText"/>
+      </w:pPr>
+      <w:r>
+        <w:rPr>
+          <w:bCs/>
+          <w:b/>
+        </w:rPr>
+        <w:t xml:space="preserve">A fare looks wrong.</w:t>
+      </w:r>
+      <w:r>
+        <w:t xml:space="preserve"> </w:t>
+      </w:r>
+      <w:r>
+        <w:t xml:space="preserve">The app charges the posted rate for the destination, raised to the</w:t>
+      </w:r>
+      <w:r>
+        <w:t xml:space="preserve"> </w:t>
+      </w:r>
+      <w:r>
+        <w:t xml:space="preserve">minimum where the posted rate is lower. Forty-six entries in the transcribed table are</w:t>
+      </w:r>
+      <w:r>
+        <w:t xml:space="preserve"> </w:t>
+      </w:r>
+      <w:r>
+        <w:t xml:space="preserve">flagged for checking and twenty-seven sit at ₱20 and are charged at the ₱25 minimum. Report</w:t>
+      </w:r>
+      <w:r>
+        <w:t xml:space="preserve"> </w:t>
+      </w:r>
+      <w:r>
+        <w:t xml:space="preserve">it under</w:t>
+      </w:r>
+      <w:r>
+        <w:t xml:space="preserve"> </w:t>
+      </w:r>
+      <w:r>
+        <w:rPr>
+          <w:bCs/>
+          <w:b/>
+        </w:rPr>
+        <w:t xml:space="preserve">Wrong fare</w:t>
+      </w:r>
+      <w:r>
+        <w:t xml:space="preserve"> </w:t>
+      </w:r>
+      <w:r>
+        <w:t xml:space="preserve">with the pickup and destination and the administrator can correct</w:t>
+      </w:r>
+      <w:r>
+        <w:t xml:space="preserve"> </w:t>
+      </w:r>
+      <w:r>
+        <w:t xml:space="preserve">that entry — no update to the app is needed.</w:t>
+      </w:r>
+    </w:p>
+    <w:p>
+      <w:pPr>
+        <w:pStyle w:val="BodyText"/>
+      </w:pPr>
+      <w:r>
+        <w:rPr>
+          <w:bCs/>
+          <w:b/>
+        </w:rPr>
+        <w:t xml:space="preserve">“</w:t>
+      </w:r>
+      <w:r>
+        <w:rPr>
+          <w:bCs/>
+          <w:b/>
+        </w:rPr>
+        <w:t xml:space="preserve">That image could not be processed.</w:t>
+      </w:r>
+      <w:r>
+        <w:rPr>
+          <w:bCs/>
+          <w:b/>
+        </w:rPr>
+        <w:t xml:space="preserve">”</w:t>
+      </w:r>
+      <w:r>
+        <w:t xml:space="preserve"> </w:t>
+      </w:r>
+      <w:r>
+        <w:t xml:space="preserve">The file is not a picture the phone can decode,</w:t>
+      </w:r>
+      <w:r>
+        <w:t xml:space="preserve"> </w:t>
+      </w:r>
+      <w:r>
+        <w:t xml:space="preserve">or it is a format the gallery listed but cannot open — this happens with some downloaded</w:t>
+      </w:r>
+      <w:r>
+        <w:t xml:space="preserve"> </w:t>
+      </w:r>
+      <w:r>
+        <w:t xml:space="preserve">images. Take a fresh photograph with the camera instead.</w:t>
+      </w:r>
+    </w:p>
+    <w:p>
+      <w:pPr>
+        <w:pStyle w:val="BodyText"/>
+      </w:pPr>
+      <w:r>
+        <w:rPr>
+          <w:bCs/>
+          <w:b/>
+        </w:rPr>
+        <w:t xml:space="preserve">The licence upload is refused.</w:t>
+      </w:r>
+      <w:r>
+        <w:t xml:space="preserve"> </w:t>
+      </w:r>
+      <w:r>
+        <w:t xml:space="preserve">Either the security rules for</w:t>
+      </w:r>
+      <w:r>
+        <w:t xml:space="preserve"> </w:t>
+      </w:r>
+      <w:r>
+        <w:rPr>
+          <w:rStyle w:val="VerbatimChar"/>
+        </w:rPr>
+        <w:t xml:space="preserve">driverDocuments</w:t>
+      </w:r>
+      <w:r>
+        <w:t xml:space="preserve"> </w:t>
+      </w:r>
+      <w:r>
+        <w:t xml:space="preserve">have not</w:t>
+      </w:r>
+      <w:r>
+        <w:t xml:space="preserve"> </w:t>
+      </w:r>
+      <w:r>
+        <w:t xml:space="preserve">been published, which is the administrator’s to fix, or the photograph is too large. A</w:t>
+      </w:r>
+      <w:r>
+        <w:t xml:space="preserve"> </w:t>
+      </w:r>
+      <w:r>
+        <w:t xml:space="preserve">photograph taken with the camera in the app is already reduced; one chosen from the gallery</w:t>
+      </w:r>
+      <w:r>
+        <w:t xml:space="preserve"> </w:t>
+      </w:r>
+      <w:r>
+        <w:t xml:space="preserve">is reduced too, but a very large file can still fail.</w:t>
+      </w:r>
+    </w:p>
+    <w:p>
+      <w:pPr>
+        <w:pStyle w:val="BodyText"/>
+      </w:pPr>
+      <w:r>
+        <w:rPr>
+          <w:bCs/>
+          <w:b/>
+        </w:rPr>
+        <w:t xml:space="preserve">The map is blank.</w:t>
+      </w:r>
+      <w:r>
+        <w:t xml:space="preserve"> </w:t>
+      </w:r>
+      <w:r>
+        <w:t xml:space="preserve">Tiles are downloaded, so a slow or absent connection leaves the map</w:t>
+      </w:r>
+      <w:r>
+        <w:t xml:space="preserve"> </w:t>
+      </w:r>
+      <w:r>
+        <w:t xml:space="preserve">empty while everything else works. It will fill in.</w:t>
+      </w:r>
+    </w:p>
+    <w:p>
+      <w:pPr>
+        <w:pStyle w:val="BodyText"/>
+      </w:pPr>
+      <w:r>
+        <w:rPr>
+          <w:bCs/>
+          <w:b/>
+        </w:rPr>
+        <w:t xml:space="preserve">The driver’s position is not moving.</w:t>
+      </w:r>
+      <w:r>
+        <w:t xml:space="preserve"> </w:t>
+      </w:r>
+      <w:r>
+        <w:t xml:space="preserve">They have closed the app or gone offline. There is</w:t>
+      </w:r>
+      <w:r>
+        <w:t xml:space="preserve"> </w:t>
+      </w:r>
+      <w:r>
+        <w:t xml:space="preserve">no background tracking, by design.</w:t>
+      </w:r>
+    </w:p>
+    <w:p>
+      <w:pPr>
+        <w:pStyle w:val="BodyText"/>
+      </w:pPr>
+      <w:r>
+        <w:rPr>
+          <w:bCs/>
+          <w:b/>
+        </w:rPr>
+        <w:t xml:space="preserve">Signed out unexpectedly.</w:t>
+      </w:r>
+      <w:r>
+        <w:t xml:space="preserve"> </w:t>
+      </w:r>
+      <w:r>
+        <w:t xml:space="preserve">The documents were revised, or the account was signed out on</w:t>
+      </w:r>
+      <w:r>
+        <w:t xml:space="preserve"> </w:t>
+      </w:r>
+      <w:r>
+        <w:t xml:space="preserve">another device. Sign in again; nothing is lost.</w:t>
+      </w:r>
+    </w:p>
+    <w:p>
+      <w:pPr>
+        <w:pStyle w:val="BodyText"/>
+      </w:pPr>
+      <w:r>
+        <w:rPr>
+          <w:bCs/>
+          <w:b/>
+        </w:rPr>
+        <w:t xml:space="preserve">Anything urgent.</w:t>
+      </w:r>
+      <w:r>
+        <w:t xml:space="preserve"> </w:t>
+      </w:r>
+      <w:r>
+        <w:t xml:space="preserve">Use the hotline on the Support tab. Do not wait on a report in the</w:t>
+      </w:r>
+      <w:r>
+        <w:t xml:space="preserve"> </w:t>
+      </w:r>
+      <w:r>
+        <w:t xml:space="preserve">app.</w:t>
+      </w:r>
+    </w:p>
+    <w:p>
+      <w:r>
+        <w:br w:type="page"/>
+      </w:r>
+    </w:p>
+    <w:bookmarkEnd w:id="207"/>
+    <w:bookmarkEnd w:id="208"/>
+    <w:bookmarkStart w:id="209" w:name="appendix-i-source-code"/>
+    <w:p>
+      <w:pPr>
+        <w:pStyle w:val="Heading2"/>
+      </w:pPr>
+      <w:r>
+        <w:t xml:space="preserve">Appendix I — Source Code</w:t>
+      </w:r>
+    </w:p>
+    <w:p>
+      <w:pPr>
+        <w:pStyle w:val="FirstParagraph"/>
+      </w:pPr>
+      <w:r>
+        <w:t xml:space="preserve">The complete source code of the system is held in a Git repository rather than reproduced here. At roughly twelve thousand seven hundred lines across fifty-five files it would add some three hundred pages to a bound copy, at a printing cost the study cannot justify.</w:t>
+      </w:r>
+    </w:p>
+    <w:p>
+      <w:pPr>
+        <w:pStyle w:val="BodyText"/>
+      </w:pPr>
+      <w:r>
+        <w:rPr>
+          <w:bCs/>
+          <w:b/>
+        </w:rPr>
+        <w:t xml:space="preserve">Retrieving the source</w:t>
+      </w:r>
+    </w:p>
+    <w:p>
+      <w:pPr>
+        <w:pStyle w:val="BodyText"/>
+      </w:pPr>
+      <w:r>
+        <w:t xml:space="preserve">The repository is at:</w:t>
+      </w:r>
+    </w:p>
+    <w:p>
+      <w:pPr>
+        <w:pStyle w:val="SourceCode"/>
+      </w:pPr>
+      <w:r>
+        <w:rPr>
+          <w:rStyle w:val="VerbatimChar"/>
+        </w:rPr>
+        <w:t xml:space="preserve">https://github.com/ZeroXJune/CapstoneProject</w:t>
+      </w:r>
+    </w:p>
+    <w:p>
+      <w:pPr>
+        <w:pStyle w:val="FirstParagraph"/>
+      </w:pPr>
+      <w:r>
+        <w:t xml:space="preserve">With Git installed, the whole project is obtained by opening a terminal in the folder where it should be placed and running:</w:t>
+      </w:r>
+    </w:p>
+    <w:p>
+      <w:pPr>
+        <w:pStyle w:val="SourceCode"/>
+      </w:pPr>
+      <w:r>
+        <w:rPr>
+          <w:rStyle w:val="VerbatimChar"/>
+        </w:rPr>
+        <w:t xml:space="preserve">git clone https://github.com/ZeroXJune/CapstoneProject</w:t>
+      </w:r>
+    </w:p>
+    <w:p>
+      <w:pPr>
+        <w:pStyle w:val="FirstParagraph"/>
+      </w:pPr>
+      <w:r>
+        <w:t xml:space="preserve">Readers without Git may instead open the address above in a browser and use the</w:t>
+      </w:r>
+      <w:r>
+        <w:t xml:space="preserve"> </w:t>
+      </w:r>
+      <w:r>
+        <w:rPr>
+          <w:bCs/>
+          <w:b/>
+        </w:rPr>
+        <w:t xml:space="preserve">Code → Download ZIP</w:t>
+      </w:r>
+      <w:r>
+        <w:t xml:space="preserve"> </w:t>
+      </w:r>
+      <w:r>
+        <w:t xml:space="preserve">button, which produces the same files. If the repository is private, the researchers can grant read access to a named GitHub account, or supply the source on request as an archive.</w:t>
+      </w:r>
+    </w:p>
+    <w:p>
+      <w:pPr>
+        <w:pStyle w:val="BodyText"/>
+      </w:pPr>
+      <w:r>
+        <w:t xml:space="preserve">Two files are required to build and are deliberately absent from the repository because they carry credentials:</w:t>
+      </w:r>
+      <w:r>
+        <w:t xml:space="preserve"> </w:t>
+      </w:r>
+      <w:r>
+        <w:rPr>
+          <w:rStyle w:val="VerbatimChar"/>
+        </w:rPr>
+        <w:t xml:space="preserve">google-services.json</w:t>
+      </w:r>
+      <w:r>
+        <w:t xml:space="preserve">, the Firebase configuration, downloaded from the project’s Firebase console; and</w:t>
+      </w:r>
+      <w:r>
+        <w:t xml:space="preserve"> </w:t>
+      </w:r>
+      <w:r>
+        <w:rPr>
+          <w:rStyle w:val="VerbatimChar"/>
+        </w:rPr>
+        <w:t xml:space="preserve">.env</w:t>
+      </w:r>
+      <w:r>
+        <w:t xml:space="preserve">, copied from the committed</w:t>
+      </w:r>
+      <w:r>
+        <w:t xml:space="preserve"> </w:t>
+      </w:r>
+      <w:r>
+        <w:rPr>
+          <w:rStyle w:val="VerbatimChar"/>
+        </w:rPr>
+        <w:t xml:space="preserve">.env.example</w:t>
+      </w:r>
+      <w:r>
+        <w:t xml:space="preserve"> </w:t>
+      </w:r>
+      <w:r>
+        <w:t xml:space="preserve">and filled in.</w:t>
+      </w:r>
+      <w:r>
+        <w:t xml:space="preserve"> </w:t>
+      </w:r>
+      <w:r>
+        <w:rPr>
+          <w:rStyle w:val="VerbatimChar"/>
+        </w:rPr>
+        <w:t xml:space="preserve">SETUP_GUIDE.md</w:t>
+      </w:r>
+      <w:r>
+        <w:t xml:space="preserve"> </w:t>
+      </w:r>
+      <w:r>
+        <w:t xml:space="preserve">in the repository root gives the full procedure, and</w:t>
+      </w:r>
+      <w:r>
+        <w:t xml:space="preserve"> </w:t>
+      </w:r>
+      <w:r>
+        <w:rPr>
+          <w:rStyle w:val="VerbatimChar"/>
+        </w:rPr>
+        <w:t xml:space="preserve">ARCHITECTURE.md</w:t>
+      </w:r>
+      <w:r>
+        <w:t xml:space="preserve"> </w:t>
+      </w:r>
+      <w:r>
+        <w:t xml:space="preserve">explains how the code is arranged.</w:t>
+      </w:r>
+    </w:p>
+    <w:p>
+      <w:pPr>
+        <w:pStyle w:val="BodyText"/>
+      </w:pPr>
+      <w:r>
+        <w:t xml:space="preserve">The repository is organized as follows.</w:t>
+      </w:r>
+    </w:p>
+    <w:tbl>
+      <w:tblPr>
+        <w:tblStyle w:val="Table"/>
+        <w:tblW w:type="pct" w:w="5000"/>
+        <w:tblLook w:firstRow="1" w:lastRow="0" w:firstColumn="0" w:lastColumn="0" w:noHBand="0" w:noVBand="0" w:val="0020"/>
+        <w:jc w:val="start"/>
+      </w:tblPr>
+      <w:tblGrid>
+        <w:gridCol w:w="3960"/>
+        <w:gridCol w:w="3960"/>
+      </w:tblGrid>
+      <w:tr>
+        <w:trPr>
+          <w:tblHeader w:val="true"/>
+        </w:trPr>
+        <w:tc>
+          <w:tcPr/>
+          <w:p>
+            <w:pPr>
+              <w:pStyle w:val="Compact"/>
+              <w:jc w:val="left"/>
+            </w:pPr>
+            <w:r>
               <w:t xml:space="preserve">Path</w:t>
             </w:r>
           </w:p>
@@ -29775,8 +33513,8 @@
         <w:t xml:space="preserve">}</w:t>
       </w:r>
     </w:p>
-    <w:bookmarkEnd w:id="183"/>
-    <w:bookmarkStart w:id="184" w:name="appendix-j-database-schema"/>
+    <w:bookmarkEnd w:id="209"/>
+    <w:bookmarkStart w:id="210" w:name="appendix-j-database-schema"/>
     <w:p>
       <w:pPr>
         <w:pStyle w:val="Heading2"/>
@@ -30296,8 +34034,8 @@
         </w:tc>
       </w:tr>
     </w:tbl>
-    <w:bookmarkEnd w:id="184"/>
-    <w:bookmarkStart w:id="185" w:name="appendix-k-test-cases"/>
+    <w:bookmarkEnd w:id="210"/>
+    <w:bookmarkStart w:id="211" w:name="appendix-k-test-cases"/>
     <w:p>
       <w:pPr>
         <w:pStyle w:val="Heading2"/>
@@ -30981,8 +34719,8 @@
         </w:tc>
       </w:tr>
     </w:tbl>
-    <w:bookmarkEnd w:id="185"/>
-    <w:bookmarkStart w:id="186" w:name="appendix-l-test-results"/>
+    <w:bookmarkEnd w:id="211"/>
+    <w:bookmarkStart w:id="212" w:name="appendix-l-test-results"/>
     <w:p>
       <w:pPr>
         <w:pStyle w:val="Heading2"/>
@@ -31011,8 +34749,8 @@
         <w:t xml:space="preserve">[The defect log should record, for each defect found: an identifier, the module, a description, the severity, the date found, the resolution, and the date resolved.]</w:t>
       </w:r>
     </w:p>
-    <w:bookmarkEnd w:id="186"/>
-    <w:bookmarkStart w:id="187" w:name="appendix-m-sample-reports"/>
+    <w:bookmarkEnd w:id="212"/>
+    <w:bookmarkStart w:id="213" w:name="appendix-m-sample-reports"/>
     <w:p>
       <w:pPr>
         <w:pStyle w:val="Heading2"/>
@@ -31124,8 +34862,8 @@
         <w:t xml:space="preserve">Estimated fare, Actual fare, Notes</w:t>
       </w:r>
     </w:p>
-    <w:bookmarkEnd w:id="187"/>
-    <w:bookmarkStart w:id="188" w:name="Xc50705ef7a2b355081ea3904d1607e0b082faec"/>
+    <w:bookmarkEnd w:id="213"/>
+    <w:bookmarkStart w:id="214" w:name="Xc50705ef7a2b355081ea3904d1607e0b082faec"/>
     <w:p>
       <w:pPr>
         <w:pStyle w:val="Heading2"/>
@@ -31154,8 +34892,8 @@
         <w:t xml:space="preserve">The following should be documented: the needs assessment administration to students and to drivers; the meeting with officers of the drivers’ association; the photographs of the posted FeTODAT fare sheet from which the fare table was transcribed; the driver orientation session; the evaluation period; and the administration of the evaluation questionnaire.</w:t>
       </w:r>
     </w:p>
-    <w:bookmarkEnd w:id="188"/>
-    <w:bookmarkStart w:id="192" w:name="appendix-o-gantt-chart"/>
+    <w:bookmarkEnd w:id="214"/>
+    <w:bookmarkStart w:id="218" w:name="appendix-o-gantt-chart"/>
     <w:p>
       <w:pPr>
         <w:pStyle w:val="Heading2"/>
@@ -31173,18 +34911,18 @@
           <wp:inline>
             <wp:extent cx="5486400" cy="2674620"/>
             <wp:effectExtent b="0" l="0" r="0" t="0"/>
-            <wp:docPr descr="Figure 14. Gantt Chart of Project Activities" title="" id="190" name="Picture"/>
+            <wp:docPr descr="Figure 14. Gantt Chart of Project Activities" title="" id="216" name="Picture"/>
             <a:graphic>
               <a:graphicData uri="http://schemas.openxmlformats.org/drawingml/2006/picture">
                 <pic:pic>
                   <pic:nvPicPr>
-                    <pic:cNvPr descr="figures/fig14_gantt.png" id="191" name="Picture"/>
+                    <pic:cNvPr descr="figures/fig14_gantt.png" id="217" name="Picture"/>
                     <pic:cNvPicPr>
                       <a:picLocks noChangeArrowheads="1" noChangeAspect="1"/>
                     </pic:cNvPicPr>
                   </pic:nvPicPr>
                   <pic:blipFill>
-                    <a:blip r:embed="rId189"/>
+                    <a:blip r:embed="rId215"/>
                     <a:stretch>
                       <a:fillRect/>
                     </a:stretch>
@@ -31224,8 +34962,8 @@
         <w:br w:type="page"/>
       </w:r>
     </w:p>
-    <w:bookmarkEnd w:id="192"/>
-    <w:bookmarkStart w:id="196" w:name="appendix-p-researchers-biodata"/>
+    <w:bookmarkEnd w:id="218"/>
+    <w:bookmarkStart w:id="222" w:name="appendix-p-researchers-biodata"/>
     <w:p>
       <w:pPr>
         <w:pStyle w:val="Heading2"/>
@@ -31234,7 +34972,7 @@
         <w:t xml:space="preserve">Appendix P — Researchers’ Biodata</w:t>
       </w:r>
     </w:p>
-    <w:bookmarkStart w:id="193" w:name="curriculum-vitae"/>
+    <w:bookmarkStart w:id="219" w:name="curriculum-vitae"/>
     <w:p>
       <w:pPr>
         <w:pStyle w:val="Heading3"/>
@@ -31548,8 +35286,8 @@
         <w:br w:type="page"/>
       </w:r>
     </w:p>
-    <w:bookmarkEnd w:id="193"/>
-    <w:bookmarkStart w:id="194" w:name="curriculum-vitae-1"/>
+    <w:bookmarkEnd w:id="219"/>
+    <w:bookmarkStart w:id="220" w:name="curriculum-vitae-1"/>
     <w:p>
       <w:pPr>
         <w:pStyle w:val="Heading3"/>
@@ -31863,8 +35601,8 @@
         <w:br w:type="page"/>
       </w:r>
     </w:p>
-    <w:bookmarkEnd w:id="194"/>
-    <w:bookmarkStart w:id="195" w:name="curriculum-vitae-2"/>
+    <w:bookmarkEnd w:id="220"/>
+    <w:bookmarkStart w:id="221" w:name="curriculum-vitae-2"/>
     <w:p>
       <w:pPr>
         <w:pStyle w:val="Heading3"/>
@@ -32173,9 +35911,9 @@
         </w:tc>
       </w:tr>
     </w:tbl>
-    <w:bookmarkEnd w:id="195"/>
-    <w:bookmarkEnd w:id="196"/>
-    <w:bookmarkEnd w:id="197"/>
+    <w:bookmarkEnd w:id="221"/>
+    <w:bookmarkEnd w:id="222"/>
+    <w:bookmarkEnd w:id="223"/>
     <w:sectPr>
       <w:pgSz w:h="15840" w:orient="portrait" w:w="12240"/>
       <w:pgMar w:bottom="1440" w:footer="720" w:gutter="0" w:header="720" w:left="2160" w:right="1440" w:top="1440"/>
@@ -33076,6 +36814,105 @@
     <w:lvlOverride w:ilvl="8">
       <w:startOverride w:val="1"/>
     </w:lvlOverride>
+  </w:num>
+  <w:num w:numId="1018">
+    <w:abstractNumId w:val="99411"/>
+    <w:lvlOverride w:ilvl="0">
+      <w:startOverride w:val="1"/>
+    </w:lvlOverride>
+    <w:lvlOverride w:ilvl="1">
+      <w:startOverride w:val="1"/>
+    </w:lvlOverride>
+    <w:lvlOverride w:ilvl="2">
+      <w:startOverride w:val="1"/>
+    </w:lvlOverride>
+    <w:lvlOverride w:ilvl="3">
+      <w:startOverride w:val="1"/>
+    </w:lvlOverride>
+    <w:lvlOverride w:ilvl="4">
+      <w:startOverride w:val="1"/>
+    </w:lvlOverride>
+    <w:lvlOverride w:ilvl="5">
+      <w:startOverride w:val="1"/>
+    </w:lvlOverride>
+    <w:lvlOverride w:ilvl="6">
+      <w:startOverride w:val="1"/>
+    </w:lvlOverride>
+    <w:lvlOverride w:ilvl="7">
+      <w:startOverride w:val="1"/>
+    </w:lvlOverride>
+    <w:lvlOverride w:ilvl="8">
+      <w:startOverride w:val="1"/>
+    </w:lvlOverride>
+  </w:num>
+  <w:num w:numId="1019">
+    <w:abstractNumId w:val="991"/>
+  </w:num>
+  <w:num w:numId="1020">
+    <w:abstractNumId w:val="99411"/>
+    <w:lvlOverride w:ilvl="0">
+      <w:startOverride w:val="1"/>
+    </w:lvlOverride>
+    <w:lvlOverride w:ilvl="1">
+      <w:startOverride w:val="1"/>
+    </w:lvlOverride>
+    <w:lvlOverride w:ilvl="2">
+      <w:startOverride w:val="1"/>
+    </w:lvlOverride>
+    <w:lvlOverride w:ilvl="3">
+      <w:startOverride w:val="1"/>
+    </w:lvlOverride>
+    <w:lvlOverride w:ilvl="4">
+      <w:startOverride w:val="1"/>
+    </w:lvlOverride>
+    <w:lvlOverride w:ilvl="5">
+      <w:startOverride w:val="1"/>
+    </w:lvlOverride>
+    <w:lvlOverride w:ilvl="6">
+      <w:startOverride w:val="1"/>
+    </w:lvlOverride>
+    <w:lvlOverride w:ilvl="7">
+      <w:startOverride w:val="1"/>
+    </w:lvlOverride>
+    <w:lvlOverride w:ilvl="8">
+      <w:startOverride w:val="1"/>
+    </w:lvlOverride>
+  </w:num>
+  <w:num w:numId="1021">
+    <w:abstractNumId w:val="991"/>
+  </w:num>
+  <w:num w:numId="1022">
+    <w:abstractNumId w:val="99411"/>
+    <w:lvlOverride w:ilvl="0">
+      <w:startOverride w:val="1"/>
+    </w:lvlOverride>
+    <w:lvlOverride w:ilvl="1">
+      <w:startOverride w:val="1"/>
+    </w:lvlOverride>
+    <w:lvlOverride w:ilvl="2">
+      <w:startOverride w:val="1"/>
+    </w:lvlOverride>
+    <w:lvlOverride w:ilvl="3">
+      <w:startOverride w:val="1"/>
+    </w:lvlOverride>
+    <w:lvlOverride w:ilvl="4">
+      <w:startOverride w:val="1"/>
+    </w:lvlOverride>
+    <w:lvlOverride w:ilvl="5">
+      <w:startOverride w:val="1"/>
+    </w:lvlOverride>
+    <w:lvlOverride w:ilvl="6">
+      <w:startOverride w:val="1"/>
+    </w:lvlOverride>
+    <w:lvlOverride w:ilvl="7">
+      <w:startOverride w:val="1"/>
+    </w:lvlOverride>
+    <w:lvlOverride w:ilvl="8">
+      <w:startOverride w:val="1"/>
+    </w:lvlOverride>
+  </w:num>
+  <w:num w:numId="1023">
+    <w:abstractNumId w:val="991"/>
   </w:num>
 </w:numbering>
 </file>

</xml_diff>

<commit_message>
Drop Diffusion of Innovations from the theoretical framework
The study measures nothing about how the system spreads, so the five
attributes were asserted rather than tested. Three theories that each do
a job, which is what the section already said it had. Its one useful
argument, that pricing from the schedule the association already posts
asks nobody to accept a new one, moves into Task-Technology Fit where it
belongs.

Also corrects a wrong cross-reference: reduced waiting time and driver
utilization are objective four, not four and five.

Co-Authored-By: Claude Opus 5 <noreply@anthropic.com>
Claude-Session: https://claude.ai/code/session_01A1yMabEEN9wVLJcuoCQ2Ki
</commit_message>
<xml_diff>
--- a/docs/TrikRide_Capstone_Documentation.docx
+++ b/docs/TrikRide_Capstone_Documentation.docx
@@ -5581,7 +5581,7 @@
       </w:r>
     </w:p>
     <w:bookmarkEnd w:id="54"/>
-    <w:bookmarkStart w:id="68" w:name="review-of-related-literature-and-systems"/>
+    <w:bookmarkStart w:id="67" w:name="review-of-related-literature-and-systems"/>
     <w:p>
       <w:pPr>
         <w:pStyle w:val="Heading1"/>
@@ -6117,7 +6117,7 @@
       </w:r>
     </w:p>
     <w:bookmarkEnd w:id="57"/>
-    <w:bookmarkStart w:id="62" w:name="theoretical-framework"/>
+    <w:bookmarkStart w:id="61" w:name="theoretical-framework"/>
     <w:p>
       <w:pPr>
         <w:pStyle w:val="Heading2"/>
@@ -6224,7 +6224,7 @@
         <w:pStyle w:val="BodyText"/>
       </w:pPr>
       <w:r>
-        <w:t xml:space="preserve">This theory accounts for the central design decision of the study, which is that the fare engine performs a lookup against the published schedule rather than a distance calculation. A distance-based fare engine would be a poorer fit for the task even though it is the more common design.</w:t>
+        <w:t xml:space="preserve">This theory accounts for the central design decision of the study, which is that the fare engine performs a lookup against the published schedule rather than a distance calculation. A distance-based fare engine would be a poorer fit for the task even though it is the more common design. The fit extends beyond the calculation itself: because the schedule the system prices from is the one the association already publishes and posts, the system introduces no pricing scheme that a driver or a passenger has to learn or accept.</w:t>
       </w:r>
     </w:p>
     <w:bookmarkEnd w:id="59"/>
@@ -6250,30 +6250,12 @@
         <w:pStyle w:val="BodyText"/>
       </w:pPr>
       <w:r>
-        <w:t xml:space="preserve">In this study, system quality is measured by the reliability and efficiency characteristics of the evaluation instrument. Information quality is addressed by the accuracy of the fare table, which is why rows transcribed with any uncertainty are flagged for verification and rows without a usable rate are disabled rather than left to price a ride with a wrong number. Net benefits correspond to the reduction in passenger waiting time and the improvement in driver utilization named in objectives four and five.</w:t>
+        <w:t xml:space="preserve">In this study, system quality is measured by the reliability and efficiency characteristics of the evaluation instrument. Information quality is addressed by the accuracy of the fare table, which is why rows transcribed with any uncertainty are flagged for verification and rows without a usable rate are disabled rather than left to price a ride with a wrong number. Net benefits correspond to the reduction in passenger waiting time and the improvement in driver utilization named in objective four.</w:t>
       </w:r>
     </w:p>
     <w:bookmarkEnd w:id="60"/>
-    <w:bookmarkStart w:id="61" w:name="diffusion-of-innovations"/>
-    <w:p>
-      <w:pPr>
-        <w:pStyle w:val="Heading3"/>
-      </w:pPr>
-      <w:r>
-        <w:t xml:space="preserve">Diffusion of Innovations</w:t>
-      </w:r>
-    </w:p>
-    <w:p>
-      <w:pPr>
-        <w:pStyle w:val="FirstParagraph"/>
-      </w:pPr>
-      <w:r>
-        <w:t xml:space="preserve">Rogers (2003) identified five attributes that predict how quickly an innovation spreads: relative advantage, compatibility, complexity, trialability, and observability. The system is designed with these in mind. Relative advantage is the elimination of waiting and searching. Compatibility is served by pricing from the schedule the association already publishes rather than introducing a new pricing scheme. Complexity is kept low. Trialability is served by distribution to a defined group of testers before any wider release. Observability is served by the administrative monitor and the exported reports, which make the system’s effects visible to the college and the association.</w:t>
-      </w:r>
-    </w:p>
     <w:bookmarkEnd w:id="61"/>
-    <w:bookmarkEnd w:id="62"/>
-    <w:bookmarkStart w:id="66" w:name="conceptual-framework"/>
+    <w:bookmarkStart w:id="65" w:name="conceptual-framework"/>
     <w:p>
       <w:pPr>
         <w:pStyle w:val="Heading2"/>
@@ -6299,18 +6281,18 @@
           <wp:inline>
             <wp:extent cx="5486400" cy="2201933"/>
             <wp:effectExtent b="0" l="0" r="0" t="0"/>
-            <wp:docPr descr="Figure 2. Conceptual Framework of the Smart Tricycle Ride and Driver Onboarding System for Talibon Polytechnic College" title="" id="64" name="Picture"/>
+            <wp:docPr descr="Figure 2. Conceptual Framework of the Smart Tricycle Ride and Driver Onboarding System for Talibon Polytechnic College" title="" id="63" name="Picture"/>
             <a:graphic>
               <a:graphicData uri="http://schemas.openxmlformats.org/drawingml/2006/picture">
                 <pic:pic>
                   <pic:nvPicPr>
-                    <pic:cNvPr descr="figures/fig02_conceptual_framework.png" id="65" name="Picture"/>
+                    <pic:cNvPr descr="figures/fig02_conceptual_framework.png" id="64" name="Picture"/>
                     <pic:cNvPicPr>
                       <a:picLocks noChangeArrowheads="1" noChangeAspect="1"/>
                     </pic:cNvPicPr>
                   </pic:nvPicPr>
                   <pic:blipFill>
-                    <a:blip r:embed="rId63"/>
+                    <a:blip r:embed="rId62"/>
                     <a:stretch>
                       <a:fillRect/>
                     </a:stretch>
@@ -6417,8 +6399,8 @@
         <w:t xml:space="preserve">The framework includes a feedback path. Evaluation results and fare corrections identified in use return to the process stage, where the administrator amends the fare table and the researchers address defects. This reflects the maintenance phase of the development model.</w:t>
       </w:r>
     </w:p>
-    <w:bookmarkEnd w:id="66"/>
-    <w:bookmarkStart w:id="67" w:name="synthesis"/>
+    <w:bookmarkEnd w:id="65"/>
+    <w:bookmarkStart w:id="66" w:name="synthesis"/>
     <w:p>
       <w:pPr>
         <w:pStyle w:val="Heading2"/>
@@ -6530,24 +6512,24 @@
         <w:br w:type="page"/>
       </w:r>
     </w:p>
+    <w:bookmarkEnd w:id="66"/>
     <w:bookmarkEnd w:id="67"/>
+    <w:bookmarkStart w:id="68" w:name="chapter-3"/>
+    <w:p>
+      <w:pPr>
+        <w:pStyle w:val="Heading1"/>
+      </w:pPr>
+      <w:r>
+        <w:t xml:space="preserve">Chapter 3</w:t>
+      </w:r>
+    </w:p>
     <w:bookmarkEnd w:id="68"/>
-    <w:bookmarkStart w:id="69" w:name="chapter-3"/>
+    <w:bookmarkStart w:id="91" w:name="technical-background"/>
     <w:p>
       <w:pPr>
         <w:pStyle w:val="Heading1"/>
       </w:pPr>
       <w:r>
-        <w:t xml:space="preserve">Chapter 3</w:t>
-      </w:r>
-    </w:p>
-    <w:bookmarkEnd w:id="69"/>
-    <w:bookmarkStart w:id="92" w:name="technical-background"/>
-    <w:p>
-      <w:pPr>
-        <w:pStyle w:val="Heading1"/>
-      </w:pPr>
-      <w:r>
         <w:t xml:space="preserve">TECHNICAL BACKGROUND</w:t>
       </w:r>
     </w:p>
@@ -6559,7 +6541,7 @@
         <w:t xml:space="preserve">This chapter documents the technical foundation of the developed system: what is required to build it, what is required to run it, and how its parts are arranged.</w:t>
       </w:r>
     </w:p>
-    <w:bookmarkStart w:id="73" w:name="software-requirements"/>
+    <w:bookmarkStart w:id="72" w:name="software-requirements"/>
     <w:p>
       <w:pPr>
         <w:pStyle w:val="Heading2"/>
@@ -6568,7 +6550,7 @@
         <w:t xml:space="preserve">3.1 Software Requirements</w:t>
       </w:r>
     </w:p>
-    <w:bookmarkStart w:id="70" w:name="development-environment"/>
+    <w:bookmarkStart w:id="69" w:name="development-environment"/>
     <w:p>
       <w:pPr>
         <w:pStyle w:val="Heading3"/>
@@ -6886,8 +6868,8 @@
         <w:t xml:space="preserve">The minimum SDK of API level 24 was chosen deliberately. Android 7.0 was released in 2016, and devices running it or later account for the overwhelming majority of Android devices still in use. Setting the floor lower would have required abandoning several libraries used by the project; setting it higher would have excluded drivers using older handsets, which is precisely the group the system needs to reach.</w:t>
       </w:r>
     </w:p>
-    <w:bookmarkEnd w:id="70"/>
-    <w:bookmarkStart w:id="71" w:name="runtime-environment-for-end-users"/>
+    <w:bookmarkEnd w:id="69"/>
+    <w:bookmarkStart w:id="70" w:name="runtime-environment-for-end-users"/>
     <w:p>
       <w:pPr>
         <w:pStyle w:val="Heading3"/>
@@ -7093,8 +7075,8 @@
         </w:tc>
       </w:tr>
     </w:tbl>
-    <w:bookmarkEnd w:id="71"/>
-    <w:bookmarkStart w:id="72" w:name="third-party-libraries-and-services"/>
+    <w:bookmarkEnd w:id="70"/>
+    <w:bookmarkStart w:id="71" w:name="third-party-libraries-and-services"/>
     <w:p>
       <w:pPr>
         <w:pStyle w:val="Heading3"/>
@@ -7613,9 +7595,9 @@
         </w:tc>
       </w:tr>
     </w:tbl>
+    <w:bookmarkEnd w:id="71"/>
     <w:bookmarkEnd w:id="72"/>
-    <w:bookmarkEnd w:id="73"/>
-    <w:bookmarkStart w:id="77" w:name="hardware-requirements"/>
+    <w:bookmarkStart w:id="76" w:name="hardware-requirements"/>
     <w:p>
       <w:pPr>
         <w:pStyle w:val="Heading2"/>
@@ -7624,7 +7606,7 @@
         <w:t xml:space="preserve">3.2 Hardware Requirements</w:t>
       </w:r>
     </w:p>
-    <w:bookmarkStart w:id="74" w:name="development-workstation"/>
+    <w:bookmarkStart w:id="73" w:name="development-workstation"/>
     <w:p>
       <w:pPr>
         <w:pStyle w:val="Heading3"/>
@@ -7885,8 +7867,8 @@
         <w:t xml:space="preserve">The recommended memory figure is not decorative. Android Studio with the Gradle daemon and an emulator running will use most of 16 GB, and a build machine with 8 GB will complete builds but slowly.</w:t>
       </w:r>
     </w:p>
-    <w:bookmarkEnd w:id="74"/>
-    <w:bookmarkStart w:id="75" w:name="target-device"/>
+    <w:bookmarkEnd w:id="73"/>
+    <w:bookmarkStart w:id="74" w:name="target-device"/>
     <w:p>
       <w:pPr>
         <w:pStyle w:val="Heading3"/>
@@ -8215,27 +8197,27 @@
         </w:tc>
       </w:tr>
     </w:tbl>
+    <w:bookmarkEnd w:id="74"/>
+    <w:bookmarkStart w:id="75" w:name="server-side-hardware"/>
+    <w:p>
+      <w:pPr>
+        <w:pStyle w:val="Heading3"/>
+      </w:pPr>
+      <w:r>
+        <w:t xml:space="preserve">Server-Side Hardware</w:t>
+      </w:r>
+    </w:p>
+    <w:p>
+      <w:pPr>
+        <w:pStyle w:val="FirstParagraph"/>
+      </w:pPr>
+      <w:r>
+        <w:t xml:space="preserve">The system requires no server hardware procured or maintained by the college. All backend functions are provided by Google Firebase, a managed backend-as-a-service platform. This is a deliberate architectural choice: a capstone project deployed to a municipal drivers’ association cannot depend on a physical server that someone must house, power, secure, and administer after the researchers graduate.</w:t>
+      </w:r>
+    </w:p>
     <w:bookmarkEnd w:id="75"/>
-    <w:bookmarkStart w:id="76" w:name="server-side-hardware"/>
-    <w:p>
-      <w:pPr>
-        <w:pStyle w:val="Heading3"/>
-      </w:pPr>
-      <w:r>
-        <w:t xml:space="preserve">Server-Side Hardware</w:t>
-      </w:r>
-    </w:p>
-    <w:p>
-      <w:pPr>
-        <w:pStyle w:val="FirstParagraph"/>
-      </w:pPr>
-      <w:r>
-        <w:t xml:space="preserve">The system requires no server hardware procured or maintained by the college. All backend functions are provided by Google Firebase, a managed backend-as-a-service platform. This is a deliberate architectural choice: a capstone project deployed to a municipal drivers’ association cannot depend on a physical server that someone must house, power, secure, and administer after the researchers graduate.</w:t>
-      </w:r>
-    </w:p>
     <w:bookmarkEnd w:id="76"/>
-    <w:bookmarkEnd w:id="77"/>
-    <w:bookmarkStart w:id="78" w:name="programming-languages"/>
+    <w:bookmarkStart w:id="77" w:name="programming-languages"/>
     <w:p>
       <w:pPr>
         <w:pStyle w:val="Heading2"/>
@@ -8313,8 +8295,8 @@
         <w:t xml:space="preserve">, a JSON-based declarative language, is used to express server-side authorization for the Realtime Database.</w:t>
       </w:r>
     </w:p>
-    <w:bookmarkEnd w:id="78"/>
-    <w:bookmarkStart w:id="79" w:name="development-tools"/>
+    <w:bookmarkEnd w:id="77"/>
+    <w:bookmarkStart w:id="78" w:name="development-tools"/>
     <w:p>
       <w:pPr>
         <w:pStyle w:val="Heading2"/>
@@ -8431,8 +8413,8 @@
         <w:t xml:space="preserve">were used to generate the system diagrams presented in Chapter 4 from textual descriptions, so that a change to a diagram is a change to a text file rather than a manual redraw.</w:t>
       </w:r>
     </w:p>
-    <w:bookmarkEnd w:id="79"/>
-    <w:bookmarkStart w:id="84" w:name="database-technologies"/>
+    <w:bookmarkEnd w:id="78"/>
+    <w:bookmarkStart w:id="83" w:name="database-technologies"/>
     <w:p>
       <w:pPr>
         <w:pStyle w:val="Heading2"/>
@@ -8441,7 +8423,7 @@
         <w:t xml:space="preserve">3.5 Database Technologies</w:t>
       </w:r>
     </w:p>
-    <w:bookmarkStart w:id="80" w:name="firebase-realtime-database"/>
+    <w:bookmarkStart w:id="79" w:name="firebase-realtime-database"/>
     <w:p>
       <w:pPr>
         <w:pStyle w:val="Heading3"/>
@@ -8559,8 +8541,8 @@
         <w:t xml:space="preserve">The trade-off accepted is that a JSON tree provides no schema enforcement and no joins. This is mitigated by defining every entity as a Kotlin data class with default values for every field, so that the application layer imposes the structure the database does not, and by denormalizing the few relationships the system needs.</w:t>
       </w:r>
     </w:p>
-    <w:bookmarkEnd w:id="80"/>
-    <w:bookmarkStart w:id="81" w:name="firebase-authentication"/>
+    <w:bookmarkEnd w:id="79"/>
+    <w:bookmarkStart w:id="80" w:name="firebase-authentication"/>
     <w:p>
       <w:pPr>
         <w:pStyle w:val="Heading3"/>
@@ -8593,14 +8575,102 @@
         <w:t xml:space="preserve">using the email and password provider. No password is ever stored or transmitted by the application itself; credentials are exchanged directly between the Firebase client library and Google’s authentication service, and the application receives only an opaque user identifier and a session token.</w:t>
       </w:r>
     </w:p>
+    <w:bookmarkEnd w:id="80"/>
+    <w:bookmarkStart w:id="81" w:name="X110cdbdb7dce7582ad37f2a6dd79e105be87571"/>
+    <w:p>
+      <w:pPr>
+        <w:pStyle w:val="Heading3"/>
+      </w:pPr>
+      <w:r>
+        <w:t xml:space="preserve">Profile Photographs Without Object Storage</w:t>
+      </w:r>
+    </w:p>
+    <w:p>
+      <w:pPr>
+        <w:pStyle w:val="FirstParagraph"/>
+      </w:pPr>
+      <w:r>
+        <w:t xml:space="preserve">Firebase Cloud Storage would ordinarily hold an uploaded image, but Firebase requires the paid Blaze plan before a Storage bucket can be provisioned on a new project, and Blaze requires a payment method on file. Because a condition of this study is that the deployed system incur no cost and require no such commitment from the college, Cloud Storage is not used.</w:t>
+      </w:r>
+    </w:p>
+    <w:p>
+      <w:pPr>
+        <w:pStyle w:val="BodyText"/>
+      </w:pPr>
+      <w:r>
+        <w:t xml:space="preserve">Profile photographs are instead reduced and stored in the Realtime Database. When a user selects an image, the application decodes it at a reduced sample size, crops it to a square, scales it to 256 pixels, and compresses it as a JPEG, stepping down through decreasing quality levels until the base64-encoded result fits within 24 kilobytes. An avatar displayed at 96 density-independent pixels needs no more resolution than this.</w:t>
+      </w:r>
+    </w:p>
+    <w:p>
+      <w:pPr>
+        <w:pStyle w:val="BodyText"/>
+      </w:pPr>
+      <w:r>
+        <w:t xml:space="preserve">The encoded photograph is written to a</w:t>
+      </w:r>
+      <w:r>
+        <w:t xml:space="preserve"> </w:t>
+      </w:r>
+      <w:r>
+        <w:rPr>
+          <w:rStyle w:val="VerbatimChar"/>
+        </w:rPr>
+        <w:t xml:space="preserve">profilePhotos</w:t>
+      </w:r>
+      <w:r>
+        <w:t xml:space="preserve"> </w:t>
+      </w:r>
+      <w:r>
+        <w:t xml:space="preserve">node keyed by user identifier, rather than into the user record itself. This separation matters in practice: the administrative screens read every user record continuously to populate their lists, and an image embedded in each record would be transferred on every one of those reads. Held separately, a photograph is transferred only when it is actually displayed.</w:t>
+      </w:r>
+    </w:p>
+    <w:p>
+      <w:pPr>
+        <w:pStyle w:val="BodyText"/>
+      </w:pPr>
+      <w:r>
+        <w:t xml:space="preserve">At 24 kilobytes per photograph, one thousand users would consume roughly 24 megabytes of the 1 gigabyte free allowance.</w:t>
+      </w:r>
+    </w:p>
+    <w:p>
+      <w:pPr>
+        <w:pStyle w:val="BodyText"/>
+      </w:pPr>
+      <w:r>
+        <w:t xml:space="preserve">The same technique carries the one document the system does collect: a photograph of the driver’s licence. Its budget is different, because its purpose is different. An avatar has only to resemble the person at 96 density-independent pixels; a licence must be legible enough for an administrator to read the number, the name, and the expiry date and compare them with what the driver typed. The long edge is therefore scaled to 1280 pixels rather than 256, the aspect ratio is preserved rather than cropped square — cropping would cut the ends of the licence number — and the budget rises to approximately 200 kilobytes. Thirty registered drivers consume around six megabytes, which is immaterial against the free allowance.</w:t>
+      </w:r>
+    </w:p>
+    <w:p>
+      <w:pPr>
+        <w:pStyle w:val="BodyText"/>
+      </w:pPr>
+      <w:r>
+        <w:t xml:space="preserve">Licence photographs are written to a</w:t>
+      </w:r>
+      <w:r>
+        <w:t xml:space="preserve"> </w:t>
+      </w:r>
+      <w:r>
+        <w:rPr>
+          <w:rStyle w:val="VerbatimChar"/>
+        </w:rPr>
+        <w:t xml:space="preserve">driverDocuments</w:t>
+      </w:r>
+      <w:r>
+        <w:t xml:space="preserve"> </w:t>
+      </w:r>
+      <w:r>
+        <w:t xml:space="preserve">node rather than to the driver record, for the reason given above and for a second one addressed in Section 3.8: they are the only data in the system that are not readable by every authenticated account.</w:t>
+      </w:r>
+    </w:p>
     <w:bookmarkEnd w:id="81"/>
-    <w:bookmarkStart w:id="82" w:name="X110cdbdb7dce7582ad37f2a6dd79e105be87571"/>
+    <w:bookmarkStart w:id="82" w:name="data-organization"/>
     <w:p>
       <w:pPr>
         <w:pStyle w:val="Heading3"/>
       </w:pPr>
       <w:r>
-        <w:t xml:space="preserve">Profile Photographs Without Object Storage</w:t>
+        <w:t xml:space="preserve">Data Organization</w:t>
       </w:r>
     </w:p>
     <w:p>
@@ -8608,100 +8678,12 @@
         <w:pStyle w:val="FirstParagraph"/>
       </w:pPr>
       <w:r>
-        <w:t xml:space="preserve">Firebase Cloud Storage would ordinarily hold an uploaded image, but Firebase requires the paid Blaze plan before a Storage bucket can be provisioned on a new project, and Blaze requires a payment method on file. Because a condition of this study is that the deployed system incur no cost and require no such commitment from the college, Cloud Storage is not used.</w:t>
-      </w:r>
-    </w:p>
-    <w:p>
-      <w:pPr>
-        <w:pStyle w:val="BodyText"/>
-      </w:pPr>
-      <w:r>
-        <w:t xml:space="preserve">Profile photographs are instead reduced and stored in the Realtime Database. When a user selects an image, the application decodes it at a reduced sample size, crops it to a square, scales it to 256 pixels, and compresses it as a JPEG, stepping down through decreasing quality levels until the base64-encoded result fits within 24 kilobytes. An avatar displayed at 96 density-independent pixels needs no more resolution than this.</w:t>
-      </w:r>
-    </w:p>
-    <w:p>
-      <w:pPr>
-        <w:pStyle w:val="BodyText"/>
-      </w:pPr>
-      <w:r>
-        <w:t xml:space="preserve">The encoded photograph is written to a</w:t>
-      </w:r>
-      <w:r>
-        <w:t xml:space="preserve"> </w:t>
-      </w:r>
-      <w:r>
-        <w:rPr>
-          <w:rStyle w:val="VerbatimChar"/>
-        </w:rPr>
-        <w:t xml:space="preserve">profilePhotos</w:t>
-      </w:r>
-      <w:r>
-        <w:t xml:space="preserve"> </w:t>
-      </w:r>
-      <w:r>
-        <w:t xml:space="preserve">node keyed by user identifier, rather than into the user record itself. This separation matters in practice: the administrative screens read every user record continuously to populate their lists, and an image embedded in each record would be transferred on every one of those reads. Held separately, a photograph is transferred only when it is actually displayed.</w:t>
-      </w:r>
-    </w:p>
-    <w:p>
-      <w:pPr>
-        <w:pStyle w:val="BodyText"/>
-      </w:pPr>
-      <w:r>
-        <w:t xml:space="preserve">At 24 kilobytes per photograph, one thousand users would consume roughly 24 megabytes of the 1 gigabyte free allowance.</w:t>
-      </w:r>
-    </w:p>
-    <w:p>
-      <w:pPr>
-        <w:pStyle w:val="BodyText"/>
-      </w:pPr>
-      <w:r>
-        <w:t xml:space="preserve">The same technique carries the one document the system does collect: a photograph of the driver’s licence. Its budget is different, because its purpose is different. An avatar has only to resemble the person at 96 density-independent pixels; a licence must be legible enough for an administrator to read the number, the name, and the expiry date and compare them with what the driver typed. The long edge is therefore scaled to 1280 pixels rather than 256, the aspect ratio is preserved rather than cropped square — cropping would cut the ends of the licence number — and the budget rises to approximately 200 kilobytes. Thirty registered drivers consume around six megabytes, which is immaterial against the free allowance.</w:t>
-      </w:r>
-    </w:p>
-    <w:p>
-      <w:pPr>
-        <w:pStyle w:val="BodyText"/>
-      </w:pPr>
-      <w:r>
-        <w:t xml:space="preserve">Licence photographs are written to a</w:t>
-      </w:r>
-      <w:r>
-        <w:t xml:space="preserve"> </w:t>
-      </w:r>
-      <w:r>
-        <w:rPr>
-          <w:rStyle w:val="VerbatimChar"/>
-        </w:rPr>
-        <w:t xml:space="preserve">driverDocuments</w:t>
-      </w:r>
-      <w:r>
-        <w:t xml:space="preserve"> </w:t>
-      </w:r>
-      <w:r>
-        <w:t xml:space="preserve">node rather than to the driver record, for the reason given above and for a second one addressed in Section 3.8: they are the only data in the system that are not readable by every authenticated account.</w:t>
+        <w:t xml:space="preserve">The database is organized as nine top-level nodes, documented in Table 8 and Figure 11.</w:t>
       </w:r>
     </w:p>
     <w:bookmarkEnd w:id="82"/>
-    <w:bookmarkStart w:id="83" w:name="data-organization"/>
-    <w:p>
-      <w:pPr>
-        <w:pStyle w:val="Heading3"/>
-      </w:pPr>
-      <w:r>
-        <w:t xml:space="preserve">Data Organization</w:t>
-      </w:r>
-    </w:p>
-    <w:p>
-      <w:pPr>
-        <w:pStyle w:val="FirstParagraph"/>
-      </w:pPr>
-      <w:r>
-        <w:t xml:space="preserve">The database is organized as nine top-level nodes, documented in Table 8 and Figure 11.</w:t>
-      </w:r>
-    </w:p>
     <w:bookmarkEnd w:id="83"/>
-    <w:bookmarkEnd w:id="84"/>
-    <w:bookmarkStart w:id="85" w:name="network-architecture"/>
+    <w:bookmarkStart w:id="84" w:name="network-architecture"/>
     <w:p>
       <w:pPr>
         <w:pStyle w:val="Heading2"/>
@@ -8787,8 +8769,8 @@
         <w:t xml:space="preserve">Firebase’s endpoints are reached through Google’s global content delivery infrastructure, so latency from Talibon is determined by the nearest edge location rather than by the distance to a single origin server.</w:t>
       </w:r>
     </w:p>
-    <w:bookmarkEnd w:id="85"/>
-    <w:bookmarkStart w:id="86" w:name="software-architecture"/>
+    <w:bookmarkEnd w:id="84"/>
+    <w:bookmarkStart w:id="85" w:name="software-architecture"/>
     <w:p>
       <w:pPr>
         <w:pStyle w:val="Heading2"/>
@@ -9306,8 +9288,8 @@
         <w:t xml:space="preserve">Data flows in one direction. A user event goes from View to ViewModel to Repository to Service to Firebase. A data change comes back from Firebase through a Flow, through the Repository, into the ViewModel’s state, and causes the View to recompose. This unidirectional flow makes the state of the interface a function of the data, which makes behaviour predictable and defects easier to locate.</w:t>
       </w:r>
     </w:p>
-    <w:bookmarkEnd w:id="86"/>
-    <w:bookmarkStart w:id="87" w:name="security-features"/>
+    <w:bookmarkEnd w:id="85"/>
+    <w:bookmarkStart w:id="86" w:name="security-features"/>
     <w:p>
       <w:pPr>
         <w:pStyle w:val="Heading2"/>
@@ -9855,8 +9837,8 @@
         <w:t xml:space="preserve">Every ride, every verification decision, and every concern is stored with timestamps, producing a record that can be examined after the fact and exported for review.</w:t>
       </w:r>
     </w:p>
-    <w:bookmarkEnd w:id="87"/>
-    <w:bookmarkStart w:id="91" w:name="system-architecture"/>
+    <w:bookmarkEnd w:id="86"/>
+    <w:bookmarkStart w:id="90" w:name="system-architecture"/>
     <w:p>
       <w:pPr>
         <w:pStyle w:val="Heading2"/>
@@ -9882,18 +9864,18 @@
           <wp:inline>
             <wp:extent cx="5486400" cy="3187598"/>
             <wp:effectExtent b="0" l="0" r="0" t="0"/>
-            <wp:docPr descr="Figure 3. System Architecture of the Smart Tricycle Ride and Driver Onboarding System" title="" id="89" name="Picture"/>
+            <wp:docPr descr="Figure 3. System Architecture of the Smart Tricycle Ride and Driver Onboarding System" title="" id="88" name="Picture"/>
             <a:graphic>
               <a:graphicData uri="http://schemas.openxmlformats.org/drawingml/2006/picture">
                 <pic:pic>
                   <pic:nvPicPr>
-                    <pic:cNvPr descr="figures/fig03_system_architecture.png" id="90" name="Picture"/>
+                    <pic:cNvPr descr="figures/fig03_system_architecture.png" id="89" name="Picture"/>
                     <pic:cNvPicPr>
                       <a:picLocks noChangeArrowheads="1" noChangeAspect="1"/>
                     </pic:cNvPicPr>
                   </pic:nvPicPr>
                   <pic:blipFill>
-                    <a:blip r:embed="rId88"/>
+                    <a:blip r:embed="rId87"/>
                     <a:stretch>
                       <a:fillRect/>
                     </a:stretch>
@@ -9941,28 +9923,28 @@
         <w:br w:type="page"/>
       </w:r>
     </w:p>
+    <w:bookmarkEnd w:id="90"/>
     <w:bookmarkEnd w:id="91"/>
+    <w:bookmarkStart w:id="92" w:name="chapter-4"/>
+    <w:p>
+      <w:pPr>
+        <w:pStyle w:val="Heading1"/>
+      </w:pPr>
+      <w:r>
+        <w:t xml:space="preserve">Chapter 4</w:t>
+      </w:r>
+    </w:p>
     <w:bookmarkEnd w:id="92"/>
-    <w:bookmarkStart w:id="93" w:name="chapter-4"/>
+    <w:bookmarkStart w:id="161" w:name="methodology-results-and-discussion"/>
     <w:p>
       <w:pPr>
         <w:pStyle w:val="Heading1"/>
       </w:pPr>
       <w:r>
-        <w:t xml:space="preserve">Chapter 4</w:t>
-      </w:r>
-    </w:p>
-    <w:bookmarkEnd w:id="93"/>
-    <w:bookmarkStart w:id="162" w:name="methodology-results-and-discussion"/>
-    <w:p>
-      <w:pPr>
-        <w:pStyle w:val="Heading1"/>
-      </w:pPr>
-      <w:r>
         <w:t xml:space="preserve">METHODOLOGY, RESULTS, AND DISCUSSION</w:t>
       </w:r>
     </w:p>
-    <w:bookmarkStart w:id="96" w:name="requirements-analysis"/>
+    <w:bookmarkStart w:id="95" w:name="requirements-analysis"/>
     <w:p>
       <w:pPr>
         <w:pStyle w:val="Heading2"/>
@@ -9979,7 +9961,7 @@
         <w:t xml:space="preserve">Requirements were derived from three sources: the problems documented in the needs assessment, the objectives set out in Section 1.3, and the published FeTODAT fare schedule, which imposes requirements of its own on how fares must be computed.</w:t>
       </w:r>
     </w:p>
-    <w:bookmarkStart w:id="94" w:name="functional-requirements"/>
+    <w:bookmarkStart w:id="93" w:name="functional-requirements"/>
     <w:p>
       <w:pPr>
         <w:pStyle w:val="Heading3"/>
@@ -12264,8 +12246,8 @@
         </w:tc>
       </w:tr>
     </w:tbl>
-    <w:bookmarkEnd w:id="94"/>
-    <w:bookmarkStart w:id="95" w:name="non-functional-requirements"/>
+    <w:bookmarkEnd w:id="93"/>
+    <w:bookmarkStart w:id="94" w:name="non-functional-requirements"/>
     <w:p>
       <w:pPr>
         <w:pStyle w:val="Heading3"/>
@@ -12983,9 +12965,9 @@
         </w:tc>
       </w:tr>
     </w:tbl>
+    <w:bookmarkEnd w:id="94"/>
     <w:bookmarkEnd w:id="95"/>
-    <w:bookmarkEnd w:id="96"/>
-    <w:bookmarkStart w:id="100" w:name="requirements-documentation"/>
+    <w:bookmarkStart w:id="99" w:name="requirements-documentation"/>
     <w:p>
       <w:pPr>
         <w:pStyle w:val="Heading2"/>
@@ -12994,7 +12976,7 @@
         <w:t xml:space="preserve">4.2 Requirements Documentation</w:t>
       </w:r>
     </w:p>
-    <w:bookmarkStart w:id="97" w:name="user-requirements"/>
+    <w:bookmarkStart w:id="96" w:name="user-requirements"/>
     <w:p>
       <w:pPr>
         <w:pStyle w:val="Heading3"/>
@@ -13131,8 +13113,8 @@
         </w:tc>
       </w:tr>
     </w:tbl>
-    <w:bookmarkEnd w:id="97"/>
-    <w:bookmarkStart w:id="98" w:name="system-requirements"/>
+    <w:bookmarkEnd w:id="96"/>
+    <w:bookmarkStart w:id="97" w:name="system-requirements"/>
     <w:p>
       <w:pPr>
         <w:pStyle w:val="Heading3"/>
@@ -13373,8 +13355,8 @@
         </w:tc>
       </w:tr>
     </w:tbl>
-    <w:bookmarkEnd w:id="98"/>
-    <w:bookmarkStart w:id="99" w:name="use-case-descriptions"/>
+    <w:bookmarkEnd w:id="97"/>
+    <w:bookmarkStart w:id="98" w:name="use-case-descriptions"/>
     <w:p>
       <w:pPr>
         <w:pStyle w:val="Heading3"/>
@@ -14056,9 +14038,9 @@
         </w:tc>
       </w:tr>
     </w:tbl>
+    <w:bookmarkEnd w:id="98"/>
     <w:bookmarkEnd w:id="99"/>
-    <w:bookmarkEnd w:id="100"/>
-    <w:bookmarkStart w:id="137" w:name="system-design"/>
+    <w:bookmarkStart w:id="136" w:name="system-design"/>
     <w:p>
       <w:pPr>
         <w:pStyle w:val="Heading2"/>
@@ -14067,7 +14049,7 @@
         <w:t xml:space="preserve">4.3 System Design</w:t>
       </w:r>
     </w:p>
-    <w:bookmarkStart w:id="104" w:name="context-diagram"/>
+    <w:bookmarkStart w:id="103" w:name="context-diagram"/>
     <w:p>
       <w:pPr>
         <w:pStyle w:val="Heading3"/>
@@ -14093,18 +14075,18 @@
           <wp:inline>
             <wp:extent cx="5486400" cy="2059321"/>
             <wp:effectExtent b="0" l="0" r="0" t="0"/>
-            <wp:docPr descr="Figure 4. Context Diagram (Data Flow Diagram Level 0)" title="" id="102" name="Picture"/>
+            <wp:docPr descr="Figure 4. Context Diagram (Data Flow Diagram Level 0)" title="" id="101" name="Picture"/>
             <a:graphic>
               <a:graphicData uri="http://schemas.openxmlformats.org/drawingml/2006/picture">
                 <pic:pic>
                   <pic:nvPicPr>
-                    <pic:cNvPr descr="figures/fig04_context_diagram.png" id="103" name="Picture"/>
+                    <pic:cNvPr descr="figures/fig04_context_diagram.png" id="102" name="Picture"/>
                     <pic:cNvPicPr>
                       <a:picLocks noChangeArrowheads="1" noChangeAspect="1"/>
                     </pic:cNvPicPr>
                   </pic:nvPicPr>
                   <pic:blipFill>
-                    <a:blip r:embed="rId101"/>
+                    <a:blip r:embed="rId100"/>
                     <a:stretch>
                       <a:fillRect/>
                     </a:stretch>
@@ -14139,8 +14121,8 @@
         <w:t xml:space="preserve">Figure 4. Context Diagram (Data Flow Diagram Level 0)</w:t>
       </w:r>
     </w:p>
-    <w:bookmarkEnd w:id="104"/>
-    <w:bookmarkStart w:id="108" w:name="data-flow-diagram"/>
+    <w:bookmarkEnd w:id="103"/>
+    <w:bookmarkStart w:id="107" w:name="data-flow-diagram"/>
     <w:p>
       <w:pPr>
         <w:pStyle w:val="Heading3"/>
@@ -14166,18 +14148,18 @@
           <wp:inline>
             <wp:extent cx="5486400" cy="5827489"/>
             <wp:effectExtent b="0" l="0" r="0" t="0"/>
-            <wp:docPr descr="Figure 5. Data Flow Diagram Level 1" title="" id="106" name="Picture"/>
+            <wp:docPr descr="Figure 5. Data Flow Diagram Level 1" title="" id="105" name="Picture"/>
             <a:graphic>
               <a:graphicData uri="http://schemas.openxmlformats.org/drawingml/2006/picture">
                 <pic:pic>
                   <pic:nvPicPr>
-                    <pic:cNvPr descr="figures/fig05_dfd_level1.png" id="107" name="Picture"/>
+                    <pic:cNvPr descr="figures/fig05_dfd_level1.png" id="106" name="Picture"/>
                     <pic:cNvPicPr>
                       <a:picLocks noChangeArrowheads="1" noChangeAspect="1"/>
                     </pic:cNvPicPr>
                   </pic:nvPicPr>
                   <pic:blipFill>
-                    <a:blip r:embed="rId105"/>
+                    <a:blip r:embed="rId104"/>
                     <a:stretch>
                       <a:fillRect/>
                     </a:stretch>
@@ -14212,8 +14194,8 @@
         <w:t xml:space="preserve">Figure 5. Data Flow Diagram Level 1</w:t>
       </w:r>
     </w:p>
-    <w:bookmarkEnd w:id="108"/>
-    <w:bookmarkStart w:id="112" w:name="entity-relationship-diagram"/>
+    <w:bookmarkEnd w:id="107"/>
+    <w:bookmarkStart w:id="111" w:name="entity-relationship-diagram"/>
     <w:p>
       <w:pPr>
         <w:pStyle w:val="Heading3"/>
@@ -14269,18 +14251,18 @@
           <wp:inline>
             <wp:extent cx="5385816" cy="6768016"/>
             <wp:effectExtent b="0" l="0" r="0" t="0"/>
-            <wp:docPr descr="Figure 6. Entity Relationship Diagram" title="" id="110" name="Picture"/>
+            <wp:docPr descr="Figure 6. Entity Relationship Diagram" title="" id="109" name="Picture"/>
             <a:graphic>
               <a:graphicData uri="http://schemas.openxmlformats.org/drawingml/2006/picture">
                 <pic:pic>
                   <pic:nvPicPr>
-                    <pic:cNvPr descr="figures/fig06_erd.png" id="111" name="Picture"/>
+                    <pic:cNvPr descr="figures/fig06_erd.png" id="110" name="Picture"/>
                     <pic:cNvPicPr>
                       <a:picLocks noChangeArrowheads="1" noChangeAspect="1"/>
                     </pic:cNvPicPr>
                   </pic:nvPicPr>
                   <pic:blipFill>
-                    <a:blip r:embed="rId109"/>
+                    <a:blip r:embed="rId108"/>
                     <a:stretch>
                       <a:fillRect/>
                     </a:stretch>
@@ -14315,8 +14297,8 @@
         <w:t xml:space="preserve">Figure 6. Entity Relationship Diagram</w:t>
       </w:r>
     </w:p>
-    <w:bookmarkEnd w:id="112"/>
-    <w:bookmarkStart w:id="116" w:name="use-case-diagram"/>
+    <w:bookmarkEnd w:id="111"/>
+    <w:bookmarkStart w:id="115" w:name="use-case-diagram"/>
     <w:p>
       <w:pPr>
         <w:pStyle w:val="Heading3"/>
@@ -14334,18 +14316,18 @@
           <wp:inline>
             <wp:extent cx="5486400" cy="6246835"/>
             <wp:effectExtent b="0" l="0" r="0" t="0"/>
-            <wp:docPr descr="Figure 7. Use Case Diagram" title="" id="114" name="Picture"/>
+            <wp:docPr descr="Figure 7. Use Case Diagram" title="" id="113" name="Picture"/>
             <a:graphic>
               <a:graphicData uri="http://schemas.openxmlformats.org/drawingml/2006/picture">
                 <pic:pic>
                   <pic:nvPicPr>
-                    <pic:cNvPr descr="figures/fig07_use_case.png" id="115" name="Picture"/>
+                    <pic:cNvPr descr="figures/fig07_use_case.png" id="114" name="Picture"/>
                     <pic:cNvPicPr>
                       <a:picLocks noChangeArrowheads="1" noChangeAspect="1"/>
                     </pic:cNvPicPr>
                   </pic:nvPicPr>
                   <pic:blipFill>
-                    <a:blip r:embed="rId113"/>
+                    <a:blip r:embed="rId112"/>
                     <a:stretch>
                       <a:fillRect/>
                     </a:stretch>
@@ -14380,8 +14362,8 @@
         <w:t xml:space="preserve">Figure 7. Use Case Diagram</w:t>
       </w:r>
     </w:p>
-    <w:bookmarkEnd w:id="116"/>
-    <w:bookmarkStart w:id="120" w:name="activity-diagram"/>
+    <w:bookmarkEnd w:id="115"/>
+    <w:bookmarkStart w:id="119" w:name="activity-diagram"/>
     <w:p>
       <w:pPr>
         <w:pStyle w:val="Heading3"/>
@@ -14407,18 +14389,18 @@
           <wp:inline>
             <wp:extent cx="5486400" cy="4828032"/>
             <wp:effectExtent b="0" l="0" r="0" t="0"/>
-            <wp:docPr descr="Figure 8. Activity Diagram: Booking a Ride" title="" id="118" name="Picture"/>
+            <wp:docPr descr="Figure 8. Activity Diagram: Booking a Ride" title="" id="117" name="Picture"/>
             <a:graphic>
               <a:graphicData uri="http://schemas.openxmlformats.org/drawingml/2006/picture">
                 <pic:pic>
                   <pic:nvPicPr>
-                    <pic:cNvPr descr="figures/fig08_activity_booking.png" id="119" name="Picture"/>
+                    <pic:cNvPr descr="figures/fig08_activity_booking.png" id="118" name="Picture"/>
                     <pic:cNvPicPr>
                       <a:picLocks noChangeArrowheads="1" noChangeAspect="1"/>
                     </pic:cNvPicPr>
                   </pic:nvPicPr>
                   <pic:blipFill>
-                    <a:blip r:embed="rId117"/>
+                    <a:blip r:embed="rId116"/>
                     <a:stretch>
                       <a:fillRect/>
                     </a:stretch>
@@ -14453,8 +14435,8 @@
         <w:t xml:space="preserve">Figure 8. Activity Diagram: Booking a Ride</w:t>
       </w:r>
     </w:p>
-    <w:bookmarkEnd w:id="120"/>
-    <w:bookmarkStart w:id="124" w:name="sequence-diagram"/>
+    <w:bookmarkEnd w:id="119"/>
+    <w:bookmarkStart w:id="123" w:name="sequence-diagram"/>
     <w:p>
       <w:pPr>
         <w:pStyle w:val="Heading3"/>
@@ -14480,18 +14462,18 @@
           <wp:inline>
             <wp:extent cx="5486400" cy="4463186"/>
             <wp:effectExtent b="0" l="0" r="0" t="0"/>
-            <wp:docPr descr="Figure 9. Sequence Diagram: Ride Request to Completion" title="" id="122" name="Picture"/>
+            <wp:docPr descr="Figure 9. Sequence Diagram: Ride Request to Completion" title="" id="121" name="Picture"/>
             <a:graphic>
               <a:graphicData uri="http://schemas.openxmlformats.org/drawingml/2006/picture">
                 <pic:pic>
                   <pic:nvPicPr>
-                    <pic:cNvPr descr="figures/fig09_sequence_booking.png" id="123" name="Picture"/>
+                    <pic:cNvPr descr="figures/fig09_sequence_booking.png" id="122" name="Picture"/>
                     <pic:cNvPicPr>
                       <a:picLocks noChangeArrowheads="1" noChangeAspect="1"/>
                     </pic:cNvPicPr>
                   </pic:nvPicPr>
                   <pic:blipFill>
-                    <a:blip r:embed="rId121"/>
+                    <a:blip r:embed="rId120"/>
                     <a:stretch>
                       <a:fillRect/>
                     </a:stretch>
@@ -14526,8 +14508,8 @@
         <w:t xml:space="preserve">Figure 9. Sequence Diagram: Ride Request to Completion</w:t>
       </w:r>
     </w:p>
-    <w:bookmarkEnd w:id="124"/>
-    <w:bookmarkStart w:id="128" w:name="class-diagram"/>
+    <w:bookmarkEnd w:id="123"/>
+    <w:bookmarkStart w:id="127" w:name="class-diagram"/>
     <w:p>
       <w:pPr>
         <w:pStyle w:val="Heading3"/>
@@ -14545,18 +14527,18 @@
           <wp:inline>
             <wp:extent cx="4809744" cy="6765755"/>
             <wp:effectExtent b="0" l="0" r="0" t="0"/>
-            <wp:docPr descr="Figure 10. Class Diagram" title="" id="126" name="Picture"/>
+            <wp:docPr descr="Figure 10. Class Diagram" title="" id="125" name="Picture"/>
             <a:graphic>
               <a:graphicData uri="http://schemas.openxmlformats.org/drawingml/2006/picture">
                 <pic:pic>
                   <pic:nvPicPr>
-                    <pic:cNvPr descr="figures/fig10_class_diagram.png" id="127" name="Picture"/>
+                    <pic:cNvPr descr="figures/fig10_class_diagram.png" id="126" name="Picture"/>
                     <pic:cNvPicPr>
                       <a:picLocks noChangeArrowheads="1" noChangeAspect="1"/>
                     </pic:cNvPicPr>
                   </pic:nvPicPr>
                   <pic:blipFill>
-                    <a:blip r:embed="rId125"/>
+                    <a:blip r:embed="rId124"/>
                     <a:stretch>
                       <a:fillRect/>
                     </a:stretch>
@@ -14591,8 +14573,8 @@
         <w:t xml:space="preserve">Figure 10. Class Diagram</w:t>
       </w:r>
     </w:p>
-    <w:bookmarkEnd w:id="128"/>
-    <w:bookmarkStart w:id="132" w:name="database-design"/>
+    <w:bookmarkEnd w:id="127"/>
+    <w:bookmarkStart w:id="131" w:name="database-design"/>
     <w:p>
       <w:pPr>
         <w:pStyle w:val="Heading3"/>
@@ -15277,18 +15259,18 @@
           <wp:inline>
             <wp:extent cx="4416552" cy="6762460"/>
             <wp:effectExtent b="0" l="0" r="0" t="0"/>
-            <wp:docPr descr="Figure 11. Realtime Database Schema" title="" id="130" name="Picture"/>
+            <wp:docPr descr="Figure 11. Realtime Database Schema" title="" id="129" name="Picture"/>
             <a:graphic>
               <a:graphicData uri="http://schemas.openxmlformats.org/drawingml/2006/picture">
                 <pic:pic>
                   <pic:nvPicPr>
-                    <pic:cNvPr descr="figures/fig11_database_schema.png" id="131" name="Picture"/>
+                    <pic:cNvPr descr="figures/fig11_database_schema.png" id="130" name="Picture"/>
                     <pic:cNvPicPr>
                       <a:picLocks noChangeArrowheads="1" noChangeAspect="1"/>
                     </pic:cNvPicPr>
                   </pic:nvPicPr>
                   <pic:blipFill>
-                    <a:blip r:embed="rId129"/>
+                    <a:blip r:embed="rId128"/>
                     <a:stretch>
                       <a:fillRect/>
                     </a:stretch>
@@ -16097,8 +16079,8 @@
         <w:t xml:space="preserve">This treatment is a deliberate design position. The alternative, which is to enter every transcribed number and let the application charge whatever was read, would produce a system that is wrong quietly. Flagging uncertainty and disabling unusable entries makes the system wrong loudly, which is the failure mode that can be corrected.</w:t>
       </w:r>
     </w:p>
-    <w:bookmarkEnd w:id="132"/>
-    <w:bookmarkStart w:id="136" w:name="interface-design"/>
+    <w:bookmarkEnd w:id="131"/>
+    <w:bookmarkStart w:id="135" w:name="interface-design"/>
     <w:p>
       <w:pPr>
         <w:pStyle w:val="Heading3"/>
@@ -16124,18 +16106,18 @@
           <wp:inline>
             <wp:extent cx="5486400" cy="5813010"/>
             <wp:effectExtent b="0" l="0" r="0" t="0"/>
-            <wp:docPr descr="Figure 13. Screen Navigation Flow" title="" id="134" name="Picture"/>
+            <wp:docPr descr="Figure 13. Screen Navigation Flow" title="" id="133" name="Picture"/>
             <a:graphic>
               <a:graphicData uri="http://schemas.openxmlformats.org/drawingml/2006/picture">
                 <pic:pic>
                   <pic:nvPicPr>
-                    <pic:cNvPr descr="figures/fig13_screen_flow.png" id="135" name="Picture"/>
+                    <pic:cNvPr descr="figures/fig13_screen_flow.png" id="134" name="Picture"/>
                     <pic:cNvPicPr>
                       <a:picLocks noChangeArrowheads="1" noChangeAspect="1"/>
                     </pic:cNvPicPr>
                   </pic:nvPicPr>
                   <pic:blipFill>
-                    <a:blip r:embed="rId133"/>
+                    <a:blip r:embed="rId132"/>
                     <a:stretch>
                       <a:fillRect/>
                     </a:stretch>
@@ -16178,9 +16160,9 @@
         <w:t xml:space="preserve">Several decisions in the interface follow from constraints identified during design. The destination picker is a full-screen searchable list rather than a dropdown, because a dropdown of 240 entries is unusable. The driver’s request card carries a countdown, because a driver deciding whether to accept needs to know how long the decision remains available. Lists show skeleton placeholders while loading rather than an empty screen, because an empty screen reads as a failure. The fare is itemized rather than given as a single figure, because a passenger who can see how the number was reached can check it against the posted sheet.</w:t>
       </w:r>
     </w:p>
+    <w:bookmarkEnd w:id="135"/>
     <w:bookmarkEnd w:id="136"/>
-    <w:bookmarkEnd w:id="137"/>
-    <w:bookmarkStart w:id="145" w:name="software-development"/>
+    <w:bookmarkStart w:id="144" w:name="software-development"/>
     <w:p>
       <w:pPr>
         <w:pStyle w:val="Heading2"/>
@@ -16189,7 +16171,7 @@
         <w:t xml:space="preserve">4.4 Software Development</w:t>
       </w:r>
     </w:p>
-    <w:bookmarkStart w:id="141" w:name="development-approach"/>
+    <w:bookmarkStart w:id="140" w:name="development-approach"/>
     <w:p>
       <w:pPr>
         <w:pStyle w:val="Heading3"/>
@@ -16215,18 +16197,18 @@
           <wp:inline>
             <wp:extent cx="3383280" cy="6766560"/>
             <wp:effectExtent b="0" l="0" r="0" t="0"/>
-            <wp:docPr descr="Figure 12. Waterfall Model of the Software Development Life Cycle" title="" id="139" name="Picture"/>
+            <wp:docPr descr="Figure 12. Waterfall Model of the Software Development Life Cycle" title="" id="138" name="Picture"/>
             <a:graphic>
               <a:graphicData uri="http://schemas.openxmlformats.org/drawingml/2006/picture">
                 <pic:pic>
                   <pic:nvPicPr>
-                    <pic:cNvPr descr="figures/fig12_waterfall.png" id="140" name="Picture"/>
+                    <pic:cNvPr descr="figures/fig12_waterfall.png" id="139" name="Picture"/>
                     <pic:cNvPicPr>
                       <a:picLocks noChangeArrowheads="1" noChangeAspect="1"/>
                     </pic:cNvPicPr>
                   </pic:nvPicPr>
                   <pic:blipFill>
-                    <a:blip r:embed="rId138"/>
+                    <a:blip r:embed="rId137"/>
                     <a:stretch>
                       <a:fillRect/>
                     </a:stretch>
@@ -16742,14 +16724,32 @@
         </w:tc>
       </w:tr>
     </w:tbl>
+    <w:bookmarkEnd w:id="140"/>
+    <w:bookmarkStart w:id="141" w:name="coding-standards"/>
+    <w:p>
+      <w:pPr>
+        <w:pStyle w:val="Heading3"/>
+      </w:pPr>
+      <w:r>
+        <w:t xml:space="preserve">Coding Standards</w:t>
+      </w:r>
+    </w:p>
+    <w:p>
+      <w:pPr>
+        <w:pStyle w:val="FirstParagraph"/>
+      </w:pPr>
+      <w:r>
+        <w:t xml:space="preserve">Kotlin’s official style guide was followed throughout. Names describe intent rather than type. Comments explain why a decision was made where the reason is not evident from the code, and are omitted where the code already says what it does. Each file holds one concern. Every screen is a composable function that receives state and emits events, holding no logic of its own.</w:t>
+      </w:r>
+    </w:p>
     <w:bookmarkEnd w:id="141"/>
-    <w:bookmarkStart w:id="142" w:name="coding-standards"/>
+    <w:bookmarkStart w:id="142" w:name="version-control"/>
     <w:p>
       <w:pPr>
         <w:pStyle w:val="Heading3"/>
       </w:pPr>
       <w:r>
-        <w:t xml:space="preserve">Coding Standards</w:t>
+        <w:t xml:space="preserve">Version Control</w:t>
       </w:r>
     </w:p>
     <w:p>
@@ -16757,17 +16757,17 @@
         <w:pStyle w:val="FirstParagraph"/>
       </w:pPr>
       <w:r>
-        <w:t xml:space="preserve">Kotlin’s official style guide was followed throughout. Names describe intent rather than type. Comments explain why a decision was made where the reason is not evident from the code, and are omitted where the code already says what it does. Each file holds one concern. Every screen is a composable function that receives state and emits events, holding no logic of its own.</w:t>
+        <w:t xml:space="preserve">All work was committed to a Git repository hosted on GitHub, on a dedicated development branch. Commits were made at the completion of each coherent unit of work, producing a history in which any change can be located and, if necessary, reverted.</w:t>
       </w:r>
     </w:p>
     <w:bookmarkEnd w:id="142"/>
-    <w:bookmarkStart w:id="143" w:name="version-control"/>
+    <w:bookmarkStart w:id="143" w:name="integration"/>
     <w:p>
       <w:pPr>
         <w:pStyle w:val="Heading3"/>
       </w:pPr>
       <w:r>
-        <w:t xml:space="preserve">Version Control</w:t>
+        <w:t xml:space="preserve">Integration</w:t>
       </w:r>
     </w:p>
     <w:p>
@@ -16775,17 +16775,18 @@
         <w:pStyle w:val="FirstParagraph"/>
       </w:pPr>
       <w:r>
-        <w:t xml:space="preserve">All work was committed to a Git repository hosted on GitHub, on a dedicated development branch. Commits were made at the completion of each coherent unit of work, producing a history in which any change can be located and, if necessary, reverted.</w:t>
+        <w:t xml:space="preserve">Integration was continuous rather than deferred. Each module was connected to Firebase as it was written, so that failures in synchronization, deserialization, or authorization surfaced immediately rather than accumulating to the end of development. Two classes of defect were found this way and would have been considerably harder to locate later: a mismatch between the package name registered in the Firebase console and the package name in the application, which caused the build to fail at the Google Services processing step; and a database write that never completed because the Realtime Database instance had not been created, which the application originally presented as an indefinite loading indicator and which was corrected by introducing a twelve-second timeout with an actionable message.</w:t>
       </w:r>
     </w:p>
     <w:bookmarkEnd w:id="143"/>
-    <w:bookmarkStart w:id="144" w:name="integration"/>
-    <w:p>
-      <w:pPr>
-        <w:pStyle w:val="Heading3"/>
-      </w:pPr>
-      <w:r>
-        <w:t xml:space="preserve">Integration</w:t>
+    <w:bookmarkEnd w:id="144"/>
+    <w:bookmarkStart w:id="151" w:name="testing"/>
+    <w:p>
+      <w:pPr>
+        <w:pStyle w:val="Heading2"/>
+      </w:pPr>
+      <w:r>
+        <w:t xml:space="preserve">4.5 Testing</w:t>
       </w:r>
     </w:p>
     <w:p>
@@ -16793,29 +16794,10 @@
         <w:pStyle w:val="FirstParagraph"/>
       </w:pPr>
       <w:r>
-        <w:t xml:space="preserve">Integration was continuous rather than deferred. Each module was connected to Firebase as it was written, so that failures in synchronization, deserialization, or authorization surfaced immediately rather than accumulating to the end of development. Two classes of defect were found this way and would have been considerably harder to locate later: a mismatch between the package name registered in the Firebase console and the package name in the application, which caused the build to fail at the Google Services processing step; and a database write that never completed because the Realtime Database instance had not been created, which the application originally presented as an indefinite loading indicator and which was corrected by introducing a twelve-second timeout with an actionable message.</w:t>
-      </w:r>
-    </w:p>
-    <w:bookmarkEnd w:id="144"/>
-    <w:bookmarkEnd w:id="145"/>
-    <w:bookmarkStart w:id="152" w:name="testing"/>
-    <w:p>
-      <w:pPr>
-        <w:pStyle w:val="Heading2"/>
-      </w:pPr>
-      <w:r>
-        <w:t xml:space="preserve">4.5 Testing</w:t>
-      </w:r>
-    </w:p>
-    <w:p>
-      <w:pPr>
-        <w:pStyle w:val="FirstParagraph"/>
-      </w:pPr>
-      <w:r>
         <w:t xml:space="preserve">Testing was conducted at four levels, followed by performance and security testing.</w:t>
       </w:r>
     </w:p>
-    <w:bookmarkStart w:id="146" w:name="unit-testing"/>
+    <w:bookmarkStart w:id="145" w:name="unit-testing"/>
     <w:p>
       <w:pPr>
         <w:pStyle w:val="Heading3"/>
@@ -17508,8 +17490,8 @@
         </w:tc>
       </w:tr>
     </w:tbl>
-    <w:bookmarkEnd w:id="146"/>
-    <w:bookmarkStart w:id="147" w:name="integration-testing"/>
+    <w:bookmarkEnd w:id="145"/>
+    <w:bookmarkStart w:id="146" w:name="integration-testing"/>
     <w:p>
       <w:pPr>
         <w:pStyle w:val="Heading3"/>
@@ -18102,8 +18084,8 @@
         </w:tc>
       </w:tr>
     </w:tbl>
-    <w:bookmarkEnd w:id="147"/>
-    <w:bookmarkStart w:id="148" w:name="system-testing"/>
+    <w:bookmarkEnd w:id="146"/>
+    <w:bookmarkStart w:id="147" w:name="system-testing"/>
     <w:p>
       <w:pPr>
         <w:pStyle w:val="Heading3"/>
@@ -18846,8 +18828,8 @@
         </w:tc>
       </w:tr>
     </w:tbl>
-    <w:bookmarkEnd w:id="148"/>
-    <w:bookmarkStart w:id="149" w:name="user-acceptance-testing"/>
+    <w:bookmarkEnd w:id="147"/>
+    <w:bookmarkStart w:id="148" w:name="user-acceptance-testing"/>
     <w:p>
       <w:pPr>
         <w:pStyle w:val="Heading3"/>
@@ -18876,8 +18858,8 @@
         <w:t xml:space="preserve">[Task completion rates and observed difficulties are to be recorded following the evaluation period.]</w:t>
       </w:r>
     </w:p>
-    <w:bookmarkEnd w:id="149"/>
-    <w:bookmarkStart w:id="150" w:name="performance-testing"/>
+    <w:bookmarkEnd w:id="148"/>
+    <w:bookmarkStart w:id="149" w:name="performance-testing"/>
     <w:p>
       <w:pPr>
         <w:pStyle w:val="Heading3"/>
@@ -18906,8 +18888,8 @@
         <w:t xml:space="preserve">[Measured figures are to be recorded following the evaluation period.]</w:t>
       </w:r>
     </w:p>
-    <w:bookmarkEnd w:id="150"/>
-    <w:bookmarkStart w:id="151" w:name="security-testing"/>
+    <w:bookmarkEnd w:id="149"/>
+    <w:bookmarkStart w:id="150" w:name="security-testing"/>
     <w:p>
       <w:pPr>
         <w:pStyle w:val="Heading3"/>
@@ -19892,9 +19874,9 @@
         </w:tc>
       </w:tr>
     </w:tbl>
+    <w:bookmarkEnd w:id="150"/>
     <w:bookmarkEnd w:id="151"/>
-    <w:bookmarkEnd w:id="152"/>
-    <w:bookmarkStart w:id="153" w:name="prototype-description"/>
+    <w:bookmarkStart w:id="152" w:name="prototype-description"/>
     <w:p>
       <w:pPr>
         <w:pStyle w:val="Heading2"/>
@@ -20229,8 +20211,8 @@
         <w:t xml:space="preserve">A notification centre is reachable from the passenger and driver home screens, showing an unread count and allowing individual or bulk marking as read.</w:t>
       </w:r>
     </w:p>
-    <w:bookmarkEnd w:id="153"/>
-    <w:bookmarkStart w:id="157" w:name="implementation-plan"/>
+    <w:bookmarkEnd w:id="152"/>
+    <w:bookmarkStart w:id="156" w:name="implementation-plan"/>
     <w:p>
       <w:pPr>
         <w:pStyle w:val="Heading2"/>
@@ -20239,7 +20221,7 @@
         <w:t xml:space="preserve">4.7 Implementation Plan</w:t>
       </w:r>
     </w:p>
-    <w:bookmarkStart w:id="154" w:name="deployment"/>
+    <w:bookmarkStart w:id="153" w:name="deployment"/>
     <w:p>
       <w:pPr>
         <w:pStyle w:val="Heading3"/>
@@ -20330,8 +20312,8 @@
         <w:t xml:space="preserve">Backend deployment requires no hardware and no payment method. The Firebase project is created through the web console, the database is initialized, the security rules are published, and the fare table is loaded once through the administrative interface. Authentication, the Realtime Database, Cloud Messaging, and App Distribution are all provided within the platform’s free tier; the one service that would require a paid plan, object storage, is not used, for the reason set out in Section 3.5.</w:t>
       </w:r>
     </w:p>
-    <w:bookmarkEnd w:id="154"/>
-    <w:bookmarkStart w:id="155" w:name="training"/>
+    <w:bookmarkEnd w:id="153"/>
+    <w:bookmarkStart w:id="154" w:name="training"/>
     <w:p>
       <w:pPr>
         <w:pStyle w:val="Heading3"/>
@@ -20402,8 +20384,8 @@
         <w:t xml:space="preserve">receive a session covering driver verification, the fare table including the review queue, concern handling, and report export, together with the administrator section of the user manual.</w:t>
       </w:r>
     </w:p>
-    <w:bookmarkEnd w:id="155"/>
-    <w:bookmarkStart w:id="156" w:name="maintenance"/>
+    <w:bookmarkEnd w:id="154"/>
+    <w:bookmarkStart w:id="155" w:name="maintenance"/>
     <w:p>
       <w:pPr>
         <w:pStyle w:val="Heading3"/>
@@ -20484,9 +20466,9 @@
         <w:t xml:space="preserve">The source code, this documentation, the database schema, and the administrator credentials are turned over to Talibon Polytechnic College at the conclusion of the study, so that the system does not depend on the continued availability of the researchers.</w:t>
       </w:r>
     </w:p>
+    <w:bookmarkEnd w:id="155"/>
     <w:bookmarkEnd w:id="156"/>
-    <w:bookmarkEnd w:id="157"/>
-    <w:bookmarkStart w:id="161" w:name="implementation-results"/>
+    <w:bookmarkStart w:id="160" w:name="implementation-results"/>
     <w:p>
       <w:pPr>
         <w:pStyle w:val="Heading2"/>
@@ -20495,7 +20477,7 @@
         <w:t xml:space="preserve">4.8 Implementation Results</w:t>
       </w:r>
     </w:p>
-    <w:bookmarkStart w:id="158" w:name="modules-delivered"/>
+    <w:bookmarkStart w:id="157" w:name="modules-delivered"/>
     <w:p>
       <w:pPr>
         <w:pStyle w:val="Heading3"/>
@@ -21069,8 +21051,8 @@
         <w:t xml:space="preserve">All forty-three functional requirements were implemented, as were the seventeen non-functional requirements.</w:t>
       </w:r>
     </w:p>
-    <w:bookmarkEnd w:id="158"/>
-    <w:bookmarkStart w:id="159" w:name="reports-generated"/>
+    <w:bookmarkEnd w:id="157"/>
+    <w:bookmarkStart w:id="158" w:name="reports-generated"/>
     <w:p>
       <w:pPr>
         <w:pStyle w:val="Heading3"/>
@@ -21447,86 +21429,86 @@
         <w:t xml:space="preserve">class in the Android framework, so the feature adds no third-party dependency and no cost.</w:t>
       </w:r>
     </w:p>
+    <w:bookmarkEnd w:id="158"/>
+    <w:bookmarkStart w:id="159" w:name="screenshots"/>
+    <w:p>
+      <w:pPr>
+        <w:pStyle w:val="Heading3"/>
+      </w:pPr>
+      <w:r>
+        <w:t xml:space="preserve">Screenshots</w:t>
+      </w:r>
+    </w:p>
+    <w:p>
+      <w:pPr>
+        <w:pStyle w:val="FirstParagraph"/>
+      </w:pPr>
+      <w:r>
+        <w:t xml:space="preserve">System screenshots are presented in Appendix G.</w:t>
+      </w:r>
+    </w:p>
+    <w:p>
+      <w:r>
+        <w:br w:type="page"/>
+      </w:r>
+    </w:p>
     <w:bookmarkEnd w:id="159"/>
-    <w:bookmarkStart w:id="160" w:name="screenshots"/>
-    <w:p>
-      <w:pPr>
-        <w:pStyle w:val="Heading3"/>
-      </w:pPr>
-      <w:r>
-        <w:t xml:space="preserve">Screenshots</w:t>
-      </w:r>
-    </w:p>
-    <w:p>
-      <w:pPr>
-        <w:pStyle w:val="FirstParagraph"/>
-      </w:pPr>
-      <w:r>
-        <w:t xml:space="preserve">System screenshots are presented in Appendix G.</w:t>
-      </w:r>
-    </w:p>
-    <w:p>
-      <w:r>
-        <w:br w:type="page"/>
-      </w:r>
-    </w:p>
     <w:bookmarkEnd w:id="160"/>
     <w:bookmarkEnd w:id="161"/>
+    <w:bookmarkStart w:id="162" w:name="chapter-5"/>
+    <w:p>
+      <w:pPr>
+        <w:pStyle w:val="Heading1"/>
+      </w:pPr>
+      <w:r>
+        <w:t xml:space="preserve">Chapter 5</w:t>
+      </w:r>
+    </w:p>
     <w:bookmarkEnd w:id="162"/>
-    <w:bookmarkStart w:id="163" w:name="chapter-5"/>
+    <w:bookmarkStart w:id="166" w:name="summary-conclusions-and-recommendations"/>
     <w:p>
       <w:pPr>
         <w:pStyle w:val="Heading1"/>
       </w:pPr>
       <w:r>
-        <w:t xml:space="preserve">Chapter 5</w:t>
+        <w:t xml:space="preserve">SUMMARY, CONCLUSIONS AND RECOMMENDATIONS</w:t>
+      </w:r>
+    </w:p>
+    <w:bookmarkStart w:id="163" w:name="conclusions"/>
+    <w:p>
+      <w:pPr>
+        <w:pStyle w:val="Heading2"/>
+      </w:pPr>
+      <w:r>
+        <w:t xml:space="preserve">5.1 Conclusions</w:t>
+      </w:r>
+    </w:p>
+    <w:p>
+      <w:pPr>
+        <w:pStyle w:val="FirstParagraph"/>
+      </w:pPr>
+      <w:r>
+        <w:t xml:space="preserve">Two conclusions can be stated independently of the evaluation results, because they rest on what was built rather than on how it was received.</w:t>
+      </w:r>
+    </w:p>
+    <w:p>
+      <w:pPr>
+        <w:pStyle w:val="BodyText"/>
+      </w:pPr>
+      <w:r>
+        <w:t xml:space="preserve">First, an ordinance-fixed fare regime can be represented faithfully in a ride-hailing application. The reviewed literature describes systems that price by distance, time, or demand, none of which is lawful where a municipal ordinance fixes the price per destination. Implementing the published schedule as a maintainable data table, with statutory minimums and a discounted rate column, demonstrates that a digital platform can operate inside such a regime rather than around it.</w:t>
+      </w:r>
+    </w:p>
+    <w:p>
+      <w:pPr>
+        <w:pStyle w:val="BodyText"/>
+      </w:pPr>
+      <w:r>
+        <w:t xml:space="preserve">Second, transcription of a physically posted fare schedule is a data quality problem that must be handled explicitly. Of the 241 rows on the posted sheet, forty-six could not be read with full confidence and three carried no usable rate. Designing the system to flag the former and disable the latter, rather than to accept every transcribed number, means that uncertainty in the source data does not become a wrong fare charged to a passenger.</w:t>
       </w:r>
     </w:p>
     <w:bookmarkEnd w:id="163"/>
-    <w:bookmarkStart w:id="167" w:name="summary-conclusions-and-recommendations"/>
-    <w:p>
-      <w:pPr>
-        <w:pStyle w:val="Heading1"/>
-      </w:pPr>
-      <w:r>
-        <w:t xml:space="preserve">SUMMARY, CONCLUSIONS AND RECOMMENDATIONS</w:t>
-      </w:r>
-    </w:p>
-    <w:bookmarkStart w:id="164" w:name="conclusions"/>
-    <w:p>
-      <w:pPr>
-        <w:pStyle w:val="Heading2"/>
-      </w:pPr>
-      <w:r>
-        <w:t xml:space="preserve">5.1 Conclusions</w:t>
-      </w:r>
-    </w:p>
-    <w:p>
-      <w:pPr>
-        <w:pStyle w:val="FirstParagraph"/>
-      </w:pPr>
-      <w:r>
-        <w:t xml:space="preserve">Two conclusions can be stated independently of the evaluation results, because they rest on what was built rather than on how it was received.</w:t>
-      </w:r>
-    </w:p>
-    <w:p>
-      <w:pPr>
-        <w:pStyle w:val="BodyText"/>
-      </w:pPr>
-      <w:r>
-        <w:t xml:space="preserve">First, an ordinance-fixed fare regime can be represented faithfully in a ride-hailing application. The reviewed literature describes systems that price by distance, time, or demand, none of which is lawful where a municipal ordinance fixes the price per destination. Implementing the published schedule as a maintainable data table, with statutory minimums and a discounted rate column, demonstrates that a digital platform can operate inside such a regime rather than around it.</w:t>
-      </w:r>
-    </w:p>
-    <w:p>
-      <w:pPr>
-        <w:pStyle w:val="BodyText"/>
-      </w:pPr>
-      <w:r>
-        <w:t xml:space="preserve">Second, transcription of a physically posted fare schedule is a data quality problem that must be handled explicitly. Of the 241 rows on the posted sheet, forty-six could not be read with full confidence and three carried no usable rate. Designing the system to flag the former and disable the latter, rather than to accept every transcribed number, means that uncertainty in the source data does not become a wrong fare charged to a passenger.</w:t>
-      </w:r>
-    </w:p>
-    <w:bookmarkEnd w:id="164"/>
-    <w:bookmarkStart w:id="165" w:name="recommendations"/>
+    <w:bookmarkStart w:id="164" w:name="recommendations"/>
     <w:p>
       <w:pPr>
         <w:pStyle w:val="Heading2"/>
@@ -21633,8 +21615,8 @@
         <w:t xml:space="preserve">Conduct the evaluation over a longer period than a capstone timeline usually permits. Adoption of a transportation platform is not immediate, and a short evaluation window measures first impressions rather than sustained use. Where possible, collect objective measures of waiting time before and after deployment alongside the perceptual measures the questionnaire provides, since objectives four and five concern actual reductions in waiting and idle time and a Likert scale can only report whether users believe those reductions occurred.</w:t>
       </w:r>
     </w:p>
-    <w:bookmarkEnd w:id="165"/>
-    <w:bookmarkStart w:id="166" w:name="future-enhancements"/>
+    <w:bookmarkEnd w:id="164"/>
+    <w:bookmarkStart w:id="165" w:name="future-enhancements"/>
     <w:p>
       <w:pPr>
         <w:pStyle w:val="Heading2"/>
@@ -21872,9 +21854,9 @@
         <w:br w:type="page"/>
       </w:r>
     </w:p>
+    <w:bookmarkEnd w:id="165"/>
     <w:bookmarkEnd w:id="166"/>
-    <w:bookmarkEnd w:id="167"/>
-    <w:bookmarkStart w:id="168" w:name="references"/>
+    <w:bookmarkStart w:id="167" w:name="references"/>
     <w:p>
       <w:pPr>
         <w:pStyle w:val="Heading1"/>
@@ -22164,7 +22146,7 @@
         <w:pStyle w:val="BodyText"/>
       </w:pPr>
       <w:r>
-        <w:t xml:space="preserve">Rogers, E. M. (2003).</w:t>
+        <w:t xml:space="preserve">Wang, H., Zhang, J., &amp; Li, Q. (2022). Intelligent transportation systems and smart mobility solutions for urban transportation management.</w:t>
       </w:r>
       <w:r>
         <w:t xml:space="preserve"> </w:t>
@@ -22174,21 +22156,18 @@
           <w:iCs/>
           <w:i/>
         </w:rPr>
-        <w:t xml:space="preserve">Diffusion of innovations</w:t>
-      </w:r>
-      <w:r>
-        <w:t xml:space="preserve"> </w:t>
-      </w:r>
-      <w:r>
-        <w:t xml:space="preserve">(5th ed.). Free Press.</w:t>
-      </w:r>
-    </w:p>
-    <w:p>
-      <w:pPr>
-        <w:pStyle w:val="BodyText"/>
-      </w:pPr>
-      <w:r>
-        <w:t xml:space="preserve">Wang, H., Zhang, J., &amp; Li, Q. (2022). Intelligent transportation systems and smart mobility solutions for urban transportation management.</w:t>
+        <w:t xml:space="preserve">IEEE Access, 10</w:t>
+      </w:r>
+      <w:r>
+        <w:t xml:space="preserve">, 49792–49805. https://doi.org/10.1109/ACCESS.2022.3172017</w:t>
+      </w:r>
+    </w:p>
+    <w:p>
+      <w:pPr>
+        <w:pStyle w:val="BodyText"/>
+      </w:pPr>
+      <w:r>
+        <w:t xml:space="preserve">Zhang, L., Li, Y., &amp; Chen, X. (2021). Development of mobile ride-hailing platforms and their impact on urban mobility.</w:t>
       </w:r>
       <w:r>
         <w:t xml:space="preserve"> </w:t>
@@ -22198,27 +22177,6 @@
           <w:iCs/>
           <w:i/>
         </w:rPr>
-        <w:t xml:space="preserve">IEEE Access, 10</w:t>
-      </w:r>
-      <w:r>
-        <w:t xml:space="preserve">, 49792–49805. https://doi.org/10.1109/ACCESS.2022.3172017</w:t>
-      </w:r>
-    </w:p>
-    <w:p>
-      <w:pPr>
-        <w:pStyle w:val="BodyText"/>
-      </w:pPr>
-      <w:r>
-        <w:t xml:space="preserve">Zhang, L., Li, Y., &amp; Chen, X. (2021). Development of mobile ride-hailing platforms and their impact on urban mobility.</w:t>
-      </w:r>
-      <w:r>
-        <w:t xml:space="preserve"> </w:t>
-      </w:r>
-      <w:r>
-        <w:rPr>
-          <w:iCs/>
-          <w:i/>
-        </w:rPr>
         <w:t xml:space="preserve">Journal of Transportation Technologies, 11</w:t>
       </w:r>
       <w:r>
@@ -22230,8 +22188,8 @@
         <w:br w:type="page"/>
       </w:r>
     </w:p>
-    <w:bookmarkEnd w:id="168"/>
-    <w:bookmarkStart w:id="223" w:name="appendices"/>
+    <w:bookmarkEnd w:id="167"/>
+    <w:bookmarkStart w:id="222" w:name="appendices"/>
     <w:p>
       <w:pPr>
         <w:pStyle w:val="Heading1"/>
@@ -22240,7 +22198,7 @@
         <w:t xml:space="preserve">APPENDICES</w:t>
       </w:r>
     </w:p>
-    <w:bookmarkStart w:id="169" w:name="appendix-a-research-instruments"/>
+    <w:bookmarkStart w:id="168" w:name="appendix-a-research-instruments"/>
     <w:p>
       <w:pPr>
         <w:pStyle w:val="Heading2"/>
@@ -22511,8 +22469,8 @@
         <w:br w:type="page"/>
       </w:r>
     </w:p>
-    <w:bookmarkEnd w:id="169"/>
-    <w:bookmarkStart w:id="170" w:name="appendix-b-letter-of-permission"/>
+    <w:bookmarkEnd w:id="168"/>
+    <w:bookmarkStart w:id="169" w:name="appendix-b-letter-of-permission"/>
     <w:p>
       <w:pPr>
         <w:pStyle w:val="Heading2"/>
@@ -22563,8 +22521,8 @@
         <w:t xml:space="preserve">, requesting permission to conduct the study among member drivers, to administer the questionnaires, to deploy the application to driver respondents, and to reproduce the association’s published fare schedule within the application.</w:t>
       </w:r>
     </w:p>
-    <w:bookmarkEnd w:id="170"/>
-    <w:bookmarkStart w:id="173" w:name="appendix-c-survey-questionnaire"/>
+    <w:bookmarkEnd w:id="169"/>
+    <w:bookmarkStart w:id="172" w:name="appendix-c-survey-questionnaire"/>
     <w:p>
       <w:pPr>
         <w:pStyle w:val="Heading2"/>
@@ -22889,7 +22847,7 @@
         </w:tc>
       </w:tr>
     </w:tbl>
-    <w:bookmarkStart w:id="171" w:name="i-for-passengers-students"/>
+    <w:bookmarkStart w:id="170" w:name="i-for-passengers-students"/>
     <w:p>
       <w:pPr>
         <w:pStyle w:val="Heading3"/>
@@ -24801,8 +24759,8 @@
         <w:br w:type="page"/>
       </w:r>
     </w:p>
-    <w:bookmarkEnd w:id="171"/>
-    <w:bookmarkStart w:id="172" w:name="ii-for-tricycle-drivers"/>
+    <w:bookmarkEnd w:id="170"/>
+    <w:bookmarkStart w:id="171" w:name="ii-for-tricycle-drivers"/>
     <w:p>
       <w:pPr>
         <w:pStyle w:val="Heading3"/>
@@ -26714,9 +26672,9 @@
         <w:br w:type="page"/>
       </w:r>
     </w:p>
+    <w:bookmarkEnd w:id="171"/>
     <w:bookmarkEnd w:id="172"/>
-    <w:bookmarkEnd w:id="173"/>
-    <w:bookmarkStart w:id="178" w:name="Xa0f1431884eca17d668bc46bc3532e12d11e1c0"/>
+    <w:bookmarkStart w:id="177" w:name="Xa0f1431884eca17d668bc46bc3532e12d11e1c0"/>
     <w:p>
       <w:pPr>
         <w:pStyle w:val="Heading2"/>
@@ -26815,7 +26773,7 @@
         <w:br w:type="page"/>
       </w:r>
     </w:p>
-    <w:bookmarkStart w:id="174" w:name="d.1-terms-and-conditions"/>
+    <w:bookmarkStart w:id="173" w:name="d.1-terms-and-conditions"/>
     <w:p>
       <w:pPr>
         <w:pStyle w:val="Heading3"/>
@@ -27179,8 +27137,8 @@
         <w:br w:type="page"/>
       </w:r>
     </w:p>
-    <w:bookmarkEnd w:id="174"/>
-    <w:bookmarkStart w:id="175" w:name="d.2-privacy-policy"/>
+    <w:bookmarkEnd w:id="173"/>
+    <w:bookmarkStart w:id="174" w:name="d.2-privacy-policy"/>
     <w:p>
       <w:pPr>
         <w:pStyle w:val="Heading3"/>
@@ -27434,8 +27392,8 @@
         <w:br w:type="page"/>
       </w:r>
     </w:p>
-    <w:bookmarkEnd w:id="175"/>
-    <w:bookmarkStart w:id="176" w:name="d.3-safety-and-community-guidelines"/>
+    <w:bookmarkEnd w:id="174"/>
+    <w:bookmarkStart w:id="175" w:name="d.3-safety-and-community-guidelines"/>
     <w:p>
       <w:pPr>
         <w:pStyle w:val="Heading3"/>
@@ -27867,8 +27825,8 @@
         <w:br w:type="page"/>
       </w:r>
     </w:p>
-    <w:bookmarkEnd w:id="176"/>
-    <w:bookmarkStart w:id="177" w:name="d.4-driver-agreement"/>
+    <w:bookmarkEnd w:id="175"/>
+    <w:bookmarkStart w:id="176" w:name="d.4-driver-agreement"/>
     <w:p>
       <w:pPr>
         <w:pStyle w:val="Heading3"/>
@@ -28220,9 +28178,9 @@
         <w:br w:type="page"/>
       </w:r>
     </w:p>
+    <w:bookmarkEnd w:id="176"/>
     <w:bookmarkEnd w:id="177"/>
-    <w:bookmarkEnd w:id="178"/>
-    <w:bookmarkStart w:id="179" w:name="appendix-e-interview-guide"/>
+    <w:bookmarkStart w:id="178" w:name="appendix-e-interview-guide"/>
     <w:p>
       <w:pPr>
         <w:pStyle w:val="Heading2"/>
@@ -28431,26 +28389,26 @@
         <w:t xml:space="preserve">What would make you go back to hailing at the roadside instead of using the application?</w:t>
       </w:r>
     </w:p>
+    <w:bookmarkEnd w:id="178"/>
+    <w:bookmarkStart w:id="179" w:name="appendix-f-evaluation-forms"/>
+    <w:p>
+      <w:pPr>
+        <w:pStyle w:val="Heading2"/>
+      </w:pPr>
+      <w:r>
+        <w:t xml:space="preserve">Appendix F — Evaluation Forms</w:t>
+      </w:r>
+    </w:p>
+    <w:p>
+      <w:pPr>
+        <w:pStyle w:val="FirstParagraph"/>
+      </w:pPr>
+      <w:r>
+        <w:t xml:space="preserve">The evaluation form administered to respondents is the System Evaluation Questionnaire reproduced as Appendix C. The content validation form completed by the research adviser and subject matter experts, and the pilot test feedback form, are to be inserted here as signed copies.</w:t>
+      </w:r>
+    </w:p>
     <w:bookmarkEnd w:id="179"/>
-    <w:bookmarkStart w:id="180" w:name="appendix-f-evaluation-forms"/>
-    <w:p>
-      <w:pPr>
-        <w:pStyle w:val="Heading2"/>
-      </w:pPr>
-      <w:r>
-        <w:t xml:space="preserve">Appendix F — Evaluation Forms</w:t>
-      </w:r>
-    </w:p>
-    <w:p>
-      <w:pPr>
-        <w:pStyle w:val="FirstParagraph"/>
-      </w:pPr>
-      <w:r>
-        <w:t xml:space="preserve">The evaluation form administered to respondents is the System Evaluation Questionnaire reproduced as Appendix C. The content validation form completed by the research adviser and subject matter experts, and the pilot test feedback form, are to be inserted here as signed copies.</w:t>
-      </w:r>
-    </w:p>
-    <w:bookmarkEnd w:id="180"/>
-    <w:bookmarkStart w:id="181" w:name="appendix-g-system-screenshots"/>
+    <w:bookmarkStart w:id="180" w:name="appendix-g-system-screenshots"/>
     <w:p>
       <w:pPr>
         <w:pStyle w:val="Heading2"/>
@@ -28807,8 +28765,8 @@
         <w:t xml:space="preserve">Dark theme, any two screens</w:t>
       </w:r>
     </w:p>
-    <w:bookmarkEnd w:id="181"/>
-    <w:bookmarkStart w:id="208" w:name="appendix-h-user-manual"/>
+    <w:bookmarkEnd w:id="180"/>
+    <w:bookmarkStart w:id="207" w:name="appendix-h-user-manual"/>
     <w:p>
       <w:pPr>
         <w:pStyle w:val="Heading2"/>
@@ -28874,7 +28832,7 @@
         <w:br w:type="page"/>
       </w:r>
     </w:p>
-    <w:bookmarkStart w:id="182" w:name="part-1-installing-the-app"/>
+    <w:bookmarkStart w:id="181" w:name="part-1-installing-the-app"/>
     <w:p>
       <w:pPr>
         <w:pStyle w:val="Heading3"/>
@@ -29062,41 +29020,41 @@
         <w:br w:type="page"/>
       </w:r>
     </w:p>
+    <w:bookmarkEnd w:id="181"/>
+    <w:bookmarkStart w:id="193" w:name="part-2-for-passengers"/>
+    <w:p>
+      <w:pPr>
+        <w:pStyle w:val="Heading3"/>
+      </w:pPr>
+      <w:r>
+        <w:t xml:space="preserve">Part 2 — For passengers</w:t>
+      </w:r>
+    </w:p>
+    <w:bookmarkStart w:id="182" w:name="first-launch"/>
+    <w:p>
+      <w:pPr>
+        <w:pStyle w:val="Heading4"/>
+      </w:pPr>
+      <w:r>
+        <w:t xml:space="preserve">2.1 First launch</w:t>
+      </w:r>
+    </w:p>
+    <w:p>
+      <w:pPr>
+        <w:pStyle w:val="FirstParagraph"/>
+      </w:pPr>
+      <w:r>
+        <w:t xml:space="preserve">Five introductory slides appear the first time the app opens. They are shown once. Swipe</w:t>
+      </w:r>
+      <w:r>
+        <w:t xml:space="preserve"> </w:t>
+      </w:r>
+      <w:r>
+        <w:t xml:space="preserve">through or skip.</w:t>
+      </w:r>
+    </w:p>
     <w:bookmarkEnd w:id="182"/>
-    <w:bookmarkStart w:id="194" w:name="part-2-for-passengers"/>
-    <w:p>
-      <w:pPr>
-        <w:pStyle w:val="Heading3"/>
-      </w:pPr>
-      <w:r>
-        <w:t xml:space="preserve">Part 2 — For passengers</w:t>
-      </w:r>
-    </w:p>
-    <w:bookmarkStart w:id="183" w:name="first-launch"/>
-    <w:p>
-      <w:pPr>
-        <w:pStyle w:val="Heading4"/>
-      </w:pPr>
-      <w:r>
-        <w:t xml:space="preserve">2.1 First launch</w:t>
-      </w:r>
-    </w:p>
-    <w:p>
-      <w:pPr>
-        <w:pStyle w:val="FirstParagraph"/>
-      </w:pPr>
-      <w:r>
-        <w:t xml:space="preserve">Five introductory slides appear the first time the app opens. They are shown once. Swipe</w:t>
-      </w:r>
-      <w:r>
-        <w:t xml:space="preserve"> </w:t>
-      </w:r>
-      <w:r>
-        <w:t xml:space="preserve">through or skip.</w:t>
-      </w:r>
-    </w:p>
-    <w:bookmarkEnd w:id="183"/>
-    <w:bookmarkStart w:id="184" w:name="creating-an-account"/>
+    <w:bookmarkStart w:id="183" w:name="creating-an-account"/>
     <w:p>
       <w:pPr>
         <w:pStyle w:val="Heading4"/>
@@ -29498,8 +29456,8 @@
         <w:t xml:space="preserve">, and the account is created.</w:t>
       </w:r>
     </w:p>
-    <w:bookmarkEnd w:id="184"/>
-    <w:bookmarkStart w:id="185" w:name="signing-in"/>
+    <w:bookmarkEnd w:id="183"/>
+    <w:bookmarkStart w:id="184" w:name="signing-in"/>
     <w:p>
       <w:pPr>
         <w:pStyle w:val="Heading4"/>
@@ -29621,44 +29579,44 @@
         <w:t xml:space="preserve">with, because for privacy the app gives the same reply whether or not an account exists.</w:t>
       </w:r>
     </w:p>
+    <w:bookmarkEnd w:id="184"/>
+    <w:bookmarkStart w:id="185" w:name="agreeing-to-the-documents"/>
+    <w:p>
+      <w:pPr>
+        <w:pStyle w:val="Heading4"/>
+      </w:pPr>
+      <w:r>
+        <w:t xml:space="preserve">2.4 Agreeing to the documents</w:t>
+      </w:r>
+    </w:p>
+    <w:p>
+      <w:pPr>
+        <w:pStyle w:val="FirstParagraph"/>
+      </w:pPr>
+      <w:r>
+        <w:t xml:space="preserve">If the documents have been revised since you last accepted them, a screen appears between</w:t>
+      </w:r>
+      <w:r>
+        <w:t xml:space="preserve"> </w:t>
+      </w:r>
+      <w:r>
+        <w:t xml:space="preserve">signing in and your dashboard. Each document has to be ticked separately. The only</w:t>
+      </w:r>
+      <w:r>
+        <w:t xml:space="preserve"> </w:t>
+      </w:r>
+      <w:r>
+        <w:t xml:space="preserve">alternative is signing out. This also happens the first time an older account opens a</w:t>
+      </w:r>
+      <w:r>
+        <w:t xml:space="preserve"> </w:t>
+      </w:r>
+      <w:r>
+        <w:t xml:space="preserve">version of the app that records consent.</w:t>
+      </w:r>
+    </w:p>
     <w:bookmarkEnd w:id="185"/>
-    <w:bookmarkStart w:id="186" w:name="agreeing-to-the-documents"/>
-    <w:p>
-      <w:pPr>
-        <w:pStyle w:val="Heading4"/>
-      </w:pPr>
-      <w:r>
-        <w:t xml:space="preserve">2.4 Agreeing to the documents</w:t>
-      </w:r>
-    </w:p>
-    <w:p>
-      <w:pPr>
-        <w:pStyle w:val="FirstParagraph"/>
-      </w:pPr>
-      <w:r>
-        <w:t xml:space="preserve">If the documents have been revised since you last accepted them, a screen appears between</w:t>
-      </w:r>
-      <w:r>
-        <w:t xml:space="preserve"> </w:t>
-      </w:r>
-      <w:r>
-        <w:t xml:space="preserve">signing in and your dashboard. Each document has to be ticked separately. The only</w:t>
-      </w:r>
-      <w:r>
-        <w:t xml:space="preserve"> </w:t>
-      </w:r>
-      <w:r>
-        <w:t xml:space="preserve">alternative is signing out. This also happens the first time an older account opens a</w:t>
-      </w:r>
-      <w:r>
-        <w:t xml:space="preserve"> </w:t>
-      </w:r>
-      <w:r>
-        <w:t xml:space="preserve">version of the app that records consent.</w:t>
-      </w:r>
-    </w:p>
-    <w:bookmarkEnd w:id="186"/>
-    <w:bookmarkStart w:id="187" w:name="the-dashboard"/>
+    <w:bookmarkStart w:id="186" w:name="the-dashboard"/>
     <w:p>
       <w:pPr>
         <w:pStyle w:val="Heading4"/>
@@ -29733,8 +29691,8 @@
         <w:t xml:space="preserve">the top right opens your notifications and carries a count of the unread ones.</w:t>
       </w:r>
     </w:p>
-    <w:bookmarkEnd w:id="187"/>
-    <w:bookmarkStart w:id="188" w:name="booking-a-ride"/>
+    <w:bookmarkEnd w:id="186"/>
+    <w:bookmarkStart w:id="187" w:name="booking-a-ride"/>
     <w:p>
       <w:pPr>
         <w:pStyle w:val="Heading4"/>
@@ -30182,8 +30140,8 @@
         <w:t xml:space="preserve">pay, in cash, directly to the driver.</w:t>
       </w:r>
     </w:p>
-    <w:bookmarkEnd w:id="188"/>
-    <w:bookmarkStart w:id="189" w:name="waiting-for-a-driver"/>
+    <w:bookmarkEnd w:id="187"/>
+    <w:bookmarkStart w:id="188" w:name="waiting-for-a-driver"/>
     <w:p>
       <w:pPr>
         <w:pStyle w:val="Heading4"/>
@@ -30250,8 +30208,8 @@
         <w:t xml:space="preserve">broken.</w:t>
       </w:r>
     </w:p>
-    <w:bookmarkEnd w:id="189"/>
-    <w:bookmarkStart w:id="190" w:name="during-the-ride"/>
+    <w:bookmarkEnd w:id="188"/>
+    <w:bookmarkStart w:id="189" w:name="during-the-ride"/>
     <w:p>
       <w:pPr>
         <w:pStyle w:val="Heading4"/>
@@ -30378,8 +30336,8 @@
         <w:t xml:space="preserve">with the app open, their position moves on the map.</w:t>
       </w:r>
     </w:p>
-    <w:bookmarkEnd w:id="190"/>
-    <w:bookmarkStart w:id="191" w:name="rating-and-history"/>
+    <w:bookmarkEnd w:id="189"/>
+    <w:bookmarkStart w:id="190" w:name="rating-and-history"/>
     <w:p>
       <w:pPr>
         <w:pStyle w:val="Heading4"/>
@@ -30442,8 +30400,8 @@
         <w:t xml:space="preserve">lists your past rides, most recent first, with the fare and how each ended.</w:t>
       </w:r>
     </w:p>
-    <w:bookmarkEnd w:id="191"/>
-    <w:bookmarkStart w:id="192" w:name="reporting-a-concern"/>
+    <w:bookmarkEnd w:id="190"/>
+    <w:bookmarkStart w:id="191" w:name="reporting-a-concern"/>
     <w:p>
       <w:pPr>
         <w:pStyle w:val="Heading4"/>
@@ -30531,8 +30489,8 @@
         <w:t xml:space="preserve">hotline, not the app, for anything urgent.</w:t>
       </w:r>
     </w:p>
-    <w:bookmarkEnd w:id="192"/>
-    <w:bookmarkStart w:id="193" w:name="your-profile"/>
+    <w:bookmarkEnd w:id="191"/>
+    <w:bookmarkStart w:id="192" w:name="your-profile"/>
     <w:p>
       <w:pPr>
         <w:pStyle w:val="Heading4"/>
@@ -30670,9 +30628,9 @@
         <w:br w:type="page"/>
       </w:r>
     </w:p>
+    <w:bookmarkEnd w:id="192"/>
     <w:bookmarkEnd w:id="193"/>
-    <w:bookmarkEnd w:id="194"/>
-    <w:bookmarkStart w:id="201" w:name="part-3-for-drivers"/>
+    <w:bookmarkStart w:id="200" w:name="part-3-for-drivers"/>
     <w:p>
       <w:pPr>
         <w:pStyle w:val="Heading3"/>
@@ -30681,7 +30639,7 @@
         <w:t xml:space="preserve">Part 3 — For drivers</w:t>
       </w:r>
     </w:p>
-    <w:bookmarkStart w:id="195" w:name="registering"/>
+    <w:bookmarkStart w:id="194" w:name="registering"/>
     <w:p>
       <w:pPr>
         <w:pStyle w:val="Heading4"/>
@@ -30887,90 +30845,90 @@
         <w:t xml:space="preserve">.</w:t>
       </w:r>
     </w:p>
+    <w:bookmarkEnd w:id="194"/>
+    <w:bookmarkStart w:id="195" w:name="the-licence-photograph"/>
+    <w:p>
+      <w:pPr>
+        <w:pStyle w:val="Heading4"/>
+      </w:pPr>
+      <w:r>
+        <w:t xml:space="preserve">3.2 The licence photograph</w:t>
+      </w:r>
+    </w:p>
+    <w:p>
+      <w:pPr>
+        <w:pStyle w:val="FirstParagraph"/>
+      </w:pPr>
+      <w:r>
+        <w:t xml:space="preserve">A card on your dashboard asks for a photograph of your licence. Take one, or choose one</w:t>
+      </w:r>
+      <w:r>
+        <w:t xml:space="preserve"> </w:t>
+      </w:r>
+      <w:r>
+        <w:t xml:space="preserve">from your gallery, and read the consent step before sending it: it names what the</w:t>
+      </w:r>
+      <w:r>
+        <w:t xml:space="preserve"> </w:t>
+      </w:r>
+      <w:r>
+        <w:t xml:space="preserve">photograph is for, who can see it, and when it is destroyed. You send it only after</w:t>
+      </w:r>
+      <w:r>
+        <w:t xml:space="preserve"> </w:t>
+      </w:r>
+      <w:r>
+        <w:t xml:space="preserve">agreeing to that specifically.</w:t>
+      </w:r>
+    </w:p>
+    <w:p>
+      <w:pPr>
+        <w:pStyle w:val="BodyText"/>
+      </w:pPr>
+      <w:r>
+        <w:t xml:space="preserve">What happens to it, in short: only you and an administrator can ever see it; it is never</w:t>
+      </w:r>
+      <w:r>
+        <w:t xml:space="preserve"> </w:t>
+      </w:r>
+      <w:r>
+        <w:t xml:space="preserve">shown to a passenger and never appears in a report. If your application is refused it is</w:t>
+      </w:r>
+      <w:r>
+        <w:t xml:space="preserve"> </w:t>
+      </w:r>
+      <w:r>
+        <w:t xml:space="preserve">deleted at that moment. If you are approved it stays while your account is active, because</w:t>
+      </w:r>
+      <w:r>
+        <w:t xml:space="preserve"> </w:t>
+      </w:r>
+      <w:r>
+        <w:t xml:space="preserve">it is needed again when your licence expires. You can remove it yourself at any time from</w:t>
+      </w:r>
+      <w:r>
+        <w:t xml:space="preserve"> </w:t>
+      </w:r>
+      <w:r>
+        <w:t xml:space="preserve">your Profile tab, though without one on file you cannot be approved to carry passengers.</w:t>
+      </w:r>
+      <w:r>
+        <w:t xml:space="preserve"> </w:t>
+      </w:r>
+      <w:r>
+        <w:t xml:space="preserve">Section 9 of the Privacy Policy sets this out in full.</w:t>
+      </w:r>
+    </w:p>
+    <w:p>
+      <w:pPr>
+        <w:pStyle w:val="BodyText"/>
+      </w:pPr>
+      <w:r>
+        <w:t xml:space="preserve">Once the photograph has been sent, the card moves off the dashboard and lives in Profile.</w:t>
+      </w:r>
+    </w:p>
     <w:bookmarkEnd w:id="195"/>
-    <w:bookmarkStart w:id="196" w:name="the-licence-photograph"/>
-    <w:p>
-      <w:pPr>
-        <w:pStyle w:val="Heading4"/>
-      </w:pPr>
-      <w:r>
-        <w:t xml:space="preserve">3.2 The licence photograph</w:t>
-      </w:r>
-    </w:p>
-    <w:p>
-      <w:pPr>
-        <w:pStyle w:val="FirstParagraph"/>
-      </w:pPr>
-      <w:r>
-        <w:t xml:space="preserve">A card on your dashboard asks for a photograph of your licence. Take one, or choose one</w:t>
-      </w:r>
-      <w:r>
-        <w:t xml:space="preserve"> </w:t>
-      </w:r>
-      <w:r>
-        <w:t xml:space="preserve">from your gallery, and read the consent step before sending it: it names what the</w:t>
-      </w:r>
-      <w:r>
-        <w:t xml:space="preserve"> </w:t>
-      </w:r>
-      <w:r>
-        <w:t xml:space="preserve">photograph is for, who can see it, and when it is destroyed. You send it only after</w:t>
-      </w:r>
-      <w:r>
-        <w:t xml:space="preserve"> </w:t>
-      </w:r>
-      <w:r>
-        <w:t xml:space="preserve">agreeing to that specifically.</w:t>
-      </w:r>
-    </w:p>
-    <w:p>
-      <w:pPr>
-        <w:pStyle w:val="BodyText"/>
-      </w:pPr>
-      <w:r>
-        <w:t xml:space="preserve">What happens to it, in short: only you and an administrator can ever see it; it is never</w:t>
-      </w:r>
-      <w:r>
-        <w:t xml:space="preserve"> </w:t>
-      </w:r>
-      <w:r>
-        <w:t xml:space="preserve">shown to a passenger and never appears in a report. If your application is refused it is</w:t>
-      </w:r>
-      <w:r>
-        <w:t xml:space="preserve"> </w:t>
-      </w:r>
-      <w:r>
-        <w:t xml:space="preserve">deleted at that moment. If you are approved it stays while your account is active, because</w:t>
-      </w:r>
-      <w:r>
-        <w:t xml:space="preserve"> </w:t>
-      </w:r>
-      <w:r>
-        <w:t xml:space="preserve">it is needed again when your licence expires. You can remove it yourself at any time from</w:t>
-      </w:r>
-      <w:r>
-        <w:t xml:space="preserve"> </w:t>
-      </w:r>
-      <w:r>
-        <w:t xml:space="preserve">your Profile tab, though without one on file you cannot be approved to carry passengers.</w:t>
-      </w:r>
-      <w:r>
-        <w:t xml:space="preserve"> </w:t>
-      </w:r>
-      <w:r>
-        <w:t xml:space="preserve">Section 9 of the Privacy Policy sets this out in full.</w:t>
-      </w:r>
-    </w:p>
-    <w:p>
-      <w:pPr>
-        <w:pStyle w:val="BodyText"/>
-      </w:pPr>
-      <w:r>
-        <w:t xml:space="preserve">Once the photograph has been sent, the card moves off the dashboard and lives in Profile.</w:t>
-      </w:r>
-    </w:p>
-    <w:bookmarkEnd w:id="196"/>
-    <w:bookmarkStart w:id="197" w:name="while-you-wait-for-verification"/>
+    <w:bookmarkStart w:id="196" w:name="while-you-wait-for-verification"/>
     <w:p>
       <w:pPr>
         <w:pStyle w:val="Heading4"/>
@@ -31018,8 +30976,8 @@
         <w:t xml:space="preserve">photograph is deleted along with the refusal.</w:t>
       </w:r>
     </w:p>
-    <w:bookmarkEnd w:id="197"/>
-    <w:bookmarkStart w:id="198" w:name="going-online"/>
+    <w:bookmarkEnd w:id="196"/>
+    <w:bookmarkStart w:id="197" w:name="going-online"/>
     <w:p>
       <w:pPr>
         <w:pStyle w:val="Heading4"/>
@@ -31097,8 +31055,8 @@
         <w:t xml:space="preserve">open on the way to a pickup.</w:t>
       </w:r>
     </w:p>
-    <w:bookmarkEnd w:id="198"/>
-    <w:bookmarkStart w:id="199" w:name="taking-a-ride"/>
+    <w:bookmarkEnd w:id="197"/>
+    <w:bookmarkStart w:id="198" w:name="taking-a-ride"/>
     <w:p>
       <w:pPr>
         <w:pStyle w:val="Heading4"/>
@@ -31273,8 +31231,8 @@
         <w:t xml:space="preserve">column they chose; it cannot verify anyone is a senior, a PWD or a student.</w:t>
       </w:r>
     </w:p>
-    <w:bookmarkEnd w:id="199"/>
-    <w:bookmarkStart w:id="200" w:name="earnings-history-and-the-rest"/>
+    <w:bookmarkEnd w:id="198"/>
+    <w:bookmarkStart w:id="199" w:name="earnings-history-and-the-rest"/>
     <w:p>
       <w:pPr>
         <w:pStyle w:val="Heading4"/>
@@ -31372,9 +31330,9 @@
         <w:br w:type="page"/>
       </w:r>
     </w:p>
+    <w:bookmarkEnd w:id="199"/>
     <w:bookmarkEnd w:id="200"/>
-    <w:bookmarkEnd w:id="201"/>
-    <w:bookmarkStart w:id="206" w:name="part-4-for-administrators"/>
+    <w:bookmarkStart w:id="205" w:name="part-4-for-administrators"/>
     <w:p>
       <w:pPr>
         <w:pStyle w:val="Heading3"/>
@@ -31506,7 +31464,7 @@
         <w:t xml:space="preserve">.</w:t>
       </w:r>
     </w:p>
-    <w:bookmarkStart w:id="202" w:name="first-run-load-the-fare-table"/>
+    <w:bookmarkStart w:id="201" w:name="first-run-load-the-fare-table"/>
     <w:p>
       <w:pPr>
         <w:pStyle w:val="Heading4"/>
@@ -31715,8 +31673,8 @@
         <w:t xml:space="preserve">. Filling in the common destinations is worth doing.</w:t>
       </w:r>
     </w:p>
-    <w:bookmarkEnd w:id="202"/>
-    <w:bookmarkStart w:id="203" w:name="verifying-drivers"/>
+    <w:bookmarkEnd w:id="201"/>
+    <w:bookmarkStart w:id="202" w:name="verifying-drivers"/>
     <w:p>
       <w:pPr>
         <w:pStyle w:val="Heading4"/>
@@ -31858,8 +31816,8 @@
         <w:t xml:space="preserve">Below the queue is every registered driver with their current state.</w:t>
       </w:r>
     </w:p>
-    <w:bookmarkEnd w:id="203"/>
-    <w:bookmarkStart w:id="204" w:name="concerns"/>
+    <w:bookmarkEnd w:id="202"/>
+    <w:bookmarkStart w:id="203" w:name="concerns"/>
     <w:p>
       <w:pPr>
         <w:pStyle w:val="Heading4"/>
@@ -31945,8 +31903,8 @@
         <w:t xml:space="preserve">Support tab.</w:t>
       </w:r>
     </w:p>
-    <w:bookmarkEnd w:id="204"/>
-    <w:bookmarkStart w:id="205" w:name="monitor"/>
+    <w:bookmarkEnd w:id="203"/>
+    <w:bookmarkStart w:id="204" w:name="monitor"/>
     <w:p>
       <w:pPr>
         <w:pStyle w:val="Heading4"/>
@@ -32293,9 +32251,9 @@
         <w:br w:type="page"/>
       </w:r>
     </w:p>
+    <w:bookmarkEnd w:id="204"/>
     <w:bookmarkEnd w:id="205"/>
-    <w:bookmarkEnd w:id="206"/>
-    <w:bookmarkStart w:id="207" w:name="part-5-when-something-goes-wrong"/>
+    <w:bookmarkStart w:id="206" w:name="part-5-when-something-goes-wrong"/>
     <w:p>
       <w:pPr>
         <w:pStyle w:val="Heading3"/>
@@ -32656,9 +32614,9 @@
         <w:br w:type="page"/>
       </w:r>
     </w:p>
+    <w:bookmarkEnd w:id="206"/>
     <w:bookmarkEnd w:id="207"/>
-    <w:bookmarkEnd w:id="208"/>
-    <w:bookmarkStart w:id="209" w:name="appendix-i-source-code"/>
+    <w:bookmarkStart w:id="208" w:name="appendix-i-source-code"/>
     <w:p>
       <w:pPr>
         <w:pStyle w:val="Heading2"/>
@@ -33513,8 +33471,8 @@
         <w:t xml:space="preserve">}</w:t>
       </w:r>
     </w:p>
-    <w:bookmarkEnd w:id="209"/>
-    <w:bookmarkStart w:id="210" w:name="appendix-j-database-schema"/>
+    <w:bookmarkEnd w:id="208"/>
+    <w:bookmarkStart w:id="209" w:name="appendix-j-database-schema"/>
     <w:p>
       <w:pPr>
         <w:pStyle w:val="Heading2"/>
@@ -34034,8 +33992,8 @@
         </w:tc>
       </w:tr>
     </w:tbl>
-    <w:bookmarkEnd w:id="210"/>
-    <w:bookmarkStart w:id="211" w:name="appendix-k-test-cases"/>
+    <w:bookmarkEnd w:id="209"/>
+    <w:bookmarkStart w:id="210" w:name="appendix-k-test-cases"/>
     <w:p>
       <w:pPr>
         <w:pStyle w:val="Heading2"/>
@@ -34719,8 +34677,8 @@
         </w:tc>
       </w:tr>
     </w:tbl>
-    <w:bookmarkEnd w:id="211"/>
-    <w:bookmarkStart w:id="212" w:name="appendix-l-test-results"/>
+    <w:bookmarkEnd w:id="210"/>
+    <w:bookmarkStart w:id="211" w:name="appendix-l-test-results"/>
     <w:p>
       <w:pPr>
         <w:pStyle w:val="Heading2"/>
@@ -34749,8 +34707,8 @@
         <w:t xml:space="preserve">[The defect log should record, for each defect found: an identifier, the module, a description, the severity, the date found, the resolution, and the date resolved.]</w:t>
       </w:r>
     </w:p>
-    <w:bookmarkEnd w:id="212"/>
-    <w:bookmarkStart w:id="213" w:name="appendix-m-sample-reports"/>
+    <w:bookmarkEnd w:id="211"/>
+    <w:bookmarkStart w:id="212" w:name="appendix-m-sample-reports"/>
     <w:p>
       <w:pPr>
         <w:pStyle w:val="Heading2"/>
@@ -34862,8 +34820,8 @@
         <w:t xml:space="preserve">Estimated fare, Actual fare, Notes</w:t>
       </w:r>
     </w:p>
-    <w:bookmarkEnd w:id="213"/>
-    <w:bookmarkStart w:id="214" w:name="Xc50705ef7a2b355081ea3904d1607e0b082faec"/>
+    <w:bookmarkEnd w:id="212"/>
+    <w:bookmarkStart w:id="213" w:name="Xc50705ef7a2b355081ea3904d1607e0b082faec"/>
     <w:p>
       <w:pPr>
         <w:pStyle w:val="Heading2"/>
@@ -34892,8 +34850,8 @@
         <w:t xml:space="preserve">The following should be documented: the needs assessment administration to students and to drivers; the meeting with officers of the drivers’ association; the photographs of the posted FeTODAT fare sheet from which the fare table was transcribed; the driver orientation session; the evaluation period; and the administration of the evaluation questionnaire.</w:t>
       </w:r>
     </w:p>
-    <w:bookmarkEnd w:id="214"/>
-    <w:bookmarkStart w:id="218" w:name="appendix-o-gantt-chart"/>
+    <w:bookmarkEnd w:id="213"/>
+    <w:bookmarkStart w:id="217" w:name="appendix-o-gantt-chart"/>
     <w:p>
       <w:pPr>
         <w:pStyle w:val="Heading2"/>
@@ -34911,18 +34869,18 @@
           <wp:inline>
             <wp:extent cx="5486400" cy="2674620"/>
             <wp:effectExtent b="0" l="0" r="0" t="0"/>
-            <wp:docPr descr="Figure 14. Gantt Chart of Project Activities" title="" id="216" name="Picture"/>
+            <wp:docPr descr="Figure 14. Gantt Chart of Project Activities" title="" id="215" name="Picture"/>
             <a:graphic>
               <a:graphicData uri="http://schemas.openxmlformats.org/drawingml/2006/picture">
                 <pic:pic>
                   <pic:nvPicPr>
-                    <pic:cNvPr descr="figures/fig14_gantt.png" id="217" name="Picture"/>
+                    <pic:cNvPr descr="figures/fig14_gantt.png" id="216" name="Picture"/>
                     <pic:cNvPicPr>
                       <a:picLocks noChangeArrowheads="1" noChangeAspect="1"/>
                     </pic:cNvPicPr>
                   </pic:nvPicPr>
                   <pic:blipFill>
-                    <a:blip r:embed="rId215"/>
+                    <a:blip r:embed="rId214"/>
                     <a:stretch>
                       <a:fillRect/>
                     </a:stretch>
@@ -34962,8 +34920,8 @@
         <w:br w:type="page"/>
       </w:r>
     </w:p>
-    <w:bookmarkEnd w:id="218"/>
-    <w:bookmarkStart w:id="222" w:name="appendix-p-researchers-biodata"/>
+    <w:bookmarkEnd w:id="217"/>
+    <w:bookmarkStart w:id="221" w:name="appendix-p-researchers-biodata"/>
     <w:p>
       <w:pPr>
         <w:pStyle w:val="Heading2"/>
@@ -34972,7 +34930,7 @@
         <w:t xml:space="preserve">Appendix P — Researchers’ Biodata</w:t>
       </w:r>
     </w:p>
-    <w:bookmarkStart w:id="219" w:name="curriculum-vitae"/>
+    <w:bookmarkStart w:id="218" w:name="curriculum-vitae"/>
     <w:p>
       <w:pPr>
         <w:pStyle w:val="Heading3"/>
@@ -35286,8 +35244,8 @@
         <w:br w:type="page"/>
       </w:r>
     </w:p>
-    <w:bookmarkEnd w:id="219"/>
-    <w:bookmarkStart w:id="220" w:name="curriculum-vitae-1"/>
+    <w:bookmarkEnd w:id="218"/>
+    <w:bookmarkStart w:id="219" w:name="curriculum-vitae-1"/>
     <w:p>
       <w:pPr>
         <w:pStyle w:val="Heading3"/>
@@ -35601,8 +35559,8 @@
         <w:br w:type="page"/>
       </w:r>
     </w:p>
-    <w:bookmarkEnd w:id="220"/>
-    <w:bookmarkStart w:id="221" w:name="curriculum-vitae-2"/>
+    <w:bookmarkEnd w:id="219"/>
+    <w:bookmarkStart w:id="220" w:name="curriculum-vitae-2"/>
     <w:p>
       <w:pPr>
         <w:pStyle w:val="Heading3"/>
@@ -35911,9 +35869,9 @@
         </w:tc>
       </w:tr>
     </w:tbl>
+    <w:bookmarkEnd w:id="220"/>
     <w:bookmarkEnd w:id="221"/>
     <w:bookmarkEnd w:id="222"/>
-    <w:bookmarkEnd w:id="223"/>
     <w:sectPr>
       <w:pgSz w:h="15840" w:orient="portrait" w:w="12240"/>
       <w:pgMar w:bottom="1440" w:footer="720" w:gutter="0" w:header="720" w:left="2160" w:right="1440" w:top="1440"/>

</xml_diff>

<commit_message>
Put the reporter's name back in the concerns exports
Both the PDF and the spreadsheet printed the name stored on the complaint,
and every form leaves that blank, so the Filed by column has always been
empty. The admin screen never showed it because it resolves the name from
the account. The exports now do the same.

Also brings the feature table in line with the map destination finder.

Co-Authored-By: Claude Opus 5 <noreply@anthropic.com>
Claude-Session: https://claude.ai/code/session_01A1yMabEEN9wVLJcuoCQ2Ki
</commit_message>
<xml_diff>
--- a/docs/TrikRide_Capstone_Documentation.docx
+++ b/docs/TrikRide_Capstone_Documentation.docx
@@ -20645,7 +20645,7 @@
               <w:jc w:val="left"/>
             </w:pPr>
             <w:r>
-              <w:t xml:space="preserve">Pickup selection, searchable destination picker across 240 stops plus two flat rates, rate column selection, passenger count and luggage, itemized fare display, request submission and cancellation</w:t>
+              <w:t xml:space="preserve">Pickup selection, searchable destination picker across 240 stops plus two flat rates, destination selection from the map by nearest posted stop, rate column selection, passenger count and luggage, itemized fare display, request submission and cancellation</w:t>
             </w:r>
           </w:p>
         </w:tc>
@@ -20721,19 +20721,19 @@
               <w:jc w:val="left"/>
             </w:pPr>
             <w:r>
-              <w:t xml:space="preserve">Interactive maps on the booking and tracking screens, rendered by Google Maps or OpenStreetMap according to configuration; live publication of a driver’s position while online; the passenger’s view of that position; pinning a pickup point on the map with a reverse-geocoded label; optional coordinates on fare stops</w:t>
-            </w:r>
-          </w:p>
-        </w:tc>
-        <w:tc>
-          <w:tcPr/>
-          <w:p>
-            <w:pPr>
-              <w:pStyle w:val="Compact"/>
-              <w:jc w:val="left"/>
-            </w:pPr>
-            <w:r>
-              <w:t xml:space="preserve">FR-09, FR-18</w:t>
+              <w:t xml:space="preserve">Interactive maps on the booking and tracking screens, rendered by Google Maps or OpenStreetMap according to configuration; live publication of a driver’s position while online; the passenger’s view of that position; pinning a pickup point on the map with a reverse-geocoded label; naming the posted stop nearest a point the passenger indicates; optional coordinates on fare stops</w:t>
+            </w:r>
+          </w:p>
+        </w:tc>
+        <w:tc>
+          <w:tcPr/>
+          <w:p>
+            <w:pPr>
+              <w:pStyle w:val="Compact"/>
+              <w:jc w:val="left"/>
+            </w:pPr>
+            <w:r>
+              <w:t xml:space="preserve">FR-09, FR-10a, FR-18</w:t>
             </w:r>
           </w:p>
         </w:tc>

</xml_diff>

<commit_message>
Say that 25 pesos is the minimum, not the price
Nothing on the booking screen showed a fare until a destination was
chosen, which is exactly when someone assumes the number they have heard
is what they will pay. The screen now says the minimum is a floor and
that longer trips cost more, and the destination picker leads with the
range the table actually spans, read off the loaded stops rather than
written down. The pickup picker says why it shows no prices at all.

Manual and Appendix H say the same thing.

Co-Authored-By: Claude Opus 5 <noreply@anthropic.com>
Claude-Session: https://claude.ai/code/session_01A1yMabEEN9wVLJcuoCQ2Ki
</commit_message>
<xml_diff>
--- a/docs/TrikRide_Capstone_Documentation.docx
+++ b/docs/TrikRide_Capstone_Documentation.docx
@@ -30138,6 +30138,48 @@
       </w:r>
       <w:r>
         <w:t xml:space="preserve">pay, in cash, directly to the driver.</w:t>
+      </w:r>
+    </w:p>
+    <w:p>
+      <w:pPr>
+        <w:pStyle w:val="BodyText"/>
+      </w:pPr>
+      <w:r>
+        <w:rPr>
+          <w:bCs/>
+          <w:b/>
+        </w:rPr>
+        <w:t xml:space="preserve">₱25 is the minimum, not the price.</w:t>
+      </w:r>
+      <w:r>
+        <w:t xml:space="preserve"> </w:t>
+      </w:r>
+      <w:r>
+        <w:t xml:space="preserve">It is what the shortest rides cost and what any</w:t>
+      </w:r>
+      <w:r>
+        <w:t xml:space="preserve"> </w:t>
+      </w:r>
+      <w:r>
+        <w:t xml:space="preserve">posted rate below it is raised to. Further destinations cost more — the highest on the</w:t>
+      </w:r>
+      <w:r>
+        <w:t xml:space="preserve"> </w:t>
+      </w:r>
+      <w:r>
+        <w:t xml:space="preserve">posted schedule is ₱150 — so a ride is only ₱25 if the schedule says so for the place you</w:t>
+      </w:r>
+      <w:r>
+        <w:t xml:space="preserve"> </w:t>
+      </w:r>
+      <w:r>
+        <w:t xml:space="preserve">are going. The screen tells you which before you commit to anything, and the picker shows</w:t>
+      </w:r>
+      <w:r>
+        <w:t xml:space="preserve"> </w:t>
+      </w:r>
+      <w:r>
+        <w:t xml:space="preserve">the price beside every destination.</w:t>
       </w:r>
     </w:p>
     <w:bookmarkEnd w:id="187"/>

</xml_diff>

<commit_message>
Stop showing plus codes as the pickup label
Google returns an Open Location Code as the first address line wherever
it has no street address, which is most of Talibon, so the line the app
treated as most specific was the one nobody can read. It now builds the
label from the named parts of the same result, barangay and municipality
and province, and strips a plus code out of the address line if it has to
fall back to it. Coordinates remain the last resort.

Co-Authored-By: Claude Opus 5 <noreply@anthropic.com>
Claude-Session: https://claude.ai/code/session_01A1yMabEEN9wVLJcuoCQ2Ki
</commit_message>
<xml_diff>
--- a/docs/TrikRide_Capstone_Documentation.docx
+++ b/docs/TrikRide_Capstone_Documentation.docx
@@ -32577,6 +32577,42 @@
       </w:r>
       <w:r>
         <w:t xml:space="preserve">empty while everything else works. It will fill in.</w:t>
+      </w:r>
+    </w:p>
+    <w:p>
+      <w:pPr>
+        <w:pStyle w:val="BodyText"/>
+      </w:pPr>
+      <w:r>
+        <w:rPr>
+          <w:bCs/>
+          <w:b/>
+        </w:rPr>
+        <w:t xml:space="preserve">The pinned pickup shows numbers instead of a place name.</w:t>
+      </w:r>
+      <w:r>
+        <w:t xml:space="preserve"> </w:t>
+      </w:r>
+      <w:r>
+        <w:t xml:space="preserve">Most of Talibon has no street</w:t>
+      </w:r>
+      <w:r>
+        <w:t xml:space="preserve"> </w:t>
+      </w:r>
+      <w:r>
+        <w:t xml:space="preserve">address on record, so the app names the barangay and municipality instead. Where even that</w:t>
+      </w:r>
+      <w:r>
+        <w:t xml:space="preserve"> </w:t>
+      </w:r>
+      <w:r>
+        <w:t xml:space="preserve">is unavailable it falls back to the coordinates, which a driver can still navigate to from</w:t>
+      </w:r>
+      <w:r>
+        <w:t xml:space="preserve"> </w:t>
+      </w:r>
+      <w:r>
+        <w:t xml:space="preserve">the pin. Add a landmark in the notes if the label is not something you would say aloud.</w:t>
       </w:r>
     </w:p>
     <w:p>

</xml_diff>

<commit_message>
Hand a driver's ride over to Waze or Google Maps
The active ride showed two addresses as text and nothing else, so a
driver who did not know the place had to type it into another app
themselves. It now opens Waze or Maps with the route started, at the
pickup before the passenger is aboard and the destination after. Only
apps that are installed are offered, which needs the packages named in
a queries block, and only when the point has coordinates.

The reset confirmation now names the address it went to. Firebase
reports success when it accepts the request, not when anything is
delivered, so the address is the only part of the outcome the app can
vouch for, and a mistyped one is the usual reason nothing arrives.

Co-Authored-By: Claude Opus 5 <noreply@anthropic.com>
Claude-Session: https://claude.ai/code/session_01A1yMabEEN9wVLJcuoCQ2Ki
</commit_message>
<xml_diff>
--- a/docs/TrikRide_Capstone_Documentation.docx
+++ b/docs/TrikRide_Capstone_Documentation.docx
@@ -4256,7 +4256,7 @@
         <w:pStyle w:val="Compact"/>
       </w:pPr>
       <w:r>
-        <w:t xml:space="preserve">Turn-by-turn navigation is not included. The booking and tracking screens show an interactive map with the relevant positions on it, but the system does not compute or display a driving route, because route calculation is a billed web service and the study operates at no cost.</w:t>
+        <w:t xml:space="preserve">Turn-by-turn navigation is not computed by the system. The booking and tracking screens show an interactive map with the relevant positions on it, but no driving route is calculated, because route calculation is a billed web service and the study operates at no cost. Where the point concerned has coordinates, a driver may hand it to Waze or Google Maps on their own device, which navigates at no cost to the study.</w:t>
       </w:r>
     </w:p>
     <w:p>
@@ -31264,6 +31264,80 @@
         <w:pStyle w:val="BodyText"/>
       </w:pPr>
       <w:r>
+        <w:rPr>
+          <w:bCs/>
+          <w:b/>
+        </w:rPr>
+        <w:t xml:space="preserve">Navigation.</w:t>
+      </w:r>
+      <w:r>
+        <w:t xml:space="preserve"> </w:t>
+      </w:r>
+      <w:r>
+        <w:t xml:space="preserve">TrikRide does not give turn-by-turn directions itself. Where the point it</w:t>
+      </w:r>
+      <w:r>
+        <w:t xml:space="preserve"> </w:t>
+      </w:r>
+      <w:r>
+        <w:t xml:space="preserve">is sending you to has a map position, the active ride shows</w:t>
+      </w:r>
+      <w:r>
+        <w:t xml:space="preserve"> </w:t>
+      </w:r>
+      <w:r>
+        <w:rPr>
+          <w:bCs/>
+          <w:b/>
+        </w:rPr>
+        <w:t xml:space="preserve">Waze</w:t>
+      </w:r>
+      <w:r>
+        <w:t xml:space="preserve"> </w:t>
+      </w:r>
+      <w:r>
+        <w:t xml:space="preserve">and</w:t>
+      </w:r>
+      <w:r>
+        <w:t xml:space="preserve"> </w:t>
+      </w:r>
+      <w:r>
+        <w:rPr>
+          <w:bCs/>
+          <w:b/>
+        </w:rPr>
+        <w:t xml:space="preserve">Google Maps</w:t>
+      </w:r>
+      <w:r>
+        <w:t xml:space="preserve"> </w:t>
+      </w:r>
+      <w:r>
+        <w:t xml:space="preserve">buttons that open whichever of those you have with the route already started — the pickup</w:t>
+      </w:r>
+      <w:r>
+        <w:t xml:space="preserve"> </w:t>
+      </w:r>
+      <w:r>
+        <w:t xml:space="preserve">before the passenger is aboard, the destination once the ride is under way. The buttons</w:t>
+      </w:r>
+      <w:r>
+        <w:t xml:space="preserve"> </w:t>
+      </w:r>
+      <w:r>
+        <w:t xml:space="preserve">only appear for apps you actually have installed, and only when the point has coordinates,</w:t>
+      </w:r>
+      <w:r>
+        <w:t xml:space="preserve"> </w:t>
+      </w:r>
+      <w:r>
+        <w:t xml:space="preserve">which for a destination means the administrator has positioned that stop.</w:t>
+      </w:r>
+    </w:p>
+    <w:p>
+      <w:pPr>
+        <w:pStyle w:val="BodyText"/>
+      </w:pPr>
+      <w:r>
         <w:t xml:space="preserve">Check identification when a passenger has booked the discounted rate. The app records the</w:t>
       </w:r>
       <w:r>
@@ -32661,6 +32735,75 @@
       </w:r>
       <w:r>
         <w:t xml:space="preserve">another device. Sign in again; nothing is lost.</w:t>
+      </w:r>
+    </w:p>
+    <w:p>
+      <w:pPr>
+        <w:pStyle w:val="BodyText"/>
+      </w:pPr>
+      <w:r>
+        <w:rPr>
+          <w:bCs/>
+          <w:b/>
+        </w:rPr>
+        <w:t xml:space="preserve">The password reset email never arrives.</w:t>
+      </w:r>
+      <w:r>
+        <w:t xml:space="preserve"> </w:t>
+      </w:r>
+      <w:r>
+        <w:t xml:space="preserve">The app confirms that Firebase accepted the</w:t>
+      </w:r>
+      <w:r>
+        <w:t xml:space="preserve"> </w:t>
+      </w:r>
+      <w:r>
+        <w:t xml:space="preserve">request, which is not the same as the mail reaching you. Check the spam folder first: the</w:t>
+      </w:r>
+      <w:r>
+        <w:t xml:space="preserve"> </w:t>
+      </w:r>
+      <w:r>
+        <w:t xml:space="preserve">message comes from a</w:t>
+      </w:r>
+      <w:r>
+        <w:t xml:space="preserve"> </w:t>
+      </w:r>
+      <w:r>
+        <w:rPr>
+          <w:rStyle w:val="VerbatimChar"/>
+        </w:rPr>
+        <w:t xml:space="preserve">firebaseapp.com</w:t>
+      </w:r>
+      <w:r>
+        <w:t xml:space="preserve"> </w:t>
+      </w:r>
+      <w:r>
+        <w:t xml:space="preserve">address and is filtered often. Then check the</w:t>
+      </w:r>
+      <w:r>
+        <w:t xml:space="preserve"> </w:t>
+      </w:r>
+      <w:r>
+        <w:t xml:space="preserve">address the confirmation named is one you can actually open — a mistyped address at</w:t>
+      </w:r>
+      <w:r>
+        <w:t xml:space="preserve"> </w:t>
+      </w:r>
+      <w:r>
+        <w:t xml:space="preserve">registration will never receive anything. If neither explains it, the administrator should</w:t>
+      </w:r>
+      <w:r>
+        <w:t xml:space="preserve"> </w:t>
+      </w:r>
+      <w:r>
+        <w:t xml:space="preserve">open Firebase Console, Authentication, Templates, and confirm the password reset template</w:t>
+      </w:r>
+      <w:r>
+        <w:t xml:space="preserve"> </w:t>
+      </w:r>
+      <w:r>
+        <w:t xml:space="preserve">is enabled for the project.</w:t>
       </w:r>
     </w:p>
     <w:p>

</xml_diff>

<commit_message>
Place a fare stop by dragging a pin
Giving a stop a position meant typing two six-decimal numbers into text
fields, 240 times, which is why not one of them has a position and why
finding a destination on the map and navigating to it both do nothing.
The stop editor now opens the same map the pickup pinner uses: drag,
confirm, save. The fields stay for anyone who has real coordinates to
paste.

Co-Authored-By: Claude Opus 5 <noreply@anthropic.com>
Claude-Session: https://claude.ai/code/session_01A1yMabEEN9wVLJcuoCQ2Ki
</commit_message>
<xml_diff>
--- a/docs/TrikRide_Capstone_Documentation.docx
+++ b/docs/TrikRide_Capstone_Documentation.docx
@@ -31765,13 +31765,32 @@
         <w:t xml:space="preserve"> </w:t>
       </w:r>
       <w:r>
-        <w:t xml:space="preserve">A stop can be given coordinates in the same dialog. A stop without them</w:t>
-      </w:r>
-      <w:r>
-        <w:t xml:space="preserve"> </w:t>
-      </w:r>
-      <w:r>
-        <w:t xml:space="preserve">books and prices normally; it just does not appear on the map, and cannot be found through</w:t>
+        <w:t xml:space="preserve">Open a stop and tap</w:t>
+      </w:r>
+      <w:r>
+        <w:t xml:space="preserve"> </w:t>
+      </w:r>
+      <w:r>
+        <w:rPr>
+          <w:bCs/>
+          <w:b/>
+        </w:rPr>
+        <w:t xml:space="preserve">Set it on the map</w:t>
+      </w:r>
+      <w:r>
+        <w:t xml:space="preserve">, then drag until the pin sits</w:t>
+      </w:r>
+      <w:r>
+        <w:t xml:space="preserve"> </w:t>
+      </w:r>
+      <w:r>
+        <w:t xml:space="preserve">on the place and confirm. There is no need to type coordinates. A stop without a position</w:t>
+      </w:r>
+      <w:r>
+        <w:t xml:space="preserve"> </w:t>
+      </w:r>
+      <w:r>
+        <w:t xml:space="preserve">books and prices normally; it just does not appear on the map, cannot be found through</w:t>
       </w:r>
       <w:r>
         <w:t xml:space="preserve"> </w:t>
@@ -31786,7 +31805,13 @@
         <w:t xml:space="preserve">”</w:t>
       </w:r>
       <w:r>
-        <w:t xml:space="preserve">. Filling in the common destinations is worth doing.</w:t>
+        <w:t xml:space="preserve">, and cannot be handed to a driver’s navigation app. Filling in the</w:t>
+      </w:r>
+      <w:r>
+        <w:t xml:space="preserve"> </w:t>
+      </w:r>
+      <w:r>
+        <w:t xml:space="preserve">common destinations is worth doing, and is what turns those two features on.</w:t>
       </w:r>
     </w:p>
     <w:bookmarkEnd w:id="201"/>

</xml_diff>

<commit_message>
Price a party that is not all one kind
A booking carried one rate column and a head count, so a student
travelling with a parent could only be charged as though both were
students or both were not. The ordinance prices them differently and the
sheet has both columns, so the app now asks how many of each: two
counters totalling at most five, each column raised to its own minimum
and multiplied separately, and the fare card shows the two lines before
the total.

Where the sheet is not charged per head, one fare covers the tricycle and
it is the regular rate unless everyone aboard is entitled to the discount.

Rides keep both counts. Older ones have neither, so the driver card and
the ride report fall back to the single column they were priced on.

Co-Authored-By: Claude Opus 5 <noreply@anthropic.com>
Claude-Session: https://claude.ai/code/session_01A1yMabEEN9wVLJcuoCQ2Ki
</commit_message>
<xml_diff>
--- a/docs/TrikRide_Capstone_Documentation.docx
+++ b/docs/TrikRide_Capstone_Documentation.docx
@@ -10816,7 +10816,7 @@
               <w:jc w:val="left"/>
             </w:pPr>
             <w:r>
-              <w:t xml:space="preserve">The system shall allow a passenger to select the regular or the discounted rate column.</w:t>
+              <w:t xml:space="preserve">The system shall allow a passenger to declare how many of the party pay the regular rate and how many pay the discounted rate, and shall price each from its own column.</w:t>
             </w:r>
           </w:p>
         </w:tc>
@@ -10966,7 +10966,7 @@
               <w:jc w:val="left"/>
             </w:pPr>
             <w:r>
-              <w:t xml:space="preserve">The system shall price a ride from the posted rate for the selected destination and rate column, applying the ordinance minimum where the posted rate falls below it, and multiplying by the number of passengers where fares are charged per head.</w:t>
+              <w:t xml:space="preserve">The system shall price a ride from the posted rate for the selected destination, applying the ordinance minimum to each rate column where the posted rate falls below it, and, where fares are charged per head, summing both columns across the declared party.</w:t>
             </w:r>
           </w:p>
         </w:tc>
@@ -20645,7 +20645,7 @@
               <w:jc w:val="left"/>
             </w:pPr>
             <w:r>
-              <w:t xml:space="preserve">Pickup selection, searchable destination picker across 240 stops plus two flat rates, destination selection from the map by nearest posted stop, rate column selection, passenger count and luggage, itemized fare display, request submission and cancellation</w:t>
+              <w:t xml:space="preserve">Pickup selection, searchable destination picker across 240 stops plus two flat rates, destination selection from the map by nearest posted stop, separate counts of regular and discounted passengers, luggage, itemized fare display showing each rate column, request submission and cancellation</w:t>
             </w:r>
           </w:p>
         </w:tc>
@@ -29951,48 +29951,43 @@
           <w:bCs/>
           <w:b/>
         </w:rPr>
-        <w:t xml:space="preserve">Fare type.</w:t>
-      </w:r>
-      <w:r>
-        <w:t xml:space="preserve"> </w:t>
-      </w:r>
-      <w:r>
-        <w:rPr>
-          <w:bCs/>
-          <w:b/>
-        </w:rPr>
-        <w:t xml:space="preserve">Regular</w:t>
-      </w:r>
-      <w:r>
-        <w:t xml:space="preserve">, or</w:t>
-      </w:r>
-      <w:r>
-        <w:t xml:space="preserve"> </w:t>
-      </w:r>
-      <w:r>
-        <w:rPr>
-          <w:bCs/>
-          <w:b/>
-        </w:rPr>
-        <w:t xml:space="preserve">Senior / PWD / Student</w:t>
-      </w:r>
-      <w:r>
-        <w:t xml:space="preserve"> </w:t>
-      </w:r>
-      <w:r>
-        <w:t xml:space="preserve">for the discounted column.</w:t>
-      </w:r>
-      <w:r>
-        <w:t xml:space="preserve"> </w:t>
-      </w:r>
-      <w:r>
-        <w:t xml:space="preserve">Bring the identification — the driver will ask for it, and the app only records which</w:t>
-      </w:r>
-      <w:r>
-        <w:t xml:space="preserve"> </w:t>
-      </w:r>
-      <w:r>
-        <w:t xml:space="preserve">column you chose.</w:t>
+        <w:t xml:space="preserve">Who is travelling.</w:t>
+      </w:r>
+      <w:r>
+        <w:t xml:space="preserve"> </w:t>
+      </w:r>
+      <w:r>
+        <w:t xml:space="preserve">Two counters, not one. Count regular passengers on the first</w:t>
+      </w:r>
+      <w:r>
+        <w:t xml:space="preserve"> </w:t>
+      </w:r>
+      <w:r>
+        <w:t xml:space="preserve">and seniors, persons with disabilities and students on the second, up to five between</w:t>
+      </w:r>
+      <w:r>
+        <w:t xml:space="preserve"> </w:t>
+      </w:r>
+      <w:r>
+        <w:t xml:space="preserve">them. A party can be a mix — two friends and a grandmother is two regular and one</w:t>
+      </w:r>
+      <w:r>
+        <w:t xml:space="preserve"> </w:t>
+      </w:r>
+      <w:r>
+        <w:t xml:space="preserve">discounted — and each is charged from its own column of the posted sheet. Bring the</w:t>
+      </w:r>
+      <w:r>
+        <w:t xml:space="preserve"> </w:t>
+      </w:r>
+      <w:r>
+        <w:t xml:space="preserve">identification; the driver will ask for it, and the app only records how many of each</w:t>
+      </w:r>
+      <w:r>
+        <w:t xml:space="preserve"> </w:t>
+      </w:r>
+      <w:r>
+        <w:t xml:space="preserve">were declared.</w:t>
       </w:r>
     </w:p>
     <w:p>
@@ -30008,13 +30003,19 @@
           <w:bCs/>
           <w:b/>
         </w:rPr>
-        <w:t xml:space="preserve">Passengers.</w:t>
-      </w:r>
-      <w:r>
-        <w:t xml:space="preserve"> </w:t>
-      </w:r>
-      <w:r>
-        <w:t xml:space="preserve">One to five, with the plus and minus buttons.</w:t>
+        <w:t xml:space="preserve">Luggage.</w:t>
+      </w:r>
+      <w:r>
+        <w:t xml:space="preserve"> </w:t>
+      </w:r>
+      <w:r>
+        <w:t xml:space="preserve">Tap any that apply. This is information for the driver and does not change</w:t>
+      </w:r>
+      <w:r>
+        <w:t xml:space="preserve"> </w:t>
+      </w:r>
+      <w:r>
+        <w:t xml:space="preserve">the fare.</w:t>
       </w:r>
     </w:p>
     <w:p>
@@ -30030,19 +30031,19 @@
           <w:bCs/>
           <w:b/>
         </w:rPr>
-        <w:t xml:space="preserve">Luggage.</w:t>
-      </w:r>
-      <w:r>
-        <w:t xml:space="preserve"> </w:t>
-      </w:r>
-      <w:r>
-        <w:t xml:space="preserve">Tap any that apply. This is information for the driver and does not change</w:t>
-      </w:r>
-      <w:r>
-        <w:t xml:space="preserve"> </w:t>
-      </w:r>
-      <w:r>
-        <w:t xml:space="preserve">the fare.</w:t>
+        <w:t xml:space="preserve">Notes.</w:t>
+      </w:r>
+      <w:r>
+        <w:t xml:space="preserve"> </w:t>
+      </w:r>
+      <w:r>
+        <w:t xml:space="preserve">Anything the driver should know: a landmark, a gate number, that you are</w:t>
+      </w:r>
+      <w:r>
+        <w:t xml:space="preserve"> </w:t>
+      </w:r>
+      <w:r>
+        <w:t xml:space="preserve">waiting under the awning.</w:t>
       </w:r>
     </w:p>
     <w:p>
@@ -30054,59 +30055,31 @@
         <w:pStyle w:val="Compact"/>
       </w:pPr>
       <w:r>
+        <w:t xml:space="preserve">Read the itemised fare, then tap</w:t>
+      </w:r>
+      <w:r>
+        <w:t xml:space="preserve"> </w:t>
+      </w:r>
+      <w:r>
         <w:rPr>
           <w:bCs/>
           <w:b/>
         </w:rPr>
-        <w:t xml:space="preserve">Notes.</w:t>
-      </w:r>
-      <w:r>
-        <w:t xml:space="preserve"> </w:t>
-      </w:r>
-      <w:r>
-        <w:t xml:space="preserve">Anything the driver should know: a landmark, a gate number, that you are</w:t>
-      </w:r>
-      <w:r>
-        <w:t xml:space="preserve"> </w:t>
-      </w:r>
-      <w:r>
-        <w:t xml:space="preserve">waiting under the awning.</w:t>
-      </w:r>
-    </w:p>
-    <w:p>
-      <w:pPr>
-        <w:numPr>
-          <w:ilvl w:val="0"/>
-          <w:numId w:val="1020"/>
-        </w:numPr>
-        <w:pStyle w:val="Compact"/>
-      </w:pPr>
-      <w:r>
-        <w:t xml:space="preserve">Read the itemised fare, then tap</w:t>
-      </w:r>
-      <w:r>
-        <w:t xml:space="preserve"> </w:t>
-      </w:r>
+        <w:t xml:space="preserve">Find a Driver</w:t>
+      </w:r>
+      <w:r>
+        <w:t xml:space="preserve">.</w:t>
+      </w:r>
+    </w:p>
+    <w:p>
+      <w:pPr>
+        <w:pStyle w:val="FirstParagraph"/>
+      </w:pPr>
       <w:r>
         <w:rPr>
           <w:bCs/>
           <w:b/>
         </w:rPr>
-        <w:t xml:space="preserve">Find a Driver</w:t>
-      </w:r>
-      <w:r>
-        <w:t xml:space="preserve">.</w:t>
-      </w:r>
-    </w:p>
-    <w:p>
-      <w:pPr>
-        <w:pStyle w:val="FirstParagraph"/>
-      </w:pPr>
-      <w:r>
-        <w:rPr>
-          <w:bCs/>
-          <w:b/>
-        </w:rPr>
         <w:t xml:space="preserve">About the fare.</w:t>
       </w:r>
       <w:r>
@@ -30119,25 +30092,37 @@
         <w:t xml:space="preserve"> </w:t>
       </w:r>
       <w:r>
-        <w:t xml:space="preserve">destination, raises it to the ordinance minimum if the posted rate is lower, and multiplies</w:t>
-      </w:r>
-      <w:r>
-        <w:t xml:space="preserve"> </w:t>
-      </w:r>
-      <w:r>
-        <w:t xml:space="preserve">by the number of passengers. Poblacion and the terminal round trip are flat rates. Nothing</w:t>
-      </w:r>
-      <w:r>
-        <w:t xml:space="preserve"> </w:t>
-      </w:r>
-      <w:r>
-        <w:t xml:space="preserve">is calculated from distance, so the number you are shown before booking is the number you</w:t>
-      </w:r>
-      <w:r>
-        <w:t xml:space="preserve"> </w:t>
-      </w:r>
-      <w:r>
-        <w:t xml:space="preserve">pay, in cash, directly to the driver.</w:t>
+        <w:t xml:space="preserve">destination, raises it to the ordinance minimum if the posted rate is lower, and charges</w:t>
+      </w:r>
+      <w:r>
+        <w:t xml:space="preserve"> </w:t>
+      </w:r>
+      <w:r>
+        <w:t xml:space="preserve">each passenger from the column that applies to them. Two regular passengers and one senior</w:t>
+      </w:r>
+      <w:r>
+        <w:t xml:space="preserve"> </w:t>
+      </w:r>
+      <w:r>
+        <w:t xml:space="preserve">are priced as two at the regular rate plus one at the discounted rate, and the fare card</w:t>
+      </w:r>
+      <w:r>
+        <w:t xml:space="preserve"> </w:t>
+      </w:r>
+      <w:r>
+        <w:t xml:space="preserve">shows those two lines separately before you book. Poblacion and the terminal round trip</w:t>
+      </w:r>
+      <w:r>
+        <w:t xml:space="preserve"> </w:t>
+      </w:r>
+      <w:r>
+        <w:t xml:space="preserve">are flat rates. Nothing is calculated from distance, so the number you are shown before</w:t>
+      </w:r>
+      <w:r>
+        <w:t xml:space="preserve"> </w:t>
+      </w:r>
+      <w:r>
+        <w:t xml:space="preserve">booking is the number you pay, in cash, directly to the driver.</w:t>
       </w:r>
     </w:p>
     <w:p>
@@ -31390,13 +31375,37 @@
         <w:pStyle w:val="BodyText"/>
       </w:pPr>
       <w:r>
-        <w:t xml:space="preserve">Check identification when a passenger has booked the discounted rate. The app records the</w:t>
-      </w:r>
-      <w:r>
-        <w:t xml:space="preserve"> </w:t>
-      </w:r>
-      <w:r>
-        <w:t xml:space="preserve">column they chose; it cannot verify anyone is a senior, a PWD or a student.</w:t>
+        <w:t xml:space="preserve">Check identification against the party the request declares. A card reading</w:t>
+      </w:r>
+      <w:r>
+        <w:t xml:space="preserve"> </w:t>
+      </w:r>
+      <w:r>
+        <w:t xml:space="preserve">“</w:t>
+      </w:r>
+      <w:r>
+        <w:t xml:space="preserve">2 regular,</w:t>
+      </w:r>
+      <w:r>
+        <w:t xml:space="preserve"> </w:t>
+      </w:r>
+      <w:r>
+        <w:t xml:space="preserve">1 senior/PWD/student</w:t>
+      </w:r>
+      <w:r>
+        <w:t xml:space="preserve">”</w:t>
+      </w:r>
+      <w:r>
+        <w:t xml:space="preserve"> </w:t>
+      </w:r>
+      <w:r>
+        <w:t xml:space="preserve">means one person aboard should be able to show an ID. The app</w:t>
+      </w:r>
+      <w:r>
+        <w:t xml:space="preserve"> </w:t>
+      </w:r>
+      <w:r>
+        <w:t xml:space="preserve">records what was declared; it cannot verify it.</w:t>
       </w:r>
     </w:p>
     <w:bookmarkEnd w:id="198"/>

</xml_diff>

<commit_message>
Show a counter only once its kind of passenger is chosen
Two chips now decide which kinds are aboard and each reveals its own
counter, so a party of one kind never looks at a second counter sitting
at zero. The last chosen kind cannot be unchosen, since a tricycle with
nobody in it is not a booking. Nothing about the pricing changed: an
unchosen kind and a count of zero are the same thing to the fare engine.

Co-Authored-By: Claude Opus 5 <noreply@anthropic.com>
Claude-Session: https://claude.ai/code/session_01A1yMabEEN9wVLJcuoCQ2Ki
</commit_message>
<xml_diff>
--- a/docs/TrikRide_Capstone_Documentation.docx
+++ b/docs/TrikRide_Capstone_Documentation.docx
@@ -29957,25 +29957,51 @@
         <w:t xml:space="preserve"> </w:t>
       </w:r>
       <w:r>
-        <w:t xml:space="preserve">Two counters, not one. Count regular passengers on the first</w:t>
-      </w:r>
-      <w:r>
-        <w:t xml:space="preserve"> </w:t>
-      </w:r>
-      <w:r>
-        <w:t xml:space="preserve">and seniors, persons with disabilities and students on the second, up to five between</w:t>
-      </w:r>
-      <w:r>
-        <w:t xml:space="preserve"> </w:t>
-      </w:r>
-      <w:r>
-        <w:t xml:space="preserve">them. A party can be a mix — two friends and a grandmother is two regular and one</w:t>
-      </w:r>
-      <w:r>
-        <w:t xml:space="preserve"> </w:t>
-      </w:r>
-      <w:r>
-        <w:t xml:space="preserve">discounted — and each is charged from its own column of the posted sheet. Bring the</w:t>
+        <w:t xml:space="preserve">Tap every kind of passenger in your party —</w:t>
+      </w:r>
+      <w:r>
+        <w:t xml:space="preserve"> </w:t>
+      </w:r>
+      <w:r>
+        <w:rPr>
+          <w:bCs/>
+          <w:b/>
+        </w:rPr>
+        <w:t xml:space="preserve">Regular</w:t>
+      </w:r>
+      <w:r>
+        <w:t xml:space="preserve">,</w:t>
+      </w:r>
+      <w:r>
+        <w:t xml:space="preserve"> </w:t>
+      </w:r>
+      <w:r>
+        <w:rPr>
+          <w:bCs/>
+          <w:b/>
+        </w:rPr>
+        <w:t xml:space="preserve">Senior / PWD / Student</w:t>
+      </w:r>
+      <w:r>
+        <w:t xml:space="preserve">, or both — and a counter appears for each one you choose.</w:t>
+      </w:r>
+      <w:r>
+        <w:t xml:space="preserve"> </w:t>
+      </w:r>
+      <w:r>
+        <w:t xml:space="preserve">Set how many of each, up to five between them. A party can be a mix: two friends and a</w:t>
+      </w:r>
+      <w:r>
+        <w:t xml:space="preserve"> </w:t>
+      </w:r>
+      <w:r>
+        <w:t xml:space="preserve">grandmother is two regular and one discounted, and each is charged from its own column</w:t>
+      </w:r>
+      <w:r>
+        <w:t xml:space="preserve"> </w:t>
+      </w:r>
+      <w:r>
+        <w:t xml:space="preserve">of the posted sheet. To drop a kind entirely, tap its chip again. Bring the</w:t>
       </w:r>
       <w:r>
         <w:t xml:space="preserve"> </w:t>

</xml_diff>